<commit_message>
removed game back from model
</commit_message>
<xml_diff>
--- a/final-report.docx
+++ b/final-report.docx
@@ -321,24 +321,6 @@
       </w:r>
       <w:r>
         <w:t xml:space="preserve">: a conservative yes/no flag for likely lottery candidates whose late win percentage dropped by at least 10 percentage points and whose late wins were unusually low under a binomial expectation.</w:t>
-      </w:r>
-    </w:p>
-    <w:p>
-      <w:pPr>
-        <w:pStyle w:val="Compact"/>
-        <w:numPr>
-          <w:ilvl w:val="0"/>
-          <w:numId w:val="1001"/>
-        </w:numPr>
-      </w:pPr>
-      <w:r>
-        <w:rPr>
-          <w:rStyle w:val="VerbatimChar"/>
-        </w:rPr>
-        <w:t xml:space="preserve">lower_left_candidate</w:t>
-      </w:r>
-      <w:r>
-        <w:t xml:space="preserve">: a likely lottery candidate that was below .500 both before March and after March. This captures teams that remained very weak late in the season, even if they did not sharply collapse.</w:t>
       </w:r>
     </w:p>
     <w:p>
@@ -883,7 +865,7 @@
               <w:jc w:val="right"/>
             </w:pPr>
             <w:r>
-              <w:t xml:space="preserve">0.873</w:t>
+              <w:t xml:space="preserve">0.892</w:t>
             </w:r>
           </w:p>
         </w:tc>
@@ -1302,7 +1284,7 @@
         <w:pStyle w:val="BodyText"/>
       </w:pPr>
       <w:r>
-        <w:t xml:space="preserve">In both models, the key coefficient is the standardized draft rating. It asks whether stronger draft classes are associated with larger tanking signals after controlling for distance from the postseason cutoff, pre-March team strength, and separate indicators for the disrupted 2012, 2020, and 2021 seasons.</w:t>
+        <w:t xml:space="preserve">In both models, the key coefficient is the standardized draft rating. It asks whether stronger draft classes are associated with larger tanking signals after controlling for pre-March team strength and separate indicators for the disrupted 2012, 2020, and 2021 seasons.</w:t>
       </w:r>
     </w:p>
     <w:p>
@@ -1412,19 +1394,19 @@
               <w:jc w:val="right"/>
             </w:pPr>
             <w:r>
-              <w:t xml:space="preserve">0.044</w:t>
-            </w:r>
-          </w:p>
-        </w:tc>
-        <w:tc>
-          <w:tcPr/>
-          <w:p>
-            <w:pPr>
-              <w:pStyle w:val="Compact"/>
-              <w:jc w:val="right"/>
-            </w:pPr>
-            <w:r>
-              <w:t xml:space="preserve">0.790</w:t>
+              <w:t xml:space="preserve">-0.003</w:t>
+            </w:r>
+          </w:p>
+        </w:tc>
+        <w:tc>
+          <w:tcPr/>
+          <w:p>
+            <w:pPr>
+              <w:pStyle w:val="Compact"/>
+              <w:jc w:val="right"/>
+            </w:pPr>
+            <w:r>
+              <w:t xml:space="preserve">0.984</w:t>
             </w:r>
           </w:p>
         </w:tc>
@@ -1462,19 +1444,19 @@
               <w:jc w:val="right"/>
             </w:pPr>
             <w:r>
-              <w:t xml:space="preserve">0.154</w:t>
-            </w:r>
-          </w:p>
-        </w:tc>
-        <w:tc>
-          <w:tcPr/>
-          <w:p>
-            <w:pPr>
-              <w:pStyle w:val="Compact"/>
-              <w:jc w:val="right"/>
-            </w:pPr>
-            <w:r>
-              <w:t xml:space="preserve">0.214</w:t>
+              <w:t xml:space="preserve">0.109</w:t>
+            </w:r>
+          </w:p>
+        </w:tc>
+        <w:tc>
+          <w:tcPr/>
+          <w:p>
+            <w:pPr>
+              <w:pStyle w:val="Compact"/>
+              <w:jc w:val="right"/>
+            </w:pPr>
+            <w:r>
+              <w:t xml:space="preserve">0.366</w:t>
             </w:r>
           </w:p>
         </w:tc>
@@ -1512,19 +1494,19 @@
               <w:jc w:val="right"/>
             </w:pPr>
             <w:r>
-              <w:t xml:space="preserve">0.100</w:t>
-            </w:r>
-          </w:p>
-        </w:tc>
-        <w:tc>
-          <w:tcPr/>
-          <w:p>
-            <w:pPr>
-              <w:pStyle w:val="Compact"/>
-              <w:jc w:val="right"/>
-            </w:pPr>
-            <w:r>
-              <w:t xml:space="preserve">0.574</w:t>
+              <w:t xml:space="preserve">0.144</w:t>
+            </w:r>
+          </w:p>
+        </w:tc>
+        <w:tc>
+          <w:tcPr/>
+          <w:p>
+            <w:pPr>
+              <w:pStyle w:val="Compact"/>
+              <w:jc w:val="right"/>
+            </w:pPr>
+            <w:r>
+              <w:t xml:space="preserve">0.412</w:t>
             </w:r>
           </w:p>
         </w:tc>
@@ -1562,19 +1544,19 @@
               <w:jc w:val="right"/>
             </w:pPr>
             <w:r>
-              <w:t xml:space="preserve">-0.006</w:t>
-            </w:r>
-          </w:p>
-        </w:tc>
-        <w:tc>
-          <w:tcPr/>
-          <w:p>
-            <w:pPr>
-              <w:pStyle w:val="Compact"/>
-              <w:jc w:val="right"/>
-            </w:pPr>
-            <w:r>
-              <w:t xml:space="preserve">0.833</w:t>
+              <w:t xml:space="preserve">-0.008</w:t>
+            </w:r>
+          </w:p>
+        </w:tc>
+        <w:tc>
+          <w:tcPr/>
+          <w:p>
+            <w:pPr>
+              <w:pStyle w:val="Compact"/>
+              <w:jc w:val="right"/>
+            </w:pPr>
+            <w:r>
+              <w:t xml:space="preserve">0.759</w:t>
             </w:r>
           </w:p>
         </w:tc>
@@ -1612,19 +1594,19 @@
               <w:jc w:val="right"/>
             </w:pPr>
             <w:r>
-              <w:t xml:space="preserve">0.013</w:t>
-            </w:r>
-          </w:p>
-        </w:tc>
-        <w:tc>
-          <w:tcPr/>
-          <w:p>
-            <w:pPr>
-              <w:pStyle w:val="Compact"/>
-              <w:jc w:val="right"/>
-            </w:pPr>
-            <w:r>
-              <w:t xml:space="preserve">0.525</w:t>
+              <w:t xml:space="preserve">0.010</w:t>
+            </w:r>
+          </w:p>
+        </w:tc>
+        <w:tc>
+          <w:tcPr/>
+          <w:p>
+            <w:pPr>
+              <w:pStyle w:val="Compact"/>
+              <w:jc w:val="right"/>
+            </w:pPr>
+            <w:r>
+              <w:t xml:space="preserve">0.590</w:t>
             </w:r>
           </w:p>
         </w:tc>
@@ -1662,19 +1644,19 @@
               <w:jc w:val="right"/>
             </w:pPr>
             <w:r>
-              <w:t xml:space="preserve">0.026</w:t>
-            </w:r>
-          </w:p>
-        </w:tc>
-        <w:tc>
-          <w:tcPr/>
-          <w:p>
-            <w:pPr>
-              <w:pStyle w:val="Compact"/>
-              <w:jc w:val="right"/>
-            </w:pPr>
-            <w:r>
-              <w:t xml:space="preserve">0.372</w:t>
+              <w:t xml:space="preserve">0.028</w:t>
+            </w:r>
+          </w:p>
+        </w:tc>
+        <w:tc>
+          <w:tcPr/>
+          <w:p>
+            <w:pPr>
+              <w:pStyle w:val="Compact"/>
+              <w:jc w:val="right"/>
+            </w:pPr>
+            <w:r>
+              <w:t xml:space="preserve">0.324</w:t>
             </w:r>
           </w:p>
         </w:tc>
@@ -1701,7 +1683,7 @@
         <w:pStyle w:val="BodyText"/>
       </w:pPr>
       <w:r>
-        <w:t xml:space="preserve">We include both</w:t>
+        <w:t xml:space="preserve">We considered including both</w:t>
       </w:r>
       <w:r>
         <w:t xml:space="preserve"> </w:t>
@@ -1731,7 +1713,7 @@
         <w:t xml:space="preserve"> </w:t>
       </w:r>
       <w:r>
-        <w:t xml:space="preserve">because they control for different parts of a team’s March situation.</w:t>
+        <w:t xml:space="preserve">as model controls, but they are highly correlated among likely lottery candidates, with a correlation of -0.827. To avoid unnecessary multicollinearity, the final model keeps</w:t>
       </w:r>
       <w:r>
         <w:t xml:space="preserve"> </w:t>
@@ -1746,7 +1728,7 @@
         <w:t xml:space="preserve"> </w:t>
       </w:r>
       <w:r>
-        <w:t xml:space="preserve">adjusts for baseline team quality, while</w:t>
+        <w:t xml:space="preserve">as the main baseline team-quality control and removes</w:t>
       </w:r>
       <w:r>
         <w:t xml:space="preserve"> </w:t>
@@ -1761,7 +1743,22 @@
         <w:t xml:space="preserve"> </w:t>
       </w:r>
       <w:r>
-        <w:t xml:space="preserve">adjusts for how realistic the team’s postseason or play-in chances were. These variables are related: among likely lottery candidates, their correlation is -0.827. However, the variance inflation factors are moderate rather than severe: 3.86 for pre-March win percentage and 4.12 for games behind the cutoff. Most importantly, the VIF for draft rating is only 1.2, so multicollinearity between the controls does not appear to threaten the main draft-strength coefficient.</w:t>
+        <w:t xml:space="preserve">from the regression.</w:t>
+      </w:r>
+      <w:r>
+        <w:t xml:space="preserve"> </w:t>
+      </w:r>
+      <w:r>
+        <w:rPr>
+          <w:rStyle w:val="VerbatimChar"/>
+        </w:rPr>
+        <w:t xml:space="preserve">games_back_cutline</w:t>
+      </w:r>
+      <w:r>
+        <w:t xml:space="preserve"> </w:t>
+      </w:r>
+      <w:r>
+        <w:t xml:space="preserve">still matters in the analysis because it helps define which teams are likely lottery candidates, but it is not included as an additional predictor in the final model.</w:t>
       </w:r>
     </w:p>
     <w:p>
@@ -1885,7 +1882,7 @@
               <w:jc w:val="right"/>
             </w:pPr>
             <w:r>
-              <w:t xml:space="preserve">0.141</w:t>
+              <w:t xml:space="preserve">0.131</w:t>
             </w:r>
           </w:p>
         </w:tc>
@@ -1909,7 +1906,7 @@
               <w:jc w:val="right"/>
             </w:pPr>
             <w:r>
-              <w:t xml:space="preserve">0.013</w:t>
+              <w:t xml:space="preserve">0.020</w:t>
             </w:r>
           </w:p>
         </w:tc>
@@ -1935,43 +1932,43 @@
               <w:jc w:val="left"/>
             </w:pPr>
             <w:r>
-              <w:t xml:space="preserve">Games behind cutoff</w:t>
-            </w:r>
-          </w:p>
-        </w:tc>
-        <w:tc>
-          <w:tcPr/>
-          <w:p>
-            <w:pPr>
-              <w:pStyle w:val="Compact"/>
-              <w:jc w:val="right"/>
-            </w:pPr>
-            <w:r>
-              <w:t xml:space="preserve">0.028</w:t>
-            </w:r>
-          </w:p>
-        </w:tc>
-        <w:tc>
-          <w:tcPr/>
-          <w:p>
-            <w:pPr>
-              <w:pStyle w:val="Compact"/>
-              <w:jc w:val="right"/>
-            </w:pPr>
-            <w:r>
-              <w:t xml:space="preserve">0.021</w:t>
-            </w:r>
-          </w:p>
-        </w:tc>
-        <w:tc>
-          <w:tcPr/>
-          <w:p>
-            <w:pPr>
-              <w:pStyle w:val="Compact"/>
-              <w:jc w:val="right"/>
-            </w:pPr>
-            <w:r>
-              <w:t xml:space="preserve">0.189</w:t>
+              <w:t xml:space="preserve">Pre-March win pct</w:t>
+            </w:r>
+          </w:p>
+        </w:tc>
+        <w:tc>
+          <w:tcPr/>
+          <w:p>
+            <w:pPr>
+              <w:pStyle w:val="Compact"/>
+              <w:jc w:val="right"/>
+            </w:pPr>
+            <w:r>
+              <w:t xml:space="preserve">1.838</w:t>
+            </w:r>
+          </w:p>
+        </w:tc>
+        <w:tc>
+          <w:tcPr/>
+          <w:p>
+            <w:pPr>
+              <w:pStyle w:val="Compact"/>
+              <w:jc w:val="right"/>
+            </w:pPr>
+            <w:r>
+              <w:t xml:space="preserve">0.600</w:t>
+            </w:r>
+          </w:p>
+        </w:tc>
+        <w:tc>
+          <w:tcPr/>
+          <w:p>
+            <w:pPr>
+              <w:pStyle w:val="Compact"/>
+              <w:jc w:val="right"/>
+            </w:pPr>
+            <w:r>
+              <w:t xml:space="preserve">0.003</w:t>
             </w:r>
           </w:p>
         </w:tc>
@@ -1997,43 +1994,43 @@
               <w:jc w:val="left"/>
             </w:pPr>
             <w:r>
-              <w:t xml:space="preserve">Pre-March win pct</w:t>
-            </w:r>
-          </w:p>
-        </w:tc>
-        <w:tc>
-          <w:tcPr/>
-          <w:p>
-            <w:pPr>
-              <w:pStyle w:val="Compact"/>
-              <w:jc w:val="right"/>
-            </w:pPr>
-            <w:r>
-              <w:t xml:space="preserve">3.172</w:t>
-            </w:r>
-          </w:p>
-        </w:tc>
-        <w:tc>
-          <w:tcPr/>
-          <w:p>
-            <w:pPr>
-              <w:pStyle w:val="Compact"/>
-              <w:jc w:val="right"/>
-            </w:pPr>
-            <w:r>
-              <w:t xml:space="preserve">1.174</w:t>
-            </w:r>
-          </w:p>
-        </w:tc>
-        <w:tc>
-          <w:tcPr/>
-          <w:p>
-            <w:pPr>
-              <w:pStyle w:val="Compact"/>
-              <w:jc w:val="right"/>
-            </w:pPr>
-            <w:r>
-              <w:t xml:space="preserve">0.008</w:t>
+              <w:t xml:space="preserve">2012 season</w:t>
+            </w:r>
+          </w:p>
+        </w:tc>
+        <w:tc>
+          <w:tcPr/>
+          <w:p>
+            <w:pPr>
+              <w:pStyle w:val="Compact"/>
+              <w:jc w:val="right"/>
+            </w:pPr>
+            <w:r>
+              <w:t xml:space="preserve">-0.080</w:t>
+            </w:r>
+          </w:p>
+        </w:tc>
+        <w:tc>
+          <w:tcPr/>
+          <w:p>
+            <w:pPr>
+              <w:pStyle w:val="Compact"/>
+              <w:jc w:val="right"/>
+            </w:pPr>
+            <w:r>
+              <w:t xml:space="preserve">0.213</w:t>
+            </w:r>
+          </w:p>
+        </w:tc>
+        <w:tc>
+          <w:tcPr/>
+          <w:p>
+            <w:pPr>
+              <w:pStyle w:val="Compact"/>
+              <w:jc w:val="right"/>
+            </w:pPr>
+            <w:r>
+              <w:t xml:space="preserve">0.707</w:t>
             </w:r>
           </w:p>
         </w:tc>
@@ -2059,43 +2056,43 @@
               <w:jc w:val="left"/>
             </w:pPr>
             <w:r>
-              <w:t xml:space="preserve">2012 season</w:t>
-            </w:r>
-          </w:p>
-        </w:tc>
-        <w:tc>
-          <w:tcPr/>
-          <w:p>
-            <w:pPr>
-              <w:pStyle w:val="Compact"/>
-              <w:jc w:val="right"/>
-            </w:pPr>
-            <w:r>
-              <w:t xml:space="preserve">0.024</w:t>
-            </w:r>
-          </w:p>
-        </w:tc>
-        <w:tc>
-          <w:tcPr/>
-          <w:p>
-            <w:pPr>
-              <w:pStyle w:val="Compact"/>
-              <w:jc w:val="right"/>
-            </w:pPr>
-            <w:r>
-              <w:t xml:space="preserve">0.227</w:t>
-            </w:r>
-          </w:p>
-        </w:tc>
-        <w:tc>
-          <w:tcPr/>
-          <w:p>
-            <w:pPr>
-              <w:pStyle w:val="Compact"/>
-              <w:jc w:val="right"/>
-            </w:pPr>
-            <w:r>
-              <w:t xml:space="preserve">0.915</w:t>
+              <w:t xml:space="preserve">2020 season</w:t>
+            </w:r>
+          </w:p>
+        </w:tc>
+        <w:tc>
+          <w:tcPr/>
+          <w:p>
+            <w:pPr>
+              <w:pStyle w:val="Compact"/>
+              <w:jc w:val="right"/>
+            </w:pPr>
+            <w:r>
+              <w:t xml:space="preserve">-0.251</w:t>
+            </w:r>
+          </w:p>
+        </w:tc>
+        <w:tc>
+          <w:tcPr/>
+          <w:p>
+            <w:pPr>
+              <w:pStyle w:val="Compact"/>
+              <w:jc w:val="right"/>
+            </w:pPr>
+            <w:r>
+              <w:t xml:space="preserve">0.206</w:t>
+            </w:r>
+          </w:p>
+        </w:tc>
+        <w:tc>
+          <w:tcPr/>
+          <w:p>
+            <w:pPr>
+              <w:pStyle w:val="Compact"/>
+              <w:jc w:val="right"/>
+            </w:pPr>
+            <w:r>
+              <w:t xml:space="preserve">0.223</w:t>
             </w:r>
           </w:p>
         </w:tc>
@@ -2121,43 +2118,43 @@
               <w:jc w:val="left"/>
             </w:pPr>
             <w:r>
-              <w:t xml:space="preserve">2020 season</w:t>
-            </w:r>
-          </w:p>
-        </w:tc>
-        <w:tc>
-          <w:tcPr/>
-          <w:p>
-            <w:pPr>
-              <w:pStyle w:val="Compact"/>
-              <w:jc w:val="right"/>
-            </w:pPr>
-            <w:r>
-              <w:t xml:space="preserve">-0.180</w:t>
-            </w:r>
-          </w:p>
-        </w:tc>
-        <w:tc>
-          <w:tcPr/>
-          <w:p>
-            <w:pPr>
-              <w:pStyle w:val="Compact"/>
-              <w:jc w:val="right"/>
-            </w:pPr>
-            <w:r>
-              <w:t xml:space="preserve">0.212</w:t>
-            </w:r>
-          </w:p>
-        </w:tc>
-        <w:tc>
-          <w:tcPr/>
-          <w:p>
-            <w:pPr>
-              <w:pStyle w:val="Compact"/>
-              <w:jc w:val="right"/>
-            </w:pPr>
-            <w:r>
-              <w:t xml:space="preserve">0.397</w:t>
+              <w:t xml:space="preserve">2021 season</w:t>
+            </w:r>
+          </w:p>
+        </w:tc>
+        <w:tc>
+          <w:tcPr/>
+          <w:p>
+            <w:pPr>
+              <w:pStyle w:val="Compact"/>
+              <w:jc w:val="right"/>
+            </w:pPr>
+            <w:r>
+              <w:t xml:space="preserve">0.951</w:t>
+            </w:r>
+          </w:p>
+        </w:tc>
+        <w:tc>
+          <w:tcPr/>
+          <w:p>
+            <w:pPr>
+              <w:pStyle w:val="Compact"/>
+              <w:jc w:val="right"/>
+            </w:pPr>
+            <w:r>
+              <w:t xml:space="preserve">0.276</w:t>
+            </w:r>
+          </w:p>
+        </w:tc>
+        <w:tc>
+          <w:tcPr/>
+          <w:p>
+            <w:pPr>
+              <w:pStyle w:val="Compact"/>
+              <w:jc w:val="right"/>
+            </w:pPr>
+            <w:r>
+              <w:t xml:space="preserve">0.001</w:t>
             </w:r>
           </w:p>
         </w:tc>
@@ -2171,55 +2168,55 @@
               <w:jc w:val="left"/>
             </w:pPr>
             <w:r>
-              <w:t xml:space="preserve">Late-collapse score</w:t>
-            </w:r>
-          </w:p>
-        </w:tc>
-        <w:tc>
-          <w:tcPr/>
-          <w:p>
-            <w:pPr>
-              <w:pStyle w:val="Compact"/>
-              <w:jc w:val="left"/>
-            </w:pPr>
-            <w:r>
-              <w:t xml:space="preserve">2021 season</w:t>
-            </w:r>
-          </w:p>
-        </w:tc>
-        <w:tc>
-          <w:tcPr/>
-          <w:p>
-            <w:pPr>
-              <w:pStyle w:val="Compact"/>
-              <w:jc w:val="right"/>
-            </w:pPr>
-            <w:r>
-              <w:t xml:space="preserve">1.087</w:t>
-            </w:r>
-          </w:p>
-        </w:tc>
-        <w:tc>
-          <w:tcPr/>
-          <w:p>
-            <w:pPr>
-              <w:pStyle w:val="Compact"/>
-              <w:jc w:val="right"/>
-            </w:pPr>
-            <w:r>
-              <w:t xml:space="preserve">0.294</w:t>
-            </w:r>
-          </w:p>
-        </w:tc>
-        <w:tc>
-          <w:tcPr/>
-          <w:p>
-            <w:pPr>
-              <w:pStyle w:val="Compact"/>
-              <w:jc w:val="right"/>
-            </w:pPr>
-            <w:r>
-              <w:t xml:space="preserve">0.000</w:t>
+              <w:t xml:space="preserve">Sustained-low score</w:t>
+            </w:r>
+          </w:p>
+        </w:tc>
+        <w:tc>
+          <w:tcPr/>
+          <w:p>
+            <w:pPr>
+              <w:pStyle w:val="Compact"/>
+              <w:jc w:val="left"/>
+            </w:pPr>
+            <w:r>
+              <w:t xml:space="preserve">Draft rating (standardized)</w:t>
+            </w:r>
+          </w:p>
+        </w:tc>
+        <w:tc>
+          <w:tcPr/>
+          <w:p>
+            <w:pPr>
+              <w:pStyle w:val="Compact"/>
+              <w:jc w:val="right"/>
+            </w:pPr>
+            <w:r>
+              <w:t xml:space="preserve">0.017</w:t>
+            </w:r>
+          </w:p>
+        </w:tc>
+        <w:tc>
+          <w:tcPr/>
+          <w:p>
+            <w:pPr>
+              <w:pStyle w:val="Compact"/>
+              <w:jc w:val="right"/>
+            </w:pPr>
+            <w:r>
+              <w:t xml:space="preserve">0.009</w:t>
+            </w:r>
+          </w:p>
+        </w:tc>
+        <w:tc>
+          <w:tcPr/>
+          <w:p>
+            <w:pPr>
+              <w:pStyle w:val="Compact"/>
+              <w:jc w:val="right"/>
+            </w:pPr>
+            <w:r>
+              <w:t xml:space="preserve">0.057</w:t>
             </w:r>
           </w:p>
         </w:tc>
@@ -2245,43 +2242,43 @@
               <w:jc w:val="left"/>
             </w:pPr>
             <w:r>
-              <w:t xml:space="preserve">Draft rating (standardized)</w:t>
-            </w:r>
-          </w:p>
-        </w:tc>
-        <w:tc>
-          <w:tcPr/>
-          <w:p>
-            <w:pPr>
-              <w:pStyle w:val="Compact"/>
-              <w:jc w:val="right"/>
-            </w:pPr>
-            <w:r>
-              <w:t xml:space="preserve">0.018</w:t>
-            </w:r>
-          </w:p>
-        </w:tc>
-        <w:tc>
-          <w:tcPr/>
-          <w:p>
-            <w:pPr>
-              <w:pStyle w:val="Compact"/>
-              <w:jc w:val="right"/>
-            </w:pPr>
-            <w:r>
-              <w:t xml:space="preserve">0.009</w:t>
-            </w:r>
-          </w:p>
-        </w:tc>
-        <w:tc>
-          <w:tcPr/>
-          <w:p>
-            <w:pPr>
-              <w:pStyle w:val="Compact"/>
-              <w:jc w:val="right"/>
-            </w:pPr>
-            <w:r>
-              <w:t xml:space="preserve">0.052</w:t>
+              <w:t xml:space="preserve">Pre-March win pct</w:t>
+            </w:r>
+          </w:p>
+        </w:tc>
+        <w:tc>
+          <w:tcPr/>
+          <w:p>
+            <w:pPr>
+              <w:pStyle w:val="Compact"/>
+              <w:jc w:val="right"/>
+            </w:pPr>
+            <w:r>
+              <w:t xml:space="preserve">-0.496</w:t>
+            </w:r>
+          </w:p>
+        </w:tc>
+        <w:tc>
+          <w:tcPr/>
+          <w:p>
+            <w:pPr>
+              <w:pStyle w:val="Compact"/>
+              <w:jc w:val="right"/>
+            </w:pPr>
+            <w:r>
+              <w:t xml:space="preserve">0.096</w:t>
+            </w:r>
+          </w:p>
+        </w:tc>
+        <w:tc>
+          <w:tcPr/>
+          <w:p>
+            <w:pPr>
+              <w:pStyle w:val="Compact"/>
+              <w:jc w:val="right"/>
+            </w:pPr>
+            <w:r>
+              <w:t xml:space="preserve">0.000</w:t>
             </w:r>
           </w:p>
         </w:tc>
@@ -2307,43 +2304,43 @@
               <w:jc w:val="left"/>
             </w:pPr>
             <w:r>
-              <w:t xml:space="preserve">Games behind cutoff</w:t>
-            </w:r>
-          </w:p>
-        </w:tc>
-        <w:tc>
-          <w:tcPr/>
-          <w:p>
-            <w:pPr>
-              <w:pStyle w:val="Compact"/>
-              <w:jc w:val="right"/>
-            </w:pPr>
-            <w:r>
-              <w:t xml:space="preserve">0.002</w:t>
-            </w:r>
-          </w:p>
-        </w:tc>
-        <w:tc>
-          <w:tcPr/>
-          <w:p>
-            <w:pPr>
-              <w:pStyle w:val="Compact"/>
-              <w:jc w:val="right"/>
-            </w:pPr>
-            <w:r>
-              <w:t xml:space="preserve">0.003</w:t>
-            </w:r>
-          </w:p>
-        </w:tc>
-        <w:tc>
-          <w:tcPr/>
-          <w:p>
-            <w:pPr>
-              <w:pStyle w:val="Compact"/>
-              <w:jc w:val="right"/>
-            </w:pPr>
-            <w:r>
-              <w:t xml:space="preserve">0.650</w:t>
+              <w:t xml:space="preserve">2012 season</w:t>
+            </w:r>
+          </w:p>
+        </w:tc>
+        <w:tc>
+          <w:tcPr/>
+          <w:p>
+            <w:pPr>
+              <w:pStyle w:val="Compact"/>
+              <w:jc w:val="right"/>
+            </w:pPr>
+            <w:r>
+              <w:t xml:space="preserve">-0.052</w:t>
+            </w:r>
+          </w:p>
+        </w:tc>
+        <w:tc>
+          <w:tcPr/>
+          <w:p>
+            <w:pPr>
+              <w:pStyle w:val="Compact"/>
+              <w:jc w:val="right"/>
+            </w:pPr>
+            <w:r>
+              <w:t xml:space="preserve">0.034</w:t>
+            </w:r>
+          </w:p>
+        </w:tc>
+        <w:tc>
+          <w:tcPr/>
+          <w:p>
+            <w:pPr>
+              <w:pStyle w:val="Compact"/>
+              <w:jc w:val="right"/>
+            </w:pPr>
+            <w:r>
+              <w:t xml:space="preserve">0.130</w:t>
             </w:r>
           </w:p>
         </w:tc>
@@ -2369,43 +2366,43 @@
               <w:jc w:val="left"/>
             </w:pPr>
             <w:r>
-              <w:t xml:space="preserve">Pre-March win pct</w:t>
-            </w:r>
-          </w:p>
-        </w:tc>
-        <w:tc>
-          <w:tcPr/>
-          <w:p>
-            <w:pPr>
-              <w:pStyle w:val="Compact"/>
-              <w:jc w:val="right"/>
-            </w:pPr>
-            <w:r>
-              <w:t xml:space="preserve">-0.422</w:t>
-            </w:r>
-          </w:p>
-        </w:tc>
-        <w:tc>
-          <w:tcPr/>
-          <w:p>
-            <w:pPr>
-              <w:pStyle w:val="Compact"/>
-              <w:jc w:val="right"/>
-            </w:pPr>
-            <w:r>
-              <w:t xml:space="preserve">0.189</w:t>
-            </w:r>
-          </w:p>
-        </w:tc>
-        <w:tc>
-          <w:tcPr/>
-          <w:p>
-            <w:pPr>
-              <w:pStyle w:val="Compact"/>
-              <w:jc w:val="right"/>
-            </w:pPr>
-            <w:r>
-              <w:t xml:space="preserve">0.027</w:t>
+              <w:t xml:space="preserve">2020 season</w:t>
+            </w:r>
+          </w:p>
+        </w:tc>
+        <w:tc>
+          <w:tcPr/>
+          <w:p>
+            <w:pPr>
+              <w:pStyle w:val="Compact"/>
+              <w:jc w:val="right"/>
+            </w:pPr>
+            <w:r>
+              <w:t xml:space="preserve">-0.051</w:t>
+            </w:r>
+          </w:p>
+        </w:tc>
+        <w:tc>
+          <w:tcPr/>
+          <w:p>
+            <w:pPr>
+              <w:pStyle w:val="Compact"/>
+              <w:jc w:val="right"/>
+            </w:pPr>
+            <w:r>
+              <w:t xml:space="preserve">0.033</w:t>
+            </w:r>
+          </w:p>
+        </w:tc>
+        <w:tc>
+          <w:tcPr/>
+          <w:p>
+            <w:pPr>
+              <w:pStyle w:val="Compact"/>
+              <w:jc w:val="right"/>
+            </w:pPr>
+            <w:r>
+              <w:t xml:space="preserve">0.125</w:t>
             </w:r>
           </w:p>
         </w:tc>
@@ -2431,130 +2428,6 @@
               <w:jc w:val="left"/>
             </w:pPr>
             <w:r>
-              <w:t xml:space="preserve">2012 season</w:t>
-            </w:r>
-          </w:p>
-        </w:tc>
-        <w:tc>
-          <w:tcPr/>
-          <w:p>
-            <w:pPr>
-              <w:pStyle w:val="Compact"/>
-              <w:jc w:val="right"/>
-            </w:pPr>
-            <w:r>
-              <w:t xml:space="preserve">-0.046</w:t>
-            </w:r>
-          </w:p>
-        </w:tc>
-        <w:tc>
-          <w:tcPr/>
-          <w:p>
-            <w:pPr>
-              <w:pStyle w:val="Compact"/>
-              <w:jc w:val="right"/>
-            </w:pPr>
-            <w:r>
-              <w:t xml:space="preserve">0.036</w:t>
-            </w:r>
-          </w:p>
-        </w:tc>
-        <w:tc>
-          <w:tcPr/>
-          <w:p>
-            <w:pPr>
-              <w:pStyle w:val="Compact"/>
-              <w:jc w:val="right"/>
-            </w:pPr>
-            <w:r>
-              <w:t xml:space="preserve">0.208</w:t>
-            </w:r>
-          </w:p>
-        </w:tc>
-      </w:tr>
-      <w:tr>
-        <w:tc>
-          <w:tcPr/>
-          <w:p>
-            <w:pPr>
-              <w:pStyle w:val="Compact"/>
-              <w:jc w:val="left"/>
-            </w:pPr>
-            <w:r>
-              <w:t xml:space="preserve">Sustained-low score</w:t>
-            </w:r>
-          </w:p>
-        </w:tc>
-        <w:tc>
-          <w:tcPr/>
-          <w:p>
-            <w:pPr>
-              <w:pStyle w:val="Compact"/>
-              <w:jc w:val="left"/>
-            </w:pPr>
-            <w:r>
-              <w:t xml:space="preserve">2020 season</w:t>
-            </w:r>
-          </w:p>
-        </w:tc>
-        <w:tc>
-          <w:tcPr/>
-          <w:p>
-            <w:pPr>
-              <w:pStyle w:val="Compact"/>
-              <w:jc w:val="right"/>
-            </w:pPr>
-            <w:r>
-              <w:t xml:space="preserve">-0.047</w:t>
-            </w:r>
-          </w:p>
-        </w:tc>
-        <w:tc>
-          <w:tcPr/>
-          <w:p>
-            <w:pPr>
-              <w:pStyle w:val="Compact"/>
-              <w:jc w:val="right"/>
-            </w:pPr>
-            <w:r>
-              <w:t xml:space="preserve">0.034</w:t>
-            </w:r>
-          </w:p>
-        </w:tc>
-        <w:tc>
-          <w:tcPr/>
-          <w:p>
-            <w:pPr>
-              <w:pStyle w:val="Compact"/>
-              <w:jc w:val="right"/>
-            </w:pPr>
-            <w:r>
-              <w:t xml:space="preserve">0.172</w:t>
-            </w:r>
-          </w:p>
-        </w:tc>
-      </w:tr>
-      <w:tr>
-        <w:tc>
-          <w:tcPr/>
-          <w:p>
-            <w:pPr>
-              <w:pStyle w:val="Compact"/>
-              <w:jc w:val="left"/>
-            </w:pPr>
-            <w:r>
-              <w:t xml:space="preserve">Sustained-low score</w:t>
-            </w:r>
-          </w:p>
-        </w:tc>
-        <w:tc>
-          <w:tcPr/>
-          <w:p>
-            <w:pPr>
-              <w:pStyle w:val="Compact"/>
-              <w:jc w:val="left"/>
-            </w:pPr>
-            <w:r>
               <w:t xml:space="preserve">2021 season</w:t>
             </w:r>
           </w:p>
@@ -2567,31 +2440,31 @@
               <w:jc w:val="right"/>
             </w:pPr>
             <w:r>
-              <w:t xml:space="preserve">0.065</w:t>
-            </w:r>
-          </w:p>
-        </w:tc>
-        <w:tc>
-          <w:tcPr/>
-          <w:p>
-            <w:pPr>
-              <w:pStyle w:val="Compact"/>
-              <w:jc w:val="right"/>
-            </w:pPr>
-            <w:r>
-              <w:t xml:space="preserve">0.047</w:t>
-            </w:r>
-          </w:p>
-        </w:tc>
-        <w:tc>
-          <w:tcPr/>
-          <w:p>
-            <w:pPr>
-              <w:pStyle w:val="Compact"/>
-              <w:jc w:val="right"/>
-            </w:pPr>
-            <w:r>
-              <w:t xml:space="preserve">0.172</w:t>
+              <w:t xml:space="preserve">0.057</w:t>
+            </w:r>
+          </w:p>
+        </w:tc>
+        <w:tc>
+          <w:tcPr/>
+          <w:p>
+            <w:pPr>
+              <w:pStyle w:val="Compact"/>
+              <w:jc w:val="right"/>
+            </w:pPr>
+            <w:r>
+              <w:t xml:space="preserve">0.044</w:t>
+            </w:r>
+          </w:p>
+        </w:tc>
+        <w:tc>
+          <w:tcPr/>
+          <w:p>
+            <w:pPr>
+              <w:pStyle w:val="Compact"/>
+              <w:jc w:val="right"/>
+            </w:pPr>
+            <w:r>
+              <w:t xml:space="preserve">0.196</w:t>
             </w:r>
           </w:p>
         </w:tc>
@@ -2602,7 +2475,7 @@
         <w:pStyle w:val="BodyText"/>
       </w:pPr>
       <w:r>
-        <w:t xml:space="preserve">The late-collapse model does not provide strong statistical evidence that draft strength predicts sudden March-onward underperformance across the full 2010-2026 period. Its draft-rating coefficient is 0.141, with a p-value of 0.013. This means a one-standard-deviation increase in draft class rating is associated with an estimated 0.141 increase in the late-collapse score, holding the other variables constant.</w:t>
+        <w:t xml:space="preserve">The late-collapse model does not provide strong statistical evidence that draft strength predicts sudden March-onward underperformance across the full 2010-2026 period. Its draft-rating coefficient is 0.131, with a p-value of 0.02. This means a one-standard-deviation increase in draft class rating is associated with an estimated 0.131 increase in the late-collapse score, holding the other variables constant.</w:t>
       </w:r>
     </w:p>
     <w:p>
@@ -2610,7 +2483,7 @@
         <w:pStyle w:val="BodyText"/>
       </w:pPr>
       <w:r>
-        <w:t xml:space="preserve">The sustained-low model tells a similar but slightly more intuitive story. Its draft-rating coefficient is 0.018, with a p-value of 0.052. Overall, the results support a cautious conclusion: stronger draft classes may be associated with more late-season losing signals, especially when we include sustained poor performance, but the evidence is suggestive rather than conclusive.</w:t>
+        <w:t xml:space="preserve">The sustained-low model tells a similar but slightly more intuitive story. Its draft-rating coefficient is 0.017, with a p-value of 0.057. Overall, the results support a cautious conclusion: stronger draft classes may be associated with more late-season losing signals, especially when we include sustained poor performance, but the evidence is suggestive rather than conclusive.</w:t>
       </w:r>
     </w:p>
     <w:p>
@@ -2754,19 +2627,19 @@
               <w:jc w:val="right"/>
             </w:pPr>
             <w:r>
-              <w:t xml:space="preserve">0.141</w:t>
-            </w:r>
-          </w:p>
-        </w:tc>
-        <w:tc>
-          <w:tcPr/>
-          <w:p>
-            <w:pPr>
-              <w:pStyle w:val="Compact"/>
-              <w:jc w:val="right"/>
-            </w:pPr>
-            <w:r>
-              <w:t xml:space="preserve">0.013</w:t>
+              <w:t xml:space="preserve">0.131</w:t>
+            </w:r>
+          </w:p>
+        </w:tc>
+        <w:tc>
+          <w:tcPr/>
+          <w:p>
+            <w:pPr>
+              <w:pStyle w:val="Compact"/>
+              <w:jc w:val="right"/>
+            </w:pPr>
+            <w:r>
+              <w:t xml:space="preserve">0.020</w:t>
             </w:r>
           </w:p>
         </w:tc>
@@ -2816,19 +2689,19 @@
               <w:jc w:val="right"/>
             </w:pPr>
             <w:r>
-              <w:t xml:space="preserve">0.137</w:t>
-            </w:r>
-          </w:p>
-        </w:tc>
-        <w:tc>
-          <w:tcPr/>
-          <w:p>
-            <w:pPr>
-              <w:pStyle w:val="Compact"/>
-              <w:jc w:val="right"/>
-            </w:pPr>
-            <w:r>
-              <w:t xml:space="preserve">0.011</w:t>
+              <w:t xml:space="preserve">0.128</w:t>
+            </w:r>
+          </w:p>
+        </w:tc>
+        <w:tc>
+          <w:tcPr/>
+          <w:p>
+            <w:pPr>
+              <w:pStyle w:val="Compact"/>
+              <w:jc w:val="right"/>
+            </w:pPr>
+            <w:r>
+              <w:t xml:space="preserve">0.017</w:t>
             </w:r>
           </w:p>
         </w:tc>
@@ -2878,19 +2751,19 @@
               <w:jc w:val="right"/>
             </w:pPr>
             <w:r>
-              <w:t xml:space="preserve">0.018</w:t>
-            </w:r>
-          </w:p>
-        </w:tc>
-        <w:tc>
-          <w:tcPr/>
-          <w:p>
-            <w:pPr>
-              <w:pStyle w:val="Compact"/>
-              <w:jc w:val="right"/>
-            </w:pPr>
-            <w:r>
-              <w:t xml:space="preserve">0.052</w:t>
+              <w:t xml:space="preserve">0.017</w:t>
+            </w:r>
+          </w:p>
+        </w:tc>
+        <w:tc>
+          <w:tcPr/>
+          <w:p>
+            <w:pPr>
+              <w:pStyle w:val="Compact"/>
+              <w:jc w:val="right"/>
+            </w:pPr>
+            <w:r>
+              <w:t xml:space="preserve">0.057</w:t>
             </w:r>
           </w:p>
         </w:tc>
@@ -2952,7 +2825,7 @@
               <w:jc w:val="right"/>
             </w:pPr>
             <w:r>
-              <w:t xml:space="preserve">0.051</w:t>
+              <w:t xml:space="preserve">0.054</w:t>
             </w:r>
           </w:p>
         </w:tc>
@@ -2963,7 +2836,7 @@
         <w:pStyle w:val="BodyText"/>
       </w:pPr>
       <w:r>
-        <w:t xml:space="preserve">Excluding 2021 produces very similar results. In the late-collapse model, the draft-rating coefficient changes from 0.141 in the all-years model to 0.137 after excluding 2021, with the p-value changing from 0.013 to 0.011. In the sustained-low model, the draft-rating coefficient changes from 0.018 to 0.017, with the p-value changing from 0.052 to 0.051. This suggests that the results are not being driven only by 2021. The separate season controls in the main model appear to account for much of the unusual behavior in disrupted seasons while still keeping all years in the primary analysis.</w:t>
+        <w:t xml:space="preserve">Excluding 2021 produces very similar results. In the late-collapse model, the draft-rating coefficient changes from 0.131 in the all-years model to 0.128 after excluding 2021, with the p-value changing from 0.02 to 0.017. In the sustained-low model, the draft-rating coefficient changes from 0.017 to 0.017, with the p-value changing from 0.057 to 0.054. This suggests that the results are not being driven only by 2021. The separate season controls in the main model appear to account for much of the unusual behavior in disrupted seasons while still keeping all years in the primary analysis.</w:t>
       </w:r>
     </w:p>
     <w:bookmarkEnd w:id="40"/>

</xml_diff>

<commit_message>
cleaned up and made into final report format
</commit_message>
<xml_diff>
--- a/final-report.docx
+++ b/final-report.docx
@@ -18,13 +18,43 @@
         <w:t xml:space="preserve">Nico L, Leo K, Colin C</w:t>
       </w:r>
     </w:p>
-    <w:bookmarkStart w:id="23" w:name="research-question"/>
+    <w:bookmarkStart w:id="20" w:name="abstract"/>
     <w:p>
       <w:pPr>
         <w:pStyle w:val="Heading2"/>
       </w:pPr>
       <w:r>
-        <w:t xml:space="preserve">Research Question</w:t>
+        <w:t xml:space="preserve">Abstract</w:t>
+      </w:r>
+    </w:p>
+    <w:p>
+      <w:pPr>
+        <w:pStyle w:val="FirstParagraph"/>
+      </w:pPr>
+      <w:r>
+        <w:t xml:space="preserve">This project studies whether stronger NBA draft classes are associated with more late-season underperformance among teams with weak playoff outlooks. Using NBA team game logs from 2010 through 2026 and CraftedNBA draft prospect ratings, we build a team-season dataset that compares each team’s performance before March 1 to its performance after March 1. As the project developed, we moved away from a simple binary definition of tanking and instead used a standardized</w:t>
+      </w:r>
+      <w:r>
+        <w:t xml:space="preserve"> </w:t>
+      </w:r>
+      <w:r>
+        <w:rPr>
+          <w:rStyle w:val="VerbatimChar"/>
+        </w:rPr>
+        <w:t xml:space="preserve">tanking_index</w:t>
+      </w:r>
+      <w:r>
+        <w:t xml:space="preserve">, which measures how many fewer games a team won late in the season than expected from its pre-March record. We also changed the draft-strength measure from a broad top-35 average to the average rating of the top four prospects, because lottery incentives are most directly tied to access to the top of the draft. The main result is suggestive rather than conclusive: likely lottery teams with larger position-adjusted draft incentives tend to have larger late-season win shortfalls, but the evidence is limited by the fact that draft quality varies mostly by season and tanking intent is not directly observable.</w:t>
+      </w:r>
+    </w:p>
+    <w:bookmarkEnd w:id="20"/>
+    <w:bookmarkStart w:id="21" w:name="i.-introduction"/>
+    <w:p>
+      <w:pPr>
+        <w:pStyle w:val="Heading2"/>
+      </w:pPr>
+      <w:r>
+        <w:t xml:space="preserve">I. Introduction</w:t>
       </w:r>
     </w:p>
     <w:p>
@@ -50,6 +80,48 @@
         <w:pStyle w:val="BodyText"/>
       </w:pPr>
       <w:r>
+        <w:t xml:space="preserve">The original project proposal focused broadly on whether stronger draft classes create stronger incentives for NBA teams to tank. As we looked more closely at the data, the question became more specific in three ways. First, we stopped treating tanking as something we could directly observe. Instead, we measure late-season underperformance among teams with weak postseason outlooks. Second, we changed the draft-strength measure to focus on the top four prospects rather than the average quality of a much larger prospect group, since the NBA lottery primarily gives teams access to the very top of the draft. Third, we made the incentive team-specific by combining top-four draft strength with each team’s estimated lottery position entering March. This matters because the same draft class does not create the same incentive for every team.</w:t>
+      </w:r>
+    </w:p>
+    <w:p>
+      <w:pPr>
+        <w:pStyle w:val="BodyText"/>
+      </w:pPr>
+      <w:r>
+        <w:t xml:space="preserve">This framing gives us a more careful final research question:</w:t>
+      </w:r>
+      <w:r>
+        <w:t xml:space="preserve"> </w:t>
+      </w:r>
+      <w:r>
+        <w:rPr>
+          <w:b/>
+          <w:bCs/>
+        </w:rPr>
+        <w:t xml:space="preserve">among likely lottery teams, are stronger top-end draft classes associated with larger late-season win shortfalls after accounting for each team’s lottery position and pre-March strength?</w:t>
+      </w:r>
+      <w:r>
+        <w:t xml:space="preserve"> </w:t>
+      </w:r>
+      <w:r>
+        <w:t xml:space="preserve">The answer matters because tanking debates often focus on lottery odds alone, while the value of losing should also depend on the players available in that draft.</w:t>
+      </w:r>
+    </w:p>
+    <w:bookmarkEnd w:id="21"/>
+    <w:bookmarkStart w:id="26" w:name="ii.-background"/>
+    <w:p>
+      <w:pPr>
+        <w:pStyle w:val="Heading2"/>
+      </w:pPr>
+      <w:r>
+        <w:t xml:space="preserve">II. Background</w:t>
+      </w:r>
+    </w:p>
+    <w:p>
+      <w:pPr>
+        <w:pStyle w:val="FirstParagraph"/>
+      </w:pPr>
+      <w:r>
         <w:t xml:space="preserve">This question is about incentives, but our data cannot directly observe intent. We therefore measure</w:t>
       </w:r>
       <w:r>
@@ -71,49 +143,7 @@
         <w:pStyle w:val="BodyText"/>
       </w:pPr>
       <w:r>
-        <w:t xml:space="preserve">Prior research has studied tanking as a response to draft lottery incentives.</w:t>
-      </w:r>
-      <w:r>
-        <w:t xml:space="preserve"> </w:t>
-      </w:r>
-      <w:hyperlink r:id="rId20">
-        <w:r>
-          <w:rPr>
-            <w:rStyle w:val="Hyperlink"/>
-          </w:rPr>
-          <w:t xml:space="preserve">Taylor and Trogdon (2002)</w:t>
-        </w:r>
-      </w:hyperlink>
-      <w:r>
-        <w:t xml:space="preserve"> </w:t>
-      </w:r>
-      <w:r>
-        <w:t xml:space="preserve">and</w:t>
-      </w:r>
-      <w:r>
-        <w:t xml:space="preserve"> </w:t>
-      </w:r>
-      <w:hyperlink r:id="rId21">
-        <w:r>
-          <w:rPr>
-            <w:rStyle w:val="Hyperlink"/>
-          </w:rPr>
-          <w:t xml:space="preserve">Price et al. (2010)</w:t>
-        </w:r>
-      </w:hyperlink>
-      <w:r>
-        <w:t xml:space="preserve"> </w:t>
-      </w:r>
-      <w:r>
-        <w:t xml:space="preserve">examine whether NBA teams lose more often when the reward for losing is larger. Our project builds on that idea by adding a second source of incentive: the quality of the incoming draft class. Instead of treating every draft as equally valuable, we ask whether likely lottery teams appear to underperform more when the player pool at the top of the draft is stronger and when their lottery position makes additional losses more valuable.</w:t>
-      </w:r>
-    </w:p>
-    <w:p>
-      <w:pPr>
-        <w:pStyle w:val="BodyText"/>
-      </w:pPr>
-      <w:r>
-        <w:t xml:space="preserve">The</w:t>
+        <w:t xml:space="preserve">The NBA draft lottery determines which non-playoff teams receive the first picks in the draft. Worse teams generally receive better lottery odds, which creates the basic incentive problem: a team that is unlikely to make the playoffs may benefit from losing more late-season games if doing so improves its draft position. The</w:t>
       </w:r>
       <w:r>
         <w:t xml:space="preserve"> </w:t>
@@ -127,17 +157,73 @@
         </w:r>
       </w:hyperlink>
       <w:r>
-        <w:t xml:space="preserve">, which is useful background for interpreting the modern seasons. The final model below pools all years from 2010 through 2026 rather than estimating separate pre-reform and post-reform slopes, but it still uses the correct pre- and post-reform lottery odds when building the team-specific incentive variable.</w:t>
-      </w:r>
-    </w:p>
-    <w:bookmarkEnd w:id="23"/>
-    <w:bookmarkStart w:id="27" w:name="dataset"/>
+        <w:t xml:space="preserve">, flattening the odds at the top. Under the</w:t>
+      </w:r>
+      <w:r>
+        <w:t xml:space="preserve"> </w:t>
+      </w:r>
+      <w:hyperlink r:id="rId23">
+        <w:r>
+          <w:rPr>
+            <w:rStyle w:val="Hyperlink"/>
+          </w:rPr>
+          <w:t xml:space="preserve">current format</w:t>
+        </w:r>
+      </w:hyperlink>
+      <w:r>
+        <w:t xml:space="preserve">, the three worst teams each have a 14.0% chance at the first pick, while other lottery teams receive lower odds. The modern lottery determines the first four picks, which is why our preferred draft-strength measure focuses on the average quality of the top four prospects rather than the full draft class.</w:t>
+      </w:r>
+    </w:p>
+    <w:p>
+      <w:pPr>
+        <w:pStyle w:val="BodyText"/>
+      </w:pPr>
+      <w:r>
+        <w:t xml:space="preserve">Prior research has studied tanking as a response to draft lottery incentives.</w:t>
+      </w:r>
+      <w:r>
+        <w:t xml:space="preserve"> </w:t>
+      </w:r>
+      <w:hyperlink r:id="rId24">
+        <w:r>
+          <w:rPr>
+            <w:rStyle w:val="Hyperlink"/>
+          </w:rPr>
+          <w:t xml:space="preserve">Taylor and Trogdon (2002)</w:t>
+        </w:r>
+      </w:hyperlink>
+      <w:r>
+        <w:t xml:space="preserve"> </w:t>
+      </w:r>
+      <w:r>
+        <w:t xml:space="preserve">and</w:t>
+      </w:r>
+      <w:r>
+        <w:t xml:space="preserve"> </w:t>
+      </w:r>
+      <w:hyperlink r:id="rId25">
+        <w:r>
+          <w:rPr>
+            <w:rStyle w:val="Hyperlink"/>
+          </w:rPr>
+          <w:t xml:space="preserve">Price et al. (2010)</w:t>
+        </w:r>
+      </w:hyperlink>
+      <w:r>
+        <w:t xml:space="preserve"> </w:t>
+      </w:r>
+      <w:r>
+        <w:t xml:space="preserve">examine whether NBA teams lose more often when the reward for losing is larger. Our project builds on that idea by adding a second source of incentive: the quality of the incoming draft class. Instead of treating every draft as equally valuable, we ask whether likely lottery teams appear to underperform more when the player pool at the top of the draft is stronger and when moving down in the standings would increase their chance of landing a top-four pick.</w:t>
+      </w:r>
+    </w:p>
+    <w:bookmarkEnd w:id="26"/>
+    <w:bookmarkStart w:id="29" w:name="iii.-data-gathering"/>
     <w:p>
       <w:pPr>
         <w:pStyle w:val="Heading2"/>
       </w:pPr>
       <w:r>
-        <w:t xml:space="preserve">Dataset</w:t>
+        <w:t xml:space="preserve">III. Data Gathering</w:t>
       </w:r>
     </w:p>
     <w:p>
@@ -150,7 +236,7 @@
       <w:r>
         <w:t xml:space="preserve"> </w:t>
       </w:r>
-      <w:hyperlink r:id="rId24">
+      <w:hyperlink r:id="rId27">
         <w:r>
           <w:rPr>
             <w:rStyle w:val="VerbatimChar"/>
@@ -182,7 +268,7 @@
       <w:r>
         <w:t xml:space="preserve"> </w:t>
       </w:r>
-      <w:hyperlink r:id="rId25">
+      <w:hyperlink r:id="rId28">
         <w:r>
           <w:rPr>
             <w:rStyle w:val="Hyperlink"/>
@@ -203,10 +289,10 @@
         <w:rPr>
           <w:rStyle w:val="VerbatimChar"/>
         </w:rPr>
-        <w:t xml:space="preserve">avg_rating</w:t>
-      </w:r>
-      <w:r>
-        <w:t xml:space="preserve">, the average rating of the top 35 prospects in that draft class. We also keep prospect positions, number of elite prospects, number of above-average prospects, and rating of the top prospect as alternate draft-strength information.</w:t>
+        <w:t xml:space="preserve">top4_avg_rating</w:t>
+      </w:r>
+      <w:r>
+        <w:t xml:space="preserve">, the average CraftedNBA rating of the top four prospects in that draft class. This is more closely tied to the lottery mechanism than the average of a larger prospect group because lottery teams are mostly trying to access the very top of the draft. We also keep the top-35 average rating, prospect positions, number of elite prospects, number of above-average prospects, and rating of the top prospect as alternate draft-strength information.</w:t>
       </w:r>
     </w:p>
     <w:p>
@@ -214,7 +300,7 @@
         <w:pStyle w:val="BodyText"/>
       </w:pPr>
       <w:r>
-        <w:t xml:space="preserve">The final dataset contains 510 team-seasons from 2010 through 2026. Each row is one team in one season. Raw draft quality changes only at the season level, so the analysis has 17 draft-class observations, not 510 independent draft-strength observations. To make the main incentive variable vary by team, we combine draft strength with each team’s estimated March 1 lottery position and first-pick odds. This does not fully eliminate the season-level limitation, but it better represents the fact that the same draft class creates different incentives for the worst team, the fifth-worst team, and a fringe lottery team.</w:t>
+        <w:t xml:space="preserve">The final dataset contains 510 team-seasons from 2010 through 2026. Each row is one team in one season. Raw draft quality changes only at the season level, so the analysis has 17 draft-class observations, not 510 independent draft-strength observations. To make the main incentive variable vary by team, we combine draft strength with each team’s estimated March 1 lottery position and probability of landing a top-four pick. This does not fully eliminate the season-level limitation, but it better represents the fact that the same draft class creates different incentives for the worst team, the fifth-worst team, and a fringe lottery team.</w:t>
       </w:r>
     </w:p>
     <w:p>
@@ -222,7 +308,7 @@
         <w:pStyle w:val="BodyText"/>
       </w:pPr>
       <w:r>
-        <w:t xml:space="preserve">We split each season at March 1. The pre-March portion gives a baseline estimate of team strength before the final stretch of the regular season. The March-onward portion is the window where late-season incentives are more likely to matter.</w:t>
+        <w:t xml:space="preserve">We split each season at March 1. The pre-March portion gives a baseline estimate of team strength before the final stretch of the regular season. The March-onward portion is the window where late-season incentives are more likely to matter. The main preprocessing steps were filtering to regular-season games, aggregating team records before and after March 1, ranking teams by pre-March league record to estimate lottery position, merging in draft class ratings, and constructing the late-season underperformance measures described below.</w:t>
       </w:r>
     </w:p>
     <w:p>
@@ -230,21 +316,7 @@
         <w:pStyle w:val="BodyText"/>
       </w:pPr>
       <w:r>
-        <w:t xml:space="preserve">The lottery-position adjustment uses published NBA lottery odds. The pre-reform odds give the worst team a 25.0% chance at the first pick, the second-worst team 19.9%, and the third-worst team 15.6%. Under the</w:t>
-      </w:r>
-      <w:r>
-        <w:t xml:space="preserve"> </w:t>
-      </w:r>
-      <w:hyperlink r:id="rId26">
-        <w:r>
-          <w:rPr>
-            <w:rStyle w:val="Hyperlink"/>
-          </w:rPr>
-          <w:t xml:space="preserve">post-2019 format</w:t>
-        </w:r>
-      </w:hyperlink>
-      <w:r>
-        <w:t xml:space="preserve">, the three worst teams each receive a 14.0% first-pick chance, with gradually lower odds for the rest of the lottery. We use standard lottery odds by seed rather than final lottery odds after end-of-season tiebreakers because the model is based on information available around March 1.</w:t>
+        <w:t xml:space="preserve">The lottery-position adjustment uses published NBA lottery weights. Before the 2019 reform, the lottery drew the first three picks; after the reform, it draws the first four picks. We use those weights to calculate each seed’s probability of finishing in the top four, then calculate how much that probability would rise from moving one lottery slot worse. We use standard lottery odds by seed rather than final lottery odds after end-of-season tiebreakers because the model is based on information available around March 1.</w:t>
       </w:r>
     </w:p>
     <w:p>
@@ -360,7 +432,7 @@
         <w:t xml:space="preserve">marginal_lottery_incentive</w:t>
       </w:r>
       <w:r>
-        <w:t xml:space="preserve">: a team-specific draft incentive equal to draft class rating multiplied by the increase in first-pick odds from moving one lottery slot worse. For example, if moving from the fifth-worst to fourth-worst record raises first-pick odds, that gain is larger in a stronger draft class.</w:t>
+        <w:t xml:space="preserve">: a team-specific draft incentive equal to the top-four draft class rating multiplied by the increase in probability of landing a top-four pick from moving one lottery slot worse. For example, if moving from the fifth-worst to fourth-worst record raises the probability of a top-four pick, that gain is larger in a stronger top-four draft class.</w:t>
       </w:r>
     </w:p>
     <w:p>
@@ -459,10 +531,10 @@
         <w:rPr>
           <w:rStyle w:val="VerbatimChar"/>
         </w:rPr>
-        <w:t xml:space="preserve">sustained_low_score</w:t>
-      </w:r>
-      <w:r>
-        <w:t xml:space="preserve">: a continuous sustained-tanking signal measuring how far below .500 a likely lottery team’s late-season win percentage was. This captures teams that stayed very weak late in the season, even if they did not collapse relative to their already-low pre-March baseline.</w:t>
+        <w:t xml:space="preserve">team_fit_score</w:t>
+      </w:r>
+      <w:r>
+        <w:t xml:space="preserve">: an exploratory measure of whether a team’s pre-March positional weaknesses line up with the strongest positions in that draft class. We group both teams and prospects into guards, wings, and bigs. A team gets a higher fit score when its weakest pre-March position groups match the position groups where the draft class has more high-rated prospects.</w:t>
       </w:r>
     </w:p>
     <w:p>
@@ -477,24 +549,6 @@
         <w:rPr>
           <w:rStyle w:val="VerbatimChar"/>
         </w:rPr>
-        <w:t xml:space="preserve">team_fit_score</w:t>
-      </w:r>
-      <w:r>
-        <w:t xml:space="preserve">: an exploratory measure of whether a team’s pre-March positional weaknesses line up with the strongest positions in that draft class. We group both teams and prospects into guards, wings, and bigs. A team gets a higher fit score when its weakest pre-March position groups match the position groups where the draft class has more high-rated prospects.</w:t>
-      </w:r>
-    </w:p>
-    <w:p>
-      <w:pPr>
-        <w:pStyle w:val="Compact"/>
-        <w:numPr>
-          <w:ilvl w:val="0"/>
-          <w:numId w:val="1001"/>
-        </w:numPr>
-      </w:pPr>
-      <w:r>
-        <w:rPr>
-          <w:rStyle w:val="VerbatimChar"/>
-        </w:rPr>
         <w:t xml:space="preserve">season_2012</w:t>
       </w:r>
       <w:r>
@@ -548,14 +602,22 @@
         <w:t xml:space="preserve">is the main outcome because it uses more information than a simple cutoff. For example, the 2021 Rockets were 11-21 before March, a .344 win percentage. If they had kept winning at that rate over their 40 March-onward games, they would have been expected to win about 13.8 games. They won 6, leaving a shortfall of 7.8 wins and a tanking index of 2.58. This does not prove intent, but it identifies a large late-season underperformance relative to that team’s own earlier baseline.</w:t>
       </w:r>
     </w:p>
-    <w:bookmarkEnd w:id="27"/>
-    <w:bookmarkStart w:id="43" w:name="exploratory-analysis"/>
+    <w:bookmarkEnd w:id="29"/>
+    <w:bookmarkStart w:id="45" w:name="iv.-data-analysis"/>
     <w:p>
       <w:pPr>
         <w:pStyle w:val="Heading2"/>
       </w:pPr>
       <w:r>
-        <w:t xml:space="preserve">Exploratory Analysis</w:t>
+        <w:t xml:space="preserve">IV. Data Analysis</w:t>
+      </w:r>
+    </w:p>
+    <w:p>
+      <w:pPr>
+        <w:pStyle w:val="FirstParagraph"/>
+      </w:pPr>
+      <w:r>
+        <w:t xml:space="preserve">This section tells the main descriptive story in the data before moving to regression models. The key questions are whether likely lottery teams look different from other teams, whether late-season underperformance is rare or common, and whether stronger top-end draft classes line up with larger late-season win shortfalls.</w:t>
       </w:r>
     </w:p>
     <w:p>
@@ -575,14 +637,13 @@
         <w:tblCaption w:val="Table 1. Summary statistics by lottery era and team group."/>
       </w:tblPr>
       <w:tblGrid>
-        <w:gridCol w:w="1440"/>
-        <w:gridCol w:w="1560"/>
-        <w:gridCol w:w="240"/>
-        <w:gridCol w:w="720"/>
-        <w:gridCol w:w="780"/>
-        <w:gridCol w:w="840"/>
-        <w:gridCol w:w="1140"/>
-        <w:gridCol w:w="1200"/>
+        <w:gridCol w:w="1697"/>
+        <w:gridCol w:w="1838"/>
+        <w:gridCol w:w="282"/>
+        <w:gridCol w:w="848"/>
+        <w:gridCol w:w="919"/>
+        <w:gridCol w:w="990"/>
+        <w:gridCol w:w="1343"/>
       </w:tblGrid>
       <w:tr>
         <w:trPr>
@@ -672,18 +733,6 @@
             </w:r>
           </w:p>
         </w:tc>
-        <w:tc>
-          <w:tcPr/>
-          <w:p>
-            <w:pPr>
-              <w:pStyle w:val="Compact"/>
-              <w:jc w:val="right"/>
-            </w:pPr>
-            <w:r>
-              <w:t xml:space="preserve">Low-win signal rate</w:t>
-            </w:r>
-          </w:p>
-        </w:tc>
       </w:tr>
       <w:tr>
         <w:tc>
@@ -770,18 +819,6 @@
             </w:r>
           </w:p>
         </w:tc>
-        <w:tc>
-          <w:tcPr/>
-          <w:p>
-            <w:pPr>
-              <w:pStyle w:val="Compact"/>
-              <w:jc w:val="right"/>
-            </w:pPr>
-            <w:r>
-              <w:t xml:space="preserve">0.877</w:t>
-            </w:r>
-          </w:p>
-        </w:tc>
       </w:tr>
       <w:tr>
         <w:tc>
@@ -868,18 +905,6 @@
             </w:r>
           </w:p>
         </w:tc>
-        <w:tc>
-          <w:tcPr/>
-          <w:p>
-            <w:pPr>
-              <w:pStyle w:val="Compact"/>
-              <w:jc w:val="right"/>
-            </w:pPr>
-            <w:r>
-              <w:t xml:space="preserve">0.000</w:t>
-            </w:r>
-          </w:p>
-        </w:tc>
       </w:tr>
       <w:tr>
         <w:tc>
@@ -966,18 +991,6 @@
             </w:r>
           </w:p>
         </w:tc>
-        <w:tc>
-          <w:tcPr/>
-          <w:p>
-            <w:pPr>
-              <w:pStyle w:val="Compact"/>
-              <w:jc w:val="right"/>
-            </w:pPr>
-            <w:r>
-              <w:t xml:space="preserve">0.892</w:t>
-            </w:r>
-          </w:p>
-        </w:tc>
       </w:tr>
       <w:tr>
         <w:tc>
@@ -1064,18 +1077,6 @@
             </w:r>
           </w:p>
         </w:tc>
-        <w:tc>
-          <w:tcPr/>
-          <w:p>
-            <w:pPr>
-              <w:pStyle w:val="Compact"/>
-              <w:jc w:val="right"/>
-            </w:pPr>
-            <w:r>
-              <w:t xml:space="preserve">0.000</w:t>
-            </w:r>
-          </w:p>
-        </w:tc>
       </w:tr>
     </w:tbl>
     <w:p>
@@ -1083,7 +1084,19 @@
         <w:pStyle w:val="BodyText"/>
       </w:pPr>
       <w:r>
-        <w:t xml:space="preserve">Table 1 shows that likely lottery candidates are much weaker than other teams before March, as expected. The average win percentage change from pre-March to late season is small in both eras, which suggests that most weak teams do not suddenly collapse late in the year. The conservative late-collapse proxy appears in only 21 of 175 likely-candidate seasons, so our binary proxy is intentionally strict. The sustained low-win signal is much more common because many likely lottery teams are bad before March and remain bad afterward.</w:t>
+        <w:t xml:space="preserve">Table 1 shows that likely lottery candidates are much weaker than other teams before March, as expected. The average win percentage change from pre-March to late season is small in both eras, which suggests that most weak teams do not suddenly collapse late in the year. The conservative late-collapse proxy appears in only 21 of 175 likely-candidate seasons, so our binary proxy is intentionally strict. The final regression therefore relies on the full</w:t>
+      </w:r>
+      <w:r>
+        <w:t xml:space="preserve"> </w:t>
+      </w:r>
+      <w:r>
+        <w:rPr>
+          <w:rStyle w:val="VerbatimChar"/>
+        </w:rPr>
+        <w:t xml:space="preserve">tanking_index</w:t>
+      </w:r>
+      <w:r>
+        <w:t xml:space="preserve">, which measures degree of late-season underperformance instead of only flagging extreme cases.</w:t>
       </w:r>
     </w:p>
     <w:p>
@@ -1095,18 +1108,18 @@
           <wp:inline>
             <wp:extent cx="5334000" cy="3333750"/>
             <wp:effectExtent b="0" l="0" r="0" t="0"/>
-            <wp:docPr descr="Figure 1. Late-season performance compared with pre-March performance. Each point is one team-season from 2010 through 2026. The dashed line shows equal pre-March and March-onward win percentages. Triangles are likely lottery candidates. Red points are conservative late-collapse proxy seasons, orange points are sustained low-win signal seasons, and blue points are all other team-seasons. Labels identify the largest late-collapse proxy seasons." title="" id="29" name="Picture"/>
+            <wp:docPr descr="Figure 1. Late-season performance compared with pre-March performance. Each point is one team-season from 2010 through 2026. The dashed line shows equal pre-March and March-onward win percentages. Triangles are likely lottery candidates. Red points are conservative late-collapse proxy seasons, and blue points are all other team-seasons. Labels identify the largest late-collapse proxy seasons." title="" id="31" name="Picture"/>
             <a:graphic>
               <a:graphicData uri="http://schemas.openxmlformats.org/drawingml/2006/picture">
                 <pic:pic>
                   <pic:nvPicPr>
-                    <pic:cNvPr descr="final-report_files/figure-docx/visual-expected-vs-actual-1.png" id="30" name="Picture"/>
+                    <pic:cNvPr descr="final-report_files/figure-docx/visual-expected-vs-actual-1.png" id="32" name="Picture"/>
                     <pic:cNvPicPr>
                       <a:picLocks noChangeArrowheads="1" noChangeAspect="1"/>
                     </pic:cNvPicPr>
                   </pic:nvPicPr>
                   <pic:blipFill>
-                    <a:blip r:embed="rId28"/>
+                    <a:blip r:embed="rId30"/>
                     <a:stretch>
                       <a:fillRect/>
                     </a:stretch>
@@ -1138,7 +1151,7 @@
         <w:pStyle w:val="ImageCaption"/>
       </w:pPr>
       <w:r>
-        <w:t xml:space="preserve">Figure 1. Late-season performance compared with pre-March performance. Each point is one team-season from 2010 through 2026. The dashed line shows equal pre-March and March-onward win percentages. Triangles are likely lottery candidates. Red points are conservative late-collapse proxy seasons, orange points are sustained low-win signal seasons, and blue points are all other team-seasons. Labels identify the largest late-collapse proxy seasons.</w:t>
+        <w:t xml:space="preserve">Figure 1. Late-season performance compared with pre-March performance. Each point is one team-season from 2010 through 2026. The dashed line shows equal pre-March and March-onward win percentages. Triangles are likely lottery candidates. Red points are conservative late-collapse proxy seasons, and blue points are all other team-seasons. Labels identify the largest late-collapse proxy seasons.</w:t>
       </w:r>
     </w:p>
     <w:p>
@@ -1146,7 +1159,22 @@
         <w:pStyle w:val="BodyText"/>
       </w:pPr>
       <w:r>
-        <w:t xml:space="preserve">Figure 1 shows that most teams cluster near the diagonal, meaning their late-season winning percentage was similar to their pre-March winning percentage. The likely lottery candidates mostly appear in the lower-left portion of the graph, which confirms that the candidate definition is identifying weaker teams. The red points are rarer and more extreme: they are teams that were not only bad, but substantially worse late in the season than their earlier record would predict. The orange points address an important weakness of the original binary proxy: some teams do not sharply collapse because they were already near the bottom, but their continued low-win performance may still be relevant to tanking incentives.</w:t>
+        <w:t xml:space="preserve">Figure 1 shows that most teams cluster near the diagonal, meaning their late-season winning percentage was similar to their pre-March winning percentage. The likely lottery candidates mostly appear in the lower-left portion of the graph, which confirms that the candidate definition is identifying weaker teams. The red points are rarer and more extreme: they are teams that were not only bad, but substantially worse late in the season than their earlier record would predict. Because the red proxy is intentionally strict, the regression below uses the full</w:t>
+      </w:r>
+      <w:r>
+        <w:t xml:space="preserve"> </w:t>
+      </w:r>
+      <w:r>
+        <w:rPr>
+          <w:rStyle w:val="VerbatimChar"/>
+        </w:rPr>
+        <w:t xml:space="preserve">tanking_index</w:t>
+      </w:r>
+      <w:r>
+        <w:t xml:space="preserve"> </w:t>
+      </w:r>
+      <w:r>
+        <w:t xml:space="preserve">rather than treating the red points as the only relevant cases.</w:t>
       </w:r>
     </w:p>
     <w:p>
@@ -1158,18 +1186,18 @@
           <wp:inline>
             <wp:extent cx="5334000" cy="3333750"/>
             <wp:effectExtent b="0" l="0" r="0" t="0"/>
-            <wp:docPr descr="Figure 2. Draft strength and average late-season underperformance among likely lottery candidates. Each point is one NBA season. The x-axis is the CraftedNBA average draft class rating, the y-axis is the mean tanking index among likely lottery candidates, and point size is the number of conservative late-collapse proxy team-seasons in that year. Fitted lines are descriptive and are shown separately for the pre-reform and post-reform lottery eras." title="" id="32" name="Picture"/>
+            <wp:docPr descr="Figure 2. Top-four draft strength and average late-season underperformance among likely lottery candidates. Each point is one NBA season. The x-axis is the CraftedNBA average rating of the top four prospects, the y-axis is the mean tanking index among likely lottery candidates, and point size is the number of conservative late-collapse proxy team-seasons in that year. Fitted lines are descriptive and are shown separately for the pre-reform and post-reform lottery eras." title="" id="34" name="Picture"/>
             <a:graphic>
               <a:graphicData uri="http://schemas.openxmlformats.org/drawingml/2006/picture">
                 <pic:pic>
                   <pic:nvPicPr>
-                    <pic:cNvPr descr="final-report_files/figure-docx/visual-draft-strength-1.png" id="33" name="Picture"/>
+                    <pic:cNvPr descr="final-report_files/figure-docx/visual-draft-strength-1.png" id="35" name="Picture"/>
                     <pic:cNvPicPr>
                       <a:picLocks noChangeArrowheads="1" noChangeAspect="1"/>
                     </pic:cNvPicPr>
                   </pic:nvPicPr>
                   <pic:blipFill>
-                    <a:blip r:embed="rId31"/>
+                    <a:blip r:embed="rId33"/>
                     <a:stretch>
                       <a:fillRect/>
                     </a:stretch>
@@ -1201,7 +1229,7 @@
         <w:pStyle w:val="ImageCaption"/>
       </w:pPr>
       <w:r>
-        <w:t xml:space="preserve">Figure 2. Draft strength and average late-season underperformance among likely lottery candidates. Each point is one NBA season. The x-axis is the CraftedNBA average draft class rating, the y-axis is the mean tanking index among likely lottery candidates, and point size is the number of conservative late-collapse proxy team-seasons in that year. Fitted lines are descriptive and are shown separately for the pre-reform and post-reform lottery eras.</w:t>
+        <w:t xml:space="preserve">Figure 2. Top-four draft strength and average late-season underperformance among likely lottery candidates. Each point is one NBA season. The x-axis is the CraftedNBA average rating of the top four prospects, the y-axis is the mean tanking index among likely lottery candidates, and point size is the number of conservative late-collapse proxy team-seasons in that year. Fitted lines are descriptive and are shown separately for the pre-reform and post-reform lottery eras.</w:t>
       </w:r>
     </w:p>
     <w:p>
@@ -1229,18 +1257,18 @@
           <wp:inline>
             <wp:extent cx="5334000" cy="3597671"/>
             <wp:effectExtent b="0" l="0" r="0" t="0"/>
-            <wp:docPr descr="Figure 3. Team-season observations for draft strength and late-season underperformance among likely lottery candidates. Each point is one likely lottery team-season. The x-axis is jittered slightly because every team in the same season has the same draft class rating. Color shows season, shape shows lottery era, and the black diamonds show the season-level averages from Figure 2." title="" id="35" name="Picture"/>
+            <wp:docPr descr="Figure 3. Team-season observations for top-four draft strength and late-season underperformance among likely lottery candidates. Each point is one likely lottery team-season. The x-axis is jittered slightly because every team in the same season has the same top-four draft rating. Color shows season, shape shows lottery era, and the black diamonds show the season-level averages from Figure 2." title="" id="37" name="Picture"/>
             <a:graphic>
               <a:graphicData uri="http://schemas.openxmlformats.org/drawingml/2006/picture">
                 <pic:pic>
                   <pic:nvPicPr>
-                    <pic:cNvPr descr="final-report_files/figure-docx/visual-team-season-observations-1.png" id="36" name="Picture"/>
+                    <pic:cNvPr descr="final-report_files/figure-docx/visual-team-season-observations-1.png" id="38" name="Picture"/>
                     <pic:cNvPicPr>
                       <a:picLocks noChangeArrowheads="1" noChangeAspect="1"/>
                     </pic:cNvPicPr>
                   </pic:nvPicPr>
                   <pic:blipFill>
-                    <a:blip r:embed="rId34"/>
+                    <a:blip r:embed="rId36"/>
                     <a:stretch>
                       <a:fillRect/>
                     </a:stretch>
@@ -1272,7 +1300,7 @@
         <w:pStyle w:val="ImageCaption"/>
       </w:pPr>
       <w:r>
-        <w:t xml:space="preserve">Figure 3. Team-season observations for draft strength and late-season underperformance among likely lottery candidates. Each point is one likely lottery team-season. The x-axis is jittered slightly because every team in the same season has the same draft class rating. Color shows season, shape shows lottery era, and the black diamonds show the season-level averages from Figure 2.</w:t>
+        <w:t xml:space="preserve">Figure 3. Team-season observations for top-four draft strength and late-season underperformance among likely lottery candidates. Each point is one likely lottery team-season. The x-axis is jittered slightly because every team in the same season has the same top-four draft rating. Color shows season, shape shows lottery era, and the black diamonds show the season-level averages from Figure 2.</w:t>
       </w:r>
     </w:p>
     <w:p>
@@ -1280,7 +1308,7 @@
         <w:pStyle w:val="BodyText"/>
       </w:pPr>
       <w:r>
-        <w:t xml:space="preserve">Figure 3 makes the observational unit clearer. Each point is a team-season, while the black diamonds are the season averages used in Figure 2. The vertical stacks show why the season-level summary can hide variation: teams in the same draft year share the same draft rating, but their tanking-index values differ widely.</w:t>
+        <w:t xml:space="preserve">Figure 3 makes the observational unit clearer. Each point is a team-season, while the black diamonds are the season averages used in Figure 2. The vertical stacks show why the season-level summary can hide variation: teams in the same draft year share the same top-four draft rating, but their tanking-index values differ widely.</w:t>
       </w:r>
     </w:p>
     <w:p>
@@ -1292,18 +1320,18 @@
           <wp:inline>
             <wp:extent cx="5334000" cy="3597671"/>
             <wp:effectExtent b="0" l="0" r="0" t="0"/>
-            <wp:docPr descr="Figure 4. Draft strength compared with two tanking-signal outcomes among likely lottery candidates. The tanking-index panel measures standardized March-onward win shortfall, where positive values mean teams won fewer games than expected. The sustained-low panel measures whether likely lottery teams remained far below .500 after March. Each point is one season, and fitted lines are descriptive." title="" id="38" name="Picture"/>
+            <wp:docPr descr="Figure 4. Comparing broad and top-four draft-strength measures. Each point is one NBA draft class from 2010 through 2026. The x-axis is the top-35 average rating, the y-axis is the top-four average rating, and color shows the mean tanking index among likely lottery candidates in that season." title="" id="40" name="Picture"/>
             <a:graphic>
               <a:graphicData uri="http://schemas.openxmlformats.org/drawingml/2006/picture">
                 <pic:pic>
                   <pic:nvPicPr>
-                    <pic:cNvPr descr="final-report_files/figure-docx/visual-two-signals-1.png" id="39" name="Picture"/>
+                    <pic:cNvPr descr="final-report_files/figure-docx/visual-draft-rating-comparison-1.png" id="41" name="Picture"/>
                     <pic:cNvPicPr>
                       <a:picLocks noChangeArrowheads="1" noChangeAspect="1"/>
                     </pic:cNvPicPr>
                   </pic:nvPicPr>
                   <pic:blipFill>
-                    <a:blip r:embed="rId37"/>
+                    <a:blip r:embed="rId39"/>
                     <a:stretch>
                       <a:fillRect/>
                     </a:stretch>
@@ -1335,7 +1363,7 @@
         <w:pStyle w:val="ImageCaption"/>
       </w:pPr>
       <w:r>
-        <w:t xml:space="preserve">Figure 4. Draft strength compared with two tanking-signal outcomes among likely lottery candidates. The tanking-index panel measures standardized March-onward win shortfall, where positive values mean teams won fewer games than expected. The sustained-low panel measures whether likely lottery teams remained far below .500 after March. Each point is one season, and fitted lines are descriptive.</w:t>
+        <w:t xml:space="preserve">Figure 4. Comparing broad and top-four draft-strength measures. Each point is one NBA draft class from 2010 through 2026. The x-axis is the top-35 average rating, the y-axis is the top-four average rating, and color shows the mean tanking index among likely lottery candidates in that season.</w:t>
       </w:r>
     </w:p>
     <w:p>
@@ -1343,7 +1371,7 @@
         <w:pStyle w:val="BodyText"/>
       </w:pPr>
       <w:r>
-        <w:t xml:space="preserve">Figure 4 helps explain why Figure 2 can look counterintuitive. The tanking-index outcome compares late-season wins to what we would expect from the team’s own pre-March record, so teams that overperform late count as negative evidence rather than being ignored. The sustained-low outcome captures a second pattern by asking whether likely lottery teams remained far below .500 late in the season. The evidence is still limited, but the two-signal version better matches the basketball story than a single hard cutoff.</w:t>
+        <w:t xml:space="preserve">Figure 4 shows why the top-four measure is useful. It is related to the broader top-35 class rating, but it is not identical. The top-four measure focuses on the players lottery teams are most realistically trying to access, so it is more directly tied to the incentive mechanism than the average quality of the full top 35.</w:t>
       </w:r>
     </w:p>
     <w:p>
@@ -1355,18 +1383,18 @@
           <wp:inline>
             <wp:extent cx="5334000" cy="3597671"/>
             <wp:effectExtent b="0" l="0" r="0" t="0"/>
-            <wp:docPr descr="Figure 5. Position-adjusted draft incentive and tanking signals among likely lottery candidates. Each point is one team-season. The x-axis combines draft class rating with the marginal first-pick odds gained by moving one lottery slot worse, so teams in the same draft year can have different incentive values depending on their lottery position entering March." title="" id="41" name="Picture"/>
+            <wp:docPr descr="Figure 5. Position-adjusted draft incentive and tanking index among likely lottery candidates. Each point is one team-season. The x-axis combines top-four draft class rating with the marginal gain in top-four-pick probability from moving one lottery slot worse. Zero-incentive points are nudged slightly to the right only to reveal overlapping observations; the fitted line and regression models use the exact, unnudged incentive values." title="" id="43" name="Picture"/>
             <a:graphic>
               <a:graphicData uri="http://schemas.openxmlformats.org/drawingml/2006/picture">
                 <pic:pic>
                   <pic:nvPicPr>
-                    <pic:cNvPr descr="final-report_files/figure-docx/visual-position-adjusted-incentive-1.png" id="42" name="Picture"/>
+                    <pic:cNvPr descr="final-report_files/figure-docx/visual-position-adjusted-incentive-1.png" id="44" name="Picture"/>
                     <pic:cNvPicPr>
                       <a:picLocks noChangeArrowheads="1" noChangeAspect="1"/>
                     </pic:cNvPicPr>
                   </pic:nvPicPr>
                   <pic:blipFill>
-                    <a:blip r:embed="rId40"/>
+                    <a:blip r:embed="rId42"/>
                     <a:stretch>
                       <a:fillRect/>
                     </a:stretch>
@@ -1398,7 +1426,7 @@
         <w:pStyle w:val="ImageCaption"/>
       </w:pPr>
       <w:r>
-        <w:t xml:space="preserve">Figure 5. Position-adjusted draft incentive and tanking signals among likely lottery candidates. Each point is one team-season. The x-axis combines draft class rating with the marginal first-pick odds gained by moving one lottery slot worse, so teams in the same draft year can have different incentive values depending on their lottery position entering March.</w:t>
+        <w:t xml:space="preserve">Figure 5. Position-adjusted draft incentive and tanking index among likely lottery candidates. Each point is one team-season. The x-axis combines top-four draft class rating with the marginal gain in top-four-pick probability from moving one lottery slot worse. Zero-incentive points are nudged slightly to the right only to reveal overlapping observations; the fitted line and regression models use the exact, unnudged incentive values.</w:t>
       </w:r>
     </w:p>
     <w:p>
@@ -1406,17 +1434,17 @@
         <w:pStyle w:val="BodyText"/>
       </w:pPr>
       <w:r>
-        <w:t xml:space="preserve">Figure 5 directly addresses the concern that a draft class has the same rating for every team in the same year. The raw draft rating is still season-level, but the position-adjusted incentive varies by team because different lottery positions have different first-pick odds and different marginal gains from moving down in the standings. The relationship is noisier than the season-average figures, which is expected: the outcome is still affected by injuries, trades, resting, and random late-season variation. However, this figure is closer to the actual mechanism we care about, because it asks whether teams with more to gain from a stronger draft class show larger losing signals.</w:t>
-      </w:r>
-    </w:p>
-    <w:bookmarkEnd w:id="43"/>
-    <w:bookmarkStart w:id="44" w:name="modeling-results"/>
+        <w:t xml:space="preserve">Figure 5 directly addresses the concern that a draft class has the same top-four rating for every team in the same year. The raw top-four draft rating is still season-level, but the position-adjusted incentive varies by team because different lottery positions have different marginal rewards for moving down in the standings. Observations at zero are meaningful: they are teams that would not gain additional top-four-pick probability by moving one slot worse, such as the worst team. We nudge the plotted zero points slightly so those overlapping observations are visible, but the model still uses the exact values. The relationship is noisier than the season-average figures, which is expected: the outcome is still affected by injuries, trades, resting, and random late-season variation.</w:t>
+      </w:r>
+    </w:p>
+    <w:bookmarkEnd w:id="45"/>
+    <w:bookmarkStart w:id="53" w:name="v.-formal-analysis"/>
     <w:p>
       <w:pPr>
         <w:pStyle w:val="Heading2"/>
       </w:pPr>
       <w:r>
-        <w:t xml:space="preserve">Modeling Results</w:t>
+        <w:t xml:space="preserve">V. Formal Analysis</w:t>
       </w:r>
     </w:p>
     <w:p>
@@ -1424,7 +1452,7 @@
         <w:pStyle w:val="FirstParagraph"/>
       </w:pPr>
       <w:r>
-        <w:t xml:space="preserve">Our models are limited to likely lottery candidates because those are the teams with the clearest incentive to lose late-season games. To avoid making the results depend on an arbitrary 10 percentage point cutoff, the primary outcome is the full</w:t>
+        <w:t xml:space="preserve">The formal analysis uses likely lottery candidates only, because those are the teams with the clearest incentive to lose late-season games. To avoid making the results depend on an arbitrary 10 percentage point cutoff, the outcome is the full</w:t>
       </w:r>
       <w:r>
         <w:t xml:space="preserve"> </w:t>
@@ -1436,22 +1464,7 @@
         <w:t xml:space="preserve">tanking_index</w:t>
       </w:r>
       <w:r>
-        <w:t xml:space="preserve">. This is a standardized late-season win shortfall: positive values mean a team won fewer March-onward games than expected from its pre-March record, while negative values mean it overperformed late. We also keep</w:t>
-      </w:r>
-      <w:r>
-        <w:t xml:space="preserve"> </w:t>
-      </w:r>
-      <w:r>
-        <w:rPr>
-          <w:rStyle w:val="VerbatimChar"/>
-        </w:rPr>
-        <w:t xml:space="preserve">sustained_low_score</w:t>
-      </w:r>
-      <w:r>
-        <w:t xml:space="preserve"> </w:t>
-      </w:r>
-      <w:r>
-        <w:t xml:space="preserve">as a secondary outcome for teams that stayed far below .500 after March even if they were already weak before March.</w:t>
+        <w:t xml:space="preserve">. This is a standardized late-season win shortfall: positive values mean a team won fewer March-onward games than expected from its pre-March record, while negative values mean it overperformed late.</w:t>
       </w:r>
     </w:p>
     <w:p>
@@ -1459,7 +1472,16 @@
         <w:pStyle w:val="BodyText"/>
       </w:pPr>
       <w:r>
-        <w:t xml:space="preserve">In the final models, the key coefficient is the standardized position-adjusted draft incentive. It asks whether teams with larger marginal lottery rewards in stronger draft classes have larger tanking signals after controlling for pre-March team strength and separate indicators for the disrupted 2012, 2020, and 2021 seasons.</w:t>
+        <w:t xml:space="preserve">The final model’s key coefficient is the standardized position-adjusted draft incentive. It asks whether teams with larger marginal lottery rewards in stronger top-four draft classes have larger tanking signals after controlling for pre-March team strength and separate indicators for the disrupted 2012, 2020, and 2021 seasons. We also include two follow-up checks: whether the relationship changed after the 2019 lottery reform, and whether a team’s roster fit with the draft class adds explanatory power.</w:t>
+      </w:r>
+    </w:p>
+    <w:bookmarkStart w:id="46" w:name="analysis-1-prepost-reform-interaction"/>
+    <w:p>
+      <w:pPr>
+        <w:pStyle w:val="Heading3"/>
+      </w:pPr>
+      <w:r>
+        <w:t xml:space="preserve">Analysis 1: Pre/Post Reform Interaction</w:t>
       </w:r>
     </w:p>
     <w:p>
@@ -1557,31 +1579,31 @@
               <w:jc w:val="left"/>
             </w:pPr>
             <w:r>
-              <w:t xml:space="preserve">Draft rating</w:t>
-            </w:r>
-          </w:p>
-        </w:tc>
-        <w:tc>
-          <w:tcPr/>
-          <w:p>
-            <w:pPr>
-              <w:pStyle w:val="Compact"/>
-              <w:jc w:val="right"/>
-            </w:pPr>
-            <w:r>
-              <w:t xml:space="preserve">-0.129</w:t>
-            </w:r>
-          </w:p>
-        </w:tc>
-        <w:tc>
-          <w:tcPr/>
-          <w:p>
-            <w:pPr>
-              <w:pStyle w:val="Compact"/>
-              <w:jc w:val="right"/>
-            </w:pPr>
-            <w:r>
-              <w:t xml:space="preserve">0.678</w:t>
+              <w:t xml:space="preserve">Top-four draft rating</w:t>
+            </w:r>
+          </w:p>
+        </w:tc>
+        <w:tc>
+          <w:tcPr/>
+          <w:p>
+            <w:pPr>
+              <w:pStyle w:val="Compact"/>
+              <w:jc w:val="right"/>
+            </w:pPr>
+            <w:r>
+              <w:t xml:space="preserve">0.077</w:t>
+            </w:r>
+          </w:p>
+        </w:tc>
+        <w:tc>
+          <w:tcPr/>
+          <w:p>
+            <w:pPr>
+              <w:pStyle w:val="Compact"/>
+              <w:jc w:val="right"/>
+            </w:pPr>
+            <w:r>
+              <w:t xml:space="preserve">0.539</w:t>
             </w:r>
           </w:p>
         </w:tc>
@@ -1619,19 +1641,19 @@
               <w:jc w:val="right"/>
             </w:pPr>
             <w:r>
-              <w:t xml:space="preserve">0.090</w:t>
-            </w:r>
-          </w:p>
-        </w:tc>
-        <w:tc>
-          <w:tcPr/>
-          <w:p>
-            <w:pPr>
-              <w:pStyle w:val="Compact"/>
-              <w:jc w:val="right"/>
-            </w:pPr>
-            <w:r>
-              <w:t xml:space="preserve">0.690</w:t>
+              <w:t xml:space="preserve">0.101</w:t>
+            </w:r>
+          </w:p>
+        </w:tc>
+        <w:tc>
+          <w:tcPr/>
+          <w:p>
+            <w:pPr>
+              <w:pStyle w:val="Compact"/>
+              <w:jc w:val="right"/>
+            </w:pPr>
+            <w:r>
+              <w:t xml:space="preserve">0.657</w:t>
             </w:r>
           </w:p>
         </w:tc>
@@ -1657,181 +1679,31 @@
               <w:jc w:val="left"/>
             </w:pPr>
             <w:r>
-              <w:t xml:space="preserve">Draft rating x post-2019</w:t>
-            </w:r>
-          </w:p>
-        </w:tc>
-        <w:tc>
-          <w:tcPr/>
-          <w:p>
-            <w:pPr>
-              <w:pStyle w:val="Compact"/>
-              <w:jc w:val="right"/>
-            </w:pPr>
-            <w:r>
-              <w:t xml:space="preserve">0.365</w:t>
-            </w:r>
-          </w:p>
-        </w:tc>
-        <w:tc>
-          <w:tcPr/>
-          <w:p>
-            <w:pPr>
-              <w:pStyle w:val="Compact"/>
-              <w:jc w:val="right"/>
-            </w:pPr>
-            <w:r>
-              <w:t xml:space="preserve">0.269</w:t>
-            </w:r>
-          </w:p>
-        </w:tc>
-      </w:tr>
-      <w:tr>
-        <w:tc>
-          <w:tcPr/>
-          <w:p>
-            <w:pPr>
-              <w:pStyle w:val="Compact"/>
-              <w:jc w:val="left"/>
-            </w:pPr>
-            <w:r>
-              <w:t xml:space="preserve">Sustained-low</w:t>
-            </w:r>
-          </w:p>
-        </w:tc>
-        <w:tc>
-          <w:tcPr/>
-          <w:p>
-            <w:pPr>
-              <w:pStyle w:val="Compact"/>
-              <w:jc w:val="left"/>
-            </w:pPr>
-            <w:r>
-              <w:t xml:space="preserve">Draft rating</w:t>
-            </w:r>
-          </w:p>
-        </w:tc>
-        <w:tc>
-          <w:tcPr/>
-          <w:p>
-            <w:pPr>
-              <w:pStyle w:val="Compact"/>
-              <w:jc w:val="right"/>
-            </w:pPr>
-            <w:r>
-              <w:t xml:space="preserve">-0.008</w:t>
-            </w:r>
-          </w:p>
-        </w:tc>
-        <w:tc>
-          <w:tcPr/>
-          <w:p>
-            <w:pPr>
-              <w:pStyle w:val="Compact"/>
-              <w:jc w:val="right"/>
-            </w:pPr>
-            <w:r>
-              <w:t xml:space="preserve">0.759</w:t>
-            </w:r>
-          </w:p>
-        </w:tc>
-      </w:tr>
-      <w:tr>
-        <w:tc>
-          <w:tcPr/>
-          <w:p>
-            <w:pPr>
-              <w:pStyle w:val="Compact"/>
-              <w:jc w:val="left"/>
-            </w:pPr>
-            <w:r>
-              <w:t xml:space="preserve">Sustained-low</w:t>
-            </w:r>
-          </w:p>
-        </w:tc>
-        <w:tc>
-          <w:tcPr/>
-          <w:p>
-            <w:pPr>
-              <w:pStyle w:val="Compact"/>
-              <w:jc w:val="left"/>
-            </w:pPr>
-            <w:r>
-              <w:t xml:space="preserve">Post-2019 reform</w:t>
-            </w:r>
-          </w:p>
-        </w:tc>
-        <w:tc>
-          <w:tcPr/>
-          <w:p>
-            <w:pPr>
-              <w:pStyle w:val="Compact"/>
-              <w:jc w:val="right"/>
-            </w:pPr>
-            <w:r>
-              <w:t xml:space="preserve">0.010</w:t>
-            </w:r>
-          </w:p>
-        </w:tc>
-        <w:tc>
-          <w:tcPr/>
-          <w:p>
-            <w:pPr>
-              <w:pStyle w:val="Compact"/>
-              <w:jc w:val="right"/>
-            </w:pPr>
-            <w:r>
-              <w:t xml:space="preserve">0.590</w:t>
-            </w:r>
-          </w:p>
-        </w:tc>
-      </w:tr>
-      <w:tr>
-        <w:tc>
-          <w:tcPr/>
-          <w:p>
-            <w:pPr>
-              <w:pStyle w:val="Compact"/>
-              <w:jc w:val="left"/>
-            </w:pPr>
-            <w:r>
-              <w:t xml:space="preserve">Sustained-low</w:t>
-            </w:r>
-          </w:p>
-        </w:tc>
-        <w:tc>
-          <w:tcPr/>
-          <w:p>
-            <w:pPr>
-              <w:pStyle w:val="Compact"/>
-              <w:jc w:val="left"/>
-            </w:pPr>
-            <w:r>
-              <w:t xml:space="preserve">Draft rating x post-2019</w:t>
-            </w:r>
-          </w:p>
-        </w:tc>
-        <w:tc>
-          <w:tcPr/>
-          <w:p>
-            <w:pPr>
-              <w:pStyle w:val="Compact"/>
-              <w:jc w:val="right"/>
-            </w:pPr>
-            <w:r>
-              <w:t xml:space="preserve">0.028</w:t>
-            </w:r>
-          </w:p>
-        </w:tc>
-        <w:tc>
-          <w:tcPr/>
-          <w:p>
-            <w:pPr>
-              <w:pStyle w:val="Compact"/>
-              <w:jc w:val="right"/>
-            </w:pPr>
-            <w:r>
-              <w:t xml:space="preserve">0.324</w:t>
+              <w:t xml:space="preserve">Top-four draft rating x post-2019</w:t>
+            </w:r>
+          </w:p>
+        </w:tc>
+        <w:tc>
+          <w:tcPr/>
+          <w:p>
+            <w:pPr>
+              <w:pStyle w:val="Compact"/>
+              <w:jc w:val="right"/>
+            </w:pPr>
+            <w:r>
+              <w:t xml:space="preserve">0.207</w:t>
+            </w:r>
+          </w:p>
+        </w:tc>
+        <w:tc>
+          <w:tcPr/>
+          <w:p>
+            <w:pPr>
+              <w:pStyle w:val="Compact"/>
+              <w:jc w:val="right"/>
+            </w:pPr>
+            <w:r>
+              <w:t xml:space="preserve">0.326</w:t>
             </w:r>
           </w:p>
         </w:tc>
@@ -1845,12 +1717,22 @@
         <w:t xml:space="preserve">The interaction models were included because feedback suggested testing whether the relationship between draft strength and tanking signals changed after the 2019 lottery reform. They are useful as an exploratory check, but they are not our preferred final model. With only 17 draft-class seasons, splitting the draft-strength effect into pre- and post-reform components makes the model harder to estimate and easier for individual seasons to influence.</w:t>
       </w:r>
     </w:p>
-    <w:p>
-      <w:pPr>
-        <w:pStyle w:val="BodyText"/>
-      </w:pPr>
-      <w:r>
-        <w:t xml:space="preserve">For that reason, our final model pools all seasons together and focuses on the team-specific position-adjusted draft incentive. This keeps the model simpler than the pre/post interaction while addressing an important weakness of the raw draft-rating model: not every likely lottery team has the same chance to benefit from losing additional games.</w:t>
+    <w:bookmarkEnd w:id="46"/>
+    <w:bookmarkStart w:id="47" w:name="Xe837124f9f200bd350346b45a493dd227e53ca1"/>
+    <w:p>
+      <w:pPr>
+        <w:pStyle w:val="Heading3"/>
+      </w:pPr>
+      <w:r>
+        <w:t xml:space="preserve">Analysis 2: Position-Adjusted Team-Season Regression</w:t>
+      </w:r>
+    </w:p>
+    <w:p>
+      <w:pPr>
+        <w:pStyle w:val="FirstParagraph"/>
+      </w:pPr>
+      <w:r>
+        <w:t xml:space="preserve">For that reason, our final model pools all seasons together and focuses on the team-specific position-adjusted draft incentive. This keeps the model simpler than the pre/post interaction while addressing an important weakness of the raw draft-rating model: not every likely lottery team has the same chance of turning a strong top-four draft class into a top-four pick.</w:t>
       </w:r>
     </w:p>
     <w:p>
@@ -1941,6 +1823,14 @@
         <w:pStyle w:val="BodyText"/>
       </w:pPr>
       <w:r>
+        <w:t xml:space="preserve">We also compared two ways of measuring draft strength: the average rating of the top 35 prospects and the average rating of only the top four prospects. The top-four version is our preferred measure because the lottery is mainly about access to the top of the draft. It also performs slightly better in the final model: the top-35 incentive p-value is 0.13, compared with 0.12 for the top-four incentive.</w:t>
+      </w:r>
+    </w:p>
+    <w:p>
+      <w:pPr>
+        <w:pStyle w:val="BodyText"/>
+      </w:pPr>
+      <w:r>
         <w:t xml:space="preserve">We also compared the full</w:t>
       </w:r>
       <w:r>
@@ -1956,7 +1846,7 @@
         <w:t xml:space="preserve"> </w:t>
       </w:r>
       <w:r>
-        <w:t xml:space="preserve">to the positive-only late-collapse score. The positive-only score is useful for labeling obvious cases, but it throws away information by setting all late-season overperformance to zero. With the same controls, the positive-only score gives a position-adjusted incentive p-value of 0.27, compared with 0.067 for the full</w:t>
+        <w:t xml:space="preserve">to the positive-only late-collapse score. The positive-only score is useful for labeling obvious cases, but it throws away information by setting all late-season overperformance to zero. With the same controls, the positive-only score gives a position-adjusted incentive p-value of 0.37, compared with 0.12 for the full</w:t>
       </w:r>
       <w:r>
         <w:t xml:space="preserve"> </w:t>
@@ -1988,11 +1878,11 @@
         <w:tblCaption w:val="Table 3. Final pooled regression models using position-adjusted draft incentives among likely lottery candidates."/>
       </w:tblPr>
       <w:tblGrid>
-        <w:gridCol w:w="1931"/>
-        <w:gridCol w:w="3283"/>
-        <w:gridCol w:w="869"/>
-        <w:gridCol w:w="1062"/>
-        <w:gridCol w:w="772"/>
+        <w:gridCol w:w="1458"/>
+        <w:gridCol w:w="3543"/>
+        <w:gridCol w:w="937"/>
+        <w:gridCol w:w="1146"/>
+        <w:gridCol w:w="833"/>
       </w:tblGrid>
       <w:tr>
         <w:trPr>
@@ -2092,31 +1982,31 @@
               <w:jc w:val="right"/>
             </w:pPr>
             <w:r>
-              <w:t xml:space="preserve">0.184</w:t>
-            </w:r>
-          </w:p>
-        </w:tc>
-        <w:tc>
-          <w:tcPr/>
-          <w:p>
-            <w:pPr>
-              <w:pStyle w:val="Compact"/>
-              <w:jc w:val="right"/>
-            </w:pPr>
-            <w:r>
-              <w:t xml:space="preserve">0.100</w:t>
-            </w:r>
-          </w:p>
-        </w:tc>
-        <w:tc>
-          <w:tcPr/>
-          <w:p>
-            <w:pPr>
-              <w:pStyle w:val="Compact"/>
-              <w:jc w:val="right"/>
-            </w:pPr>
-            <w:r>
-              <w:t xml:space="preserve">0.067</w:t>
+              <w:t xml:space="preserve">0.157</w:t>
+            </w:r>
+          </w:p>
+        </w:tc>
+        <w:tc>
+          <w:tcPr/>
+          <w:p>
+            <w:pPr>
+              <w:pStyle w:val="Compact"/>
+              <w:jc w:val="right"/>
+            </w:pPr>
+            <w:r>
+              <w:t xml:space="preserve">0.099</w:t>
+            </w:r>
+          </w:p>
+        </w:tc>
+        <w:tc>
+          <w:tcPr/>
+          <w:p>
+            <w:pPr>
+              <w:pStyle w:val="Compact"/>
+              <w:jc w:val="right"/>
+            </w:pPr>
+            <w:r>
+              <w:t xml:space="preserve">0.115</w:t>
             </w:r>
           </w:p>
         </w:tc>
@@ -2154,19 +2044,19 @@
               <w:jc w:val="right"/>
             </w:pPr>
             <w:r>
-              <w:t xml:space="preserve">4.984</w:t>
-            </w:r>
-          </w:p>
-        </w:tc>
-        <w:tc>
-          <w:tcPr/>
-          <w:p>
-            <w:pPr>
-              <w:pStyle w:val="Compact"/>
-              <w:jc w:val="right"/>
-            </w:pPr>
-            <w:r>
-              <w:t xml:space="preserve">1.139</w:t>
+              <w:t xml:space="preserve">4.852</w:t>
+            </w:r>
+          </w:p>
+        </w:tc>
+        <w:tc>
+          <w:tcPr/>
+          <w:p>
+            <w:pPr>
+              <w:pStyle w:val="Compact"/>
+              <w:jc w:val="right"/>
+            </w:pPr>
+            <w:r>
+              <w:t xml:space="preserve">1.135</w:t>
             </w:r>
           </w:p>
         </w:tc>
@@ -2216,31 +2106,31 @@
               <w:jc w:val="right"/>
             </w:pPr>
             <w:r>
-              <w:t xml:space="preserve">-0.749</w:t>
-            </w:r>
-          </w:p>
-        </w:tc>
-        <w:tc>
-          <w:tcPr/>
-          <w:p>
-            <w:pPr>
-              <w:pStyle w:val="Compact"/>
-              <w:jc w:val="right"/>
-            </w:pPr>
-            <w:r>
-              <w:t xml:space="preserve">0.402</w:t>
-            </w:r>
-          </w:p>
-        </w:tc>
-        <w:tc>
-          <w:tcPr/>
-          <w:p>
-            <w:pPr>
-              <w:pStyle w:val="Compact"/>
-              <w:jc w:val="right"/>
-            </w:pPr>
-            <w:r>
-              <w:t xml:space="preserve">0.064</w:t>
+              <w:t xml:space="preserve">-0.741</w:t>
+            </w:r>
+          </w:p>
+        </w:tc>
+        <w:tc>
+          <w:tcPr/>
+          <w:p>
+            <w:pPr>
+              <w:pStyle w:val="Compact"/>
+              <w:jc w:val="right"/>
+            </w:pPr>
+            <w:r>
+              <w:t xml:space="preserve">0.403</w:t>
+            </w:r>
+          </w:p>
+        </w:tc>
+        <w:tc>
+          <w:tcPr/>
+          <w:p>
+            <w:pPr>
+              <w:pStyle w:val="Compact"/>
+              <w:jc w:val="right"/>
+            </w:pPr>
+            <w:r>
+              <w:t xml:space="preserve">0.068</w:t>
             </w:r>
           </w:p>
         </w:tc>
@@ -2278,7 +2168,7 @@
               <w:jc w:val="right"/>
             </w:pPr>
             <w:r>
-              <w:t xml:space="preserve">-0.587</w:t>
+              <w:t xml:space="preserve">-0.610</w:t>
             </w:r>
           </w:p>
         </w:tc>
@@ -2302,7 +2192,7 @@
               <w:jc w:val="right"/>
             </w:pPr>
             <w:r>
-              <w:t xml:space="preserve">0.118</w:t>
+              <w:t xml:space="preserve">0.105</w:t>
             </w:r>
           </w:p>
         </w:tc>
@@ -2340,341 +2230,31 @@
               <w:jc w:val="right"/>
             </w:pPr>
             <w:r>
-              <w:t xml:space="preserve">0.580</w:t>
-            </w:r>
-          </w:p>
-        </w:tc>
-        <w:tc>
-          <w:tcPr/>
-          <w:p>
-            <w:pPr>
-              <w:pStyle w:val="Compact"/>
-              <w:jc w:val="right"/>
-            </w:pPr>
-            <w:r>
-              <w:t xml:space="preserve">0.498</w:t>
-            </w:r>
-          </w:p>
-        </w:tc>
-        <w:tc>
-          <w:tcPr/>
-          <w:p>
-            <w:pPr>
-              <w:pStyle w:val="Compact"/>
-              <w:jc w:val="right"/>
-            </w:pPr>
-            <w:r>
-              <w:t xml:space="preserve">0.246</w:t>
-            </w:r>
-          </w:p>
-        </w:tc>
-      </w:tr>
-      <w:tr>
-        <w:tc>
-          <w:tcPr/>
-          <w:p>
-            <w:pPr>
-              <w:pStyle w:val="Compact"/>
-              <w:jc w:val="left"/>
-            </w:pPr>
-            <w:r>
-              <w:t xml:space="preserve">Sustained-low score</w:t>
-            </w:r>
-          </w:p>
-        </w:tc>
-        <w:tc>
-          <w:tcPr/>
-          <w:p>
-            <w:pPr>
-              <w:pStyle w:val="Compact"/>
-              <w:jc w:val="left"/>
-            </w:pPr>
-            <w:r>
-              <w:t xml:space="preserve">Position-adjusted draft incentive</w:t>
-            </w:r>
-          </w:p>
-        </w:tc>
-        <w:tc>
-          <w:tcPr/>
-          <w:p>
-            <w:pPr>
-              <w:pStyle w:val="Compact"/>
-              <w:jc w:val="right"/>
-            </w:pPr>
-            <w:r>
-              <w:t xml:space="preserve">0.015</w:t>
-            </w:r>
-          </w:p>
-        </w:tc>
-        <w:tc>
-          <w:tcPr/>
-          <w:p>
-            <w:pPr>
-              <w:pStyle w:val="Compact"/>
-              <w:jc w:val="right"/>
-            </w:pPr>
-            <w:r>
-              <w:t xml:space="preserve">0.009</w:t>
-            </w:r>
-          </w:p>
-        </w:tc>
-        <w:tc>
-          <w:tcPr/>
-          <w:p>
-            <w:pPr>
-              <w:pStyle w:val="Compact"/>
-              <w:jc w:val="right"/>
-            </w:pPr>
-            <w:r>
-              <w:t xml:space="preserve">0.089</w:t>
-            </w:r>
-          </w:p>
-        </w:tc>
-      </w:tr>
-      <w:tr>
-        <w:tc>
-          <w:tcPr/>
-          <w:p>
-            <w:pPr>
-              <w:pStyle w:val="Compact"/>
-              <w:jc w:val="left"/>
-            </w:pPr>
-            <w:r>
-              <w:t xml:space="preserve">Sustained-low score</w:t>
-            </w:r>
-          </w:p>
-        </w:tc>
-        <w:tc>
-          <w:tcPr/>
-          <w:p>
-            <w:pPr>
-              <w:pStyle w:val="Compact"/>
-              <w:jc w:val="left"/>
-            </w:pPr>
-            <w:r>
-              <w:t xml:space="preserve">Pre-March win pct</w:t>
-            </w:r>
-          </w:p>
-        </w:tc>
-        <w:tc>
-          <w:tcPr/>
-          <w:p>
-            <w:pPr>
-              <w:pStyle w:val="Compact"/>
-              <w:jc w:val="right"/>
-            </w:pPr>
-            <w:r>
-              <w:t xml:space="preserve">-0.477</w:t>
-            </w:r>
-          </w:p>
-        </w:tc>
-        <w:tc>
-          <w:tcPr/>
-          <w:p>
-            <w:pPr>
-              <w:pStyle w:val="Compact"/>
-              <w:jc w:val="right"/>
-            </w:pPr>
-            <w:r>
-              <w:t xml:space="preserve">0.097</w:t>
-            </w:r>
-          </w:p>
-        </w:tc>
-        <w:tc>
-          <w:tcPr/>
-          <w:p>
-            <w:pPr>
-              <w:pStyle w:val="Compact"/>
-              <w:jc w:val="right"/>
-            </w:pPr>
-            <w:r>
-              <w:t xml:space="preserve">0.000</w:t>
-            </w:r>
-          </w:p>
-        </w:tc>
-      </w:tr>
-      <w:tr>
-        <w:tc>
-          <w:tcPr/>
-          <w:p>
-            <w:pPr>
-              <w:pStyle w:val="Compact"/>
-              <w:jc w:val="left"/>
-            </w:pPr>
-            <w:r>
-              <w:t xml:space="preserve">Sustained-low score</w:t>
-            </w:r>
-          </w:p>
-        </w:tc>
-        <w:tc>
-          <w:tcPr/>
-          <w:p>
-            <w:pPr>
-              <w:pStyle w:val="Compact"/>
-              <w:jc w:val="left"/>
-            </w:pPr>
-            <w:r>
-              <w:t xml:space="preserve">2012 season</w:t>
-            </w:r>
-          </w:p>
-        </w:tc>
-        <w:tc>
-          <w:tcPr/>
-          <w:p>
-            <w:pPr>
-              <w:pStyle w:val="Compact"/>
-              <w:jc w:val="right"/>
-            </w:pPr>
-            <w:r>
-              <w:t xml:space="preserve">-0.057</w:t>
-            </w:r>
-          </w:p>
-        </w:tc>
-        <w:tc>
-          <w:tcPr/>
-          <w:p>
-            <w:pPr>
-              <w:pStyle w:val="Compact"/>
-              <w:jc w:val="right"/>
-            </w:pPr>
-            <w:r>
-              <w:t xml:space="preserve">0.034</w:t>
-            </w:r>
-          </w:p>
-        </w:tc>
-        <w:tc>
-          <w:tcPr/>
-          <w:p>
-            <w:pPr>
-              <w:pStyle w:val="Compact"/>
-              <w:jc w:val="right"/>
-            </w:pPr>
-            <w:r>
-              <w:t xml:space="preserve">0.100</w:t>
-            </w:r>
-          </w:p>
-        </w:tc>
-      </w:tr>
-      <w:tr>
-        <w:tc>
-          <w:tcPr/>
-          <w:p>
-            <w:pPr>
-              <w:pStyle w:val="Compact"/>
-              <w:jc w:val="left"/>
-            </w:pPr>
-            <w:r>
-              <w:t xml:space="preserve">Sustained-low score</w:t>
-            </w:r>
-          </w:p>
-        </w:tc>
-        <w:tc>
-          <w:tcPr/>
-          <w:p>
-            <w:pPr>
-              <w:pStyle w:val="Compact"/>
-              <w:jc w:val="left"/>
-            </w:pPr>
-            <w:r>
-              <w:t xml:space="preserve">2020 season</w:t>
-            </w:r>
-          </w:p>
-        </w:tc>
-        <w:tc>
-          <w:tcPr/>
-          <w:p>
-            <w:pPr>
-              <w:pStyle w:val="Compact"/>
-              <w:jc w:val="right"/>
-            </w:pPr>
-            <w:r>
-              <w:t xml:space="preserve">-0.062</w:t>
-            </w:r>
-          </w:p>
-        </w:tc>
-        <w:tc>
-          <w:tcPr/>
-          <w:p>
-            <w:pPr>
-              <w:pStyle w:val="Compact"/>
-              <w:jc w:val="right"/>
-            </w:pPr>
-            <w:r>
-              <w:t xml:space="preserve">0.032</w:t>
-            </w:r>
-          </w:p>
-        </w:tc>
-        <w:tc>
-          <w:tcPr/>
-          <w:p>
-            <w:pPr>
-              <w:pStyle w:val="Compact"/>
-              <w:jc w:val="right"/>
-            </w:pPr>
-            <w:r>
-              <w:t xml:space="preserve">0.055</w:t>
-            </w:r>
-          </w:p>
-        </w:tc>
-      </w:tr>
-      <w:tr>
-        <w:tc>
-          <w:tcPr/>
-          <w:p>
-            <w:pPr>
-              <w:pStyle w:val="Compact"/>
-              <w:jc w:val="left"/>
-            </w:pPr>
-            <w:r>
-              <w:t xml:space="preserve">Sustained-low score</w:t>
-            </w:r>
-          </w:p>
-        </w:tc>
-        <w:tc>
-          <w:tcPr/>
-          <w:p>
-            <w:pPr>
-              <w:pStyle w:val="Compact"/>
-              <w:jc w:val="left"/>
-            </w:pPr>
-            <w:r>
-              <w:t xml:space="preserve">2021 season</w:t>
-            </w:r>
-          </w:p>
-        </w:tc>
-        <w:tc>
-          <w:tcPr/>
-          <w:p>
-            <w:pPr>
-              <w:pStyle w:val="Compact"/>
-              <w:jc w:val="right"/>
-            </w:pPr>
-            <w:r>
-              <w:t xml:space="preserve">0.040</w:t>
-            </w:r>
-          </w:p>
-        </w:tc>
-        <w:tc>
-          <w:tcPr/>
-          <w:p>
-            <w:pPr>
-              <w:pStyle w:val="Compact"/>
-              <w:jc w:val="right"/>
-            </w:pPr>
-            <w:r>
-              <w:t xml:space="preserve">0.042</w:t>
-            </w:r>
-          </w:p>
-        </w:tc>
-        <w:tc>
-          <w:tcPr/>
-          <w:p>
-            <w:pPr>
-              <w:pStyle w:val="Compact"/>
-              <w:jc w:val="right"/>
-            </w:pPr>
-            <w:r>
-              <w:t xml:space="preserve">0.350</w:t>
+              <w:t xml:space="preserve">0.567</w:t>
+            </w:r>
+          </w:p>
+        </w:tc>
+        <w:tc>
+          <w:tcPr/>
+          <w:p>
+            <w:pPr>
+              <w:pStyle w:val="Compact"/>
+              <w:jc w:val="right"/>
+            </w:pPr>
+            <w:r>
+              <w:t xml:space="preserve">0.500</w:t>
+            </w:r>
+          </w:p>
+        </w:tc>
+        <w:tc>
+          <w:tcPr/>
+          <w:p>
+            <w:pPr>
+              <w:pStyle w:val="Compact"/>
+              <w:jc w:val="right"/>
+            </w:pPr>
+            <w:r>
+              <w:t xml:space="preserve">0.258</w:t>
             </w:r>
           </w:p>
         </w:tc>
@@ -2685,15 +2265,7 @@
         <w:pStyle w:val="BodyText"/>
       </w:pPr>
       <w:r>
-        <w:t xml:space="preserve">The tanking-index model has a positive position-adjusted incentive coefficient of 0.184, with a p-value of 0.067. This is stronger than the earlier positive-only late-collapse score because the full index keeps all information: underperformance counts positively, while late-season overperformance counts against the tanking-incentive story.</w:t>
-      </w:r>
-    </w:p>
-    <w:p>
-      <w:pPr>
-        <w:pStyle w:val="BodyText"/>
-      </w:pPr>
-      <w:r>
-        <w:t xml:space="preserve">The sustained-low model tells a somewhat stronger story. Its position-adjusted incentive coefficient is 0.015, with a p-value of 0.089. This is consistent with the idea that lottery incentives may show up more as sustained poor late-season performance than as a sudden collapse after March. Overall, the position-adjusted model supports a cautious conclusion: the relationship is in the expected direction, especially for sustained low performance, but the evidence is suggestive rather than conclusive.</w:t>
+        <w:t xml:space="preserve">The tanking-index model has a positive position-adjusted incentive coefficient of 0.157, with a p-value of 0.12. This is stronger than the earlier positive-only late-collapse score because the full index keeps all information: underperformance counts positively, while late-season overperformance counts against the tanking-incentive story.</w:t>
       </w:r>
     </w:p>
     <w:p>
@@ -2837,19 +2409,19 @@
               <w:jc w:val="right"/>
             </w:pPr>
             <w:r>
-              <w:t xml:space="preserve">0.184</w:t>
-            </w:r>
-          </w:p>
-        </w:tc>
-        <w:tc>
-          <w:tcPr/>
-          <w:p>
-            <w:pPr>
-              <w:pStyle w:val="Compact"/>
-              <w:jc w:val="right"/>
-            </w:pPr>
-            <w:r>
-              <w:t xml:space="preserve">0.067</w:t>
+              <w:t xml:space="preserve">0.157</w:t>
+            </w:r>
+          </w:p>
+        </w:tc>
+        <w:tc>
+          <w:tcPr/>
+          <w:p>
+            <w:pPr>
+              <w:pStyle w:val="Compact"/>
+              <w:jc w:val="right"/>
+            </w:pPr>
+            <w:r>
+              <w:t xml:space="preserve">0.115</w:t>
             </w:r>
           </w:p>
         </w:tc>
@@ -2899,143 +2471,19 @@
               <w:jc w:val="right"/>
             </w:pPr>
             <w:r>
-              <w:t xml:space="preserve">0.167</w:t>
-            </w:r>
-          </w:p>
-        </w:tc>
-        <w:tc>
-          <w:tcPr/>
-          <w:p>
-            <w:pPr>
-              <w:pStyle w:val="Compact"/>
-              <w:jc w:val="right"/>
-            </w:pPr>
-            <w:r>
-              <w:t xml:space="preserve">0.093</w:t>
-            </w:r>
-          </w:p>
-        </w:tc>
-      </w:tr>
-      <w:tr>
-        <w:tc>
-          <w:tcPr/>
-          <w:p>
-            <w:pPr>
-              <w:pStyle w:val="Compact"/>
-              <w:jc w:val="left"/>
-            </w:pPr>
-            <w:r>
-              <w:t xml:space="preserve">Sustained-low</w:t>
-            </w:r>
-          </w:p>
-        </w:tc>
-        <w:tc>
-          <w:tcPr/>
-          <w:p>
-            <w:pPr>
-              <w:pStyle w:val="Compact"/>
-              <w:jc w:val="left"/>
-            </w:pPr>
-            <w:r>
-              <w:t xml:space="preserve">All years</w:t>
-            </w:r>
-          </w:p>
-        </w:tc>
-        <w:tc>
-          <w:tcPr/>
-          <w:p>
-            <w:pPr>
-              <w:pStyle w:val="Compact"/>
-              <w:jc w:val="left"/>
-            </w:pPr>
-            <w:r>
-              <w:t xml:space="preserve">Position-adjusted draft incentive</w:t>
-            </w:r>
-          </w:p>
-        </w:tc>
-        <w:tc>
-          <w:tcPr/>
-          <w:p>
-            <w:pPr>
-              <w:pStyle w:val="Compact"/>
-              <w:jc w:val="right"/>
-            </w:pPr>
-            <w:r>
-              <w:t xml:space="preserve">0.015</w:t>
-            </w:r>
-          </w:p>
-        </w:tc>
-        <w:tc>
-          <w:tcPr/>
-          <w:p>
-            <w:pPr>
-              <w:pStyle w:val="Compact"/>
-              <w:jc w:val="right"/>
-            </w:pPr>
-            <w:r>
-              <w:t xml:space="preserve">0.089</w:t>
-            </w:r>
-          </w:p>
-        </w:tc>
-      </w:tr>
-      <w:tr>
-        <w:tc>
-          <w:tcPr/>
-          <w:p>
-            <w:pPr>
-              <w:pStyle w:val="Compact"/>
-              <w:jc w:val="left"/>
-            </w:pPr>
-            <w:r>
-              <w:t xml:space="preserve">Sustained-low</w:t>
-            </w:r>
-          </w:p>
-        </w:tc>
-        <w:tc>
-          <w:tcPr/>
-          <w:p>
-            <w:pPr>
-              <w:pStyle w:val="Compact"/>
-              <w:jc w:val="left"/>
-            </w:pPr>
-            <w:r>
-              <w:t xml:space="preserve">Excluding 2021</w:t>
-            </w:r>
-          </w:p>
-        </w:tc>
-        <w:tc>
-          <w:tcPr/>
-          <w:p>
-            <w:pPr>
-              <w:pStyle w:val="Compact"/>
-              <w:jc w:val="left"/>
-            </w:pPr>
-            <w:r>
-              <w:t xml:space="preserve">Position-adjusted draft incentive</w:t>
-            </w:r>
-          </w:p>
-        </w:tc>
-        <w:tc>
-          <w:tcPr/>
-          <w:p>
-            <w:pPr>
-              <w:pStyle w:val="Compact"/>
-              <w:jc w:val="right"/>
-            </w:pPr>
-            <w:r>
-              <w:t xml:space="preserve">0.014</w:t>
-            </w:r>
-          </w:p>
-        </w:tc>
-        <w:tc>
-          <w:tcPr/>
-          <w:p>
-            <w:pPr>
-              <w:pStyle w:val="Compact"/>
-              <w:jc w:val="right"/>
-            </w:pPr>
-            <w:r>
-              <w:t xml:space="preserve">0.114</w:t>
+              <w:t xml:space="preserve">0.145</w:t>
+            </w:r>
+          </w:p>
+        </w:tc>
+        <w:tc>
+          <w:tcPr/>
+          <w:p>
+            <w:pPr>
+              <w:pStyle w:val="Compact"/>
+              <w:jc w:val="right"/>
+            </w:pPr>
+            <w:r>
+              <w:t xml:space="preserve">0.140</w:t>
             </w:r>
           </w:p>
         </w:tc>
@@ -3046,17 +2494,17 @@
         <w:pStyle w:val="BodyText"/>
       </w:pPr>
       <w:r>
-        <w:t xml:space="preserve">Excluding 2021 does not reverse the direction of the estimates. In the tanking-index model, the position-adjusted incentive coefficient changes from 0.184 in the all-years model to 0.167 after excluding 2021, with the p-value changing from 0.067 to 0.093. In the sustained-low model, the coefficient changes from 0.015 to 0.014, with the p-value changing from 0.089 to 0.11. This suggests that 2021 matters, but the main pattern is not simply a one-season artifact. The separate season controls in the main model let us keep all years in the primary analysis while acknowledging that disrupted seasons are not perfectly comparable to normal 82-game seasons.</w:t>
-      </w:r>
-    </w:p>
-    <w:bookmarkEnd w:id="44"/>
-    <w:bookmarkStart w:id="48" w:name="team-fit-extension"/>
-    <w:p>
-      <w:pPr>
-        <w:pStyle w:val="Heading2"/>
-      </w:pPr>
-      <w:r>
-        <w:t xml:space="preserve">Team Fit Extension</w:t>
+        <w:t xml:space="preserve">Excluding 2021 does not reverse the direction of the estimate. The position-adjusted incentive coefficient changes from 0.157 in the all-years model to 0.145 after excluding 2021, with the p-value changing from 0.12 to 0.14. This suggests that 2021 matters, but the main pattern is not simply a one-season artifact. The separate season controls in the main model let us keep all years in the primary analysis while acknowledging that disrupted seasons are not perfectly comparable to normal 82-game seasons.</w:t>
+      </w:r>
+    </w:p>
+    <w:bookmarkEnd w:id="47"/>
+    <w:bookmarkStart w:id="51" w:name="analysis-3-team-fit-heterogeneity-check"/>
+    <w:p>
+      <w:pPr>
+        <w:pStyle w:val="Heading3"/>
+      </w:pPr>
+      <w:r>
+        <w:t xml:space="preserve">Analysis 3: Team-Fit Heterogeneity Check</w:t>
       </w:r>
     </w:p>
     <w:p>
@@ -3110,7 +2558,7 @@
         <w:t xml:space="preserve"> </w:t>
       </w:r>
       <w:r>
-        <w:t xml:space="preserve">is team-specific and is only weakly correlated with overall draft rating among likely lottery candidates (0.057). In other words, it is not just another version of draft strength.</w:t>
+        <w:t xml:space="preserve">is team-specific and is only weakly correlated with top-four draft rating among likely lottery candidates (0.009). In other words, it is not just another version of draft strength.</w:t>
       </w:r>
     </w:p>
     <w:p>
@@ -3122,18 +2570,18 @@
           <wp:inline>
             <wp:extent cx="5334000" cy="3597671"/>
             <wp:effectExtent b="0" l="0" r="0" t="0"/>
-            <wp:docPr descr="Figure 6. Team fit and tanking signals among likely lottery candidates. Each point is one team-season. The x-axis measures whether a team’s pre-March positional weaknesses align with the strongest prospect position groups in that year’s draft. The panels show the two tanking-signal outcomes, and color shows overall draft class strength." title="" id="46" name="Picture"/>
+            <wp:docPr descr="Figure 6. Team fit and tanking index among likely lottery candidates. Each point is one team-season. The x-axis measures whether a team’s pre-March positional weaknesses align with the strongest prospect position groups in that year’s draft, and color shows top-four draft class strength." title="" id="49" name="Picture"/>
             <a:graphic>
               <a:graphicData uri="http://schemas.openxmlformats.org/drawingml/2006/picture">
                 <pic:pic>
                   <pic:nvPicPr>
-                    <pic:cNvPr descr="final-report_files/figure-docx/team-fit-visual-1.png" id="47" name="Picture"/>
+                    <pic:cNvPr descr="final-report_files/figure-docx/team-fit-visual-1.png" id="50" name="Picture"/>
                     <pic:cNvPicPr>
                       <a:picLocks noChangeArrowheads="1" noChangeAspect="1"/>
                     </pic:cNvPicPr>
                   </pic:nvPicPr>
                   <pic:blipFill>
-                    <a:blip r:embed="rId45"/>
+                    <a:blip r:embed="rId48"/>
                     <a:stretch>
                       <a:fillRect/>
                     </a:stretch>
@@ -3165,7 +2613,7 @@
         <w:pStyle w:val="ImageCaption"/>
       </w:pPr>
       <w:r>
-        <w:t xml:space="preserve">Figure 6. Team fit and tanking signals among likely lottery candidates. Each point is one team-season. The x-axis measures whether a team’s pre-March positional weaknesses align with the strongest prospect position groups in that year’s draft. The panels show the two tanking-signal outcomes, and color shows overall draft class strength.</w:t>
+        <w:t xml:space="preserve">Figure 6. Team fit and tanking index among likely lottery candidates. Each point is one team-season. The x-axis measures whether a team’s pre-March positional weaknesses align with the strongest prospect position groups in that year’s draft, and color shows top-four draft class strength.</w:t>
       </w:r>
     </w:p>
     <w:p>
@@ -3263,31 +2711,31 @@
               <w:jc w:val="left"/>
             </w:pPr>
             <w:r>
-              <w:t xml:space="preserve">Draft rating</w:t>
-            </w:r>
-          </w:p>
-        </w:tc>
-        <w:tc>
-          <w:tcPr/>
-          <w:p>
-            <w:pPr>
-              <w:pStyle w:val="Compact"/>
-              <w:jc w:val="right"/>
-            </w:pPr>
-            <w:r>
-              <w:t xml:space="preserve">0.198</w:t>
-            </w:r>
-          </w:p>
-        </w:tc>
-        <w:tc>
-          <w:tcPr/>
-          <w:p>
-            <w:pPr>
-              <w:pStyle w:val="Compact"/>
-              <w:jc w:val="right"/>
-            </w:pPr>
-            <w:r>
-              <w:t xml:space="preserve">0.062</w:t>
+              <w:t xml:space="preserve">Top-four draft rating</w:t>
+            </w:r>
+          </w:p>
+        </w:tc>
+        <w:tc>
+          <w:tcPr/>
+          <w:p>
+            <w:pPr>
+              <w:pStyle w:val="Compact"/>
+              <w:jc w:val="right"/>
+            </w:pPr>
+            <w:r>
+              <w:t xml:space="preserve">0.154</w:t>
+            </w:r>
+          </w:p>
+        </w:tc>
+        <w:tc>
+          <w:tcPr/>
+          <w:p>
+            <w:pPr>
+              <w:pStyle w:val="Compact"/>
+              <w:jc w:val="right"/>
+            </w:pPr>
+            <w:r>
+              <w:t xml:space="preserve">0.121</w:t>
             </w:r>
           </w:p>
         </w:tc>
@@ -3325,19 +2773,19 @@
               <w:jc w:val="right"/>
             </w:pPr>
             <w:r>
-              <w:t xml:space="preserve">0.142</w:t>
-            </w:r>
-          </w:p>
-        </w:tc>
-        <w:tc>
-          <w:tcPr/>
-          <w:p>
-            <w:pPr>
-              <w:pStyle w:val="Compact"/>
-              <w:jc w:val="right"/>
-            </w:pPr>
-            <w:r>
-              <w:t xml:space="preserve">0.171</w:t>
+              <w:t xml:space="preserve">0.141</w:t>
+            </w:r>
+          </w:p>
+        </w:tc>
+        <w:tc>
+          <w:tcPr/>
+          <w:p>
+            <w:pPr>
+              <w:pStyle w:val="Compact"/>
+              <w:jc w:val="right"/>
+            </w:pPr>
+            <w:r>
+              <w:t xml:space="preserve">0.175</w:t>
             </w:r>
           </w:p>
         </w:tc>
@@ -3363,181 +2811,31 @@
               <w:jc w:val="left"/>
             </w:pPr>
             <w:r>
-              <w:t xml:space="preserve">Draft rating x team fit</w:t>
-            </w:r>
-          </w:p>
-        </w:tc>
-        <w:tc>
-          <w:tcPr/>
-          <w:p>
-            <w:pPr>
-              <w:pStyle w:val="Compact"/>
-              <w:jc w:val="right"/>
-            </w:pPr>
-            <w:r>
-              <w:t xml:space="preserve">-0.112</w:t>
-            </w:r>
-          </w:p>
-        </w:tc>
-        <w:tc>
-          <w:tcPr/>
-          <w:p>
-            <w:pPr>
-              <w:pStyle w:val="Compact"/>
-              <w:jc w:val="right"/>
-            </w:pPr>
-            <w:r>
-              <w:t xml:space="preserve">0.263</w:t>
-            </w:r>
-          </w:p>
-        </w:tc>
-      </w:tr>
-      <w:tr>
-        <w:tc>
-          <w:tcPr/>
-          <w:p>
-            <w:pPr>
-              <w:pStyle w:val="Compact"/>
-              <w:jc w:val="left"/>
-            </w:pPr>
-            <w:r>
-              <w:t xml:space="preserve">Sustained-low</w:t>
-            </w:r>
-          </w:p>
-        </w:tc>
-        <w:tc>
-          <w:tcPr/>
-          <w:p>
-            <w:pPr>
-              <w:pStyle w:val="Compact"/>
-              <w:jc w:val="left"/>
-            </w:pPr>
-            <w:r>
-              <w:t xml:space="preserve">Draft rating</w:t>
-            </w:r>
-          </w:p>
-        </w:tc>
-        <w:tc>
-          <w:tcPr/>
-          <w:p>
-            <w:pPr>
-              <w:pStyle w:val="Compact"/>
-              <w:jc w:val="right"/>
-            </w:pPr>
-            <w:r>
-              <w:t xml:space="preserve">0.017</w:t>
-            </w:r>
-          </w:p>
-        </w:tc>
-        <w:tc>
-          <w:tcPr/>
-          <w:p>
-            <w:pPr>
-              <w:pStyle w:val="Compact"/>
-              <w:jc w:val="right"/>
-            </w:pPr>
-            <w:r>
-              <w:t xml:space="preserve">0.062</w:t>
-            </w:r>
-          </w:p>
-        </w:tc>
-      </w:tr>
-      <w:tr>
-        <w:tc>
-          <w:tcPr/>
-          <w:p>
-            <w:pPr>
-              <w:pStyle w:val="Compact"/>
-              <w:jc w:val="left"/>
-            </w:pPr>
-            <w:r>
-              <w:t xml:space="preserve">Sustained-low</w:t>
-            </w:r>
-          </w:p>
-        </w:tc>
-        <w:tc>
-          <w:tcPr/>
-          <w:p>
-            <w:pPr>
-              <w:pStyle w:val="Compact"/>
-              <w:jc w:val="left"/>
-            </w:pPr>
-            <w:r>
-              <w:t xml:space="preserve">Team fit</w:t>
-            </w:r>
-          </w:p>
-        </w:tc>
-        <w:tc>
-          <w:tcPr/>
-          <w:p>
-            <w:pPr>
-              <w:pStyle w:val="Compact"/>
-              <w:jc w:val="right"/>
-            </w:pPr>
-            <w:r>
-              <w:t xml:space="preserve">0.011</w:t>
-            </w:r>
-          </w:p>
-        </w:tc>
-        <w:tc>
-          <w:tcPr/>
-          <w:p>
-            <w:pPr>
-              <w:pStyle w:val="Compact"/>
-              <w:jc w:val="right"/>
-            </w:pPr>
-            <w:r>
-              <w:t xml:space="preserve">0.203</w:t>
-            </w:r>
-          </w:p>
-        </w:tc>
-      </w:tr>
-      <w:tr>
-        <w:tc>
-          <w:tcPr/>
-          <w:p>
-            <w:pPr>
-              <w:pStyle w:val="Compact"/>
-              <w:jc w:val="left"/>
-            </w:pPr>
-            <w:r>
-              <w:t xml:space="preserve">Sustained-low</w:t>
-            </w:r>
-          </w:p>
-        </w:tc>
-        <w:tc>
-          <w:tcPr/>
-          <w:p>
-            <w:pPr>
-              <w:pStyle w:val="Compact"/>
-              <w:jc w:val="left"/>
-            </w:pPr>
-            <w:r>
-              <w:t xml:space="preserve">Draft rating x team fit</w:t>
-            </w:r>
-          </w:p>
-        </w:tc>
-        <w:tc>
-          <w:tcPr/>
-          <w:p>
-            <w:pPr>
-              <w:pStyle w:val="Compact"/>
-              <w:jc w:val="right"/>
-            </w:pPr>
-            <w:r>
-              <w:t xml:space="preserve">-0.007</w:t>
-            </w:r>
-          </w:p>
-        </w:tc>
-        <w:tc>
-          <w:tcPr/>
-          <w:p>
-            <w:pPr>
-              <w:pStyle w:val="Compact"/>
-              <w:jc w:val="right"/>
-            </w:pPr>
-            <w:r>
-              <w:t xml:space="preserve">0.397</w:t>
+              <w:t xml:space="preserve">Top-four draft rating x team fit</w:t>
+            </w:r>
+          </w:p>
+        </w:tc>
+        <w:tc>
+          <w:tcPr/>
+          <w:p>
+            <w:pPr>
+              <w:pStyle w:val="Compact"/>
+              <w:jc w:val="right"/>
+            </w:pPr>
+            <w:r>
+              <w:t xml:space="preserve">-0.032</w:t>
+            </w:r>
+          </w:p>
+        </w:tc>
+        <w:tc>
+          <w:tcPr/>
+          <w:p>
+            <w:pPr>
+              <w:pStyle w:val="Compact"/>
+              <w:jc w:val="right"/>
+            </w:pPr>
+            <w:r>
+              <w:t xml:space="preserve">0.757</w:t>
             </w:r>
           </w:p>
         </w:tc>
@@ -3548,17 +2846,60 @@
         <w:pStyle w:val="BodyText"/>
       </w:pPr>
       <w:r>
-        <w:t xml:space="preserve">The team-fit interaction is not statistically significant in either outcome model. The interaction p-value is 0.26 for the tanking index and 0.4 for sustained low performance. This does not mean fit is irrelevant; it means our simple fit proxy does not add clear evidence beyond the main draft-strength model. A stronger version of this idea would use team-specific draft boards, roster contract data, or play-type needs instead of broad position groups.</w:t>
-      </w:r>
-    </w:p>
-    <w:bookmarkEnd w:id="48"/>
-    <w:bookmarkStart w:id="49" w:name="discussion"/>
+        <w:t xml:space="preserve">The team-fit interaction is not statistically significant. The interaction p-value is 0.76. This does not mean fit is irrelevant; it means our simple fit proxy does not add clear evidence beyond the main draft-strength model. A stronger version of this idea would use team-specific draft boards, roster contract data, or play-type needs instead of broad position groups.</w:t>
+      </w:r>
+    </w:p>
+    <w:bookmarkEnd w:id="51"/>
+    <w:bookmarkStart w:id="52" w:name="conclusions-from-the-formal-analysis"/>
+    <w:p>
+      <w:pPr>
+        <w:pStyle w:val="Heading3"/>
+      </w:pPr>
+      <w:r>
+        <w:t xml:space="preserve">Conclusions From the Formal Analysis</w:t>
+      </w:r>
+    </w:p>
+    <w:p>
+      <w:pPr>
+        <w:pStyle w:val="FirstParagraph"/>
+      </w:pPr>
+      <w:r>
+        <w:t xml:space="preserve">The main finding is that draft strength appears related to late-season losing signals, but the strength of the evidence depends on how directly we model incentives. The raw draft-strength figures show a clearer positive relationship, but they are partly season-level summaries. The position-adjusted model is more conservative because it asks whether a team’s own lottery position gives it more to gain from a strong class. In that model, the estimate remains positive for the tanking index, but it is not strong enough to support a causal claim.</w:t>
+      </w:r>
+    </w:p>
+    <w:p>
+      <w:pPr>
+        <w:pStyle w:val="BodyText"/>
+      </w:pPr>
+      <w:r>
+        <w:t xml:space="preserve">The analysis also shows why the definition of tanking matters. A strict 10 percentage point late-collapse proxy flags only a small number of team-seasons. That makes the proxy conservative, but it can miss meaningful variation around the cutoff. It also creates extra noise by treating all non-flagged teams as the same. The full tanking index is better suited for regression because it measures degree of underperformance rather than forcing a binary cutoff.</w:t>
+      </w:r>
+    </w:p>
+    <w:p>
+      <w:pPr>
+        <w:pStyle w:val="BodyText"/>
+      </w:pPr>
+      <w:r>
+        <w:t xml:space="preserve">The team-fit extension adds a second check on heterogeneity. It asks whether a strong class matters more when its strongest prospect positions line up with a team’s roster weaknesses. In our version, the answer is not clear. The fit interaction is not statistically significant, so we do not make it part of the main conclusion. Still, including the extension makes the model more responsive to the basketball mechanism: teams are not only responding to abstract draft strength, but to the players they could realistically hope to add.</w:t>
+      </w:r>
+    </w:p>
+    <w:p>
+      <w:pPr>
+        <w:pStyle w:val="BodyText"/>
+      </w:pPr>
+      <w:r>
+        <w:t xml:space="preserve">The 2021 season remains an important case. Several teams underperformed sharply late in the season, but that year was shortened and affected by COVID-era scheduling and player availability. Rather than deleting 2021 from the main model, we include a separate 2021 control. We also include separate controls for 2012 and 2020 because those seasons were disrupted in different ways. This keeps the observations in the main analysis while acknowledging that they may not be comparable to normal 82-game seasons.</w:t>
+      </w:r>
+    </w:p>
+    <w:bookmarkEnd w:id="52"/>
+    <w:bookmarkEnd w:id="53"/>
+    <w:bookmarkStart w:id="57" w:name="vi.-next-steps"/>
     <w:p>
       <w:pPr>
         <w:pStyle w:val="Heading2"/>
       </w:pPr>
       <w:r>
-        <w:t xml:space="preserve">Discussion</w:t>
+        <w:t xml:space="preserve">VI. Next Steps</w:t>
       </w:r>
     </w:p>
     <w:p>
@@ -3566,7 +2907,24 @@
         <w:pStyle w:val="FirstParagraph"/>
       </w:pPr>
       <w:r>
-        <w:t xml:space="preserve">The main finding is that draft strength appears related to late-season losing signals, but the strength of the evidence depends on how directly we model incentives. The raw draft-strength figures show a clearer positive relationship, but they are partly season-level summaries. The position-adjusted model is more conservative because it asks whether a team’s own lottery position gives it more to gain from a strong class. In that model, the estimates remain positive for both the tanking index and sustained low performance, but they are not strong enough to support a causal claim.</w:t>
+        <w:t xml:space="preserve">The results should be interpreted cautiously. The model finds a positive relationship between position-adjusted top-four draft incentives and late-season underperformance, but it does not prove intent and should not be read as definitive evidence that teams deliberately lost games.</w:t>
+      </w:r>
+    </w:p>
+    <w:bookmarkStart w:id="54" w:name="limitations-and-cautions"/>
+    <w:p>
+      <w:pPr>
+        <w:pStyle w:val="Heading3"/>
+      </w:pPr>
+      <w:r>
+        <w:t xml:space="preserve">Limitations and Cautions</w:t>
+      </w:r>
+    </w:p>
+    <w:p>
+      <w:pPr>
+        <w:pStyle w:val="FirstParagraph"/>
+      </w:pPr>
+      <w:r>
+        <w:t xml:space="preserve">The biggest limitation is that tanking is not directly observable. We can observe losses, late-season underperformance, and playoff context, but we cannot observe whether a front office intended to lose. For that reason, all outcomes in this report should be interpreted as tanking proxies or tanking signals.</w:t>
       </w:r>
     </w:p>
     <w:p>
@@ -3574,7 +2932,25 @@
         <w:pStyle w:val="BodyText"/>
       </w:pPr>
       <w:r>
-        <w:t xml:space="preserve">The analysis also shows why the definition of tanking matters. A strict 10 percentage point late-collapse proxy flags only a small number of team-seasons. That makes the proxy conservative, but it can miss teams that were already very weak and remained very weak. It also creates extra noise by treating all non-flagged teams as the same. The full tanking index is better suited for regression because it measures degree of underperformance rather than forcing a binary cutoff. The sustained-low score then adds a complementary view of teams that stayed bad late in the season, even if they did not sharply decline after March.</w:t>
+        <w:t xml:space="preserve">A second limitation is that raw draft strength varies by season, not by team. Even after expanding the data to 2010-2026, there are only 17 draft-class observations. The position-adjusted incentive improves this by combining draft strength with each team’s lottery position, but part of the signal still comes from season-level variation in draft quality. The incentive measure is also simplified: it uses the marginal gain in top-four-pick probability from moving one lottery slot worse, so it does not distinguish between the value of the first, second, third, and fourth picks, larger multi-slot changes, player-specific team preferences, or the possibility that teams care about protecting an already-strong lottery position.</w:t>
+      </w:r>
+    </w:p>
+    <w:bookmarkEnd w:id="54"/>
+    <w:bookmarkStart w:id="55" w:name="future-extensions"/>
+    <w:p>
+      <w:pPr>
+        <w:pStyle w:val="Heading3"/>
+      </w:pPr>
+      <w:r>
+        <w:t xml:space="preserve">Future Extensions</w:t>
+      </w:r>
+    </w:p>
+    <w:p>
+      <w:pPr>
+        <w:pStyle w:val="FirstParagraph"/>
+      </w:pPr>
+      <w:r>
+        <w:t xml:space="preserve">A direct next step is to measure player resting more explicitly. One peer-review suggestion was to add a variable for whether teams benched starters or reduced minutes for their best players late in the season. A practical version would use player game logs to identify each team’s top pre-March minute players, then measure whether those players’ minutes or games played dropped sharply after March. This would help separate strategic late-season roster management from ordinary losing.</w:t>
       </w:r>
     </w:p>
     <w:p>
@@ -3582,7 +2958,7 @@
         <w:pStyle w:val="BodyText"/>
       </w:pPr>
       <w:r>
-        <w:t xml:space="preserve">The team-fit extension adds a second check on heterogeneity. It asks whether a strong class matters more when its strongest prospect positions line up with a team’s roster weaknesses. In our version, the answer is not clear. The fit interaction is not statistically significant, so we do not make it part of the main conclusion. Still, including the extension makes the model more responsive to the basketball mechanism: teams are not only responding to abstract draft strength, but to the players they could realistically hope to add.</w:t>
+        <w:t xml:space="preserve">Another extension would improve the team-fit score. The current version uses broad position groups and pre-March box-score production, not detailed roster needs, contracts, player age, front-office preferences, or team-specific draft evaluations. The fit extension should therefore be interpreted as a first-pass robustness check rather than a final answer about roster construction.</w:t>
       </w:r>
     </w:p>
     <w:p>
@@ -3590,17 +2966,17 @@
         <w:pStyle w:val="BodyText"/>
       </w:pPr>
       <w:r>
-        <w:t xml:space="preserve">The 2021 season remains an important case. Several teams underperformed sharply late in the season, but that year was shortened and affected by COVID-era scheduling and player availability. Rather than deleting 2021 from the main model, we include a separate 2021 control. We also include separate controls for 2012 and 2020 because those seasons were disrupted in different ways. This keeps the observations in the main analysis while acknowledging that they may not be comparable to normal 82-game seasons.</w:t>
-      </w:r>
-    </w:p>
-    <w:bookmarkEnd w:id="49"/>
-    <w:bookmarkStart w:id="50" w:name="limitations-and-future-work"/>
-    <w:p>
-      <w:pPr>
-        <w:pStyle w:val="Heading2"/>
-      </w:pPr>
-      <w:r>
-        <w:t xml:space="preserve">Limitations and Future Work</w:t>
+        <w:t xml:space="preserve">A final extension would compare multiple draft-quality measures. The CraftedNBA rating is useful because it gives one consistent external measure of draft class quality, but it is still one source’s model-based ranking. Future versions should test whether results change when draft strength is measured by top-prospect rating, number of elite prospects, consensus mock draft rankings, or later NBA outcomes such as win shares.</w:t>
+      </w:r>
+    </w:p>
+    <w:bookmarkEnd w:id="55"/>
+    <w:bookmarkStart w:id="56" w:name="final-takeaway"/>
+    <w:p>
+      <w:pPr>
+        <w:pStyle w:val="Heading3"/>
+      </w:pPr>
+      <w:r>
+        <w:t xml:space="preserve">Final Takeaway</w:t>
       </w:r>
     </w:p>
     <w:p>
@@ -3608,7 +2984,7 @@
         <w:pStyle w:val="FirstParagraph"/>
       </w:pPr>
       <w:r>
-        <w:t xml:space="preserve">The biggest limitation is that tanking is not directly observable. We can observe losses, late-season underperformance, and playoff context, but we cannot observe whether a front office intended to lose. For that reason, all outcomes in this report should be interpreted as tanking proxies or tanking signals.</w:t>
+        <w:t xml:space="preserve">This project finds suggestive evidence that draft class strength is related to late-season losing signals among likely lottery candidates. The clearest descriptive patterns come from season-level draft-strength graphs, while the more conservative position-adjusted model shows positive but noisier estimates. The full tanking index is a better final outcome than a hard 10 percentage point cutoff because it measures the size and direction of late-season underperformance instead of only flagging the most obvious collapses.</w:t>
       </w:r>
     </w:p>
     <w:p>
@@ -3616,7 +2992,7 @@
         <w:pStyle w:val="BodyText"/>
       </w:pPr>
       <w:r>
-        <w:t xml:space="preserve">A second limitation is that raw draft strength varies by season, not by team. Even after expanding the data to 2010-2026, there are only 17 draft-class observations. The position-adjusted incentive improves this by combining draft strength with each team’s lottery position, but part of the signal still comes from season-level variation in draft quality. The incentive measure is also simplified: it captures the marginal first-pick odds gained from moving one lottery slot worse, but it does not fully capture the incentive for an already-bottom team to protect its current lottery position.</w:t>
+        <w:t xml:space="preserve">The most defensible conclusion is therefore cautious: draft class quality appears relevant to tanking incentives, but the evidence is not strong enough to claim that stronger draft classes directly cause tanking. The project improves on simpler tanking analyses by combining playoff context, lottery position, standardized late-season underperformance, and draft class quality into one framework.</w:t>
       </w:r>
     </w:p>
     <w:p>
@@ -3624,61 +3000,12 @@
         <w:pStyle w:val="BodyText"/>
       </w:pPr>
       <w:r>
-        <w:t xml:space="preserve">A third limitation is that our current model does not directly measure player resting. One peer-review suggestion was to add a variable for whether teams benched starters or reduced minutes for their best players late in the season. That would be a strong addition. A practical version would use player game logs to identify each team’s top pre-March minute players, then measure whether those players’ minutes or games played dropped sharply after March. This would help separate strategic late-season roster management from ordinary losing.</w:t>
-      </w:r>
-    </w:p>
-    <w:p>
-      <w:pPr>
-        <w:pStyle w:val="BodyText"/>
-      </w:pPr>
-      <w:r>
-        <w:t xml:space="preserve">A fourth limitation is that the team-fit score is only a rough proxy. It uses broad position groups and pre-March box-score production, not detailed roster needs, contracts, player age, front-office preferences, or team-specific draft evaluations. The fit extension should therefore be interpreted as a first-pass robustness check rather than a final answer about roster construction.</w:t>
-      </w:r>
-    </w:p>
-    <w:p>
-      <w:pPr>
-        <w:pStyle w:val="BodyText"/>
-      </w:pPr>
-      <w:r>
-        <w:t xml:space="preserve">Finally, the CraftedNBA rating is useful because it gives one consistent external measure of draft class quality, but it is still one source’s model-based ranking. Future versions should test whether results change when draft strength is measured by top-prospect rating, number of elite prospects, consensus mock draft rankings, or later NBA outcomes such as win shares.</w:t>
-      </w:r>
-    </w:p>
-    <w:bookmarkEnd w:id="50"/>
-    <w:bookmarkStart w:id="51" w:name="conclusion"/>
-    <w:p>
-      <w:pPr>
-        <w:pStyle w:val="Heading2"/>
-      </w:pPr>
-      <w:r>
-        <w:t xml:space="preserve">Conclusion</w:t>
-      </w:r>
-    </w:p>
-    <w:p>
-      <w:pPr>
-        <w:pStyle w:val="FirstParagraph"/>
-      </w:pPr>
-      <w:r>
-        <w:t xml:space="preserve">This project finds suggestive evidence that draft class strength is related to late-season losing signals among likely lottery candidates. The clearest descriptive patterns come from season-level draft-strength graphs, while the more conservative position-adjusted model shows positive but noisier estimates. The full tanking index is a better final outcome than a hard 10 percentage point cutoff because it measures the size and direction of late-season underperformance instead of only flagging the most obvious collapses.</w:t>
-      </w:r>
-    </w:p>
-    <w:p>
-      <w:pPr>
-        <w:pStyle w:val="BodyText"/>
-      </w:pPr>
-      <w:r>
-        <w:t xml:space="preserve">The most defensible conclusion is therefore cautious: draft class quality appears relevant to tanking incentives, but the evidence is not strong enough to claim that stronger draft classes directly cause tanking. The project improves on simpler tanking analyses by combining playoff context, lottery position, standardized late-season underperformance, sustained low late-season performance, and draft class quality into one framework.</w:t>
-      </w:r>
-    </w:p>
-    <w:p>
-      <w:pPr>
-        <w:pStyle w:val="BodyText"/>
-      </w:pPr>
-      <w:r>
         <w:t xml:space="preserve">The exploratory team-fit extension is less conclusive. It gives a plausible way to think about team-level heterogeneity, but the broad fit proxy does not add strong statistical evidence beyond overall draft strength. That leaves team fit as an important direction for future work rather than a core result of this report.</w:t>
       </w:r>
     </w:p>
-    <w:bookmarkEnd w:id="51"/>
-    <w:bookmarkStart w:id="54" w:name="references"/>
+    <w:bookmarkEnd w:id="56"/>
+    <w:bookmarkEnd w:id="57"/>
+    <w:bookmarkStart w:id="60" w:name="references"/>
     <w:p>
       <w:pPr>
         <w:pStyle w:val="Heading2"/>
@@ -3701,7 +3028,7 @@
       <w:r>
         <w:t xml:space="preserve"> </w:t>
       </w:r>
-      <w:hyperlink r:id="rId25">
+      <w:hyperlink r:id="rId28">
         <w:r>
           <w:rPr>
             <w:rStyle w:val="Hyperlink"/>
@@ -3727,7 +3054,7 @@
       <w:r>
         <w:t xml:space="preserve"> </w:t>
       </w:r>
-      <w:hyperlink r:id="rId52">
+      <w:hyperlink r:id="rId58">
         <w:r>
           <w:rPr>
             <w:rStyle w:val="Hyperlink"/>
@@ -3753,7 +3080,7 @@
       <w:r>
         <w:t xml:space="preserve"> </w:t>
       </w:r>
-      <w:hyperlink r:id="rId24">
+      <w:hyperlink r:id="rId27">
         <w:r>
           <w:rPr>
             <w:rStyle w:val="Hyperlink"/>
@@ -3805,7 +3132,7 @@
       <w:r>
         <w:t xml:space="preserve"> </w:t>
       </w:r>
-      <w:hyperlink r:id="rId26">
+      <w:hyperlink r:id="rId23">
         <w:r>
           <w:rPr>
             <w:rStyle w:val="Hyperlink"/>
@@ -3831,7 +3158,7 @@
       <w:r>
         <w:t xml:space="preserve"> </w:t>
       </w:r>
-      <w:hyperlink r:id="rId53">
+      <w:hyperlink r:id="rId59">
         <w:r>
           <w:rPr>
             <w:rStyle w:val="Hyperlink"/>
@@ -3857,7 +3184,7 @@
       <w:r>
         <w:t xml:space="preserve"> </w:t>
       </w:r>
-      <w:hyperlink r:id="rId21">
+      <w:hyperlink r:id="rId25">
         <w:r>
           <w:rPr>
             <w:rStyle w:val="Hyperlink"/>
@@ -3883,7 +3210,7 @@
       <w:r>
         <w:t xml:space="preserve"> </w:t>
       </w:r>
-      <w:hyperlink r:id="rId20">
+      <w:hyperlink r:id="rId24">
         <w:r>
           <w:rPr>
             <w:rStyle w:val="Hyperlink"/>
@@ -3895,7 +3222,7 @@
         <w:t xml:space="preserve">.</w:t>
       </w:r>
     </w:p>
-    <w:bookmarkEnd w:id="54"/>
+    <w:bookmarkEnd w:id="60"/>
     <w:sectPr>
       <w:footnotePr>
         <w:numRestart w:val="eachSect"/>

</xml_diff>

<commit_message>
added a fourth model for player usage drop rate
</commit_message>
<xml_diff>
--- a/final-report.docx
+++ b/final-report.docx
@@ -32,7 +32,7 @@
         <w:pStyle w:val="FirstParagraph"/>
       </w:pPr>
       <w:r>
-        <w:t xml:space="preserve">This project studies whether stronger NBA draft classes are associated with more late-season underperformance among teams with weak playoff outlooks. Using NBA team game logs from 2010 through 2026 and CraftedNBA draft prospect ratings, we build a team-season dataset that compares each team’s performance before March 1 to its performance after March 1. As the project developed, we moved away from a simple binary definition of tanking and instead used a standardized</w:t>
+        <w:t xml:space="preserve">This project studies whether stronger NBA draft classes are associated with more late-season underperformance among teams with weak playoff outlooks. Using NBA team and player game logs from 2010 through 2026 and CraftedNBA draft prospect ratings, we build a team-season dataset that compares each team’s performance before March 1 to its performance after March 1. As the project developed, we moved away from a simple binary definition of tanking and instead used a standardized</w:t>
       </w:r>
       <w:r>
         <w:t xml:space="preserve"> </w:t>
@@ -44,7 +44,7 @@
         <w:t xml:space="preserve">tanking_index</w:t>
       </w:r>
       <w:r>
-        <w:t xml:space="preserve">, which measures how many fewer games a team won late in the season than expected from its pre-March record. We also changed the draft-strength measure from a broad top-35 average to the average rating of the top four prospects, because lottery incentives are most directly tied to access to the top of the draft. The main result is suggestive rather than conclusive: likely lottery teams with larger position-adjusted draft incentives tend to have larger late-season win shortfalls, but the evidence is limited by the fact that draft quality varies mostly by season and tanking intent is not directly observable.</w:t>
+        <w:t xml:space="preserve">, which measures how many fewer games a team won late in the season than expected from its pre-March record. We also changed the draft-strength measure from a broad top-35 average to the average rating of the top four prospects, because lottery incentives are most directly tied to access to the top of the draft. The main win-loss result is suggestive rather than conclusive: likely lottery teams with larger position-adjusted draft incentives tend to have larger late-season win shortfalls, but the evidence is limited by the fact that draft quality varies mostly by season and tanking intent is not directly observable. A fourth exploratory analysis finds a stronger relationship between top-four draft strength and reduced late-season minutes for continuing core players, which points to roster management as a useful follow-up tanking signal.</w:t>
       </w:r>
     </w:p>
     <w:bookmarkEnd w:id="20"/>
@@ -535,6 +535,24 @@
       </w:r>
       <w:r>
         <w:t xml:space="preserve">: an exploratory measure of whether a team’s pre-March positional weaknesses line up with the strongest positions in that draft class. We group both teams and prospects into guards, wings, and bigs. A team gets a higher fit score when its weakest pre-March position groups match the position groups where the draft class has more high-rated prospects.</w:t>
+      </w:r>
+    </w:p>
+    <w:p>
+      <w:pPr>
+        <w:pStyle w:val="Compact"/>
+        <w:numPr>
+          <w:ilvl w:val="0"/>
+          <w:numId w:val="1001"/>
+        </w:numPr>
+      </w:pPr>
+      <w:r>
+        <w:rPr>
+          <w:rStyle w:val="VerbatimChar"/>
+        </w:rPr>
+        <w:t xml:space="preserve">core_usage_drop_rate</w:t>
+      </w:r>
+      <w:r>
+        <w:t xml:space="preserve">: an exploratory roster-management outcome. We identify each team’s top three pre-March core players using starts and minutes, keep only players who appeared for the same team after March 1, and measure the percentage drop in their combined minutes per team game after March 1.</w:t>
       </w:r>
     </w:p>
     <w:p>
@@ -1438,7 +1456,7 @@
       </w:r>
     </w:p>
     <w:bookmarkEnd w:id="45"/>
-    <w:bookmarkStart w:id="53" w:name="v.-formal-analysis"/>
+    <w:bookmarkStart w:id="57" w:name="v.-formal-analysis"/>
     <w:p>
       <w:pPr>
         <w:pStyle w:val="Heading2"/>
@@ -1472,7 +1490,52 @@
         <w:pStyle w:val="BodyText"/>
       </w:pPr>
       <w:r>
-        <w:t xml:space="preserve">The final model’s key coefficient is the standardized position-adjusted draft incentive. It asks whether teams with larger marginal lottery rewards in stronger top-four draft classes have larger tanking signals after controlling for pre-March team strength and separate indicators for the disrupted 2012, 2020, and 2021 seasons. We also include two follow-up checks: whether the relationship changed after the 2019 lottery reform, and whether a team’s roster fit with the draft class adds explanatory power.</w:t>
+        <w:t xml:space="preserve">All formal regression models in this section use</w:t>
+      </w:r>
+      <w:r>
+        <w:t xml:space="preserve"> </w:t>
+      </w:r>
+      <w:r>
+        <w:rPr>
+          <w:b/>
+          <w:bCs/>
+        </w:rPr>
+        <w:t xml:space="preserve">team-season observations</w:t>
+      </w:r>
+      <w:r>
+        <w:t xml:space="preserve">, not one observation per season. In other words, a team like Houston in 2021 and Orlando in 2021 are separate observations because they had different pre-March records, lottery positions, marginal lottery incentives, and late-season outcomes. Some predictors, especially raw</w:t>
+      </w:r>
+      <w:r>
+        <w:t xml:space="preserve"> </w:t>
+      </w:r>
+      <w:r>
+        <w:rPr>
+          <w:rStyle w:val="VerbatimChar"/>
+        </w:rPr>
+        <w:t xml:space="preserve">top4_avg_rating</w:t>
+      </w:r>
+      <w:r>
+        <w:t xml:space="preserve">, still vary only by draft year. That means the draft-quality signal is partly season-level even though the regression dataset is team-season-level. This is why the final model uses</w:t>
+      </w:r>
+      <w:r>
+        <w:t xml:space="preserve"> </w:t>
+      </w:r>
+      <w:r>
+        <w:rPr>
+          <w:rStyle w:val="VerbatimChar"/>
+        </w:rPr>
+        <w:t xml:space="preserve">marginal_lottery_incentive</w:t>
+      </w:r>
+      <w:r>
+        <w:t xml:space="preserve">: it combines season-level draft strength with team-specific lottery position, giving teams in the same draft year different incentive values.</w:t>
+      </w:r>
+    </w:p>
+    <w:p>
+      <w:pPr>
+        <w:pStyle w:val="BodyText"/>
+      </w:pPr>
+      <w:r>
+        <w:t xml:space="preserve">The final model’s key coefficient is the standardized position-adjusted draft incentive. It asks whether teams with larger marginal lottery rewards in stronger top-four draft classes have larger tanking signals after controlling for pre-March team strength and separate indicators for the disrupted 2012, 2020, and 2021 seasons. We also include follow-up checks for whether the relationship changed after the 2019 lottery reform, whether a team’s roster fit with the draft class adds explanatory power, and whether stronger top-four draft classes are associated with late-season reductions in core-player minutes.</w:t>
       </w:r>
     </w:p>
     <w:bookmarkStart w:id="46" w:name="analysis-1-prepost-reform-interaction"/>
@@ -1717,6 +1780,29 @@
         <w:t xml:space="preserve">The interaction models were included because feedback suggested testing whether the relationship between draft strength and tanking signals changed after the 2019 lottery reform. They are useful as an exploratory check, but they are not our preferred final model. With only 17 draft-class seasons, splitting the draft-strength effect into pre- and post-reform components makes the model harder to estimate and easier for individual seasons to influence.</w:t>
       </w:r>
     </w:p>
+    <w:p>
+      <w:pPr>
+        <w:pStyle w:val="BodyText"/>
+      </w:pPr>
+      <w:r>
+        <w:t xml:space="preserve">The coefficient of interest in Table 2 is the draft-strength slope and its interaction with the post-2019 reform indicator. Because</w:t>
+      </w:r>
+      <w:r>
+        <w:t xml:space="preserve"> </w:t>
+      </w:r>
+      <w:r>
+        <w:rPr>
+          <w:rStyle w:val="VerbatimChar"/>
+        </w:rPr>
+        <w:t xml:space="preserve">top4_avg_rating</w:t>
+      </w:r>
+      <w:r>
+        <w:t xml:space="preserve"> </w:t>
+      </w:r>
+      <w:r>
+        <w:t xml:space="preserve">is standardized, the top-four draft rating coefficient means that, before the reform, a one-standard-deviation increase in top-four draft strength is associated with a 0.077 change in the tanking index, holding pre-March strength and disrupted-season controls fixed. The interaction coefficient of 0.207 is the additional post-reform change in that slope, so the implied post-reform slope is 0.284. Since the interaction p-value is 0.33, we do not treat this as strong evidence that the relationship changed after the lottery reform.</w:t>
+      </w:r>
+    </w:p>
     <w:bookmarkEnd w:id="46"/>
     <w:bookmarkStart w:id="47" w:name="Xe837124f9f200bd350346b45a493dd227e53ca1"/>
     <w:p>
@@ -1823,15 +1909,7 @@
         <w:pStyle w:val="BodyText"/>
       </w:pPr>
       <w:r>
-        <w:t xml:space="preserve">We also compared two ways of measuring draft strength: the average rating of the top 35 prospects and the average rating of only the top four prospects. The top-four version is our preferred measure because the lottery is mainly about access to the top of the draft. It also performs slightly better in the final model: the top-35 incentive p-value is 0.13, compared with 0.12 for the top-four incentive.</w:t>
-      </w:r>
-    </w:p>
-    <w:p>
-      <w:pPr>
-        <w:pStyle w:val="BodyText"/>
-      </w:pPr>
-      <w:r>
-        <w:t xml:space="preserve">We also compared the full</w:t>
+        <w:t xml:space="preserve">We also compared two ways of measuring draft strength: the average rating of the top 35 prospects and the average rating of only the top four prospects. The top-four version is our preferred measure because the lottery is mainly about access to the top of the draft. In both models, the coefficient of interest has the same interpretation: the expected change in</w:t>
       </w:r>
       <w:r>
         <w:t xml:space="preserve"> </w:t>
@@ -1846,7 +1924,30 @@
         <w:t xml:space="preserve"> </w:t>
       </w:r>
       <w:r>
-        <w:t xml:space="preserve">to the positive-only late-collapse score. The positive-only score is useful for labeling obvious cases, but it throws away information by setting all late-season overperformance to zero. With the same controls, the positive-only score gives a position-adjusted incentive p-value of 0.37, compared with 0.12 for the full</w:t>
+        <w:t xml:space="preserve">for a one-standard-deviation increase in the position-adjusted draft incentive. The top-four version performs slightly better in the final model: the top-35 incentive p-value is 0.13, compared with 0.12 for the top-four incentive.</w:t>
+      </w:r>
+    </w:p>
+    <w:p>
+      <w:pPr>
+        <w:pStyle w:val="BodyText"/>
+      </w:pPr>
+      <w:r>
+        <w:t xml:space="preserve">We also compared the full</w:t>
+      </w:r>
+      <w:r>
+        <w:t xml:space="preserve"> </w:t>
+      </w:r>
+      <w:r>
+        <w:rPr>
+          <w:rStyle w:val="VerbatimChar"/>
+        </w:rPr>
+        <w:t xml:space="preserve">tanking_index</w:t>
+      </w:r>
+      <w:r>
+        <w:t xml:space="preserve"> </w:t>
+      </w:r>
+      <w:r>
+        <w:t xml:space="preserve">to the positive-only late-collapse score. The positive-only model uses the same incentive coefficient, but the outcome changes: instead of predicting all late-season underperformance and overperformance, it predicts only the positive part of the late-collapse signal. The positive-only score is useful for labeling obvious cases, but it throws away information by setting all late-season overperformance to zero. With the same controls, the positive-only score gives a position-adjusted incentive p-value of 0.37, compared with 0.12 for the full</w:t>
       </w:r>
       <w:r>
         <w:t xml:space="preserve"> </w:t>
@@ -2265,7 +2366,7 @@
         <w:pStyle w:val="BodyText"/>
       </w:pPr>
       <w:r>
-        <w:t xml:space="preserve">The tanking-index model has a positive position-adjusted incentive coefficient of 0.157, with a p-value of 0.12. This is stronger than the earlier positive-only late-collapse score because the full index keeps all information: underperformance counts positively, while late-season overperformance counts against the tanking-incentive story.</w:t>
+        <w:t xml:space="preserve">The tanking-index model has a positive position-adjusted incentive coefficient of 0.157, with a p-value of 0.12. Because the incentive variable is standardized, this means that a likely lottery team with a one-standard-deviation larger marginal top-four draft incentive is expected to have a tanking index that is 0.157 units higher, holding pre-March win percentage and disrupted-season controls fixed. Positive values of the tanking index mean more late-season wins below expectation, so the positive coefficient points in the direction predicted by the tanking-incentive story. This is stronger than the earlier positive-only late-collapse score because the full index keeps all information: underperformance counts positively, while late-season overperformance counts against the tanking-incentive story.</w:t>
       </w:r>
     </w:p>
     <w:p>
@@ -2494,7 +2595,7 @@
         <w:pStyle w:val="BodyText"/>
       </w:pPr>
       <w:r>
-        <w:t xml:space="preserve">Excluding 2021 does not reverse the direction of the estimate. The position-adjusted incentive coefficient changes from 0.157 in the all-years model to 0.145 after excluding 2021, with the p-value changing from 0.12 to 0.14. This suggests that 2021 matters, but the main pattern is not simply a one-season artifact. The separate season controls in the main model let us keep all years in the primary analysis while acknowledging that disrupted seasons are not perfectly comparable to normal 82-game seasons.</w:t>
+        <w:t xml:space="preserve">Excluding 2021 does not reverse the direction of the estimate. The coefficient has the same interpretation as in Table 3, but it is estimated on the sample without the unusual 2021 season: a one-standard-deviation larger position-adjusted draft incentive is associated with a 0.145 higher tanking index, holding the remaining controls fixed. The position-adjusted incentive coefficient changes from 0.157 in the all-years model to 0.145 after excluding 2021, with the p-value changing from 0.12 to 0.14. This suggests that 2021 matters, but the main pattern is not simply a one-season artifact. The separate season controls in the main model let us keep all years in the primary analysis while acknowledging that disrupted seasons are not perfectly comparable to normal 82-game seasons.</w:t>
       </w:r>
     </w:p>
     <w:bookmarkEnd w:id="47"/>
@@ -2846,16 +2947,571 @@
         <w:pStyle w:val="BodyText"/>
       </w:pPr>
       <w:r>
-        <w:t xml:space="preserve">The team-fit interaction is not statistically significant. The interaction p-value is 0.76. This does not mean fit is irrelevant; it means our simple fit proxy does not add clear evidence beyond the main draft-strength model. A stronger version of this idea would use team-specific draft boards, roster contract data, or play-type needs instead of broad position groups.</w:t>
+        <w:t xml:space="preserve">The coefficient of interest in Table 5 is the interaction between top-four draft strength and team fit. Because both variables are standardized, the interaction coefficient of -0.032 means that a one-standard-deviation increase in team fit changes the draft-strength slope by -0.032 tanking-index units, holding the controls fixed. The interaction p-value is 0.76, so this is not statistically significant. This does not mean fit is irrelevant; it means our simple fit proxy does not add clear evidence beyond the main draft-strength model. A stronger version of this idea would use team-specific draft boards, roster contract data, or play-type needs instead of broad position groups.</w:t>
       </w:r>
     </w:p>
     <w:bookmarkEnd w:id="51"/>
-    <w:bookmarkStart w:id="52" w:name="conclusions-from-the-formal-analysis"/>
+    <w:bookmarkStart w:id="55" w:name="analysis-4-core-player-usage-reduction"/>
     <w:p>
       <w:pPr>
         <w:pStyle w:val="Heading3"/>
       </w:pPr>
       <w:r>
+        <w:t xml:space="preserve">Analysis 4: Core-Player Usage Reduction</w:t>
+      </w:r>
+    </w:p>
+    <w:p>
+      <w:pPr>
+        <w:pStyle w:val="FirstParagraph"/>
+      </w:pPr>
+      <w:r>
+        <w:t xml:space="preserve">The final exploratory model uses a different kind of tanking signal: whether likely lottery teams reduce the minutes of their main pre-March players late in the season. This is motivated by the idea that tanking may show up not only in losses, but also in roster management. We define each team’s core players as the three players with the most pre-March starts, breaking ties by pre-March minutes. To focus on usage changes rather than trades or complete absences, we keep only core players who appeared for the same team at least once after March 1. We then calculate their combined minutes per team game before March and after March. The outcome,</w:t>
+      </w:r>
+      <w:r>
+        <w:t xml:space="preserve"> </w:t>
+      </w:r>
+      <w:r>
+        <w:rPr>
+          <w:rStyle w:val="VerbatimChar"/>
+        </w:rPr>
+        <w:t xml:space="preserve">core_usage_drop_rate</w:t>
+      </w:r>
+      <w:r>
+        <w:t xml:space="preserve">, is the percentage drop in those core-player minutes after March 1. Positive values mean the team’s main continuing pre-March players were used less late in the season.</w:t>
+      </w:r>
+    </w:p>
+    <w:p>
+      <w:pPr>
+        <w:pStyle w:val="BodyText"/>
+      </w:pPr>
+      <w:r>
+        <w:t xml:space="preserve">This model should be interpreted cautiously. The player logs include</w:t>
+      </w:r>
+      <w:r>
+        <w:t xml:space="preserve"> </w:t>
+      </w:r>
+      <w:r>
+        <w:rPr>
+          <w:rStyle w:val="VerbatimChar"/>
+        </w:rPr>
+        <w:t xml:space="preserve">did_not_play</w:t>
+      </w:r>
+      <w:r>
+        <w:t xml:space="preserve">,</w:t>
+      </w:r>
+      <w:r>
+        <w:t xml:space="preserve"> </w:t>
+      </w:r>
+      <w:r>
+        <w:rPr>
+          <w:rStyle w:val="VerbatimChar"/>
+        </w:rPr>
+        <w:t xml:space="preserve">active</w:t>
+      </w:r>
+      <w:r>
+        <w:t xml:space="preserve">, and</w:t>
+      </w:r>
+      <w:r>
+        <w:t xml:space="preserve"> </w:t>
+      </w:r>
+      <w:r>
+        <w:rPr>
+          <w:rStyle w:val="VerbatimChar"/>
+        </w:rPr>
+        <w:t xml:space="preserve">reason</w:t>
+      </w:r>
+      <w:r>
+        <w:t xml:space="preserve"> </w:t>
+      </w:r>
+      <w:r>
+        <w:t xml:space="preserve">fields, but they do not perfectly tell us whether a player was healthy. Therefore this is a</w:t>
+      </w:r>
+      <w:r>
+        <w:t xml:space="preserve"> </w:t>
+      </w:r>
+      <w:r>
+        <w:rPr>
+          <w:b/>
+          <w:bCs/>
+        </w:rPr>
+        <w:t xml:space="preserve">core-player usage reduction</w:t>
+      </w:r>
+      <w:r>
+        <w:t xml:space="preserve"> </w:t>
+      </w:r>
+      <w:r>
+        <w:t xml:space="preserve">model, not proof that teams intentionally benched healthy starters. We use raw top-four draft rating here, instead of the position-adjusted lottery incentive, because this mechanism asks whether stronger top-end classes are associated with a broader roster-management response among likely lottery teams.</w:t>
+      </w:r>
+    </w:p>
+    <w:p>
+      <w:pPr>
+        <w:pStyle w:val="CaptionedFigure"/>
+      </w:pPr>
+      <w:r>
+        <w:drawing>
+          <wp:inline>
+            <wp:extent cx="5334000" cy="3597671"/>
+            <wp:effectExtent b="0" l="0" r="0" t="0"/>
+            <wp:docPr descr="Figure 7. Top-four draft strength and core-player usage reduction among likely lottery candidates. Each point is one team-season. Core players are the top three pre-March starters, among players who stayed with the same team and appeared after March 1. The y-axis is the percentage drop in their combined minutes per team game after March 1." title="" id="53" name="Picture"/>
+            <a:graphic>
+              <a:graphicData uri="http://schemas.openxmlformats.org/drawingml/2006/picture">
+                <pic:pic>
+                  <pic:nvPicPr>
+                    <pic:cNvPr descr="final-report_files/figure-docx/core-usage-visual-1.png" id="54" name="Picture"/>
+                    <pic:cNvPicPr>
+                      <a:picLocks noChangeArrowheads="1" noChangeAspect="1"/>
+                    </pic:cNvPicPr>
+                  </pic:nvPicPr>
+                  <pic:blipFill>
+                    <a:blip r:embed="rId52"/>
+                    <a:stretch>
+                      <a:fillRect/>
+                    </a:stretch>
+                  </pic:blipFill>
+                  <pic:spPr bwMode="auto">
+                    <a:xfrm>
+                      <a:off x="0" y="0"/>
+                      <a:ext cx="5334000" cy="3597671"/>
+                    </a:xfrm>
+                    <a:prstGeom prst="rect">
+                      <a:avLst/>
+                    </a:prstGeom>
+                    <a:noFill/>
+                    <a:ln w="9525">
+                      <a:noFill/>
+                      <a:headEnd/>
+                      <a:tailEnd/>
+                    </a:ln>
+                  </pic:spPr>
+                </pic:pic>
+              </a:graphicData>
+            </a:graphic>
+          </wp:inline>
+        </w:drawing>
+      </w:r>
+    </w:p>
+    <w:p>
+      <w:pPr>
+        <w:pStyle w:val="ImageCaption"/>
+      </w:pPr>
+      <w:r>
+        <w:t xml:space="preserve">Figure 7. Top-four draft strength and core-player usage reduction among likely lottery candidates. Each point is one team-season. Core players are the top three pre-March starters, among players who stayed with the same team and appeared after March 1. The y-axis is the percentage drop in their combined minutes per team game after March 1.</w:t>
+      </w:r>
+    </w:p>
+    <w:p>
+      <w:pPr>
+        <w:pStyle w:val="TableCaption"/>
+      </w:pPr>
+      <w:r>
+        <w:t xml:space="preserve">Table 6. Exploratory model predicting late-season core-player usage reduction among likely lottery candidates.</w:t>
+      </w:r>
+    </w:p>
+    <w:tbl>
+      <w:tblPr>
+        <w:tblStyle w:val="Table"/>
+        <w:tblW w:type="pct" w:w="5000"/>
+        <w:tblLayout w:type="fixed"/>
+        <w:tblLook w:firstRow="1" w:lastRow="0" w:firstColumn="0" w:lastColumn="0" w:noHBand="0" w:noVBand="0" w:val="0020"/>
+        <w:tblCaption w:val="Table 6. Exploratory model predicting late-season core-player usage reduction among likely lottery candidates."/>
+      </w:tblPr>
+      <w:tblGrid>
+        <w:gridCol w:w="2843"/>
+        <w:gridCol w:w="2233"/>
+        <w:gridCol w:w="913"/>
+        <w:gridCol w:w="1116"/>
+        <w:gridCol w:w="812"/>
+      </w:tblGrid>
+      <w:tr>
+        <w:trPr>
+          <w:tblHeader w:val="on"/>
+        </w:trPr>
+        <w:tc>
+          <w:tcPr/>
+          <w:p>
+            <w:pPr>
+              <w:pStyle w:val="Compact"/>
+              <w:jc w:val="left"/>
+            </w:pPr>
+            <w:r>
+              <w:t xml:space="preserve">Model</w:t>
+            </w:r>
+          </w:p>
+        </w:tc>
+        <w:tc>
+          <w:tcPr/>
+          <w:p>
+            <w:pPr>
+              <w:pStyle w:val="Compact"/>
+              <w:jc w:val="left"/>
+            </w:pPr>
+            <w:r>
+              <w:t xml:space="preserve">Term</w:t>
+            </w:r>
+          </w:p>
+        </w:tc>
+        <w:tc>
+          <w:tcPr/>
+          <w:p>
+            <w:pPr>
+              <w:pStyle w:val="Compact"/>
+              <w:jc w:val="right"/>
+            </w:pPr>
+            <w:r>
+              <w:t xml:space="preserve">Estimate</w:t>
+            </w:r>
+          </w:p>
+        </w:tc>
+        <w:tc>
+          <w:tcPr/>
+          <w:p>
+            <w:pPr>
+              <w:pStyle w:val="Compact"/>
+              <w:jc w:val="right"/>
+            </w:pPr>
+            <w:r>
+              <w:t xml:space="preserve">Std. error</w:t>
+            </w:r>
+          </w:p>
+        </w:tc>
+        <w:tc>
+          <w:tcPr/>
+          <w:p>
+            <w:pPr>
+              <w:pStyle w:val="Compact"/>
+              <w:jc w:val="right"/>
+            </w:pPr>
+            <w:r>
+              <w:t xml:space="preserve">p-value</w:t>
+            </w:r>
+          </w:p>
+        </w:tc>
+      </w:tr>
+      <w:tr>
+        <w:tc>
+          <w:tcPr/>
+          <w:p>
+            <w:pPr>
+              <w:pStyle w:val="Compact"/>
+              <w:jc w:val="left"/>
+            </w:pPr>
+            <w:r>
+              <w:t xml:space="preserve">Core-player usage drop rate</w:t>
+            </w:r>
+          </w:p>
+        </w:tc>
+        <w:tc>
+          <w:tcPr/>
+          <w:p>
+            <w:pPr>
+              <w:pStyle w:val="Compact"/>
+              <w:jc w:val="left"/>
+            </w:pPr>
+            <w:r>
+              <w:t xml:space="preserve">Top-four draft rating</w:t>
+            </w:r>
+          </w:p>
+        </w:tc>
+        <w:tc>
+          <w:tcPr/>
+          <w:p>
+            <w:pPr>
+              <w:pStyle w:val="Compact"/>
+              <w:jc w:val="right"/>
+            </w:pPr>
+            <w:r>
+              <w:t xml:space="preserve">0.054</w:t>
+            </w:r>
+          </w:p>
+        </w:tc>
+        <w:tc>
+          <w:tcPr/>
+          <w:p>
+            <w:pPr>
+              <w:pStyle w:val="Compact"/>
+              <w:jc w:val="right"/>
+            </w:pPr>
+            <w:r>
+              <w:t xml:space="preserve">0.016</w:t>
+            </w:r>
+          </w:p>
+        </w:tc>
+        <w:tc>
+          <w:tcPr/>
+          <w:p>
+            <w:pPr>
+              <w:pStyle w:val="Compact"/>
+              <w:jc w:val="right"/>
+            </w:pPr>
+            <w:r>
+              <w:t xml:space="preserve">0.001</w:t>
+            </w:r>
+          </w:p>
+        </w:tc>
+      </w:tr>
+      <w:tr>
+        <w:tc>
+          <w:tcPr/>
+          <w:p>
+            <w:pPr>
+              <w:pStyle w:val="Compact"/>
+              <w:jc w:val="left"/>
+            </w:pPr>
+            <w:r>
+              <w:t xml:space="preserve">Core-player usage drop rate</w:t>
+            </w:r>
+          </w:p>
+        </w:tc>
+        <w:tc>
+          <w:tcPr/>
+          <w:p>
+            <w:pPr>
+              <w:pStyle w:val="Compact"/>
+              <w:jc w:val="left"/>
+            </w:pPr>
+            <w:r>
+              <w:t xml:space="preserve">Pre-March core MPG</w:t>
+            </w:r>
+          </w:p>
+        </w:tc>
+        <w:tc>
+          <w:tcPr/>
+          <w:p>
+            <w:pPr>
+              <w:pStyle w:val="Compact"/>
+              <w:jc w:val="right"/>
+            </w:pPr>
+            <w:r>
+              <w:t xml:space="preserve">0.000</w:t>
+            </w:r>
+          </w:p>
+        </w:tc>
+        <w:tc>
+          <w:tcPr/>
+          <w:p>
+            <w:pPr>
+              <w:pStyle w:val="Compact"/>
+              <w:jc w:val="right"/>
+            </w:pPr>
+            <w:r>
+              <w:t xml:space="preserve">0.001</w:t>
+            </w:r>
+          </w:p>
+        </w:tc>
+        <w:tc>
+          <w:tcPr/>
+          <w:p>
+            <w:pPr>
+              <w:pStyle w:val="Compact"/>
+              <w:jc w:val="right"/>
+            </w:pPr>
+            <w:r>
+              <w:t xml:space="preserve">0.591</w:t>
+            </w:r>
+          </w:p>
+        </w:tc>
+      </w:tr>
+      <w:tr>
+        <w:tc>
+          <w:tcPr/>
+          <w:p>
+            <w:pPr>
+              <w:pStyle w:val="Compact"/>
+              <w:jc w:val="left"/>
+            </w:pPr>
+            <w:r>
+              <w:t xml:space="preserve">Core-player usage drop rate</w:t>
+            </w:r>
+          </w:p>
+        </w:tc>
+        <w:tc>
+          <w:tcPr/>
+          <w:p>
+            <w:pPr>
+              <w:pStyle w:val="Compact"/>
+              <w:jc w:val="left"/>
+            </w:pPr>
+            <w:r>
+              <w:t xml:space="preserve">2012 season</w:t>
+            </w:r>
+          </w:p>
+        </w:tc>
+        <w:tc>
+          <w:tcPr/>
+          <w:p>
+            <w:pPr>
+              <w:pStyle w:val="Compact"/>
+              <w:jc w:val="right"/>
+            </w:pPr>
+            <w:r>
+              <w:t xml:space="preserve">0.057</w:t>
+            </w:r>
+          </w:p>
+        </w:tc>
+        <w:tc>
+          <w:tcPr/>
+          <w:p>
+            <w:pPr>
+              <w:pStyle w:val="Compact"/>
+              <w:jc w:val="right"/>
+            </w:pPr>
+            <w:r>
+              <w:t xml:space="preserve">0.065</w:t>
+            </w:r>
+          </w:p>
+        </w:tc>
+        <w:tc>
+          <w:tcPr/>
+          <w:p>
+            <w:pPr>
+              <w:pStyle w:val="Compact"/>
+              <w:jc w:val="right"/>
+            </w:pPr>
+            <w:r>
+              <w:t xml:space="preserve">0.386</w:t>
+            </w:r>
+          </w:p>
+        </w:tc>
+      </w:tr>
+      <w:tr>
+        <w:tc>
+          <w:tcPr/>
+          <w:p>
+            <w:pPr>
+              <w:pStyle w:val="Compact"/>
+              <w:jc w:val="left"/>
+            </w:pPr>
+            <w:r>
+              <w:t xml:space="preserve">Core-player usage drop rate</w:t>
+            </w:r>
+          </w:p>
+        </w:tc>
+        <w:tc>
+          <w:tcPr/>
+          <w:p>
+            <w:pPr>
+              <w:pStyle w:val="Compact"/>
+              <w:jc w:val="left"/>
+            </w:pPr>
+            <w:r>
+              <w:t xml:space="preserve">2020 season</w:t>
+            </w:r>
+          </w:p>
+        </w:tc>
+        <w:tc>
+          <w:tcPr/>
+          <w:p>
+            <w:pPr>
+              <w:pStyle w:val="Compact"/>
+              <w:jc w:val="right"/>
+            </w:pPr>
+            <w:r>
+              <w:t xml:space="preserve">-0.178</w:t>
+            </w:r>
+          </w:p>
+        </w:tc>
+        <w:tc>
+          <w:tcPr/>
+          <w:p>
+            <w:pPr>
+              <w:pStyle w:val="Compact"/>
+              <w:jc w:val="right"/>
+            </w:pPr>
+            <w:r>
+              <w:t xml:space="preserve">0.063</w:t>
+            </w:r>
+          </w:p>
+        </w:tc>
+        <w:tc>
+          <w:tcPr/>
+          <w:p>
+            <w:pPr>
+              <w:pStyle w:val="Compact"/>
+              <w:jc w:val="right"/>
+            </w:pPr>
+            <w:r>
+              <w:t xml:space="preserve">0.005</w:t>
+            </w:r>
+          </w:p>
+        </w:tc>
+      </w:tr>
+      <w:tr>
+        <w:tc>
+          <w:tcPr/>
+          <w:p>
+            <w:pPr>
+              <w:pStyle w:val="Compact"/>
+              <w:jc w:val="left"/>
+            </w:pPr>
+            <w:r>
+              <w:t xml:space="preserve">Core-player usage drop rate</w:t>
+            </w:r>
+          </w:p>
+        </w:tc>
+        <w:tc>
+          <w:tcPr/>
+          <w:p>
+            <w:pPr>
+              <w:pStyle w:val="Compact"/>
+              <w:jc w:val="left"/>
+            </w:pPr>
+            <w:r>
+              <w:t xml:space="preserve">2021 season</w:t>
+            </w:r>
+          </w:p>
+        </w:tc>
+        <w:tc>
+          <w:tcPr/>
+          <w:p>
+            <w:pPr>
+              <w:pStyle w:val="Compact"/>
+              <w:jc w:val="right"/>
+            </w:pPr>
+            <w:r>
+              <w:t xml:space="preserve">0.181</w:t>
+            </w:r>
+          </w:p>
+        </w:tc>
+        <w:tc>
+          <w:tcPr/>
+          <w:p>
+            <w:pPr>
+              <w:pStyle w:val="Compact"/>
+              <w:jc w:val="right"/>
+            </w:pPr>
+            <w:r>
+              <w:t xml:space="preserve">0.080</w:t>
+            </w:r>
+          </w:p>
+        </w:tc>
+        <w:tc>
+          <w:tcPr/>
+          <w:p>
+            <w:pPr>
+              <w:pStyle w:val="Compact"/>
+              <w:jc w:val="right"/>
+            </w:pPr>
+            <w:r>
+              <w:t xml:space="preserve">0.025</w:t>
+            </w:r>
+          </w:p>
+        </w:tc>
+      </w:tr>
+    </w:tbl>
+    <w:p>
+      <w:pPr>
+        <w:pStyle w:val="BodyText"/>
+      </w:pPr>
+      <w:r>
+        <w:t xml:space="preserve">The coefficient of interest in Table 6 is the standardized top-four draft rating. Because the draft rating is standardized and the outcome is a percentage drop in core-player minutes, the coefficient of 0.054 means that a one-standard-deviation stronger top-four draft class is associated with a 5.4 percentage point larger drop in late-season core-player usage, holding pre-March core-player minutes and disrupted-season controls fixed. The p-value is 0.00098, so this exploratory model gives stronger evidence of a roster-management pattern than the earlier win-loss models. Still, it should not be interpreted as causal proof of tanking because injuries, planned rest, player development, and unobserved availability can also affect late-season minutes.</w:t>
+      </w:r>
+    </w:p>
+    <w:bookmarkEnd w:id="55"/>
+    <w:bookmarkStart w:id="56" w:name="conclusions-from-the-formal-analysis"/>
+    <w:p>
+      <w:pPr>
+        <w:pStyle w:val="Heading3"/>
+      </w:pPr>
+      <w:r>
         <w:t xml:space="preserve">Conclusions From the Formal Analysis</w:t>
       </w:r>
     </w:p>
@@ -2888,124 +3544,132 @@
         <w:pStyle w:val="BodyText"/>
       </w:pPr>
       <w:r>
+        <w:t xml:space="preserve">The core-player usage model adds a different type of outcome. It asks whether stronger top-four draft classes are associated with using main continuing pre-March players less often late in the season. This is closer to a behavioral tanking mechanism than the win-loss outcome alone, and this version points in the expected direction: stronger top-four classes are associated with larger percentage drops in core-player minutes. At the same time, the result is exploratory because injuries, planned rest, player development, and unobserved availability can all reduce minutes for reasons unrelated to intentional tanking.</w:t>
+      </w:r>
+    </w:p>
+    <w:p>
+      <w:pPr>
+        <w:pStyle w:val="BodyText"/>
+      </w:pPr>
+      <w:r>
         <w:t xml:space="preserve">The 2021 season remains an important case. Several teams underperformed sharply late in the season, but that year was shortened and affected by COVID-era scheduling and player availability. Rather than deleting 2021 from the main model, we include a separate 2021 control. We also include separate controls for 2012 and 2020 because those seasons were disrupted in different ways. This keeps the observations in the main analysis while acknowledging that they may not be comparable to normal 82-game seasons.</w:t>
-      </w:r>
-    </w:p>
-    <w:bookmarkEnd w:id="52"/>
-    <w:bookmarkEnd w:id="53"/>
-    <w:bookmarkStart w:id="57" w:name="vi.-next-steps"/>
-    <w:p>
-      <w:pPr>
-        <w:pStyle w:val="Heading2"/>
-      </w:pPr>
-      <w:r>
-        <w:t xml:space="preserve">VI. Next Steps</w:t>
-      </w:r>
-    </w:p>
-    <w:p>
-      <w:pPr>
-        <w:pStyle w:val="FirstParagraph"/>
-      </w:pPr>
-      <w:r>
-        <w:t xml:space="preserve">The results should be interpreted cautiously. The model finds a positive relationship between position-adjusted top-four draft incentives and late-season underperformance, but it does not prove intent and should not be read as definitive evidence that teams deliberately lost games.</w:t>
-      </w:r>
-    </w:p>
-    <w:bookmarkStart w:id="54" w:name="limitations-and-cautions"/>
-    <w:p>
-      <w:pPr>
-        <w:pStyle w:val="Heading3"/>
-      </w:pPr>
-      <w:r>
-        <w:t xml:space="preserve">Limitations and Cautions</w:t>
-      </w:r>
-    </w:p>
-    <w:p>
-      <w:pPr>
-        <w:pStyle w:val="FirstParagraph"/>
-      </w:pPr>
-      <w:r>
-        <w:t xml:space="preserve">The biggest limitation is that tanking is not directly observable. We can observe losses, late-season underperformance, and playoff context, but we cannot observe whether a front office intended to lose. For that reason, all outcomes in this report should be interpreted as tanking proxies or tanking signals.</w:t>
-      </w:r>
-    </w:p>
-    <w:p>
-      <w:pPr>
-        <w:pStyle w:val="BodyText"/>
-      </w:pPr>
-      <w:r>
-        <w:t xml:space="preserve">A second limitation is that raw draft strength varies by season, not by team. Even after expanding the data to 2010-2026, there are only 17 draft-class observations. The position-adjusted incentive improves this by combining draft strength with each team’s lottery position, but part of the signal still comes from season-level variation in draft quality. The incentive measure is also simplified: it uses the marginal gain in top-four-pick probability from moving one lottery slot worse, so it does not distinguish between the value of the first, second, third, and fourth picks, larger multi-slot changes, player-specific team preferences, or the possibility that teams care about protecting an already-strong lottery position.</w:t>
-      </w:r>
-    </w:p>
-    <w:bookmarkEnd w:id="54"/>
-    <w:bookmarkStart w:id="55" w:name="future-extensions"/>
-    <w:p>
-      <w:pPr>
-        <w:pStyle w:val="Heading3"/>
-      </w:pPr>
-      <w:r>
-        <w:t xml:space="preserve">Future Extensions</w:t>
-      </w:r>
-    </w:p>
-    <w:p>
-      <w:pPr>
-        <w:pStyle w:val="FirstParagraph"/>
-      </w:pPr>
-      <w:r>
-        <w:t xml:space="preserve">A direct next step is to measure player resting more explicitly. One peer-review suggestion was to add a variable for whether teams benched starters or reduced minutes for their best players late in the season. A practical version would use player game logs to identify each team’s top pre-March minute players, then measure whether those players’ minutes or games played dropped sharply after March. This would help separate strategic late-season roster management from ordinary losing.</w:t>
-      </w:r>
-    </w:p>
-    <w:p>
-      <w:pPr>
-        <w:pStyle w:val="BodyText"/>
-      </w:pPr>
-      <w:r>
-        <w:t xml:space="preserve">Another extension would improve the team-fit score. The current version uses broad position groups and pre-March box-score production, not detailed roster needs, contracts, player age, front-office preferences, or team-specific draft evaluations. The fit extension should therefore be interpreted as a first-pass robustness check rather than a final answer about roster construction.</w:t>
-      </w:r>
-    </w:p>
-    <w:p>
-      <w:pPr>
-        <w:pStyle w:val="BodyText"/>
-      </w:pPr>
-      <w:r>
-        <w:t xml:space="preserve">A final extension would compare multiple draft-quality measures. The CraftedNBA rating is useful because it gives one consistent external measure of draft class quality, but it is still one source’s model-based ranking. Future versions should test whether results change when draft strength is measured by top-prospect rating, number of elite prospects, consensus mock draft rankings, or later NBA outcomes such as win shares.</w:t>
-      </w:r>
-    </w:p>
-    <w:bookmarkEnd w:id="55"/>
-    <w:bookmarkStart w:id="56" w:name="final-takeaway"/>
-    <w:p>
-      <w:pPr>
-        <w:pStyle w:val="Heading3"/>
-      </w:pPr>
-      <w:r>
-        <w:t xml:space="preserve">Final Takeaway</w:t>
-      </w:r>
-    </w:p>
-    <w:p>
-      <w:pPr>
-        <w:pStyle w:val="FirstParagraph"/>
-      </w:pPr>
-      <w:r>
-        <w:t xml:space="preserve">This project finds suggestive evidence that draft class strength is related to late-season losing signals among likely lottery candidates. The clearest descriptive patterns come from season-level draft-strength graphs, while the more conservative position-adjusted model shows positive but noisier estimates. The full tanking index is a better final outcome than a hard 10 percentage point cutoff because it measures the size and direction of late-season underperformance instead of only flagging the most obvious collapses.</w:t>
-      </w:r>
-    </w:p>
-    <w:p>
-      <w:pPr>
-        <w:pStyle w:val="BodyText"/>
-      </w:pPr>
-      <w:r>
-        <w:t xml:space="preserve">The most defensible conclusion is therefore cautious: draft class quality appears relevant to tanking incentives, but the evidence is not strong enough to claim that stronger draft classes directly cause tanking. The project improves on simpler tanking analyses by combining playoff context, lottery position, standardized late-season underperformance, and draft class quality into one framework.</w:t>
-      </w:r>
-    </w:p>
-    <w:p>
-      <w:pPr>
-        <w:pStyle w:val="BodyText"/>
-      </w:pPr>
-      <w:r>
-        <w:t xml:space="preserve">The exploratory team-fit extension is less conclusive. It gives a plausible way to think about team-level heterogeneity, but the broad fit proxy does not add strong statistical evidence beyond overall draft strength. That leaves team fit as an important direction for future work rather than a core result of this report.</w:t>
       </w:r>
     </w:p>
     <w:bookmarkEnd w:id="56"/>
     <w:bookmarkEnd w:id="57"/>
-    <w:bookmarkStart w:id="60" w:name="references"/>
+    <w:bookmarkStart w:id="61" w:name="vi.-next-steps"/>
+    <w:p>
+      <w:pPr>
+        <w:pStyle w:val="Heading2"/>
+      </w:pPr>
+      <w:r>
+        <w:t xml:space="preserve">VI. Next Steps</w:t>
+      </w:r>
+    </w:p>
+    <w:p>
+      <w:pPr>
+        <w:pStyle w:val="FirstParagraph"/>
+      </w:pPr>
+      <w:r>
+        <w:t xml:space="preserve">The results should be interpreted cautiously. The model finds a positive relationship between position-adjusted top-four draft incentives and late-season underperformance, but it does not prove intent and should not be read as definitive evidence that teams deliberately lost games.</w:t>
+      </w:r>
+    </w:p>
+    <w:bookmarkStart w:id="58" w:name="limitations-and-cautions"/>
+    <w:p>
+      <w:pPr>
+        <w:pStyle w:val="Heading3"/>
+      </w:pPr>
+      <w:r>
+        <w:t xml:space="preserve">Limitations and Cautions</w:t>
+      </w:r>
+    </w:p>
+    <w:p>
+      <w:pPr>
+        <w:pStyle w:val="FirstParagraph"/>
+      </w:pPr>
+      <w:r>
+        <w:t xml:space="preserve">The biggest limitation is that tanking is not directly observable. We can observe losses, late-season underperformance, and playoff context, but we cannot observe whether a front office intended to lose. For that reason, all outcomes in this report should be interpreted as tanking proxies or tanking signals.</w:t>
+      </w:r>
+    </w:p>
+    <w:p>
+      <w:pPr>
+        <w:pStyle w:val="BodyText"/>
+      </w:pPr>
+      <w:r>
+        <w:t xml:space="preserve">A second limitation is that raw draft strength varies by season, not by team. Even after expanding the data to 2010-2026, there are only 17 draft-class observations. The position-adjusted incentive improves this by combining draft strength with each team’s lottery position, but part of the signal still comes from season-level variation in draft quality. The incentive measure is also simplified: it uses the marginal gain in top-four-pick probability from moving one lottery slot worse, so it does not distinguish between the value of the first, second, third, and fourth picks, larger multi-slot changes, player-specific team preferences, or the possibility that teams care about protecting an already-strong lottery position.</w:t>
+      </w:r>
+    </w:p>
+    <w:bookmarkEnd w:id="58"/>
+    <w:bookmarkStart w:id="59" w:name="future-extensions"/>
+    <w:p>
+      <w:pPr>
+        <w:pStyle w:val="Heading3"/>
+      </w:pPr>
+      <w:r>
+        <w:t xml:space="preserve">Future Extensions</w:t>
+      </w:r>
+    </w:p>
+    <w:p>
+      <w:pPr>
+        <w:pStyle w:val="FirstParagraph"/>
+      </w:pPr>
+      <w:r>
+        <w:t xml:space="preserve">A direct next step is to improve the core-player usage model with better availability data. The version in this report uses player game logs to identify each team’s main pre-March players who stayed with the team and appeared after March 1, then measures whether their minutes drop late in the season. This keeps the analysis focused on continuing players, but it still cannot perfectly distinguish injuries, rest, player development, and coach’s decisions. A stronger version would merge injury reports, transaction data, and inactive-list reasons to separate strategic late-season roster management from ordinary player availability.</w:t>
+      </w:r>
+    </w:p>
+    <w:p>
+      <w:pPr>
+        <w:pStyle w:val="BodyText"/>
+      </w:pPr>
+      <w:r>
+        <w:t xml:space="preserve">Another extension would improve the team-fit score. The current version uses broad position groups and pre-March box-score production, not detailed roster needs, contracts, player age, front-office preferences, or team-specific draft evaluations. The fit extension should therefore be interpreted as a first-pass robustness check rather than a final answer about roster construction.</w:t>
+      </w:r>
+    </w:p>
+    <w:p>
+      <w:pPr>
+        <w:pStyle w:val="BodyText"/>
+      </w:pPr>
+      <w:r>
+        <w:t xml:space="preserve">A final extension would compare multiple draft-quality measures. The CraftedNBA rating is useful because it gives one consistent external measure of draft class quality, but it is still one source’s model-based ranking. Future versions should test whether results change when draft strength is measured by top-prospect rating, number of elite prospects, consensus mock draft rankings, or later NBA outcomes such as win shares.</w:t>
+      </w:r>
+    </w:p>
+    <w:bookmarkEnd w:id="59"/>
+    <w:bookmarkStart w:id="60" w:name="final-takeaway"/>
+    <w:p>
+      <w:pPr>
+        <w:pStyle w:val="Heading3"/>
+      </w:pPr>
+      <w:r>
+        <w:t xml:space="preserve">Final Takeaway</w:t>
+      </w:r>
+    </w:p>
+    <w:p>
+      <w:pPr>
+        <w:pStyle w:val="FirstParagraph"/>
+      </w:pPr>
+      <w:r>
+        <w:t xml:space="preserve">This project finds suggestive evidence that draft class strength is related to late-season losing signals among likely lottery candidates. The clearest descriptive patterns come from season-level draft-strength graphs, while the more conservative position-adjusted win-loss model shows positive but noisier estimates. The core-player usage model adds a stronger exploratory signal that teams in better top-four draft classes reduced minutes more for continuing core players. The full tanking index is a better final win-loss outcome than a hard 10 percentage point cutoff because it measures the size and direction of late-season underperformance instead of only flagging the most obvious collapses.</w:t>
+      </w:r>
+    </w:p>
+    <w:p>
+      <w:pPr>
+        <w:pStyle w:val="BodyText"/>
+      </w:pPr>
+      <w:r>
+        <w:t xml:space="preserve">The most defensible conclusion is therefore cautious: draft class quality appears relevant to tanking incentives, but the evidence is not strong enough to claim that stronger draft classes directly cause tanking. The project improves on simpler tanking analyses by combining playoff context, lottery position, standardized late-season underperformance, and draft class quality into one framework.</w:t>
+      </w:r>
+    </w:p>
+    <w:p>
+      <w:pPr>
+        <w:pStyle w:val="BodyText"/>
+      </w:pPr>
+      <w:r>
+        <w:t xml:space="preserve">The exploratory team-fit extension is less conclusive. It gives a plausible way to think about team-level heterogeneity, but the broad fit proxy does not add strong statistical evidence beyond overall draft strength. That leaves team fit as an important direction for future work rather than a core result of this report.</w:t>
+      </w:r>
+    </w:p>
+    <w:bookmarkEnd w:id="60"/>
+    <w:bookmarkEnd w:id="61"/>
+    <w:bookmarkStart w:id="64" w:name="references"/>
     <w:p>
       <w:pPr>
         <w:pStyle w:val="Heading2"/>
@@ -3054,7 +3718,7 @@
       <w:r>
         <w:t xml:space="preserve"> </w:t>
       </w:r>
-      <w:hyperlink r:id="rId58">
+      <w:hyperlink r:id="rId62">
         <w:r>
           <w:rPr>
             <w:rStyle w:val="Hyperlink"/>
@@ -3158,7 +3822,7 @@
       <w:r>
         <w:t xml:space="preserve"> </w:t>
       </w:r>
-      <w:hyperlink r:id="rId59">
+      <w:hyperlink r:id="rId63">
         <w:r>
           <w:rPr>
             <w:rStyle w:val="Hyperlink"/>
@@ -3222,7 +3886,7 @@
         <w:t xml:space="preserve">.</w:t>
       </w:r>
     </w:p>
-    <w:bookmarkEnd w:id="60"/>
+    <w:bookmarkEnd w:id="64"/>
     <w:sectPr>
       <w:footnotePr>
         <w:numRestart w:val="eachSect"/>

</xml_diff>

<commit_message>
removed tanking indicator from graphs
</commit_message>
<xml_diff>
--- a/final-report.docx
+++ b/final-report.docx
@@ -342,7 +342,40 @@
         <w:t xml:space="preserve">pre_win_pct</w:t>
       </w:r>
       <w:r>
-        <w:t xml:space="preserve">: team win percentage before March 1.</w:t>
+        <w:t xml:space="preserve"> </w:t>
+      </w:r>
+      <w:r>
+        <w:t xml:space="preserve">and</w:t>
+      </w:r>
+      <w:r>
+        <w:t xml:space="preserve"> </w:t>
+      </w:r>
+      <w:r>
+        <w:rPr>
+          <w:rStyle w:val="VerbatimChar"/>
+        </w:rPr>
+        <w:t xml:space="preserve">late_win_pct</w:t>
+      </w:r>
+      <w:r>
+        <w:t xml:space="preserve"> </w:t>
+      </w:r>
+      <w:r>
+        <w:t xml:space="preserve">are each team’s winning percentage before March 1 and on or after March 1.</w:t>
+      </w:r>
+      <w:r>
+        <w:t xml:space="preserve"> </w:t>
+      </w:r>
+      <w:r>
+        <w:rPr>
+          <w:rStyle w:val="VerbatimChar"/>
+        </w:rPr>
+        <w:t xml:space="preserve">pre_win_pct</w:t>
+      </w:r>
+      <w:r>
+        <w:t xml:space="preserve"> </w:t>
+      </w:r>
+      <w:r>
+        <w:t xml:space="preserve">is used as a baseline team-strength control because a team that was already very weak before March should not be evaluated the same way as a team that was close to .500.</w:t>
       </w:r>
     </w:p>
     <w:p>
@@ -357,10 +390,13 @@
         <w:rPr>
           <w:rStyle w:val="VerbatimChar"/>
         </w:rPr>
-        <w:t xml:space="preserve">late_win_pct</w:t>
-      </w:r>
-      <w:r>
-        <w:t xml:space="preserve">: team win percentage on or after March 1.</w:t>
+        <w:t xml:space="preserve">games_back_cutline</w:t>
+      </w:r>
+      <w:r>
+        <w:t xml:space="preserve"> </w:t>
+      </w:r>
+      <w:r>
+        <w:t xml:space="preserve">measures how far a team was from the postseason/play-in cutoff entering March. For seasons before the play-in era, the cutoff is the 8th seed. For seasons beginning in 2021, the cutoff is the 10th seed. We use this to help identify teams with weak playoff outlooks.</w:t>
       </w:r>
     </w:p>
     <w:p>
@@ -375,10 +411,13 @@
         <w:rPr>
           <w:rStyle w:val="VerbatimChar"/>
         </w:rPr>
-        <w:t xml:space="preserve">games_back_cutline</w:t>
-      </w:r>
-      <w:r>
-        <w:t xml:space="preserve">: games behind the postseason/play-in cutoff entering March. For seasons before the play-in era, the cutoff is the 8th seed. For seasons beginning in 2021, the cutoff is the 10th seed.</w:t>
+        <w:t xml:space="preserve">likely_lottery_candidate</w:t>
+      </w:r>
+      <w:r>
+        <w:t xml:space="preserve"> </w:t>
+      </w:r>
+      <w:r>
+        <w:t xml:space="preserve">is our sample filter for teams that plausibly had an incentive to prioritize draft position over late-season wins. A team is classified this way if it was outside the relevant postseason cutoff and was either at least 3 games behind that cutoff or below a .400 pre-March winning percentage. This is not an outcome variable; it defines the group of teams used in the formal models.</w:t>
       </w:r>
     </w:p>
     <w:p>
@@ -393,10 +432,13 @@
         <w:rPr>
           <w:rStyle w:val="VerbatimChar"/>
         </w:rPr>
-        <w:t xml:space="preserve">likely_lottery_candidate</w:t>
-      </w:r>
-      <w:r>
-        <w:t xml:space="preserve">: a team outside the relevant postseason cutoff that was either at least 3 games behind the cutoff or below a .400 pre-March win percentage.</w:t>
+        <w:t xml:space="preserve">lottery_seed_march</w:t>
+      </w:r>
+      <w:r>
+        <w:t xml:space="preserve"> </w:t>
+      </w:r>
+      <w:r>
+        <w:t xml:space="preserve">is an estimated lottery position entering March, based on league-wide pre-March record. The worst pre-March record is seed 1, the second-worst is seed 2, and so on through the 14-team lottery. This is an approximation because final lottery order depends on end-of-season records and tiebreakers.</w:t>
       </w:r>
     </w:p>
     <w:p>
@@ -411,10 +453,13 @@
         <w:rPr>
           <w:rStyle w:val="VerbatimChar"/>
         </w:rPr>
-        <w:t xml:space="preserve">lottery_seed_march</w:t>
-      </w:r>
-      <w:r>
-        <w:t xml:space="preserve">: an estimated lottery position entering March, based on league-wide pre-March record. The worst pre-March record is seed 1, the second-worst is seed 2, and so on through the 14-team lottery.</w:t>
+        <w:t xml:space="preserve">top4_avg_rating</w:t>
+      </w:r>
+      <w:r>
+        <w:t xml:space="preserve"> </w:t>
+      </w:r>
+      <w:r>
+        <w:t xml:space="preserve">is the average CraftedNBA rating of the top four prospects in a draft class. Higher values mean a stronger top of the draft. This variable is the same for every team in the same season, so raw top-four draft-strength models are interpreted as draft-class-level evidence.</w:t>
       </w:r>
     </w:p>
     <w:p>
@@ -432,7 +477,40 @@
         <w:t xml:space="preserve">marginal_lottery_incentive</w:t>
       </w:r>
       <w:r>
-        <w:t xml:space="preserve">: a team-specific draft incentive equal to the top-four draft class rating multiplied by the increase in probability of landing a top-four pick from moving one lottery slot worse. For example, if moving from the fifth-worst to fourth-worst record raises the probability of a top-four pick, that gain is larger in a stronger top-four draft class.</w:t>
+        <w:t xml:space="preserve"> </w:t>
+      </w:r>
+      <w:r>
+        <w:t xml:space="preserve">is our team-specific draft incentive. First, we calculate how much a team’s probability of landing a top-four pick would increase if it moved one lottery slot worse. Then we multiply that probability gain by</w:t>
+      </w:r>
+      <w:r>
+        <w:t xml:space="preserve"> </w:t>
+      </w:r>
+      <w:r>
+        <w:rPr>
+          <w:rStyle w:val="VerbatimChar"/>
+        </w:rPr>
+        <w:t xml:space="preserve">top4_avg_rating</w:t>
+      </w:r>
+      <w:r>
+        <w:t xml:space="preserve">:</w:t>
+      </w:r>
+      <w:r>
+        <w:br/>
+      </w:r>
+      <w:r>
+        <w:rPr>
+          <w:rStyle w:val="VerbatimChar"/>
+        </w:rPr>
+        <w:t xml:space="preserve">marginal_lottery_incentive = top4_avg_rating x marginal top-four-pick probability gain</w:t>
+      </w:r>
+      <w:r>
+        <w:t xml:space="preserve">.</w:t>
+      </w:r>
+      <w:r>
+        <w:br/>
+      </w:r>
+      <w:r>
+        <w:t xml:space="preserve">For example, if moving from the fifth-worst to fourth-worst record increases a team’s top-four-pick probability, that gain is more valuable in a year with a stronger top four. Teams with no added top-four-pick probability from moving one slot worse, such as the worst team, receive a marginal incentive of 0.</w:t>
       </w:r>
     </w:p>
     <w:p>
@@ -450,7 +528,37 @@
         <w:t xml:space="preserve">tanking_index</w:t>
       </w:r>
       <w:r>
-        <w:t xml:space="preserve">: standardized late-season win shortfall. Positive values mean a team won fewer March-onward games than expected from its pre-March record.</w:t>
+        <w:t xml:space="preserve"> </w:t>
+      </w:r>
+      <w:r>
+        <w:t xml:space="preserve">is the main win-loss outcome. It compares a team’s actual March-onward wins to the number of late-season wins expected from its pre-March winning percentage:</w:t>
+      </w:r>
+      <w:r>
+        <w:br/>
+      </w:r>
+      <w:r>
+        <w:rPr>
+          <w:rStyle w:val="VerbatimChar"/>
+        </w:rPr>
+        <w:t xml:space="preserve">expected late wins = late games x pre_win_pct</w:t>
+      </w:r>
+      <w:r>
+        <w:br/>
+      </w:r>
+      <w:r>
+        <w:rPr>
+          <w:rStyle w:val="VerbatimChar"/>
+        </w:rPr>
+        <w:t xml:space="preserve">tanking_index = (expected late wins - actual late wins) / expected standard deviation</w:t>
+      </w:r>
+      <w:r>
+        <w:t xml:space="preserve">.</w:t>
+      </w:r>
+      <w:r>
+        <w:br/>
+      </w:r>
+      <w:r>
+        <w:t xml:space="preserve">Positive values mean the team won fewer late-season games than expected. Values near 0 mean it performed about as expected. Negative values mean it overperformed late in the season.</w:t>
       </w:r>
     </w:p>
     <w:p>
@@ -465,10 +573,13 @@
         <w:rPr>
           <w:rStyle w:val="VerbatimChar"/>
         </w:rPr>
-        <w:t xml:space="preserve">tanking_proxy</w:t>
-      </w:r>
-      <w:r>
-        <w:t xml:space="preserve">: a conservative yes/no flag for likely lottery candidates whose late win percentage dropped by at least 10 percentage points and whose late wins were unusually low under a binomial expectation.</w:t>
+        <w:t xml:space="preserve">team_fit_score</w:t>
+      </w:r>
+      <w:r>
+        <w:t xml:space="preserve"> </w:t>
+      </w:r>
+      <w:r>
+        <w:t xml:space="preserve">is an exploratory team-specific measure of whether a team’s weaknesses line up with the strengths of that year’s draft. We group players and prospects into guards, wings, and bigs. First, we estimate each team’s pre-March need by identifying position groups where its production was below the league average. Second, we calculate which position groups contain more high-rated prospects in that draft class. The score is higher when a team’s weak position groups match the positions where the draft class is strongest. This is a rough proxy for roster fit, not a team-specific draft board.</w:t>
       </w:r>
     </w:p>
     <w:p>
@@ -483,40 +594,43 @@
         <w:rPr>
           <w:rStyle w:val="VerbatimChar"/>
         </w:rPr>
-        <w:t xml:space="preserve">late_collapse_score</w:t>
-      </w:r>
-      <w:r>
-        <w:t xml:space="preserve">: a positive-only version of the late-collapse signal. It equals the positive part of</w:t>
-      </w:r>
-      <w:r>
-        <w:t xml:space="preserve"> </w:t>
+        <w:t xml:space="preserve">core_usage_drop_rate</w:t>
+      </w:r>
+      <w:r>
+        <w:t xml:space="preserve"> </w:t>
+      </w:r>
+      <w:r>
+        <w:t xml:space="preserve">is an exploratory roster-management outcome. For each team-season, we identify the team’s top three pre-March core players by starts, breaking ties by minutes. We keep only core players who appeared for the same team after March 1, so traded players are not counted as</w:t>
+      </w:r>
+      <w:r>
+        <w:t xml:space="preserve"> </w:t>
+      </w:r>
+      <w:r>
+        <w:t xml:space="preserve">“benched.”</w:t>
+      </w:r>
+      <w:r>
+        <w:t xml:space="preserve"> </w:t>
+      </w:r>
+      <w:r>
+        <w:t xml:space="preserve">We then calculate their combined minutes per team game before and after March:</w:t>
+      </w:r>
+      <w:r>
+        <w:br/>
       </w:r>
       <w:r>
         <w:rPr>
           <w:rStyle w:val="VerbatimChar"/>
         </w:rPr>
-        <w:t xml:space="preserve">tanking_index</w:t>
-      </w:r>
-      <w:r>
-        <w:t xml:space="preserve"> </w:t>
-      </w:r>
-      <w:r>
-        <w:t xml:space="preserve">for likely lottery candidates. We use it descriptively, but the final regression uses the full</w:t>
-      </w:r>
-      <w:r>
-        <w:t xml:space="preserve"> </w:t>
-      </w:r>
-      <w:r>
-        <w:rPr>
-          <w:rStyle w:val="VerbatimChar"/>
-        </w:rPr>
-        <w:t xml:space="preserve">tanking_index</w:t>
-      </w:r>
-      <w:r>
-        <w:t xml:space="preserve"> </w:t>
-      </w:r>
-      <w:r>
-        <w:t xml:space="preserve">because the full index keeps overperformance as negative evidence instead of turning it into zero.</w:t>
+        <w:t xml:space="preserve">core usage drop rate = (pre-March core MPG - late core MPG) / pre-March core MPG</w:t>
+      </w:r>
+      <w:r>
+        <w:t xml:space="preserve">.</w:t>
+      </w:r>
+      <w:r>
+        <w:br/>
+      </w:r>
+      <w:r>
+        <w:t xml:space="preserve">Positive values mean the team’s main continuing pre-March players were used less after March 1. This does not prove healthy starters were benched; injuries, rest, development minutes, and coaching decisions can also reduce minutes.</w:t>
       </w:r>
     </w:p>
     <w:p>
@@ -531,20 +645,64 @@
         <w:rPr>
           <w:rStyle w:val="VerbatimChar"/>
         </w:rPr>
-        <w:t xml:space="preserve">team_fit_score</w:t>
-      </w:r>
-      <w:r>
-        <w:t xml:space="preserve">: an exploratory measure of whether a team’s pre-March positional weaknesses line up with the strongest positions in that draft class. We group both teams and prospects into guards, wings, and bigs. A team gets a higher fit score when its weakest pre-March position groups match the position groups where the draft class has more high-rated prospects.</w:t>
-      </w:r>
-    </w:p>
-    <w:p>
-      <w:pPr>
-        <w:pStyle w:val="Compact"/>
-        <w:numPr>
-          <w:ilvl w:val="0"/>
-          <w:numId w:val="1001"/>
-        </w:numPr>
-      </w:pPr>
+        <w:t xml:space="preserve">season_2012</w:t>
+      </w:r>
+      <w:r>
+        <w:t xml:space="preserve">,</w:t>
+      </w:r>
+      <w:r>
+        <w:t xml:space="preserve"> </w:t>
+      </w:r>
+      <w:r>
+        <w:rPr>
+          <w:rStyle w:val="VerbatimChar"/>
+        </w:rPr>
+        <w:t xml:space="preserve">season_2020</w:t>
+      </w:r>
+      <w:r>
+        <w:t xml:space="preserve">, and</w:t>
+      </w:r>
+      <w:r>
+        <w:t xml:space="preserve"> </w:t>
+      </w:r>
+      <w:r>
+        <w:rPr>
+          <w:rStyle w:val="VerbatimChar"/>
+        </w:rPr>
+        <w:t xml:space="preserve">season_2021</w:t>
+      </w:r>
+      <w:r>
+        <w:t xml:space="preserve"> </w:t>
+      </w:r>
+      <w:r>
+        <w:t xml:space="preserve">are separate controls for disrupted seasons. We use separate indicators because the 2012 lockout season, 2020 bubble season, and 2021 shortened COVID-era season may have affected late-season performance in different ways.</w:t>
+      </w:r>
+    </w:p>
+    <w:p>
+      <w:pPr>
+        <w:pStyle w:val="FirstParagraph"/>
+      </w:pPr>
+      <w:r>
+        <w:t xml:space="preserve">The</w:t>
+      </w:r>
+      <w:r>
+        <w:t xml:space="preserve"> </w:t>
+      </w:r>
+      <w:r>
+        <w:rPr>
+          <w:rStyle w:val="VerbatimChar"/>
+        </w:rPr>
+        <w:t xml:space="preserve">tanking_index</w:t>
+      </w:r>
+      <w:r>
+        <w:t xml:space="preserve"> </w:t>
+      </w:r>
+      <w:r>
+        <w:t xml:space="preserve">is the main outcome because it uses more information than a simple cutoff. For example, the 2021 Rockets were 11-21 before March, a .344 win percentage. If they had kept winning at that rate over their 40 March-onward games, they would have been expected to win about 13.8 games. They won 6, leaving a shortfall of 7.8 wins and a tanking index of 2.58. This does not prove intent, but it identifies a large late-season underperformance relative to that team’s own earlier baseline. Similarly, if a team’s top three continuing core players averaged 95 combined minutes per game before March and 76 after March, its</w:t>
+      </w:r>
+      <w:r>
+        <w:t xml:space="preserve"> </w:t>
+      </w:r>
       <w:r>
         <w:rPr>
           <w:rStyle w:val="VerbatimChar"/>
@@ -552,72 +710,22 @@
         <w:t xml:space="preserve">core_usage_drop_rate</w:t>
       </w:r>
       <w:r>
-        <w:t xml:space="preserve">: an exploratory roster-management outcome. We identify each team’s top three pre-March core players using starts and minutes, keep only players who appeared for the same team after March 1, and measure the percentage drop in their combined minutes per team game after March 1.</w:t>
-      </w:r>
-    </w:p>
-    <w:p>
-      <w:pPr>
-        <w:pStyle w:val="Compact"/>
-        <w:numPr>
-          <w:ilvl w:val="0"/>
-          <w:numId w:val="1001"/>
-        </w:numPr>
-      </w:pPr>
+        <w:t xml:space="preserve"> </w:t>
+      </w:r>
+      <w:r>
+        <w:t xml:space="preserve">would be</w:t>
+      </w:r>
+      <w:r>
+        <w:t xml:space="preserve"> </w:t>
+      </w:r>
       <w:r>
         <w:rPr>
           <w:rStyle w:val="VerbatimChar"/>
         </w:rPr>
-        <w:t xml:space="preserve">season_2012</w:t>
-      </w:r>
-      <w:r>
-        <w:t xml:space="preserve">,</w:t>
-      </w:r>
-      <w:r>
-        <w:t xml:space="preserve"> </w:t>
-      </w:r>
-      <w:r>
-        <w:rPr>
-          <w:rStyle w:val="VerbatimChar"/>
-        </w:rPr>
-        <w:t xml:space="preserve">season_2020</w:t>
-      </w:r>
-      <w:r>
-        <w:t xml:space="preserve">, and</w:t>
-      </w:r>
-      <w:r>
-        <w:t xml:space="preserve"> </w:t>
-      </w:r>
-      <w:r>
-        <w:rPr>
-          <w:rStyle w:val="VerbatimChar"/>
-        </w:rPr>
-        <w:t xml:space="preserve">season_2021</w:t>
-      </w:r>
-      <w:r>
-        <w:t xml:space="preserve">: separate controls for disrupted seasons. We use separate indicators because the 2012 lockout season, 2020 bubble season, and 2021 shortened COVID-era season may have affected late-season performance in different ways.</w:t>
-      </w:r>
-    </w:p>
-    <w:p>
-      <w:pPr>
-        <w:pStyle w:val="FirstParagraph"/>
-      </w:pPr>
-      <w:r>
-        <w:t xml:space="preserve">The</w:t>
-      </w:r>
-      <w:r>
-        <w:t xml:space="preserve"> </w:t>
-      </w:r>
-      <w:r>
-        <w:rPr>
-          <w:rStyle w:val="VerbatimChar"/>
-        </w:rPr>
-        <w:t xml:space="preserve">tanking_index</w:t>
-      </w:r>
-      <w:r>
-        <w:t xml:space="preserve"> </w:t>
-      </w:r>
-      <w:r>
-        <w:t xml:space="preserve">is the main outcome because it uses more information than a simple cutoff. For example, the 2021 Rockets were 11-21 before March, a .344 win percentage. If they had kept winning at that rate over their 40 March-onward games, they would have been expected to win about 13.8 games. They won 6, leaving a shortfall of 7.8 wins and a tanking index of 2.58. This does not prove intent, but it identifies a large late-season underperformance relative to that team’s own earlier baseline.</w:t>
+        <w:t xml:space="preserve">(95 - 76) / 95 = 0.20</w:t>
+      </w:r>
+      <w:r>
+        <w:t xml:space="preserve">, or a 20% drop in core-player usage.</w:t>
       </w:r>
     </w:p>
     <w:bookmarkEnd w:id="29"/>
@@ -655,13 +763,12 @@
         <w:tblCaption w:val="Table 1. Summary statistics by lottery era and team group."/>
       </w:tblPr>
       <w:tblGrid>
-        <w:gridCol w:w="1697"/>
-        <w:gridCol w:w="1838"/>
-        <w:gridCol w:w="282"/>
-        <w:gridCol w:w="848"/>
-        <w:gridCol w:w="919"/>
-        <w:gridCol w:w="990"/>
-        <w:gridCol w:w="1343"/>
+        <w:gridCol w:w="2043"/>
+        <w:gridCol w:w="2214"/>
+        <w:gridCol w:w="340"/>
+        <w:gridCol w:w="1021"/>
+        <w:gridCol w:w="1107"/>
+        <w:gridCol w:w="1192"/>
       </w:tblGrid>
       <w:tr>
         <w:trPr>
@@ -739,18 +846,6 @@
             </w:r>
           </w:p>
         </w:tc>
-        <w:tc>
-          <w:tcPr/>
-          <w:p>
-            <w:pPr>
-              <w:pStyle w:val="Compact"/>
-              <w:jc w:val="right"/>
-            </w:pPr>
-            <w:r>
-              <w:t xml:space="preserve">Late-collapse rate</w:t>
-            </w:r>
-          </w:p>
-        </w:tc>
       </w:tr>
       <w:tr>
         <w:tc>
@@ -825,18 +920,6 @@
             </w:r>
           </w:p>
         </w:tc>
-        <w:tc>
-          <w:tcPr/>
-          <w:p>
-            <w:pPr>
-              <w:pStyle w:val="Compact"/>
-              <w:jc w:val="right"/>
-            </w:pPr>
-            <w:r>
-              <w:t xml:space="preserve">0.137</w:t>
-            </w:r>
-          </w:p>
-        </w:tc>
       </w:tr>
       <w:tr>
         <w:tc>
@@ -911,18 +994,6 @@
             </w:r>
           </w:p>
         </w:tc>
-        <w:tc>
-          <w:tcPr/>
-          <w:p>
-            <w:pPr>
-              <w:pStyle w:val="Compact"/>
-              <w:jc w:val="right"/>
-            </w:pPr>
-            <w:r>
-              <w:t xml:space="preserve">0.000</w:t>
-            </w:r>
-          </w:p>
-        </w:tc>
       </w:tr>
       <w:tr>
         <w:tc>
@@ -997,18 +1068,6 @@
             </w:r>
           </w:p>
         </w:tc>
-        <w:tc>
-          <w:tcPr/>
-          <w:p>
-            <w:pPr>
-              <w:pStyle w:val="Compact"/>
-              <w:jc w:val="right"/>
-            </w:pPr>
-            <w:r>
-              <w:t xml:space="preserve">0.108</w:t>
-            </w:r>
-          </w:p>
-        </w:tc>
       </w:tr>
       <w:tr>
         <w:tc>
@@ -1083,18 +1142,6 @@
             </w:r>
           </w:p>
         </w:tc>
-        <w:tc>
-          <w:tcPr/>
-          <w:p>
-            <w:pPr>
-              <w:pStyle w:val="Compact"/>
-              <w:jc w:val="right"/>
-            </w:pPr>
-            <w:r>
-              <w:t xml:space="preserve">0.000</w:t>
-            </w:r>
-          </w:p>
-        </w:tc>
       </w:tr>
     </w:tbl>
     <w:p>
@@ -1102,7 +1149,7 @@
         <w:pStyle w:val="BodyText"/>
       </w:pPr>
       <w:r>
-        <w:t xml:space="preserve">Table 1 shows that likely lottery candidates are much weaker than other teams before March, as expected. The average win percentage change from pre-March to late season is small in both eras, which suggests that most weak teams do not suddenly collapse late in the year. The conservative late-collapse proxy appears in only 21 of 175 likely-candidate seasons, so our binary proxy is intentionally strict. The final regression therefore relies on the full</w:t>
+        <w:t xml:space="preserve">Table 1 shows that likely lottery candidates are much weaker than other teams before March, as expected. The average win percentage change from pre-March to late season is small in both eras, which suggests that most weak teams do not suddenly collapse late in the year. The final regression relies on the full</w:t>
       </w:r>
       <w:r>
         <w:t xml:space="preserve"> </w:t>
@@ -1114,7 +1161,7 @@
         <w:t xml:space="preserve">tanking_index</w:t>
       </w:r>
       <w:r>
-        <w:t xml:space="preserve">, which measures degree of late-season underperformance instead of only flagging extreme cases.</w:t>
+        <w:t xml:space="preserve">, which measures degree of late-season underperformance instead of forcing teams into a yes/no collapse category.</w:t>
       </w:r>
     </w:p>
     <w:p>
@@ -1126,7 +1173,7 @@
           <wp:inline>
             <wp:extent cx="5334000" cy="3333750"/>
             <wp:effectExtent b="0" l="0" r="0" t="0"/>
-            <wp:docPr descr="Figure 1. Late-season performance compared with pre-March performance. Each point is one team-season from 2010 through 2026. The dashed line shows equal pre-March and March-onward win percentages. Triangles are likely lottery candidates. Red points are conservative late-collapse proxy seasons, and blue points are all other team-seasons. Labels identify the largest late-collapse proxy seasons." title="" id="31" name="Picture"/>
+            <wp:docPr descr="Figure 1. Late-season performance compared with pre-March performance. Each point is one team-season from 2010 through 2026. The dashed line shows equal pre-March and March-onward win percentages. Triangles are likely lottery candidates. Color shows the tanking index, where higher values mean larger late-season win shortfalls. Labels identify the largest tanking-index seasons among likely lottery candidates." title="" id="31" name="Picture"/>
             <a:graphic>
               <a:graphicData uri="http://schemas.openxmlformats.org/drawingml/2006/picture">
                 <pic:pic>
@@ -1169,7 +1216,7 @@
         <w:pStyle w:val="ImageCaption"/>
       </w:pPr>
       <w:r>
-        <w:t xml:space="preserve">Figure 1. Late-season performance compared with pre-March performance. Each point is one team-season from 2010 through 2026. The dashed line shows equal pre-March and March-onward win percentages. Triangles are likely lottery candidates. Red points are conservative late-collapse proxy seasons, and blue points are all other team-seasons. Labels identify the largest late-collapse proxy seasons.</w:t>
+        <w:t xml:space="preserve">Figure 1. Late-season performance compared with pre-March performance. Each point is one team-season from 2010 through 2026. The dashed line shows equal pre-March and March-onward win percentages. Triangles are likely lottery candidates. Color shows the tanking index, where higher values mean larger late-season win shortfalls. Labels identify the largest tanking-index seasons among likely lottery candidates.</w:t>
       </w:r>
     </w:p>
     <w:p>
@@ -1177,7 +1224,7 @@
         <w:pStyle w:val="BodyText"/>
       </w:pPr>
       <w:r>
-        <w:t xml:space="preserve">Figure 1 shows that most teams cluster near the diagonal, meaning their late-season winning percentage was similar to their pre-March winning percentage. The likely lottery candidates mostly appear in the lower-left portion of the graph, which confirms that the candidate definition is identifying weaker teams. The red points are rarer and more extreme: they are teams that were not only bad, but substantially worse late in the season than their earlier record would predict. Because the red proxy is intentionally strict, the regression below uses the full</w:t>
+        <w:t xml:space="preserve">Figure 1 shows that most teams cluster near the diagonal, meaning their late-season winning percentage was similar to their pre-March winning percentage. The likely lottery candidates mostly appear in the lower-left portion of the graph, which confirms that the candidate definition is identifying weaker teams. The darker red points are teams with larger positive tanking-index values: they won substantially fewer late-season games than expected from their earlier record. This is why the regression below uses the full</w:t>
       </w:r>
       <w:r>
         <w:t xml:space="preserve"> </w:t>
@@ -1192,7 +1239,7 @@
         <w:t xml:space="preserve"> </w:t>
       </w:r>
       <w:r>
-        <w:t xml:space="preserve">rather than treating the red points as the only relevant cases.</w:t>
+        <w:t xml:space="preserve">rather than a binary collapse label.</w:t>
       </w:r>
     </w:p>
     <w:p>
@@ -1204,7 +1251,7 @@
           <wp:inline>
             <wp:extent cx="5334000" cy="3333750"/>
             <wp:effectExtent b="0" l="0" r="0" t="0"/>
-            <wp:docPr descr="Figure 2. Top-four draft strength and average late-season underperformance among likely lottery candidates. Each point is one NBA season. The x-axis is the CraftedNBA average rating of the top four prospects, the y-axis is the mean tanking index among likely lottery candidates, and point size is the number of conservative late-collapse proxy team-seasons in that year. Fitted lines are descriptive and are shown separately for the pre-reform and post-reform lottery eras." title="" id="34" name="Picture"/>
+            <wp:docPr descr="Figure 2. Top-four draft strength and average late-season underperformance among likely lottery candidates. Each point is one NBA season. The x-axis is the CraftedNBA average rating of the top four prospects, the y-axis is the mean tanking index among likely lottery candidates, and point size is the number of likely lottery team-seasons in that year. Fitted lines are descriptive and are shown separately for the pre-reform and post-reform lottery eras." title="" id="34" name="Picture"/>
             <a:graphic>
               <a:graphicData uri="http://schemas.openxmlformats.org/drawingml/2006/picture">
                 <pic:pic>
@@ -1247,7 +1294,7 @@
         <w:pStyle w:val="ImageCaption"/>
       </w:pPr>
       <w:r>
-        <w:t xml:space="preserve">Figure 2. Top-four draft strength and average late-season underperformance among likely lottery candidates. Each point is one NBA season. The x-axis is the CraftedNBA average rating of the top four prospects, the y-axis is the mean tanking index among likely lottery candidates, and point size is the number of conservative late-collapse proxy team-seasons in that year. Fitted lines are descriptive and are shown separately for the pre-reform and post-reform lottery eras.</w:t>
+        <w:t xml:space="preserve">Figure 2. Top-four draft strength and average late-season underperformance among likely lottery candidates. Each point is one NBA season. The x-axis is the CraftedNBA average rating of the top four prospects, the y-axis is the mean tanking index among likely lottery candidates, and point size is the number of likely lottery team-seasons in that year. Fitted lines are descriptive and are shown separately for the pre-reform and post-reform lottery eras.</w:t>
       </w:r>
     </w:p>
     <w:p>
@@ -1953,7 +2000,7 @@
         <w:pStyle w:val="BodyText"/>
       </w:pPr>
       <w:r>
-        <w:t xml:space="preserve">We also compared the full</w:t>
+        <w:t xml:space="preserve">The final model uses the full</w:t>
       </w:r>
       <w:r>
         <w:t xml:space="preserve"> </w:t>
@@ -1968,19 +2015,19 @@
         <w:t xml:space="preserve"> </w:t>
       </w:r>
       <w:r>
-        <w:t xml:space="preserve">to the positive-only late-collapse score. The positive-only model uses the same incentive coefficient, but the outcome changes: instead of predicting all late-season underperformance and overperformance, it predicts only the positive part of the late-collapse signal. The positive-only score is useful for labeling obvious cases, but it throws away information by setting all late-season overperformance to zero. With the same controls, the positive-only score gives a position-adjusted incentive p-value of 0.37, compared with 0.12 for the full</w:t>
-      </w:r>
-      <w:r>
-        <w:t xml:space="preserve"> </w:t>
-      </w:r>
-      <w:r>
-        <w:rPr>
-          <w:rStyle w:val="VerbatimChar"/>
-        </w:rPr>
-        <w:t xml:space="preserve">tanking_index</w:t>
-      </w:r>
-      <w:r>
-        <w:t xml:space="preserve">. For that reason, the final model uses the full index as the clearer primary outcome.</w:t>
+        <w:t xml:space="preserve">rather than a binary collapse flag because the index keeps more information. A strict cutoff is useful for labeling the most obvious cases in figures, but it treats a small late-season decline and a strong late-season improvement as equally</w:t>
+      </w:r>
+      <w:r>
+        <w:t xml:space="preserve"> </w:t>
+      </w:r>
+      <w:r>
+        <w:t xml:space="preserve">“not flagged.”</w:t>
+      </w:r>
+      <w:r>
+        <w:t xml:space="preserve"> </w:t>
+      </w:r>
+      <w:r>
+        <w:t xml:space="preserve">The continuous index is better for regression because larger underperformance counts more strongly, while late-season overperformance counts against the tanking-incentive story.</w:t>
       </w:r>
     </w:p>
     <w:p>
@@ -2387,7 +2434,7 @@
         <w:pStyle w:val="BodyText"/>
       </w:pPr>
       <w:r>
-        <w:t xml:space="preserve">The tanking-index model has a positive position-adjusted incentive coefficient of 0.157, with a p-value of 0.12. Because the incentive variable is standardized, this means that a likely lottery team with a one-standard-deviation larger marginal top-four draft incentive is expected to have a tanking index that is 0.157 units higher, holding pre-March win percentage and disrupted-season controls fixed. Positive values of the tanking index mean more late-season wins below expectation, so the positive coefficient points in the direction predicted by the tanking-incentive story. This is stronger than the earlier positive-only late-collapse score because the full index keeps all information: underperformance counts positively, while late-season overperformance counts against the tanking-incentive story.</w:t>
+        <w:t xml:space="preserve">The tanking-index model has a positive position-adjusted incentive coefficient of 0.157, with a p-value of 0.12. Because the incentive variable is standardized, this means that a likely lottery team with a one-standard-deviation larger marginal top-four draft incentive is expected to have a tanking index that is 0.157 units higher, holding pre-March win percentage and disrupted-season controls fixed. Positive values of the tanking index mean more late-season wins below expectation, so the positive coefficient points in the direction predicted by the tanking-incentive story.</w:t>
       </w:r>
     </w:p>
     <w:p>
@@ -4390,7 +4437,7 @@
         <w:pStyle w:val="BodyText"/>
       </w:pPr>
       <w:r>
-        <w:t xml:space="preserve">The analysis also shows why the definition of tanking matters. A strict 10 percentage point late-collapse proxy flags only a small number of team-seasons. That makes the proxy conservative, but it can miss meaningful variation around the cutoff. It also creates extra noise by treating all non-flagged teams as the same. The full tanking index is better suited for regression because it measures degree of underperformance rather than forcing a binary cutoff.</w:t>
+        <w:t xml:space="preserve">The analysis also shows why the definition of tanking matters. Instead of forcing teams into a yes/no tanking category, the full tanking index measures degree of underperformance. That is better suited for regression because a small late-season decline, a major collapse, and a late-season improvement should not all be treated the same.</w:t>
       </w:r>
     </w:p>
     <w:p>
@@ -4510,7 +4557,7 @@
         <w:pStyle w:val="FirstParagraph"/>
       </w:pPr>
       <w:r>
-        <w:t xml:space="preserve">This project finds suggestive evidence that draft class strength is related to late-season losing signals among likely lottery candidates. The clearest descriptive patterns come from season-level draft-strength graphs, while the more conservative position-adjusted win-loss model shows positive but noisier estimates. The core-player usage model adds a stronger exploratory signal that teams in better top-four draft classes reduced minutes more for continuing core players. The full tanking index is a better final win-loss outcome than a hard 10 percentage point cutoff because it measures the size and direction of late-season underperformance instead of only flagging the most obvious collapses.</w:t>
+        <w:t xml:space="preserve">This project finds suggestive evidence that draft class strength is related to late-season losing signals among likely lottery candidates. The clearest descriptive patterns come from season-level draft-strength graphs, while the more conservative position-adjusted win-loss model shows positive but noisier estimates. The core-player usage model adds a stronger exploratory signal that teams in better top-four draft classes reduced minutes more for continuing core players. The full tanking index is a better final win-loss outcome because it measures the size and direction of late-season underperformance rather than depending on an arbitrary cutoff.</w:t>
       </w:r>
     </w:p>
     <w:p>

</xml_diff>

<commit_message>
improved some of the visuals
</commit_message>
<xml_diff>
--- a/final-report.docx
+++ b/final-report.docx
@@ -329,7 +329,6 @@
     </w:p>
     <w:p>
       <w:pPr>
-        <w:pStyle w:val="Compact"/>
         <w:numPr>
           <w:ilvl w:val="0"/>
           <w:numId w:val="1001"/>
@@ -362,9 +361,143 @@
       <w:r>
         <w:t xml:space="preserve">are each team’s winning percentage before March 1 and on or after March 1.</w:t>
       </w:r>
-      <w:r>
-        <w:t xml:space="preserve"> </w:t>
-      </w:r>
+    </w:p>
+    <w:p>
+      <w:pPr>
+        <w:pStyle w:val="BodyText"/>
+      </w:pPr>
+      <m:oMathPara>
+        <m:oMathParaPr>
+          <m:jc m:val="center"/>
+        </m:oMathParaPr>
+        <m:oMath>
+          <m:r>
+            <m:rPr>
+              <m:nor/>
+              <m:sty m:val="p"/>
+            </m:rPr>
+            <m:t>Pre-March win pct</m:t>
+          </m:r>
+          <m:r>
+            <m:rPr>
+              <m:sty m:val="p"/>
+            </m:rPr>
+            <m:t>=</m:t>
+          </m:r>
+          <m:f>
+            <m:fPr>
+              <m:type m:val="bar"/>
+            </m:fPr>
+            <m:num>
+              <m:sSub>
+                <m:e>
+                  <m:r>
+                    <m:t>W</m:t>
+                  </m:r>
+                </m:e>
+                <m:sub>
+                  <m:r>
+                    <m:rPr>
+                      <m:nor/>
+                      <m:sty m:val="p"/>
+                    </m:rPr>
+                    <m:t>pre</m:t>
+                  </m:r>
+                </m:sub>
+              </m:sSub>
+            </m:num>
+            <m:den>
+              <m:sSub>
+                <m:e>
+                  <m:r>
+                    <m:t>G</m:t>
+                  </m:r>
+                </m:e>
+                <m:sub>
+                  <m:r>
+                    <m:rPr>
+                      <m:nor/>
+                      <m:sty m:val="p"/>
+                    </m:rPr>
+                    <m:t>pre</m:t>
+                  </m:r>
+                </m:sub>
+              </m:sSub>
+            </m:den>
+          </m:f>
+          <m:r>
+            <m:rPr>
+              <m:sty m:val="p"/>
+            </m:rPr>
+            <m:t>,</m:t>
+          </m:r>
+          <m:r>
+            <m:t>  </m:t>
+          </m:r>
+          <m:r>
+            <m:rPr>
+              <m:nor/>
+              <m:sty m:val="p"/>
+            </m:rPr>
+            <m:t>Late win pct</m:t>
+          </m:r>
+          <m:r>
+            <m:rPr>
+              <m:sty m:val="p"/>
+            </m:rPr>
+            <m:t>=</m:t>
+          </m:r>
+          <m:f>
+            <m:fPr>
+              <m:type m:val="bar"/>
+            </m:fPr>
+            <m:num>
+              <m:sSub>
+                <m:e>
+                  <m:r>
+                    <m:t>W</m:t>
+                  </m:r>
+                </m:e>
+                <m:sub>
+                  <m:r>
+                    <m:rPr>
+                      <m:nor/>
+                      <m:sty m:val="p"/>
+                    </m:rPr>
+                    <m:t>late</m:t>
+                  </m:r>
+                </m:sub>
+              </m:sSub>
+            </m:num>
+            <m:den>
+              <m:sSub>
+                <m:e>
+                  <m:r>
+                    <m:t>G</m:t>
+                  </m:r>
+                </m:e>
+                <m:sub>
+                  <m:r>
+                    <m:rPr>
+                      <m:nor/>
+                      <m:sty m:val="p"/>
+                    </m:rPr>
+                    <m:t>late</m:t>
+                  </m:r>
+                </m:sub>
+              </m:sSub>
+            </m:den>
+          </m:f>
+        </m:oMath>
+      </m:oMathPara>
+    </w:p>
+    <w:p>
+      <w:pPr>
+        <w:numPr>
+          <w:ilvl w:val="0"/>
+          <w:numId w:val="1000"/>
+        </w:numPr>
+      </w:pPr>
       <w:r>
         <w:rPr>
           <w:rStyle w:val="VerbatimChar"/>
@@ -380,7 +513,6 @@
     </w:p>
     <w:p>
       <w:pPr>
-        <w:pStyle w:val="Compact"/>
         <w:numPr>
           <w:ilvl w:val="0"/>
           <w:numId w:val="1001"/>
@@ -401,7 +533,170 @@
     </w:p>
     <w:p>
       <w:pPr>
-        <w:pStyle w:val="Compact"/>
+        <w:pStyle w:val="BodyText"/>
+      </w:pPr>
+      <m:oMathPara>
+        <m:oMathParaPr>
+          <m:jc m:val="center"/>
+        </m:oMathParaPr>
+        <m:oMath>
+          <m:r>
+            <m:rPr>
+              <m:nor/>
+              <m:sty m:val="p"/>
+            </m:rPr>
+            <m:t>Games back</m:t>
+          </m:r>
+          <m:r>
+            <m:rPr>
+              <m:sty m:val="p"/>
+            </m:rPr>
+            <m:t>=</m:t>
+          </m:r>
+          <m:r>
+            <m:rPr>
+              <m:sty m:val="p"/>
+            </m:rPr>
+            <m:t>max</m:t>
+          </m:r>
+          <m:d>
+            <m:dPr>
+              <m:begChr m:val="("/>
+              <m:sepChr m:val=""/>
+              <m:endChr m:val=")"/>
+              <m:grow/>
+            </m:dPr>
+            <m:e>
+              <m:r>
+                <m:t>0</m:t>
+              </m:r>
+              <m:r>
+                <m:rPr>
+                  <m:sty m:val="p"/>
+                </m:rPr>
+                <m:t>,</m:t>
+              </m:r>
+              <m:f>
+                <m:fPr>
+                  <m:type m:val="bar"/>
+                </m:fPr>
+                <m:num>
+                  <m:d>
+                    <m:dPr>
+                      <m:begChr m:val="("/>
+                      <m:sepChr m:val=""/>
+                      <m:endChr m:val=")"/>
+                      <m:grow/>
+                    </m:dPr>
+                    <m:e>
+                      <m:sSub>
+                        <m:e>
+                          <m:r>
+                            <m:t>W</m:t>
+                          </m:r>
+                        </m:e>
+                        <m:sub>
+                          <m:r>
+                            <m:rPr>
+                              <m:nor/>
+                              <m:sty m:val="p"/>
+                            </m:rPr>
+                            <m:t>cutline</m:t>
+                          </m:r>
+                        </m:sub>
+                      </m:sSub>
+                      <m:r>
+                        <m:rPr>
+                          <m:sty m:val="p"/>
+                        </m:rPr>
+                        <m:t>−</m:t>
+                      </m:r>
+                      <m:sSub>
+                        <m:e>
+                          <m:r>
+                            <m:t>W</m:t>
+                          </m:r>
+                        </m:e>
+                        <m:sub>
+                          <m:r>
+                            <m:rPr>
+                              <m:nor/>
+                              <m:sty m:val="p"/>
+                            </m:rPr>
+                            <m:t>team</m:t>
+                          </m:r>
+                        </m:sub>
+                      </m:sSub>
+                    </m:e>
+                  </m:d>
+                  <m:r>
+                    <m:rPr>
+                      <m:sty m:val="p"/>
+                    </m:rPr>
+                    <m:t>+</m:t>
+                  </m:r>
+                  <m:d>
+                    <m:dPr>
+                      <m:begChr m:val="("/>
+                      <m:sepChr m:val=""/>
+                      <m:endChr m:val=")"/>
+                      <m:grow/>
+                    </m:dPr>
+                    <m:e>
+                      <m:sSub>
+                        <m:e>
+                          <m:r>
+                            <m:t>L</m:t>
+                          </m:r>
+                        </m:e>
+                        <m:sub>
+                          <m:r>
+                            <m:rPr>
+                              <m:nor/>
+                              <m:sty m:val="p"/>
+                            </m:rPr>
+                            <m:t>team</m:t>
+                          </m:r>
+                        </m:sub>
+                      </m:sSub>
+                      <m:r>
+                        <m:rPr>
+                          <m:sty m:val="p"/>
+                        </m:rPr>
+                        <m:t>−</m:t>
+                      </m:r>
+                      <m:sSub>
+                        <m:e>
+                          <m:r>
+                            <m:t>L</m:t>
+                          </m:r>
+                        </m:e>
+                        <m:sub>
+                          <m:r>
+                            <m:rPr>
+                              <m:nor/>
+                              <m:sty m:val="p"/>
+                            </m:rPr>
+                            <m:t>cutline</m:t>
+                          </m:r>
+                        </m:sub>
+                      </m:sSub>
+                    </m:e>
+                  </m:d>
+                </m:num>
+                <m:den>
+                  <m:r>
+                    <m:t>2</m:t>
+                  </m:r>
+                </m:den>
+              </m:f>
+            </m:e>
+          </m:d>
+        </m:oMath>
+      </m:oMathPara>
+    </w:p>
+    <w:p>
+      <w:pPr>
         <w:numPr>
           <w:ilvl w:val="0"/>
           <w:numId w:val="1001"/>
@@ -417,12 +712,163 @@
         <w:t xml:space="preserve"> </w:t>
       </w:r>
       <w:r>
-        <w:t xml:space="preserve">is our sample filter for teams that plausibly had an incentive to prioritize draft position over late-season wins. A team is classified this way if it was outside the relevant postseason cutoff and was either at least 3 games behind that cutoff or below a .400 pre-March winning percentage. This is not an outcome variable; it defines the group of teams used in the formal models.</w:t>
-      </w:r>
-    </w:p>
-    <w:p>
-      <w:pPr>
-        <w:pStyle w:val="Compact"/>
+        <w:t xml:space="preserve">is our sample filter for teams that plausibly had an incentive to prioritize draft position over late-season wins.</w:t>
+      </w:r>
+    </w:p>
+    <w:p>
+      <w:pPr>
+        <w:pStyle w:val="BodyText"/>
+      </w:pPr>
+      <m:oMathPara>
+        <m:oMathParaPr>
+          <m:jc m:val="center"/>
+        </m:oMathParaPr>
+        <m:oMath>
+          <m:r>
+            <m:rPr>
+              <m:nor/>
+              <m:sty m:val="p"/>
+            </m:rPr>
+            <m:t>Likely lottery candidate</m:t>
+          </m:r>
+          <m:r>
+            <m:rPr>
+              <m:sty m:val="p"/>
+            </m:rPr>
+            <m:t>=</m:t>
+          </m:r>
+          <m:d>
+            <m:dPr>
+              <m:begChr m:val="{"/>
+              <m:sepChr m:val=""/>
+              <m:endChr m:val=""/>
+              <m:grow/>
+            </m:dPr>
+            <m:e>
+              <m:m>
+                <m:mPr>
+                  <m:baseJc m:val="center"/>
+                  <m:plcHide m:val="on"/>
+                  <m:mcs>
+                    <m:mc>
+                      <m:mcPr>
+                        <m:mcJc m:val="left"/>
+                        <m:count m:val="1"/>
+                      </m:mcPr>
+                    </m:mc>
+                    <m:mc>
+                      <m:mcPr>
+                        <m:mcJc m:val="left"/>
+                        <m:count m:val="1"/>
+                      </m:mcPr>
+                    </m:mc>
+                  </m:mcs>
+                </m:mPr>
+                <m:mr>
+                  <m:e>
+                    <m:r>
+                      <m:t>1</m:t>
+                    </m:r>
+                    <m:r>
+                      <m:rPr>
+                        <m:sty m:val="p"/>
+                      </m:rPr>
+                      <m:t>,</m:t>
+                    </m:r>
+                  </m:e>
+                  <m:e>
+                    <m:r>
+                      <m:rPr>
+                        <m:nor/>
+                        <m:sty m:val="p"/>
+                      </m:rPr>
+                      <m:t>outside cutoff and </m:t>
+                    </m:r>
+                    <m:d>
+                      <m:dPr>
+                        <m:begChr m:val="("/>
+                        <m:sepChr m:val=""/>
+                        <m:endChr m:val=")"/>
+                        <m:grow/>
+                      </m:dPr>
+                      <m:e>
+                        <m:r>
+                          <m:rPr>
+                            <m:nor/>
+                            <m:sty m:val="p"/>
+                          </m:rPr>
+                          <m:t>games back</m:t>
+                        </m:r>
+                        <m:r>
+                          <m:rPr>
+                            <m:sty m:val="p"/>
+                          </m:rPr>
+                          <m:t>≥</m:t>
+                        </m:r>
+                        <m:r>
+                          <m:t>3</m:t>
+                        </m:r>
+                        <m:r>
+                          <m:rPr>
+                            <m:nor/>
+                            <m:sty m:val="p"/>
+                          </m:rPr>
+                          <m:t> or pre-March win pct</m:t>
+                        </m:r>
+                        <m:r>
+                          <m:rPr>
+                            <m:sty m:val="p"/>
+                          </m:rPr>
+                          <m:t>&lt;</m:t>
+                        </m:r>
+                        <m:r>
+                          <m:t>0.400</m:t>
+                        </m:r>
+                      </m:e>
+                    </m:d>
+                  </m:e>
+                </m:mr>
+                <m:mr>
+                  <m:e>
+                    <m:r>
+                      <m:t>0</m:t>
+                    </m:r>
+                    <m:r>
+                      <m:rPr>
+                        <m:sty m:val="p"/>
+                      </m:rPr>
+                      <m:t>,</m:t>
+                    </m:r>
+                  </m:e>
+                  <m:e>
+                    <m:r>
+                      <m:rPr>
+                        <m:nor/>
+                        <m:sty m:val="p"/>
+                      </m:rPr>
+                      <m:t>otherwise</m:t>
+                    </m:r>
+                  </m:e>
+                </m:mr>
+              </m:m>
+            </m:e>
+          </m:d>
+        </m:oMath>
+      </m:oMathPara>
+    </w:p>
+    <w:p>
+      <w:pPr>
+        <w:numPr>
+          <w:ilvl w:val="0"/>
+          <w:numId w:val="1000"/>
+        </w:numPr>
+      </w:pPr>
+      <w:r>
+        <w:t xml:space="preserve">This is not an outcome variable; it defines the group of teams used in the formal models.</w:t>
+      </w:r>
+    </w:p>
+    <w:p>
+      <w:pPr>
         <w:numPr>
           <w:ilvl w:val="0"/>
           <w:numId w:val="1001"/>
@@ -443,7 +889,6 @@
     </w:p>
     <w:p>
       <w:pPr>
-        <w:pStyle w:val="Compact"/>
         <w:numPr>
           <w:ilvl w:val="0"/>
           <w:numId w:val="1001"/>
@@ -459,12 +904,125 @@
         <w:t xml:space="preserve"> </w:t>
       </w:r>
       <w:r>
-        <w:t xml:space="preserve">is the average CraftedNBA rating of the top four prospects in a draft class. Higher values mean a stronger top of the draft. This variable is the same for every team in the same season, so raw top-four draft-strength models are interpreted as draft-class-level evidence.</w:t>
-      </w:r>
-    </w:p>
-    <w:p>
-      <w:pPr>
-        <w:pStyle w:val="Compact"/>
+        <w:t xml:space="preserve">is the average CraftedNBA rating of the top four prospects in a draft class.</w:t>
+      </w:r>
+    </w:p>
+    <w:p>
+      <w:pPr>
+        <w:pStyle w:val="BodyText"/>
+      </w:pPr>
+      <m:oMathPara>
+        <m:oMathParaPr>
+          <m:jc m:val="center"/>
+        </m:oMathParaPr>
+        <m:oMath>
+          <m:r>
+            <m:rPr>
+              <m:nor/>
+              <m:sty m:val="p"/>
+            </m:rPr>
+            <m:t>Top-four average rating</m:t>
+          </m:r>
+          <m:r>
+            <m:rPr>
+              <m:sty m:val="p"/>
+            </m:rPr>
+            <m:t>=</m:t>
+          </m:r>
+          <m:f>
+            <m:fPr>
+              <m:type m:val="bar"/>
+            </m:fPr>
+            <m:num>
+              <m:sSub>
+                <m:e>
+                  <m:r>
+                    <m:t>r</m:t>
+                  </m:r>
+                </m:e>
+                <m:sub>
+                  <m:r>
+                    <m:t>1</m:t>
+                  </m:r>
+                </m:sub>
+              </m:sSub>
+              <m:r>
+                <m:rPr>
+                  <m:sty m:val="p"/>
+                </m:rPr>
+                <m:t>+</m:t>
+              </m:r>
+              <m:sSub>
+                <m:e>
+                  <m:r>
+                    <m:t>r</m:t>
+                  </m:r>
+                </m:e>
+                <m:sub>
+                  <m:r>
+                    <m:t>2</m:t>
+                  </m:r>
+                </m:sub>
+              </m:sSub>
+              <m:r>
+                <m:rPr>
+                  <m:sty m:val="p"/>
+                </m:rPr>
+                <m:t>+</m:t>
+              </m:r>
+              <m:sSub>
+                <m:e>
+                  <m:r>
+                    <m:t>r</m:t>
+                  </m:r>
+                </m:e>
+                <m:sub>
+                  <m:r>
+                    <m:t>3</m:t>
+                  </m:r>
+                </m:sub>
+              </m:sSub>
+              <m:r>
+                <m:rPr>
+                  <m:sty m:val="p"/>
+                </m:rPr>
+                <m:t>+</m:t>
+              </m:r>
+              <m:sSub>
+                <m:e>
+                  <m:r>
+                    <m:t>r</m:t>
+                  </m:r>
+                </m:e>
+                <m:sub>
+                  <m:r>
+                    <m:t>4</m:t>
+                  </m:r>
+                </m:sub>
+              </m:sSub>
+            </m:num>
+            <m:den>
+              <m:r>
+                <m:t>4</m:t>
+              </m:r>
+            </m:den>
+          </m:f>
+        </m:oMath>
+      </m:oMathPara>
+    </w:p>
+    <w:p>
+      <w:pPr>
+        <w:numPr>
+          <w:ilvl w:val="0"/>
+          <w:numId w:val="1000"/>
+        </w:numPr>
+      </w:pPr>
+      <w:r>
+        <w:t xml:space="preserve">Higher values mean a stronger top of the draft. This variable is the same for every team in the same season, so raw top-four draft-strength models are interpreted as draft-class-level evidence.</w:t>
+      </w:r>
+    </w:p>
+    <w:p>
+      <w:pPr>
         <w:numPr>
           <w:ilvl w:val="0"/>
           <w:numId w:val="1001"/>
@@ -492,30 +1050,67 @@
         <w:t xml:space="preserve">top4_avg_rating</w:t>
       </w:r>
       <w:r>
-        <w:t xml:space="preserve">:</w:t>
-      </w:r>
-      <w:r>
-        <w:br/>
-      </w:r>
-      <w:r>
-        <w:rPr>
-          <w:rStyle w:val="VerbatimChar"/>
-        </w:rPr>
-        <w:t xml:space="preserve">marginal_lottery_incentive = top4_avg_rating x marginal top-four-pick probability gain</w:t>
-      </w:r>
-      <w:r>
         <w:t xml:space="preserve">.</w:t>
       </w:r>
-      <w:r>
-        <w:br/>
-      </w:r>
+    </w:p>
+    <w:p>
+      <w:pPr>
+        <w:pStyle w:val="BodyText"/>
+      </w:pPr>
+      <m:oMathPara>
+        <m:oMathParaPr>
+          <m:jc m:val="center"/>
+        </m:oMathParaPr>
+        <m:oMath>
+          <m:r>
+            <m:rPr>
+              <m:nor/>
+              <m:sty m:val="p"/>
+            </m:rPr>
+            <m:t>Marginal lottery incentive</m:t>
+          </m:r>
+          <m:r>
+            <m:rPr>
+              <m:sty m:val="p"/>
+            </m:rPr>
+            <m:t>=</m:t>
+          </m:r>
+          <m:r>
+            <m:rPr>
+              <m:nor/>
+              <m:sty m:val="p"/>
+            </m:rPr>
+            <m:t>Top-four average rating</m:t>
+          </m:r>
+          <m:r>
+            <m:rPr>
+              <m:sty m:val="p"/>
+            </m:rPr>
+            <m:t>×</m:t>
+          </m:r>
+          <m:r>
+            <m:rPr>
+              <m:nor/>
+              <m:sty m:val="p"/>
+            </m:rPr>
+            <m:t>Marginal top-four-pick probability gain</m:t>
+          </m:r>
+        </m:oMath>
+      </m:oMathPara>
+    </w:p>
+    <w:p>
+      <w:pPr>
+        <w:numPr>
+          <w:ilvl w:val="0"/>
+          <w:numId w:val="1000"/>
+        </w:numPr>
+      </w:pPr>
       <w:r>
         <w:t xml:space="preserve">For example, if moving from the fifth-worst to fourth-worst record increases a team’s top-four-pick probability, that gain is more valuable in a year with a stronger top four. Teams with no added top-four-pick probability from moving one slot worse, such as the worst team, receive a marginal incentive of 0.</w:t>
       </w:r>
     </w:p>
     <w:p>
       <w:pPr>
-        <w:pStyle w:val="Compact"/>
         <w:numPr>
           <w:ilvl w:val="0"/>
           <w:numId w:val="1001"/>
@@ -531,39 +1126,293 @@
         <w:t xml:space="preserve"> </w:t>
       </w:r>
       <w:r>
-        <w:t xml:space="preserve">is the main win-loss outcome. It compares a team’s actual March-onward wins to the number of late-season wins expected from its pre-March winning percentage:</w:t>
-      </w:r>
-      <w:r>
-        <w:br/>
-      </w:r>
-      <w:r>
-        <w:rPr>
-          <w:rStyle w:val="VerbatimChar"/>
-        </w:rPr>
-        <w:t xml:space="preserve">expected late wins = late games x pre_win_pct</w:t>
-      </w:r>
-      <w:r>
-        <w:br/>
-      </w:r>
-      <w:r>
-        <w:rPr>
-          <w:rStyle w:val="VerbatimChar"/>
-        </w:rPr>
-        <w:t xml:space="preserve">tanking_index = (expected late wins - actual late wins) / expected standard deviation</w:t>
-      </w:r>
-      <w:r>
-        <w:t xml:space="preserve">.</w:t>
-      </w:r>
-      <w:r>
-        <w:br/>
-      </w:r>
+        <w:t xml:space="preserve">is the main win-loss outcome. It compares a team’s actual March-onward wins to the number of late-season wins expected from its pre-March winning percentage.</w:t>
+      </w:r>
+    </w:p>
+    <w:p>
+      <w:pPr>
+        <w:pStyle w:val="BodyText"/>
+      </w:pPr>
+      <m:oMathPara>
+        <m:oMathParaPr>
+          <m:jc m:val="center"/>
+        </m:oMathParaPr>
+        <m:oMath>
+          <m:sSub>
+            <m:e>
+              <m:acc>
+                <m:accPr>
+                  <m:chr m:val="̂"/>
+                </m:accPr>
+                <m:e>
+                  <m:r>
+                    <m:t>W</m:t>
+                  </m:r>
+                </m:e>
+              </m:acc>
+            </m:e>
+            <m:sub>
+              <m:r>
+                <m:rPr>
+                  <m:nor/>
+                  <m:sty m:val="p"/>
+                </m:rPr>
+                <m:t>late</m:t>
+              </m:r>
+            </m:sub>
+          </m:sSub>
+          <m:r>
+            <m:rPr>
+              <m:sty m:val="p"/>
+            </m:rPr>
+            <m:t>=</m:t>
+          </m:r>
+          <m:sSub>
+            <m:e>
+              <m:r>
+                <m:t>G</m:t>
+              </m:r>
+            </m:e>
+            <m:sub>
+              <m:r>
+                <m:rPr>
+                  <m:nor/>
+                  <m:sty m:val="p"/>
+                </m:rPr>
+                <m:t>late</m:t>
+              </m:r>
+            </m:sub>
+          </m:sSub>
+          <m:r>
+            <m:rPr>
+              <m:sty m:val="p"/>
+            </m:rPr>
+            <m:t>×</m:t>
+          </m:r>
+          <m:sSub>
+            <m:e>
+              <m:r>
+                <m:t>p</m:t>
+              </m:r>
+            </m:e>
+            <m:sub>
+              <m:r>
+                <m:rPr>
+                  <m:nor/>
+                  <m:sty m:val="p"/>
+                </m:rPr>
+                <m:t>pre</m:t>
+              </m:r>
+            </m:sub>
+          </m:sSub>
+        </m:oMath>
+      </m:oMathPara>
+    </w:p>
+    <w:p>
+      <w:pPr>
+        <w:pStyle w:val="FirstParagraph"/>
+      </w:pPr>
+      <m:oMathPara>
+        <m:oMathParaPr>
+          <m:jc m:val="center"/>
+        </m:oMathParaPr>
+        <m:oMath>
+          <m:r>
+            <m:rPr>
+              <m:nor/>
+              <m:sty m:val="p"/>
+            </m:rPr>
+            <m:t>Tanking index</m:t>
+          </m:r>
+          <m:r>
+            <m:rPr>
+              <m:sty m:val="p"/>
+            </m:rPr>
+            <m:t>=</m:t>
+          </m:r>
+          <m:f>
+            <m:fPr>
+              <m:type m:val="bar"/>
+            </m:fPr>
+            <m:num>
+              <m:sSub>
+                <m:e>
+                  <m:acc>
+                    <m:accPr>
+                      <m:chr m:val="̂"/>
+                    </m:accPr>
+                    <m:e>
+                      <m:r>
+                        <m:t>W</m:t>
+                      </m:r>
+                    </m:e>
+                  </m:acc>
+                </m:e>
+                <m:sub>
+                  <m:r>
+                    <m:rPr>
+                      <m:nor/>
+                      <m:sty m:val="p"/>
+                    </m:rPr>
+                    <m:t>late</m:t>
+                  </m:r>
+                </m:sub>
+              </m:sSub>
+              <m:r>
+                <m:rPr>
+                  <m:sty m:val="p"/>
+                </m:rPr>
+                <m:t>−</m:t>
+              </m:r>
+              <m:sSub>
+                <m:e>
+                  <m:r>
+                    <m:t>W</m:t>
+                  </m:r>
+                </m:e>
+                <m:sub>
+                  <m:r>
+                    <m:rPr>
+                      <m:nor/>
+                      <m:sty m:val="p"/>
+                    </m:rPr>
+                    <m:t>late</m:t>
+                  </m:r>
+                </m:sub>
+              </m:sSub>
+            </m:num>
+            <m:den>
+              <m:rad>
+                <m:radPr>
+                  <m:degHide m:val="on"/>
+                </m:radPr>
+                <m:deg/>
+                <m:e>
+                  <m:sSub>
+                    <m:e>
+                      <m:r>
+                        <m:t>G</m:t>
+                      </m:r>
+                    </m:e>
+                    <m:sub>
+                      <m:r>
+                        <m:rPr>
+                          <m:nor/>
+                          <m:sty m:val="p"/>
+                        </m:rPr>
+                        <m:t>late</m:t>
+                      </m:r>
+                    </m:sub>
+                  </m:sSub>
+                  <m:sSub>
+                    <m:e>
+                      <m:r>
+                        <m:t>p</m:t>
+                      </m:r>
+                    </m:e>
+                    <m:sub>
+                      <m:r>
+                        <m:rPr>
+                          <m:nor/>
+                          <m:sty m:val="p"/>
+                        </m:rPr>
+                        <m:t>pre</m:t>
+                      </m:r>
+                    </m:sub>
+                  </m:sSub>
+                  <m:d>
+                    <m:dPr>
+                      <m:begChr m:val="("/>
+                      <m:sepChr m:val=""/>
+                      <m:endChr m:val=")"/>
+                      <m:grow/>
+                    </m:dPr>
+                    <m:e>
+                      <m:r>
+                        <m:t>1</m:t>
+                      </m:r>
+                      <m:r>
+                        <m:rPr>
+                          <m:sty m:val="p"/>
+                        </m:rPr>
+                        <m:t>−</m:t>
+                      </m:r>
+                      <m:sSub>
+                        <m:e>
+                          <m:r>
+                            <m:t>p</m:t>
+                          </m:r>
+                        </m:e>
+                        <m:sub>
+                          <m:r>
+                            <m:rPr>
+                              <m:nor/>
+                              <m:sty m:val="p"/>
+                            </m:rPr>
+                            <m:t>pre</m:t>
+                          </m:r>
+                        </m:sub>
+                      </m:sSub>
+                    </m:e>
+                  </m:d>
+                </m:e>
+              </m:rad>
+            </m:den>
+          </m:f>
+        </m:oMath>
+      </m:oMathPara>
+    </w:p>
+    <w:p>
+      <w:pPr>
+        <w:numPr>
+          <w:ilvl w:val="0"/>
+          <w:numId w:val="1000"/>
+        </w:numPr>
+      </w:pPr>
+      <w:r>
+        <w:t xml:space="preserve">Here,</w:t>
+      </w:r>
+      <w:r>
+        <w:t xml:space="preserve"> </w:t>
+      </w:r>
+      <m:oMath>
+        <m:sSub>
+          <m:e>
+            <m:r>
+              <m:t>p</m:t>
+            </m:r>
+          </m:e>
+          <m:sub>
+            <m:r>
+              <m:rPr>
+                <m:nor/>
+                <m:sty m:val="p"/>
+              </m:rPr>
+              <m:t>pre</m:t>
+            </m:r>
+          </m:sub>
+        </m:sSub>
+      </m:oMath>
+      <w:r>
+        <w:t xml:space="preserve"> </w:t>
+      </w:r>
+      <w:r>
+        <w:t xml:space="preserve">is the team’s pre-March winning percentage. The code uses a small lower bound on the denominator for numerical stability.</w:t>
+      </w:r>
+    </w:p>
+    <w:p>
+      <w:pPr>
+        <w:numPr>
+          <w:ilvl w:val="0"/>
+          <w:numId w:val="1000"/>
+        </w:numPr>
+      </w:pPr>
       <w:r>
         <w:t xml:space="preserve">Positive values mean the team won fewer late-season games than expected. Values near 0 mean it performed about as expected. Negative values mean it overperformed late in the season.</w:t>
       </w:r>
     </w:p>
     <w:p>
       <w:pPr>
-        <w:pStyle w:val="Compact"/>
         <w:numPr>
           <w:ilvl w:val="0"/>
           <w:numId w:val="1001"/>
@@ -579,12 +1428,598 @@
         <w:t xml:space="preserve"> </w:t>
       </w:r>
       <w:r>
-        <w:t xml:space="preserve">is an exploratory team-specific measure of whether a team’s weaknesses line up with the strengths of that year’s draft. We group players and prospects into guards, wings, and bigs. First, we estimate each team’s pre-March need by identifying position groups where its production was below the league average. Second, we calculate which position groups contain more high-rated prospects in that draft class. The score is higher when a team’s weak position groups match the positions where the draft class is strongest. This is a rough proxy for roster fit, not a team-specific draft board.</w:t>
-      </w:r>
-    </w:p>
-    <w:p>
-      <w:pPr>
-        <w:pStyle w:val="Compact"/>
+        <w:t xml:space="preserve">is an exploratory team-specific measure of whether a team’s weakest position groups match the strongest position groups in that year’s draft. We group players and prospects into three position groups: guards, wings, and bigs. For each team-position group before March 1, we calculate a simple production rate:</w:t>
+      </w:r>
+    </w:p>
+    <w:p>
+      <w:pPr>
+        <w:pStyle w:val="BodyText"/>
+      </w:pPr>
+      <m:oMathPara>
+        <m:oMathParaPr>
+          <m:jc m:val="center"/>
+        </m:oMathParaPr>
+        <m:oMath>
+          <m:r>
+            <m:rPr>
+              <m:nor/>
+              <m:sty m:val="p"/>
+            </m:rPr>
+            <m:t>Value per 36</m:t>
+          </m:r>
+          <m:r>
+            <m:rPr>
+              <m:sty m:val="p"/>
+            </m:rPr>
+            <m:t>=</m:t>
+          </m:r>
+          <m:r>
+            <m:t>36</m:t>
+          </m:r>
+          <m:r>
+            <m:rPr>
+              <m:sty m:val="p"/>
+            </m:rPr>
+            <m:t>×</m:t>
+          </m:r>
+          <m:f>
+            <m:fPr>
+              <m:type m:val="bar"/>
+            </m:fPr>
+            <m:num>
+              <m:r>
+                <m:rPr>
+                  <m:nor/>
+                  <m:sty m:val="p"/>
+                </m:rPr>
+                <m:t>points</m:t>
+              </m:r>
+              <m:r>
+                <m:rPr>
+                  <m:sty m:val="p"/>
+                </m:rPr>
+                <m:t>+</m:t>
+              </m:r>
+              <m:r>
+                <m:rPr>
+                  <m:nor/>
+                  <m:sty m:val="p"/>
+                </m:rPr>
+                <m:t>rebounds</m:t>
+              </m:r>
+              <m:r>
+                <m:rPr>
+                  <m:sty m:val="p"/>
+                </m:rPr>
+                <m:t>+</m:t>
+              </m:r>
+              <m:r>
+                <m:rPr>
+                  <m:nor/>
+                  <m:sty m:val="p"/>
+                </m:rPr>
+                <m:t>assists</m:t>
+              </m:r>
+              <m:r>
+                <m:rPr>
+                  <m:sty m:val="p"/>
+                </m:rPr>
+                <m:t>+</m:t>
+              </m:r>
+              <m:r>
+                <m:rPr>
+                  <m:nor/>
+                  <m:sty m:val="p"/>
+                </m:rPr>
+                <m:t>steals</m:t>
+              </m:r>
+              <m:r>
+                <m:rPr>
+                  <m:sty m:val="p"/>
+                </m:rPr>
+                <m:t>+</m:t>
+              </m:r>
+              <m:r>
+                <m:rPr>
+                  <m:nor/>
+                  <m:sty m:val="p"/>
+                </m:rPr>
+                <m:t>blocks</m:t>
+              </m:r>
+              <m:r>
+                <m:rPr>
+                  <m:sty m:val="p"/>
+                </m:rPr>
+                <m:t>−</m:t>
+              </m:r>
+              <m:r>
+                <m:rPr>
+                  <m:nor/>
+                  <m:sty m:val="p"/>
+                </m:rPr>
+                <m:t>turnovers</m:t>
+              </m:r>
+            </m:num>
+            <m:den>
+              <m:r>
+                <m:rPr>
+                  <m:nor/>
+                  <m:sty m:val="p"/>
+                </m:rPr>
+                <m:t>minutes</m:t>
+              </m:r>
+            </m:den>
+          </m:f>
+        </m:oMath>
+      </m:oMathPara>
+    </w:p>
+    <w:p>
+      <w:pPr>
+        <w:numPr>
+          <w:ilvl w:val="0"/>
+          <w:numId w:val="1000"/>
+        </w:numPr>
+      </w:pPr>
+      <w:r>
+        <w:t xml:space="preserve">Within each season and position group, we standardize value per 36 across teams. A team gets a positive need score only where it is below average:</w:t>
+      </w:r>
+    </w:p>
+    <w:p>
+      <w:pPr>
+        <w:pStyle w:val="BodyText"/>
+      </w:pPr>
+      <m:oMathPara>
+        <m:oMathParaPr>
+          <m:jc m:val="center"/>
+        </m:oMathParaPr>
+        <m:oMath>
+          <m:sSub>
+            <m:e>
+              <m:r>
+                <m:rPr>
+                  <m:nor/>
+                  <m:sty m:val="p"/>
+                </m:rPr>
+                <m:t>Position need</m:t>
+              </m:r>
+            </m:e>
+            <m:sub>
+              <m:r>
+                <m:t>g</m:t>
+              </m:r>
+            </m:sub>
+          </m:sSub>
+          <m:r>
+            <m:rPr>
+              <m:sty m:val="p"/>
+            </m:rPr>
+            <m:t>=</m:t>
+          </m:r>
+          <m:r>
+            <m:rPr>
+              <m:sty m:val="p"/>
+            </m:rPr>
+            <m:t>max</m:t>
+          </m:r>
+          <m:d>
+            <m:dPr>
+              <m:begChr m:val="("/>
+              <m:sepChr m:val=""/>
+              <m:endChr m:val=")"/>
+              <m:grow/>
+            </m:dPr>
+            <m:e>
+              <m:r>
+                <m:t>0</m:t>
+              </m:r>
+              <m:r>
+                <m:rPr>
+                  <m:sty m:val="p"/>
+                </m:rPr>
+                <m:t>,</m:t>
+              </m:r>
+              <m:r>
+                <m:rPr>
+                  <m:sty m:val="p"/>
+                </m:rPr>
+                <m:t>−</m:t>
+              </m:r>
+              <m:r>
+                <m:t>z</m:t>
+              </m:r>
+              <m:d>
+                <m:dPr>
+                  <m:begChr m:val="("/>
+                  <m:sepChr m:val=""/>
+                  <m:endChr m:val=")"/>
+                  <m:grow/>
+                </m:dPr>
+                <m:e>
+                  <m:sSub>
+                    <m:e>
+                      <m:r>
+                        <m:rPr>
+                          <m:nor/>
+                          <m:sty m:val="p"/>
+                        </m:rPr>
+                        <m:t>Value per 36</m:t>
+                      </m:r>
+                    </m:e>
+                    <m:sub>
+                      <m:r>
+                        <m:t>g</m:t>
+                      </m:r>
+                    </m:sub>
+                  </m:sSub>
+                </m:e>
+              </m:d>
+            </m:e>
+          </m:d>
+        </m:oMath>
+      </m:oMathPara>
+    </w:p>
+    <w:p>
+      <w:pPr>
+        <w:numPr>
+          <w:ilvl w:val="0"/>
+          <w:numId w:val="1000"/>
+        </w:numPr>
+      </w:pPr>
+      <w:r>
+        <w:t xml:space="preserve">We then measure draft supply using the top 35 CraftedNBA prospects. Each prospect’s draft value is:</w:t>
+      </w:r>
+    </w:p>
+    <w:p>
+      <w:pPr>
+        <w:pStyle w:val="BodyText"/>
+      </w:pPr>
+      <m:oMathPara>
+        <m:oMathParaPr>
+          <m:jc m:val="center"/>
+        </m:oMathParaPr>
+        <m:oMath>
+          <m:sSub>
+            <m:e>
+              <m:r>
+                <m:rPr>
+                  <m:nor/>
+                  <m:sty m:val="p"/>
+                </m:rPr>
+                <m:t>Draft value</m:t>
+              </m:r>
+            </m:e>
+            <m:sub>
+              <m:r>
+                <m:t>j</m:t>
+              </m:r>
+            </m:sub>
+          </m:sSub>
+          <m:r>
+            <m:rPr>
+              <m:sty m:val="p"/>
+            </m:rPr>
+            <m:t>=</m:t>
+          </m:r>
+          <m:r>
+            <m:rPr>
+              <m:sty m:val="p"/>
+            </m:rPr>
+            <m:t>max</m:t>
+          </m:r>
+          <m:d>
+            <m:dPr>
+              <m:begChr m:val="("/>
+              <m:sepChr m:val=""/>
+              <m:endChr m:val=")"/>
+              <m:grow/>
+            </m:dPr>
+            <m:e>
+              <m:sSub>
+                <m:e>
+                  <m:r>
+                    <m:rPr>
+                      <m:nor/>
+                      <m:sty m:val="p"/>
+                    </m:rPr>
+                    <m:t>rating</m:t>
+                  </m:r>
+                </m:e>
+                <m:sub>
+                  <m:r>
+                    <m:t>j</m:t>
+                  </m:r>
+                </m:sub>
+              </m:sSub>
+              <m:r>
+                <m:rPr>
+                  <m:sty m:val="p"/>
+                </m:rPr>
+                <m:t>−</m:t>
+              </m:r>
+              <m:r>
+                <m:t>50</m:t>
+              </m:r>
+              <m:r>
+                <m:rPr>
+                  <m:sty m:val="p"/>
+                </m:rPr>
+                <m:t>,</m:t>
+              </m:r>
+              <m:r>
+                <m:t>0</m:t>
+              </m:r>
+            </m:e>
+          </m:d>
+        </m:oMath>
+      </m:oMathPara>
+    </w:p>
+    <w:p>
+      <w:pPr>
+        <w:numPr>
+          <w:ilvl w:val="0"/>
+          <w:numId w:val="1000"/>
+        </w:numPr>
+      </w:pPr>
+      <w:r>
+        <w:t xml:space="preserve">For each position group, draft value is converted into a share of all top-35 draft value:</w:t>
+      </w:r>
+    </w:p>
+    <w:p>
+      <w:pPr>
+        <w:pStyle w:val="BodyText"/>
+      </w:pPr>
+      <m:oMathPara>
+        <m:oMathParaPr>
+          <m:jc m:val="center"/>
+        </m:oMathParaPr>
+        <m:oMath>
+          <m:sSub>
+            <m:e>
+              <m:r>
+                <m:rPr>
+                  <m:nor/>
+                  <m:sty m:val="p"/>
+                </m:rPr>
+                <m:t>Draft value share</m:t>
+              </m:r>
+            </m:e>
+            <m:sub>
+              <m:r>
+                <m:t>g</m:t>
+              </m:r>
+            </m:sub>
+          </m:sSub>
+          <m:r>
+            <m:rPr>
+              <m:sty m:val="p"/>
+            </m:rPr>
+            <m:t>=</m:t>
+          </m:r>
+          <m:f>
+            <m:fPr>
+              <m:type m:val="bar"/>
+            </m:fPr>
+            <m:num>
+              <m:nary>
+                <m:naryPr>
+                  <m:chr m:val="∑"/>
+                  <m:limLoc m:val="undOvr"/>
+                  <m:subHide m:val="off"/>
+                  <m:supHide m:val="on"/>
+                </m:naryPr>
+                <m:sub>
+                  <m:r>
+                    <m:t>j</m:t>
+                  </m:r>
+                  <m:r>
+                    <m:rPr>
+                      <m:sty m:val="p"/>
+                    </m:rPr>
+                    <m:t>∈</m:t>
+                  </m:r>
+                  <m:r>
+                    <m:t>g</m:t>
+                  </m:r>
+                </m:sub>
+                <m:sup>
+                  <m:r>
+                    <m:t>​</m:t>
+                  </m:r>
+                </m:sup>
+                <m:e>
+                  <m:sSub>
+                    <m:e>
+                      <m:r>
+                        <m:rPr>
+                          <m:nor/>
+                          <m:sty m:val="p"/>
+                        </m:rPr>
+                        <m:t>Draft value</m:t>
+                      </m:r>
+                    </m:e>
+                    <m:sub>
+                      <m:r>
+                        <m:t>j</m:t>
+                      </m:r>
+                    </m:sub>
+                  </m:sSub>
+                </m:e>
+              </m:nary>
+            </m:num>
+            <m:den>
+              <m:nary>
+                <m:naryPr>
+                  <m:chr m:val="∑"/>
+                  <m:limLoc m:val="undOvr"/>
+                  <m:subHide m:val="off"/>
+                  <m:supHide m:val="on"/>
+                </m:naryPr>
+                <m:sub>
+                  <m:r>
+                    <m:t>j</m:t>
+                  </m:r>
+                </m:sub>
+                <m:sup>
+                  <m:r>
+                    <m:t>​</m:t>
+                  </m:r>
+                </m:sup>
+                <m:e>
+                  <m:sSub>
+                    <m:e>
+                      <m:r>
+                        <m:rPr>
+                          <m:nor/>
+                          <m:sty m:val="p"/>
+                        </m:rPr>
+                        <m:t>Draft value</m:t>
+                      </m:r>
+                    </m:e>
+                    <m:sub>
+                      <m:r>
+                        <m:t>j</m:t>
+                      </m:r>
+                    </m:sub>
+                  </m:sSub>
+                </m:e>
+              </m:nary>
+            </m:den>
+          </m:f>
+        </m:oMath>
+      </m:oMathPara>
+    </w:p>
+    <w:p>
+      <w:pPr>
+        <w:numPr>
+          <w:ilvl w:val="0"/>
+          <w:numId w:val="1000"/>
+        </w:numPr>
+      </w:pPr>
+      <w:r>
+        <w:t xml:space="preserve">The final score is:</w:t>
+      </w:r>
+    </w:p>
+    <w:p>
+      <w:pPr>
+        <w:pStyle w:val="BodyText"/>
+      </w:pPr>
+      <m:oMathPara>
+        <m:oMathParaPr>
+          <m:jc m:val="center"/>
+        </m:oMathParaPr>
+        <m:oMath>
+          <m:r>
+            <m:rPr>
+              <m:nor/>
+              <m:sty m:val="p"/>
+            </m:rPr>
+            <m:t>Team fit score</m:t>
+          </m:r>
+          <m:r>
+            <m:rPr>
+              <m:sty m:val="p"/>
+            </m:rPr>
+            <m:t>=</m:t>
+          </m:r>
+          <m:nary>
+            <m:naryPr>
+              <m:chr m:val="∑"/>
+              <m:limLoc m:val="undOvr"/>
+              <m:subHide m:val="off"/>
+              <m:supHide m:val="on"/>
+            </m:naryPr>
+            <m:sub>
+              <m:r>
+                <m:t>g</m:t>
+              </m:r>
+              <m:r>
+                <m:rPr>
+                  <m:sty m:val="p"/>
+                </m:rPr>
+                <m:t>∈</m:t>
+              </m:r>
+              <m:r>
+                <m:rPr>
+                  <m:sty m:val="p"/>
+                </m:rPr>
+                <m:t>{</m:t>
+              </m:r>
+              <m:r>
+                <m:rPr>
+                  <m:nor/>
+                  <m:sty m:val="p"/>
+                </m:rPr>
+                <m:t>Guard, Wing, Big</m:t>
+              </m:r>
+              <m:r>
+                <m:rPr>
+                  <m:sty m:val="p"/>
+                </m:rPr>
+                <m:t>}</m:t>
+              </m:r>
+            </m:sub>
+            <m:sup>
+              <m:r>
+                <m:t>​</m:t>
+              </m:r>
+            </m:sup>
+            <m:e>
+              <m:sSub>
+                <m:e>
+                  <m:r>
+                    <m:rPr>
+                      <m:nor/>
+                      <m:sty m:val="p"/>
+                    </m:rPr>
+                    <m:t>Position need</m:t>
+                  </m:r>
+                </m:e>
+                <m:sub>
+                  <m:r>
+                    <m:t>g</m:t>
+                  </m:r>
+                </m:sub>
+              </m:sSub>
+            </m:e>
+          </m:nary>
+          <m:r>
+            <m:rPr>
+              <m:sty m:val="p"/>
+            </m:rPr>
+            <m:t>×</m:t>
+          </m:r>
+          <m:sSub>
+            <m:e>
+              <m:r>
+                <m:rPr>
+                  <m:nor/>
+                  <m:sty m:val="p"/>
+                </m:rPr>
+                <m:t>Draft value share</m:t>
+              </m:r>
+            </m:e>
+            <m:sub>
+              <m:r>
+                <m:t>g</m:t>
+              </m:r>
+            </m:sub>
+          </m:sSub>
+        </m:oMath>
+      </m:oMathPara>
+    </w:p>
+    <w:p>
+      <w:pPr>
+        <w:numPr>
+          <w:ilvl w:val="0"/>
+          <w:numId w:val="1000"/>
+        </w:numPr>
+      </w:pPr>
+      <w:r>
+        <w:t xml:space="preserve">Higher values mean a team was weak at positions where that draft had more high-rated prospects. This is a rough proxy for roster fit, not a team-specific draft board.</w:t>
+      </w:r>
+    </w:p>
+    <w:p>
+      <w:pPr>
         <w:numPr>
           <w:ilvl w:val="0"/>
           <w:numId w:val="1001"/>
@@ -614,28 +2049,81 @@
       <w:r>
         <w:t xml:space="preserve">We then calculate their combined minutes per team game before and after March:</w:t>
       </w:r>
-      <w:r>
-        <w:br/>
-      </w:r>
-      <w:r>
-        <w:rPr>
-          <w:rStyle w:val="VerbatimChar"/>
-        </w:rPr>
-        <w:t xml:space="preserve">core usage drop rate = (pre-March core MPG - late core MPG) / pre-March core MPG</w:t>
-      </w:r>
-      <w:r>
-        <w:t xml:space="preserve">.</w:t>
-      </w:r>
-      <w:r>
-        <w:br/>
-      </w:r>
+    </w:p>
+    <w:p>
+      <w:pPr>
+        <w:pStyle w:val="BodyText"/>
+      </w:pPr>
+      <m:oMathPara>
+        <m:oMathParaPr>
+          <m:jc m:val="center"/>
+        </m:oMathParaPr>
+        <m:oMath>
+          <m:r>
+            <m:rPr>
+              <m:nor/>
+              <m:sty m:val="p"/>
+            </m:rPr>
+            <m:t>Core usage drop rate</m:t>
+          </m:r>
+          <m:r>
+            <m:rPr>
+              <m:sty m:val="p"/>
+            </m:rPr>
+            <m:t>=</m:t>
+          </m:r>
+          <m:f>
+            <m:fPr>
+              <m:type m:val="bar"/>
+            </m:fPr>
+            <m:num>
+              <m:r>
+                <m:rPr>
+                  <m:nor/>
+                  <m:sty m:val="p"/>
+                </m:rPr>
+                <m:t>Pre-March core MPG</m:t>
+              </m:r>
+              <m:r>
+                <m:rPr>
+                  <m:sty m:val="p"/>
+                </m:rPr>
+                <m:t>−</m:t>
+              </m:r>
+              <m:r>
+                <m:rPr>
+                  <m:nor/>
+                  <m:sty m:val="p"/>
+                </m:rPr>
+                <m:t>Late core MPG</m:t>
+              </m:r>
+            </m:num>
+            <m:den>
+              <m:r>
+                <m:rPr>
+                  <m:nor/>
+                  <m:sty m:val="p"/>
+                </m:rPr>
+                <m:t>Pre-March core MPG</m:t>
+              </m:r>
+            </m:den>
+          </m:f>
+        </m:oMath>
+      </m:oMathPara>
+    </w:p>
+    <w:p>
+      <w:pPr>
+        <w:numPr>
+          <w:ilvl w:val="0"/>
+          <w:numId w:val="1000"/>
+        </w:numPr>
+      </w:pPr>
       <w:r>
         <w:t xml:space="preserve">Positive values mean the team’s main continuing pre-March players were used less after March 1. This does not prove healthy starters were benched; injuries, rest, development minutes, and coaching decisions can also reduce minutes.</w:t>
       </w:r>
     </w:p>
     <w:p>
       <w:pPr>
-        <w:pStyle w:val="Compact"/>
         <w:numPr>
           <w:ilvl w:val="0"/>
           <w:numId w:val="1001"/>
@@ -698,34 +2186,60 @@
         <w:t xml:space="preserve"> </w:t>
       </w:r>
       <w:r>
-        <w:t xml:space="preserve">is the main outcome because it uses more information than a simple cutoff. For example, the 2021 Rockets were 11-21 before March, a .344 win percentage. If they had kept winning at that rate over their 40 March-onward games, they would have been expected to win about 13.8 games. They won 6, leaving a shortfall of 7.8 wins and a tanking index of 2.58. This does not prove intent, but it identifies a large late-season underperformance relative to that team’s own earlier baseline. Similarly, if a team’s top three continuing core players averaged 95 combined minutes per game before March and 76 after March, its</w:t>
-      </w:r>
-      <w:r>
-        <w:t xml:space="preserve"> </w:t>
-      </w:r>
-      <w:r>
-        <w:rPr>
-          <w:rStyle w:val="VerbatimChar"/>
-        </w:rPr>
-        <w:t xml:space="preserve">core_usage_drop_rate</w:t>
-      </w:r>
-      <w:r>
-        <w:t xml:space="preserve"> </w:t>
-      </w:r>
-      <w:r>
-        <w:t xml:space="preserve">would be</w:t>
-      </w:r>
-      <w:r>
-        <w:t xml:space="preserve"> </w:t>
-      </w:r>
-      <w:r>
-        <w:rPr>
-          <w:rStyle w:val="VerbatimChar"/>
-        </w:rPr>
-        <w:t xml:space="preserve">(95 - 76) / 95 = 0.20</w:t>
-      </w:r>
-      <w:r>
-        <w:t xml:space="preserve">, or a 20% drop in core-player usage.</w:t>
+        <w:t xml:space="preserve">is the main outcome because it uses more information than a simple cutoff. For example, the 2021 Rockets were 11-21 before March, a .344 win percentage. If they had kept winning at that rate over their 40 March-onward games, they would have been expected to win about 13.8 games. They won 6, leaving a shortfall of 7.8 wins and a tanking index of 2.58. This does not prove intent, but it identifies a large late-season underperformance relative to that team’s own earlier baseline. Similarly, if a team’s top three continuing core players averaged 95 combined minutes per game before March and 76 after March, its core usage drop rate would be:</w:t>
+      </w:r>
+    </w:p>
+    <w:p>
+      <w:pPr>
+        <w:pStyle w:val="BodyText"/>
+      </w:pPr>
+      <m:oMathPara>
+        <m:oMathParaPr>
+          <m:jc m:val="center"/>
+        </m:oMathParaPr>
+        <m:oMath>
+          <m:f>
+            <m:fPr>
+              <m:type m:val="bar"/>
+            </m:fPr>
+            <m:num>
+              <m:r>
+                <m:t>95</m:t>
+              </m:r>
+              <m:r>
+                <m:rPr>
+                  <m:sty m:val="p"/>
+                </m:rPr>
+                <m:t>−</m:t>
+              </m:r>
+              <m:r>
+                <m:t>76</m:t>
+              </m:r>
+            </m:num>
+            <m:den>
+              <m:r>
+                <m:t>95</m:t>
+              </m:r>
+            </m:den>
+          </m:f>
+          <m:r>
+            <m:rPr>
+              <m:sty m:val="p"/>
+            </m:rPr>
+            <m:t>=</m:t>
+          </m:r>
+          <m:r>
+            <m:t>0.20</m:t>
+          </m:r>
+        </m:oMath>
+      </m:oMathPara>
+    </w:p>
+    <w:p>
+      <w:pPr>
+        <w:pStyle w:val="FirstParagraph"/>
+      </w:pPr>
+      <w:r>
+        <w:t xml:space="preserve">or a 20% drop in core-player usage.</w:t>
       </w:r>
     </w:p>
     <w:bookmarkEnd w:id="29"/>
@@ -927,11 +2441,7 @@
           <w:p>
             <w:pPr>
               <w:pStyle w:val="Compact"/>
-              <w:jc w:val="left"/>
-            </w:pPr>
-            <w:r>
-              <w:t xml:space="preserve">Post-reform (2019-2026)</w:t>
-            </w:r>
+            </w:pPr>
           </w:p>
         </w:tc>
         <w:tc>
@@ -1075,11 +2585,7 @@
           <w:p>
             <w:pPr>
               <w:pStyle w:val="Compact"/>
-              <w:jc w:val="left"/>
-            </w:pPr>
-            <w:r>
-              <w:t xml:space="preserve">Pre-reform (2010-2018)</w:t>
-            </w:r>
+            </w:pPr>
           </w:p>
         </w:tc>
         <w:tc>
@@ -1745,11 +3251,7 @@
           <w:p>
             <w:pPr>
               <w:pStyle w:val="Compact"/>
-              <w:jc w:val="left"/>
-            </w:pPr>
-            <w:r>
-              <w:t xml:space="preserve">Tanking index</w:t>
-            </w:r>
+            </w:pPr>
           </w:p>
         </w:tc>
         <w:tc>
@@ -1795,11 +3297,7 @@
           <w:p>
             <w:pPr>
               <w:pStyle w:val="Compact"/>
-              <w:jc w:val="left"/>
-            </w:pPr>
-            <w:r>
-              <w:t xml:space="preserve">Tanking index</w:t>
-            </w:r>
+            </w:pPr>
           </w:p>
         </w:tc>
         <w:tc>
@@ -2186,11 +3684,7 @@
           <w:p>
             <w:pPr>
               <w:pStyle w:val="Compact"/>
-              <w:jc w:val="left"/>
-            </w:pPr>
-            <w:r>
-              <w:t xml:space="preserve">Tanking index</w:t>
-            </w:r>
+            </w:pPr>
           </w:p>
         </w:tc>
         <w:tc>
@@ -2248,11 +3742,7 @@
           <w:p>
             <w:pPr>
               <w:pStyle w:val="Compact"/>
-              <w:jc w:val="left"/>
-            </w:pPr>
-            <w:r>
-              <w:t xml:space="preserve">Tanking index</w:t>
-            </w:r>
+            </w:pPr>
           </w:p>
         </w:tc>
         <w:tc>
@@ -2310,11 +3800,7 @@
           <w:p>
             <w:pPr>
               <w:pStyle w:val="Compact"/>
-              <w:jc w:val="left"/>
-            </w:pPr>
-            <w:r>
-              <w:t xml:space="preserve">Tanking index</w:t>
-            </w:r>
+            </w:pPr>
           </w:p>
         </w:tc>
         <w:tc>
@@ -2372,11 +3858,7 @@
           <w:p>
             <w:pPr>
               <w:pStyle w:val="Compact"/>
-              <w:jc w:val="left"/>
-            </w:pPr>
-            <w:r>
-              <w:t xml:space="preserve">Tanking index</w:t>
-            </w:r>
+            </w:pPr>
           </w:p>
         </w:tc>
         <w:tc>
@@ -2601,11 +4083,7 @@
           <w:p>
             <w:pPr>
               <w:pStyle w:val="Compact"/>
-              <w:jc w:val="left"/>
-            </w:pPr>
-            <w:r>
-              <w:t xml:space="preserve">Tanking index</w:t>
-            </w:r>
+            </w:pPr>
           </w:p>
         </w:tc>
         <w:tc>
@@ -2704,7 +4182,22 @@
         <w:t xml:space="preserve"> </w:t>
       </w:r>
       <w:r>
-        <w:t xml:space="preserve">in two steps. First, we use pre-March player game logs to measure each team’s production by position group: guard, wing, and big. Position groups that are below the league average in that season receive higher need scores. Second, we use CraftedNBA prospect positions and ratings to measure how much of each draft class’s top-35 prospect value is concentrated in each position group. The final fit score is higher when a team’s weak position groups align with the position groups where that draft has more high-rated prospects.</w:t>
+        <w:t xml:space="preserve">by matching team need to draft supply. Team need comes from pre-March production by position group. For guards, wings, and bigs, we calculate each team’s</w:t>
+      </w:r>
+      <w:r>
+        <w:t xml:space="preserve"> </w:t>
+      </w:r>
+      <w:r>
+        <w:rPr>
+          <w:rStyle w:val="VerbatimChar"/>
+        </w:rPr>
+        <w:t xml:space="preserve">value_per36</w:t>
+      </w:r>
+      <w:r>
+        <w:t xml:space="preserve"> </w:t>
+      </w:r>
+      <w:r>
+        <w:t xml:space="preserve">using points, rebounds, assists, steals, blocks, turnovers, and minutes. We then standardize that rate within each season-position group, so below-average production becomes a positive need score and above-average production becomes 0 need. Draft supply comes from the top 35 CraftedNBA prospects: we calculate each prospect’s positive rating value above 50, sum that value by position group, and convert it to a share of the draft class’s top-35 value. The final score multiplies each position group’s team need by that position group’s draft-value share and sums across guards, wings, and bigs.</w:t>
       </w:r>
     </w:p>
     <w:p>
@@ -2915,11 +4408,7 @@
           <w:p>
             <w:pPr>
               <w:pStyle w:val="Compact"/>
-              <w:jc w:val="left"/>
-            </w:pPr>
-            <w:r>
-              <w:t xml:space="preserve">Tanking index</w:t>
-            </w:r>
+            </w:pPr>
           </w:p>
         </w:tc>
         <w:tc>
@@ -2965,11 +4454,7 @@
           <w:p>
             <w:pPr>
               <w:pStyle w:val="Compact"/>
-              <w:jc w:val="left"/>
-            </w:pPr>
-            <w:r>
-              <w:t xml:space="preserve">Tanking index</w:t>
-            </w:r>
+            </w:pPr>
           </w:p>
         </w:tc>
         <w:tc>
@@ -3322,11 +4807,7 @@
           <w:p>
             <w:pPr>
               <w:pStyle w:val="Compact"/>
-              <w:jc w:val="left"/>
-            </w:pPr>
-            <w:r>
-              <w:t xml:space="preserve">Core-player usage drop rate</w:t>
-            </w:r>
+            </w:pPr>
           </w:p>
         </w:tc>
         <w:tc>
@@ -3384,11 +4865,7 @@
           <w:p>
             <w:pPr>
               <w:pStyle w:val="Compact"/>
-              <w:jc w:val="left"/>
-            </w:pPr>
-            <w:r>
-              <w:t xml:space="preserve">Core-player usage drop rate</w:t>
-            </w:r>
+            </w:pPr>
           </w:p>
         </w:tc>
         <w:tc>
@@ -3446,11 +4923,7 @@
           <w:p>
             <w:pPr>
               <w:pStyle w:val="Compact"/>
-              <w:jc w:val="left"/>
-            </w:pPr>
-            <w:r>
-              <w:t xml:space="preserve">Core-player usage drop rate</w:t>
-            </w:r>
+            </w:pPr>
           </w:p>
         </w:tc>
         <w:tc>
@@ -3508,11 +4981,7 @@
           <w:p>
             <w:pPr>
               <w:pStyle w:val="Compact"/>
-              <w:jc w:val="left"/>
-            </w:pPr>
-            <w:r>
-              <w:t xml:space="preserve">Core-player usage drop rate</w:t>
-            </w:r>
+            </w:pPr>
           </w:p>
         </w:tc>
         <w:tc>
@@ -3903,11 +5372,7 @@
           <w:p>
             <w:pPr>
               <w:pStyle w:val="Compact"/>
-              <w:jc w:val="left"/>
-            </w:pPr>
-            <w:r>
-              <w:t xml:space="preserve">Pre/post interaction</w:t>
-            </w:r>
+            </w:pPr>
           </w:p>
         </w:tc>
         <w:tc>

</xml_diff>

<commit_message>
changed some of the language
</commit_message>
<xml_diff>
--- a/final-report.docx
+++ b/final-report.docx
@@ -32,7 +32,7 @@
         <w:pStyle w:val="FirstParagraph"/>
       </w:pPr>
       <w:r>
-        <w:t xml:space="preserve">This project studies whether stronger NBA draft classes are associated with more late-season underperformance among teams with weak playoff outlooks. Using NBA team and player game logs from 2010 through 2026 and CraftedNBA draft prospect ratings, we build a team-season dataset that compares each team’s performance before March 1 to its performance after March 1. As the project developed, we moved away from a simple binary definition of tanking and instead used a standardized</w:t>
+        <w:t xml:space="preserve">This project studies whether stronger National Basketball Association (NBA) draft classes are associated with more late-season underperformance among teams with weak playoff outlooks. Using NBA team and player game logs from 2010 through 2026 and CraftedNBA draft prospect ratings, we build a team-season dataset that compares each team’s performance before March 1 to its performance after March 1. As the project developed, we moved away from a simple binary definition of tanking and instead used a standardized</w:t>
       </w:r>
       <w:r>
         <w:t xml:space="preserve"> </w:t>
@@ -1138,29 +1138,38 @@
           <m:jc m:val="center"/>
         </m:oMathParaPr>
         <m:oMath>
-          <m:sSub>
+          <m:r>
+            <m:rPr>
+              <m:sty m:val="p"/>
+            </m:rPr>
+            <m:t>E</m:t>
+          </m:r>
+          <m:d>
+            <m:dPr>
+              <m:begChr m:val="("/>
+              <m:sepChr m:val=""/>
+              <m:endChr m:val=")"/>
+              <m:grow/>
+            </m:dPr>
             <m:e>
-              <m:acc>
-                <m:accPr>
-                  <m:chr m:val="̂"/>
-                </m:accPr>
+              <m:sSub>
                 <m:e>
                   <m:r>
                     <m:t>W</m:t>
                   </m:r>
                 </m:e>
-              </m:acc>
+                <m:sub>
+                  <m:r>
+                    <m:rPr>
+                      <m:nor/>
+                      <m:sty m:val="p"/>
+                    </m:rPr>
+                    <m:t>late</m:t>
+                  </m:r>
+                </m:sub>
+              </m:sSub>
             </m:e>
-            <m:sub>
-              <m:r>
-                <m:rPr>
-                  <m:nor/>
-                  <m:sty m:val="p"/>
-                </m:rPr>
-                <m:t>late</m:t>
-              </m:r>
-            </m:sub>
-          </m:sSub>
+          </m:d>
           <m:r>
             <m:rPr>
               <m:sty m:val="p"/>
@@ -1235,29 +1244,38 @@
               <m:type m:val="bar"/>
             </m:fPr>
             <m:num>
-              <m:sSub>
+              <m:r>
+                <m:rPr>
+                  <m:sty m:val="p"/>
+                </m:rPr>
+                <m:t>E</m:t>
+              </m:r>
+              <m:d>
+                <m:dPr>
+                  <m:begChr m:val="("/>
+                  <m:sepChr m:val=""/>
+                  <m:endChr m:val=")"/>
+                  <m:grow/>
+                </m:dPr>
                 <m:e>
-                  <m:acc>
-                    <m:accPr>
-                      <m:chr m:val="̂"/>
-                    </m:accPr>
+                  <m:sSub>
                     <m:e>
                       <m:r>
                         <m:t>W</m:t>
                       </m:r>
                     </m:e>
-                  </m:acc>
+                    <m:sub>
+                      <m:r>
+                        <m:rPr>
+                          <m:nor/>
+                          <m:sty m:val="p"/>
+                        </m:rPr>
+                        <m:t>late</m:t>
+                      </m:r>
+                    </m:sub>
+                  </m:sSub>
                 </m:e>
-                <m:sub>
-                  <m:r>
-                    <m:rPr>
-                      <m:nor/>
-                      <m:sty m:val="p"/>
-                    </m:rPr>
-                    <m:t>late</m:t>
-                  </m:r>
-                </m:sub>
-              </m:sSub>
+              </m:d>
               <m:r>
                 <m:rPr>
                   <m:sty m:val="p"/>
@@ -1397,7 +1415,50 @@
         <w:t xml:space="preserve"> </w:t>
       </w:r>
       <w:r>
-        <w:t xml:space="preserve">is the team’s pre-March winning percentage. The code uses a small lower bound on the denominator for numerical stability.</w:t>
+        <w:t xml:space="preserve">is the team’s pre-March winning percentage and</w:t>
+      </w:r>
+      <w:r>
+        <w:t xml:space="preserve"> </w:t>
+      </w:r>
+      <m:oMath>
+        <m:r>
+          <m:rPr>
+            <m:sty m:val="p"/>
+          </m:rPr>
+          <m:t>E</m:t>
+        </m:r>
+        <m:d>
+          <m:dPr>
+            <m:begChr m:val="("/>
+            <m:sepChr m:val=""/>
+            <m:endChr m:val=")"/>
+            <m:grow/>
+          </m:dPr>
+          <m:e>
+            <m:sSub>
+              <m:e>
+                <m:r>
+                  <m:t>W</m:t>
+                </m:r>
+              </m:e>
+              <m:sub>
+                <m:r>
+                  <m:rPr>
+                    <m:nor/>
+                    <m:sty m:val="p"/>
+                  </m:rPr>
+                  <m:t>late</m:t>
+                </m:r>
+              </m:sub>
+            </m:sSub>
+          </m:e>
+        </m:d>
+      </m:oMath>
+      <w:r>
+        <w:t xml:space="preserve"> </w:t>
+      </w:r>
+      <w:r>
+        <w:t xml:space="preserve">is the expected number of March-onward wins under that pre-March win rate. The denominator is the expected standard deviation of late-season wins under a binomial model; dividing by it puts teams with different numbers of late-season games on the same scale. The code uses a small lower bound on the denominator for numerical stability.</w:t>
       </w:r>
     </w:p>
     <w:p>
@@ -2119,7 +2180,7 @@
         </w:numPr>
       </w:pPr>
       <w:r>
-        <w:t xml:space="preserve">Positive values mean the team’s main continuing pre-March players were used less after March 1. This does not prove healthy starters were benched; injuries, rest, development minutes, and coaching decisions can also reduce minutes.</w:t>
+        <w:t xml:space="preserve">MPG means minutes per game. Positive values mean the team’s main continuing pre-March players were used less after March 1. This does not prove healthy starters were benched; injuries, rest, development minutes, and coaching decisions can also reduce minutes.</w:t>
       </w:r>
     </w:p>
     <w:p>
@@ -2163,7 +2224,7 @@
         <w:t xml:space="preserve"> </w:t>
       </w:r>
       <w:r>
-        <w:t xml:space="preserve">are separate controls for disrupted seasons. We use separate indicators because the 2012 lockout season, 2020 bubble season, and 2021 shortened COVID-era season may have affected late-season performance in different ways.</w:t>
+        <w:t xml:space="preserve">are separate controls for disrupted seasons. We use separate indicators because the 2012 lockout season, 2020 bubble season, and 2021 shortened COVID-era season may have affected late-season performance in different ways. We do not treat season as a continuous linear predictor in the formal models.</w:t>
       </w:r>
     </w:p>
     <w:p>
@@ -2239,11 +2300,11 @@
         <w:pStyle w:val="FirstParagraph"/>
       </w:pPr>
       <w:r>
-        <w:t xml:space="preserve">or a 20% drop in core-player usage.</w:t>
+        <w:t xml:space="preserve">or a 20% proportional drop in core-player usage.</w:t>
       </w:r>
     </w:p>
     <w:bookmarkEnd w:id="29"/>
-    <w:bookmarkStart w:id="45" w:name="iv.-data-analysis"/>
+    <w:bookmarkStart w:id="49" w:name="iv.-data-analysis"/>
     <w:p>
       <w:pPr>
         <w:pStyle w:val="Heading2"/>
@@ -2655,7 +2716,7 @@
         <w:pStyle w:val="BodyText"/>
       </w:pPr>
       <w:r>
-        <w:t xml:space="preserve">Table 1 shows that likely lottery candidates are much weaker than other teams before March, as expected. The average win percentage change from pre-March to late season is small in both eras, which suggests that most weak teams do not suddenly collapse late in the year. The final regression relies on the full</w:t>
+        <w:t xml:space="preserve">Table 1 shows that likely lottery candidates are much weaker than other teams before March, as expected. The average pre-to-late change is small in percentage-point terms in both eras, which suggests that most weak teams do not suddenly collapse late in the year. The final regression relies on the full</w:t>
       </w:r>
       <w:r>
         <w:t xml:space="preserve"> </w:t>
@@ -2677,20 +2738,126 @@
       <w:r>
         <w:drawing>
           <wp:inline>
-            <wp:extent cx="5334000" cy="3333750"/>
+            <wp:extent cx="5334000" cy="3194843"/>
             <wp:effectExtent b="0" l="0" r="0" t="0"/>
-            <wp:docPr descr="Figure 1. Late-season performance compared with pre-March performance. Each point is one team-season from 2010 through 2026. The dashed line shows equal pre-March and March-onward win percentages. Triangles are likely lottery candidates. Color shows the tanking index, where higher values mean larger late-season win shortfalls. Labels identify the largest tanking-index seasons among likely lottery candidates." title="" id="31" name="Picture"/>
+            <wp:docPr descr="Figure 1. Distribution of the tanking index among likely lottery candidates. Positive values mean a team won fewer March-onward games than expected from its pre-March record, while negative values mean it won more than expected. Labels identify the largest positive outliers." title="" id="31" name="Picture"/>
             <a:graphic>
               <a:graphicData uri="http://schemas.openxmlformats.org/drawingml/2006/picture">
                 <pic:pic>
                   <pic:nvPicPr>
-                    <pic:cNvPr descr="final-report_files/figure-docx/visual-expected-vs-actual-1.png" id="32" name="Picture"/>
+                    <pic:cNvPr descr="final-report_files/figure-docx/visual-response-distribution-1.png" id="32" name="Picture"/>
                     <pic:cNvPicPr>
                       <a:picLocks noChangeArrowheads="1" noChangeAspect="1"/>
                     </pic:cNvPicPr>
                   </pic:nvPicPr>
                   <pic:blipFill>
                     <a:blip r:embed="rId30"/>
+                    <a:stretch>
+                      <a:fillRect/>
+                    </a:stretch>
+                  </pic:blipFill>
+                  <pic:spPr bwMode="auto">
+                    <a:xfrm>
+                      <a:off x="0" y="0"/>
+                      <a:ext cx="5334000" cy="3194843"/>
+                    </a:xfrm>
+                    <a:prstGeom prst="rect">
+                      <a:avLst/>
+                    </a:prstGeom>
+                    <a:noFill/>
+                    <a:ln w="9525">
+                      <a:noFill/>
+                      <a:headEnd/>
+                      <a:tailEnd/>
+                    </a:ln>
+                  </pic:spPr>
+                </pic:pic>
+              </a:graphicData>
+            </a:graphic>
+          </wp:inline>
+        </w:drawing>
+      </w:r>
+    </w:p>
+    <w:p>
+      <w:pPr>
+        <w:pStyle w:val="ImageCaption"/>
+      </w:pPr>
+      <w:r>
+        <w:t xml:space="preserve">Figure 1. Distribution of the tanking index among likely lottery candidates. Positive values mean a team won fewer March-onward games than expected from its pre-March record, while negative values mean it won more than expected. Labels identify the largest positive outliers.</w:t>
+      </w:r>
+    </w:p>
+    <w:p>
+      <w:pPr>
+        <w:pStyle w:val="BodyText"/>
+      </w:pPr>
+      <w:r>
+        <w:t xml:space="preserve">Figure 1 shows that the response variable is centered near 0, but there is a noticeable right tail. In plain terms, most likely lottery teams did about what their pre-March records predicted, while a smaller set had unusually large late-season win shortfalls. Utah is a useful recent example. The 2024 Jazz have a tanking index of 2.53, which ranks 3rd among likely lottery candidates in the dataset, and Utah remains positive in both 2025 (1.84) and 2026 (1.21). The public league context points in the same direction: the</w:t>
+      </w:r>
+      <w:r>
+        <w:t xml:space="preserve"> </w:t>
+      </w:r>
+      <w:hyperlink r:id="rId33">
+        <w:r>
+          <w:rPr>
+            <w:rStyle w:val="Hyperlink"/>
+            <w:i/>
+            <w:iCs/>
+          </w:rPr>
+          <w:t xml:space="preserve">New York Post</w:t>
+        </w:r>
+        <w:r>
+          <w:rPr>
+            <w:rStyle w:val="Hyperlink"/>
+          </w:rPr>
+          <w:t xml:space="preserve"> </w:t>
+        </w:r>
+        <w:r>
+          <w:rPr>
+            <w:rStyle w:val="Hyperlink"/>
+          </w:rPr>
+          <w:t xml:space="preserve">reported in 2026</w:t>
+        </w:r>
+      </w:hyperlink>
+      <w:r>
+        <w:t xml:space="preserve"> </w:t>
+      </w:r>
+      <w:r>
+        <w:t xml:space="preserve">that the NBA fined the Jazz $500,000 and the Pacers $100,000 for player-participation violations connected to sitting or removing key players while the teams were near the bottom of the standings. This kind of article is useful context, but it is not treated as proof of intent or as the source of the outcome variable. This is why the models below focus on explaining variation in the continuous</w:t>
+      </w:r>
+      <w:r>
+        <w:t xml:space="preserve"> </w:t>
+      </w:r>
+      <w:r>
+        <w:rPr>
+          <w:rStyle w:val="VerbatimChar"/>
+        </w:rPr>
+        <w:t xml:space="preserve">tanking_index</w:t>
+      </w:r>
+      <w:r>
+        <w:t xml:space="preserve">, rather than only labeling a few teams as tanking or not tanking.</w:t>
+      </w:r>
+    </w:p>
+    <w:p>
+      <w:pPr>
+        <w:pStyle w:val="CaptionedFigure"/>
+      </w:pPr>
+      <w:r>
+        <w:drawing>
+          <wp:inline>
+            <wp:extent cx="5334000" cy="3333750"/>
+            <wp:effectExtent b="0" l="0" r="0" t="0"/>
+            <wp:docPr descr="Figure 2. Late-season performance compared with pre-March performance. Each point is one team-season from 2010 through 2026. The dashed line shows equal pre-March and March-onward win percentages. Triangles are likely lottery candidates. Color shows the tanking index, where higher values mean larger late-season win shortfalls. Labels identify the largest tanking-index seasons among likely lottery candidates." title="" id="35" name="Picture"/>
+            <a:graphic>
+              <a:graphicData uri="http://schemas.openxmlformats.org/drawingml/2006/picture">
+                <pic:pic>
+                  <pic:nvPicPr>
+                    <pic:cNvPr descr="final-report_files/figure-docx/visual-expected-vs-actual-1.png" id="36" name="Picture"/>
+                    <pic:cNvPicPr>
+                      <a:picLocks noChangeArrowheads="1" noChangeAspect="1"/>
+                    </pic:cNvPicPr>
+                  </pic:nvPicPr>
+                  <pic:blipFill>
+                    <a:blip r:embed="rId34"/>
                     <a:stretch>
                       <a:fillRect/>
                     </a:stretch>
@@ -2722,7 +2889,7 @@
         <w:pStyle w:val="ImageCaption"/>
       </w:pPr>
       <w:r>
-        <w:t xml:space="preserve">Figure 1. Late-season performance compared with pre-March performance. Each point is one team-season from 2010 through 2026. The dashed line shows equal pre-March and March-onward win percentages. Triangles are likely lottery candidates. Color shows the tanking index, where higher values mean larger late-season win shortfalls. Labels identify the largest tanking-index seasons among likely lottery candidates.</w:t>
+        <w:t xml:space="preserve">Figure 2. Late-season performance compared with pre-March performance. Each point is one team-season from 2010 through 2026. The dashed line shows equal pre-March and March-onward win percentages. Triangles are likely lottery candidates. Color shows the tanking index, where higher values mean larger late-season win shortfalls. Labels identify the largest tanking-index seasons among likely lottery candidates.</w:t>
       </w:r>
     </w:p>
     <w:p>
@@ -2730,7 +2897,7 @@
         <w:pStyle w:val="BodyText"/>
       </w:pPr>
       <w:r>
-        <w:t xml:space="preserve">Figure 1 shows that most teams cluster near the diagonal, meaning their late-season winning percentage was similar to their pre-March winning percentage. The likely lottery candidates mostly appear in the lower-left portion of the graph, which confirms that the candidate definition is identifying weaker teams. The darker red points are teams with larger positive tanking-index values: they won substantially fewer late-season games than expected from their earlier record. This is why the regression below uses the full</w:t>
+        <w:t xml:space="preserve">Figure 2 shows that most teams cluster near the diagonal, meaning their late-season winning percentage was similar to their pre-March winning percentage. The likely lottery candidates mostly appear in the lower-left portion of the graph, which confirms that the candidate definition is identifying weaker teams. The darker red points are teams with larger positive tanking-index values: they won substantially fewer late-season games than expected from their earlier record. This is why the regression below uses the full</w:t>
       </w:r>
       <w:r>
         <w:t xml:space="preserve"> </w:t>
@@ -2757,18 +2924,18 @@
           <wp:inline>
             <wp:extent cx="5334000" cy="3333750"/>
             <wp:effectExtent b="0" l="0" r="0" t="0"/>
-            <wp:docPr descr="Figure 2. Top-four draft strength and average late-season underperformance among likely lottery candidates. Each point is one NBA season. The x-axis is the CraftedNBA average rating of the top four prospects, the y-axis is the mean tanking index among likely lottery candidates, and point size is the number of likely lottery team-seasons in that year. Fitted lines are descriptive and are shown separately for the pre-reform and post-reform lottery eras." title="" id="34" name="Picture"/>
+            <wp:docPr descr="Figure 3. Top-four draft strength and average late-season underperformance among likely lottery candidates. Each point is one NBA season. The x-axis is the CraftedNBA average rating of the top four prospects, the y-axis is the mean tanking index among likely lottery candidates, and point size is the number of likely lottery team-seasons in that year. Fitted lines are descriptive and are shown separately for the pre-reform and post-reform lottery eras." title="" id="38" name="Picture"/>
             <a:graphic>
               <a:graphicData uri="http://schemas.openxmlformats.org/drawingml/2006/picture">
                 <pic:pic>
                   <pic:nvPicPr>
-                    <pic:cNvPr descr="final-report_files/figure-docx/visual-draft-strength-1.png" id="35" name="Picture"/>
+                    <pic:cNvPr descr="final-report_files/figure-docx/visual-draft-strength-1.png" id="39" name="Picture"/>
                     <pic:cNvPicPr>
                       <a:picLocks noChangeArrowheads="1" noChangeAspect="1"/>
                     </pic:cNvPicPr>
                   </pic:nvPicPr>
                   <pic:blipFill>
-                    <a:blip r:embed="rId33"/>
+                    <a:blip r:embed="rId37"/>
                     <a:stretch>
                       <a:fillRect/>
                     </a:stretch>
@@ -2800,7 +2967,7 @@
         <w:pStyle w:val="ImageCaption"/>
       </w:pPr>
       <w:r>
-        <w:t xml:space="preserve">Figure 2. Top-four draft strength and average late-season underperformance among likely lottery candidates. Each point is one NBA season. The x-axis is the CraftedNBA average rating of the top four prospects, the y-axis is the mean tanking index among likely lottery candidates, and point size is the number of likely lottery team-seasons in that year. Fitted lines are descriptive and are shown separately for the pre-reform and post-reform lottery eras.</w:t>
+        <w:t xml:space="preserve">Figure 3. Top-four draft strength and average late-season underperformance among likely lottery candidates. Each point is one NBA season. The x-axis is the CraftedNBA average rating of the top four prospects, the y-axis is the mean tanking index among likely lottery candidates, and point size is the number of likely lottery team-seasons in that year. Fitted lines are descriptive and are shown separately for the pre-reform and post-reform lottery eras.</w:t>
       </w:r>
     </w:p>
     <w:p>
@@ -2808,7 +2975,7 @@
         <w:pStyle w:val="BodyText"/>
       </w:pPr>
       <w:r>
-        <w:t xml:space="preserve">Figure 2 provides exploratory context rather than the final model specification. The pre-reform and post-reform fitted lines are shown descriptively, but the final regression below pools all years together. The graph still shows why the conclusion should be cautious: there are only 17 season-level draft class observations, and 2021 remains unusual because it was affected by COVID-era scheduling and roster disruptions.</w:t>
+        <w:t xml:space="preserve">Figure 3 provides exploratory context rather than the final model specification. The pre-reform and post-reform fitted lines are shown descriptively, but the final regression below pools all years together. The graph still shows why the conclusion should be cautious: there are only 17 season-level draft class observations, and 2021 remains unusual because it was affected by COVID-era scheduling and roster disruptions.</w:t>
       </w:r>
     </w:p>
     <w:p>
@@ -2816,7 +2983,7 @@
         <w:pStyle w:val="BodyText"/>
       </w:pPr>
       <w:r>
-        <w:t xml:space="preserve">Although the model uses team-season observations, Figure 2 summarizes outcomes at the season level because draft strength is constant for all teams in a given draft year. Figure 3 shows the same draft-strength relationship using all likely lottery team-seasons.</w:t>
+        <w:t xml:space="preserve">Although the model uses team-season observations, Figure 3 summarizes outcomes at the season level because draft strength is constant for all teams in a given draft year. Figure 4 shows the same draft-strength relationship using all likely lottery team-seasons.</w:t>
       </w:r>
     </w:p>
     <w:p>
@@ -2828,18 +2995,18 @@
           <wp:inline>
             <wp:extent cx="5334000" cy="3597671"/>
             <wp:effectExtent b="0" l="0" r="0" t="0"/>
-            <wp:docPr descr="Figure 3. Team-season observations for top-four draft strength and late-season underperformance among likely lottery candidates. Each point is one likely lottery team-season. The x-axis is jittered slightly because every team in the same season has the same top-four draft rating. Color shows season, shape shows lottery era, and the black diamonds show the season-level averages from Figure 2." title="" id="37" name="Picture"/>
+            <wp:docPr descr="Figure 4. Team-season observations for top-four draft strength and late-season underperformance among likely lottery candidates. Each point is one likely lottery team-season. The x-axis is jittered slightly because every team in the same season has the same top-four draft rating. Color shows season, shape shows lottery era, and the black diamonds show the season-level averages from Figure 3." title="" id="41" name="Picture"/>
             <a:graphic>
               <a:graphicData uri="http://schemas.openxmlformats.org/drawingml/2006/picture">
                 <pic:pic>
                   <pic:nvPicPr>
-                    <pic:cNvPr descr="final-report_files/figure-docx/visual-team-season-observations-1.png" id="38" name="Picture"/>
+                    <pic:cNvPr descr="final-report_files/figure-docx/visual-team-season-observations-1.png" id="42" name="Picture"/>
                     <pic:cNvPicPr>
                       <a:picLocks noChangeArrowheads="1" noChangeAspect="1"/>
                     </pic:cNvPicPr>
                   </pic:nvPicPr>
                   <pic:blipFill>
-                    <a:blip r:embed="rId36"/>
+                    <a:blip r:embed="rId40"/>
                     <a:stretch>
                       <a:fillRect/>
                     </a:stretch>
@@ -2871,7 +3038,7 @@
         <w:pStyle w:val="ImageCaption"/>
       </w:pPr>
       <w:r>
-        <w:t xml:space="preserve">Figure 3. Team-season observations for top-four draft strength and late-season underperformance among likely lottery candidates. Each point is one likely lottery team-season. The x-axis is jittered slightly because every team in the same season has the same top-four draft rating. Color shows season, shape shows lottery era, and the black diamonds show the season-level averages from Figure 2.</w:t>
+        <w:t xml:space="preserve">Figure 4. Team-season observations for top-four draft strength and late-season underperformance among likely lottery candidates. Each point is one likely lottery team-season. The x-axis is jittered slightly because every team in the same season has the same top-four draft rating. Color shows season, shape shows lottery era, and the black diamonds show the season-level averages from Figure 3.</w:t>
       </w:r>
     </w:p>
     <w:p>
@@ -2879,7 +3046,7 @@
         <w:pStyle w:val="BodyText"/>
       </w:pPr>
       <w:r>
-        <w:t xml:space="preserve">Figure 3 makes the observational unit clearer. Each point is a team-season, while the black diamonds are the season averages used in Figure 2. The vertical stacks show why the season-level summary can hide variation: teams in the same draft year share the same top-four draft rating, but their tanking-index values differ widely.</w:t>
+        <w:t xml:space="preserve">Figure 4 makes the observational unit clearer. Each point is a team-season, while the black diamonds are the season averages used in Figure 3. The vertical stacks show why the season-level summary can hide variation: teams in the same draft year share the same top-four draft rating, but their tanking-index values differ widely.</w:t>
       </w:r>
     </w:p>
     <w:p>
@@ -2891,18 +3058,18 @@
           <wp:inline>
             <wp:extent cx="5334000" cy="3597671"/>
             <wp:effectExtent b="0" l="0" r="0" t="0"/>
-            <wp:docPr descr="Figure 4. Comparing broad and top-four draft-strength measures. Each point is one NBA draft class from 2010 through 2026. The x-axis is the top-35 average rating, the y-axis is the top-four average rating, and color shows the mean tanking index among likely lottery candidates in that season." title="" id="40" name="Picture"/>
+            <wp:docPr descr="Figure 5. Comparing broad and top-four draft-strength measures. Each point is one NBA draft class from 2010 through 2026. The x-axis is the top-35 average rating, the y-axis is the top-four average rating, and color shows the mean tanking index among likely lottery candidates in that season." title="" id="44" name="Picture"/>
             <a:graphic>
               <a:graphicData uri="http://schemas.openxmlformats.org/drawingml/2006/picture">
                 <pic:pic>
                   <pic:nvPicPr>
-                    <pic:cNvPr descr="final-report_files/figure-docx/visual-draft-rating-comparison-1.png" id="41" name="Picture"/>
+                    <pic:cNvPr descr="final-report_files/figure-docx/visual-draft-rating-comparison-1.png" id="45" name="Picture"/>
                     <pic:cNvPicPr>
                       <a:picLocks noChangeArrowheads="1" noChangeAspect="1"/>
                     </pic:cNvPicPr>
                   </pic:nvPicPr>
                   <pic:blipFill>
-                    <a:blip r:embed="rId39"/>
+                    <a:blip r:embed="rId43"/>
                     <a:stretch>
                       <a:fillRect/>
                     </a:stretch>
@@ -2934,7 +3101,7 @@
         <w:pStyle w:val="ImageCaption"/>
       </w:pPr>
       <w:r>
-        <w:t xml:space="preserve">Figure 4. Comparing broad and top-four draft-strength measures. Each point is one NBA draft class from 2010 through 2026. The x-axis is the top-35 average rating, the y-axis is the top-four average rating, and color shows the mean tanking index among likely lottery candidates in that season.</w:t>
+        <w:t xml:space="preserve">Figure 5. Comparing broad and top-four draft-strength measures. Each point is one NBA draft class from 2010 through 2026. The x-axis is the top-35 average rating, the y-axis is the top-four average rating, and color shows the mean tanking index among likely lottery candidates in that season.</w:t>
       </w:r>
     </w:p>
     <w:p>
@@ -2942,7 +3109,7 @@
         <w:pStyle w:val="BodyText"/>
       </w:pPr>
       <w:r>
-        <w:t xml:space="preserve">Figure 4 shows why the top-four measure is useful. It is related to the broader top-35 class rating, but it is not identical. The top-four measure focuses on the players lottery teams are most realistically trying to access, so it is more directly tied to the incentive mechanism than the average quality of the full top 35.</w:t>
+        <w:t xml:space="preserve">Figure 5 shows why the top-four measure is useful. It is related to the broader top-35 class rating, but it is not identical. The top-four measure focuses on the players lottery teams are most realistically trying to access, so it is more directly tied to the incentive mechanism than the average quality of the full top 35.</w:t>
       </w:r>
     </w:p>
     <w:p>
@@ -2954,18 +3121,18 @@
           <wp:inline>
             <wp:extent cx="5334000" cy="3597671"/>
             <wp:effectExtent b="0" l="0" r="0" t="0"/>
-            <wp:docPr descr="Figure 5. Position-adjusted draft incentive and tanking index among likely lottery candidates. Each point is one team-season. The x-axis combines top-four draft class rating with the marginal gain in top-four-pick probability from moving one lottery slot worse. Zero-incentive points are nudged slightly to the right only to reveal overlapping observations; the fitted line and regression models use the exact, unnudged incentive values." title="" id="43" name="Picture"/>
+            <wp:docPr descr="Figure 6. Position-adjusted draft incentive and tanking index among likely lottery candidates. Each point is one team-season. The x-axis combines top-four draft class rating with the marginal gain in top-four-pick probability from moving one lottery slot worse. Zero-incentive points are nudged slightly to the right only to reveal overlapping observations; the fitted line and regression models use the exact, unnudged incentive values." title="" id="47" name="Picture"/>
             <a:graphic>
               <a:graphicData uri="http://schemas.openxmlformats.org/drawingml/2006/picture">
                 <pic:pic>
                   <pic:nvPicPr>
-                    <pic:cNvPr descr="final-report_files/figure-docx/visual-position-adjusted-incentive-1.png" id="44" name="Picture"/>
+                    <pic:cNvPr descr="final-report_files/figure-docx/visual-position-adjusted-incentive-1.png" id="48" name="Picture"/>
                     <pic:cNvPicPr>
                       <a:picLocks noChangeArrowheads="1" noChangeAspect="1"/>
                     </pic:cNvPicPr>
                   </pic:nvPicPr>
                   <pic:blipFill>
-                    <a:blip r:embed="rId42"/>
+                    <a:blip r:embed="rId46"/>
                     <a:stretch>
                       <a:fillRect/>
                     </a:stretch>
@@ -2997,7 +3164,7 @@
         <w:pStyle w:val="ImageCaption"/>
       </w:pPr>
       <w:r>
-        <w:t xml:space="preserve">Figure 5. Position-adjusted draft incentive and tanking index among likely lottery candidates. Each point is one team-season. The x-axis combines top-four draft class rating with the marginal gain in top-four-pick probability from moving one lottery slot worse. Zero-incentive points are nudged slightly to the right only to reveal overlapping observations; the fitted line and regression models use the exact, unnudged incentive values.</w:t>
+        <w:t xml:space="preserve">Figure 6. Position-adjusted draft incentive and tanking index among likely lottery candidates. Each point is one team-season. The x-axis combines top-four draft class rating with the marginal gain in top-four-pick probability from moving one lottery slot worse. Zero-incentive points are nudged slightly to the right only to reveal overlapping observations; the fitted line and regression models use the exact, unnudged incentive values.</w:t>
       </w:r>
     </w:p>
     <w:p>
@@ -3005,11 +3172,11 @@
         <w:pStyle w:val="BodyText"/>
       </w:pPr>
       <w:r>
-        <w:t xml:space="preserve">Figure 5 directly addresses the concern that a draft class has the same top-four rating for every team in the same year. The raw top-four draft rating is still season-level, but the position-adjusted incentive varies by team because different lottery positions have different marginal rewards for moving down in the standings. Observations at zero are meaningful: they are teams that would not gain additional top-four-pick probability by moving one slot worse, such as the worst team. We nudge the plotted zero points slightly so those overlapping observations are visible, but the model still uses the exact values. The relationship is noisier than the season-average figures, which is expected: the outcome is still affected by injuries, trades, resting, and random late-season variation.</w:t>
-      </w:r>
-    </w:p>
-    <w:bookmarkEnd w:id="45"/>
-    <w:bookmarkStart w:id="57" w:name="v.-formal-analysis"/>
+        <w:t xml:space="preserve">Figure 6 directly addresses the concern that a draft class has the same top-four rating for every team in the same year. The raw top-four draft rating is still season-level, but the position-adjusted incentive varies by team because different lottery positions have different marginal rewards for moving down in the standings. Observations at zero are meaningful: they are teams that would not gain additional top-four-pick probability by moving one slot worse, such as the worst team. We nudge the plotted zero points slightly so those overlapping observations are visible, but the model still uses the exact values. The relationship is noisier than the season-average figures, which is expected: the outcome is still affected by injuries, trades, resting, and random late-season variation.</w:t>
+      </w:r>
+    </w:p>
+    <w:bookmarkEnd w:id="49"/>
+    <w:bookmarkStart w:id="61" w:name="v.-formal-analysis"/>
     <w:p>
       <w:pPr>
         <w:pStyle w:val="Heading2"/>
@@ -3112,7 +3279,7 @@
         <w:t xml:space="preserve">The final model’s key coefficient is the standardized position-adjusted draft incentive. It asks whether teams with larger marginal lottery rewards in stronger top-four draft classes have larger tanking signals after controlling for pre-March team strength and separate indicators for the disrupted 2012, 2020, and 2021 seasons. We also include follow-up checks for whether the relationship changed after the 2019 lottery reform, whether a team’s roster fit with the draft class adds explanatory power, and whether stronger top-four draft classes are associated with late-season reductions in core-player minutes.</w:t>
       </w:r>
     </w:p>
-    <w:bookmarkStart w:id="46" w:name="analysis-1-prepost-reform-interaction"/>
+    <w:bookmarkStart w:id="50" w:name="analysis-1-prepost-reform-interaction"/>
     <w:p>
       <w:pPr>
         <w:pStyle w:val="Heading3"/>
@@ -3419,8 +3586,8 @@
         <w:t xml:space="preserve">is standardized, the top-four draft rating coefficient means that, before the reform, a one-standard-deviation increase in top-four draft strength is associated with a 0.077 change in the tanking index, holding pre-March strength and disrupted-season controls fixed. The interaction coefficient of 0.207 is the additional post-reform change in that slope, so the implied post-reform slope is 0.284. Since draft strength is shared by teams in the same season, Table 2 reports standard errors clustered by season. The season-clustered interaction p-value is 0.15, so we do not treat this as strong evidence that the relationship changed after the lottery reform.</w:t>
       </w:r>
     </w:p>
-    <w:bookmarkEnd w:id="46"/>
-    <w:bookmarkStart w:id="47" w:name="Xe837124f9f200bd350346b45a493dd227e53ca1"/>
+    <w:bookmarkEnd w:id="50"/>
+    <w:bookmarkStart w:id="51" w:name="Xe837124f9f200bd350346b45a493dd227e53ca1"/>
     <w:p>
       <w:pPr>
         <w:pStyle w:val="Heading3"/>
@@ -3974,6 +4141,14 @@
         <w:pStyle w:val="BodyText"/>
       </w:pPr>
       <w:r>
+        <w:t xml:space="preserve">We report R-squared only as descriptive context, not as the main criterion for judging the model. The goal is not to build the best possible prediction model for late-season wins; it is to isolate the direction and uncertainty of the draft-incentive coefficient. With that framing, the model R-squared is 0.14 and the adjusted R-squared is 0.114, which is consistent with the graphs showing that win-loss tanking signals are noisy.</w:t>
+      </w:r>
+    </w:p>
+    <w:p>
+      <w:pPr>
+        <w:pStyle w:val="BodyText"/>
+      </w:pPr>
+      <w:r>
         <w:t xml:space="preserve">Because 2021 is visibly unusual in the exploratory graphs, we also refit the same all-years models after removing only the 2021 season. This is a sensitivity check, not a replacement for the main model. The main model uses all available years from 2010 through 2026, while the sensitivity model asks whether the conclusion depends heavily on one COVID-affected season.</w:t>
       </w:r>
     </w:p>
@@ -4194,8 +4369,8 @@
         <w:t xml:space="preserve">Excluding 2021 does not reverse the direction of the estimate. The coefficient has the same interpretation as in Table 3, but it is estimated on the sample without the unusual 2021 season: a one-standard-deviation larger position-adjusted draft incentive is associated with a 0.145 higher tanking index, holding the remaining controls fixed. The position-adjusted incentive coefficient changes from 0.157 in the all-years model to 0.145 after excluding 2021, with the p-value changing from 0.12 to 0.14. This suggests that 2021 matters, but the main pattern is not simply a one-season artifact. The separate season controls in the main model let us keep all years in the primary analysis while acknowledging that disrupted seasons are not perfectly comparable to normal 82-game seasons.</w:t>
       </w:r>
     </w:p>
-    <w:bookmarkEnd w:id="47"/>
-    <w:bookmarkStart w:id="51" w:name="analysis-3-team-fit-heterogeneity-check"/>
+    <w:bookmarkEnd w:id="51"/>
+    <w:bookmarkStart w:id="55" w:name="analysis-3-team-fit-heterogeneity-check"/>
     <w:p>
       <w:pPr>
         <w:pStyle w:val="Heading3"/>
@@ -4282,385 +4457,12 @@
           <wp:inline>
             <wp:extent cx="5334000" cy="3597671"/>
             <wp:effectExtent b="0" l="0" r="0" t="0"/>
-            <wp:docPr descr="Figure 6. Team fit and tanking index among likely lottery candidates. Each point is one team-season. The x-axis measures whether a team’s pre-March positional weaknesses align with the strongest prospect position groups in that year’s draft, and color shows top-four draft class strength." title="" id="49" name="Picture"/>
+            <wp:docPr descr="Figure 7. Team fit and tanking index among likely lottery candidates. Each point is one team-season. The x-axis measures whether a team’s pre-March positional weaknesses align with the strongest prospect position groups in that year’s draft, and color shows top-four draft class strength." title="" id="53" name="Picture"/>
             <a:graphic>
               <a:graphicData uri="http://schemas.openxmlformats.org/drawingml/2006/picture">
                 <pic:pic>
                   <pic:nvPicPr>
-                    <pic:cNvPr descr="final-report_files/figure-docx/team-fit-visual-1.png" id="50" name="Picture"/>
-                    <pic:cNvPicPr>
-                      <a:picLocks noChangeArrowheads="1" noChangeAspect="1"/>
-                    </pic:cNvPicPr>
-                  </pic:nvPicPr>
-                  <pic:blipFill>
-                    <a:blip r:embed="rId48"/>
-                    <a:stretch>
-                      <a:fillRect/>
-                    </a:stretch>
-                  </pic:blipFill>
-                  <pic:spPr bwMode="auto">
-                    <a:xfrm>
-                      <a:off x="0" y="0"/>
-                      <a:ext cx="5334000" cy="3597671"/>
-                    </a:xfrm>
-                    <a:prstGeom prst="rect">
-                      <a:avLst/>
-                    </a:prstGeom>
-                    <a:noFill/>
-                    <a:ln w="9525">
-                      <a:noFill/>
-                      <a:headEnd/>
-                      <a:tailEnd/>
-                    </a:ln>
-                  </pic:spPr>
-                </pic:pic>
-              </a:graphicData>
-            </a:graphic>
-          </wp:inline>
-        </w:drawing>
-      </w:r>
-    </w:p>
-    <w:p>
-      <w:pPr>
-        <w:pStyle w:val="ImageCaption"/>
-      </w:pPr>
-      <w:r>
-        <w:t xml:space="preserve">Figure 6. Team fit and tanking index among likely lottery candidates. Each point is one team-season. The x-axis measures whether a team’s pre-March positional weaknesses align with the strongest prospect position groups in that year’s draft, and color shows top-four draft class strength.</w:t>
-      </w:r>
-    </w:p>
-    <w:p>
-      <w:pPr>
-        <w:pStyle w:val="TableCaption"/>
-      </w:pPr>
-      <w:r>
-        <w:t xml:space="preserve">Table 5. Exploratory models adding team fit and a draft-strength-by-fit interaction.</w:t>
-      </w:r>
-    </w:p>
-    <w:tbl>
-      <w:tblPr>
-        <w:tblStyle w:val="Table"/>
-        <w:tblW w:type="auto" w:w="0"/>
-        <w:tblLook w:firstRow="1" w:lastRow="0" w:firstColumn="0" w:lastColumn="0" w:noHBand="0" w:noVBand="0" w:val="0020"/>
-        <w:tblCaption w:val="Table 5. Exploratory models adding team fit and a draft-strength-by-fit interaction."/>
-      </w:tblPr>
-      <w:tblGrid>
-        <w:gridCol w:w="1980"/>
-        <w:gridCol w:w="1980"/>
-        <w:gridCol w:w="1980"/>
-        <w:gridCol w:w="1980"/>
-      </w:tblGrid>
-      <w:tr>
-        <w:trPr>
-          <w:tblHeader w:val="on"/>
-        </w:trPr>
-        <w:tc>
-          <w:tcPr/>
-          <w:p>
-            <w:pPr>
-              <w:pStyle w:val="Compact"/>
-              <w:jc w:val="left"/>
-            </w:pPr>
-            <w:r>
-              <w:t xml:space="preserve">Outcome</w:t>
-            </w:r>
-          </w:p>
-        </w:tc>
-        <w:tc>
-          <w:tcPr/>
-          <w:p>
-            <w:pPr>
-              <w:pStyle w:val="Compact"/>
-              <w:jc w:val="left"/>
-            </w:pPr>
-            <w:r>
-              <w:t xml:space="preserve">Term</w:t>
-            </w:r>
-          </w:p>
-        </w:tc>
-        <w:tc>
-          <w:tcPr/>
-          <w:p>
-            <w:pPr>
-              <w:pStyle w:val="Compact"/>
-              <w:jc w:val="right"/>
-            </w:pPr>
-            <w:r>
-              <w:t xml:space="preserve">Estimate</w:t>
-            </w:r>
-          </w:p>
-        </w:tc>
-        <w:tc>
-          <w:tcPr/>
-          <w:p>
-            <w:pPr>
-              <w:pStyle w:val="Compact"/>
-              <w:jc w:val="right"/>
-            </w:pPr>
-            <w:r>
-              <w:t xml:space="preserve">p-value</w:t>
-            </w:r>
-          </w:p>
-        </w:tc>
-      </w:tr>
-      <w:tr>
-        <w:tc>
-          <w:tcPr/>
-          <w:p>
-            <w:pPr>
-              <w:pStyle w:val="Compact"/>
-              <w:jc w:val="left"/>
-            </w:pPr>
-            <w:r>
-              <w:t xml:space="preserve">Tanking index</w:t>
-            </w:r>
-          </w:p>
-        </w:tc>
-        <w:tc>
-          <w:tcPr/>
-          <w:p>
-            <w:pPr>
-              <w:pStyle w:val="Compact"/>
-              <w:jc w:val="left"/>
-            </w:pPr>
-            <w:r>
-              <w:t xml:space="preserve">Top-four draft rating</w:t>
-            </w:r>
-          </w:p>
-        </w:tc>
-        <w:tc>
-          <w:tcPr/>
-          <w:p>
-            <w:pPr>
-              <w:pStyle w:val="Compact"/>
-              <w:jc w:val="right"/>
-            </w:pPr>
-            <w:r>
-              <w:t xml:space="preserve">0.154</w:t>
-            </w:r>
-          </w:p>
-        </w:tc>
-        <w:tc>
-          <w:tcPr/>
-          <w:p>
-            <w:pPr>
-              <w:pStyle w:val="Compact"/>
-              <w:jc w:val="right"/>
-            </w:pPr>
-            <w:r>
-              <w:t xml:space="preserve">0.121</w:t>
-            </w:r>
-          </w:p>
-        </w:tc>
-      </w:tr>
-      <w:tr>
-        <w:tc>
-          <w:tcPr/>
-          <w:p>
-            <w:pPr>
-              <w:pStyle w:val="Compact"/>
-            </w:pPr>
-          </w:p>
-        </w:tc>
-        <w:tc>
-          <w:tcPr/>
-          <w:p>
-            <w:pPr>
-              <w:pStyle w:val="Compact"/>
-              <w:jc w:val="left"/>
-            </w:pPr>
-            <w:r>
-              <w:t xml:space="preserve">Team fit</w:t>
-            </w:r>
-          </w:p>
-        </w:tc>
-        <w:tc>
-          <w:tcPr/>
-          <w:p>
-            <w:pPr>
-              <w:pStyle w:val="Compact"/>
-              <w:jc w:val="right"/>
-            </w:pPr>
-            <w:r>
-              <w:t xml:space="preserve">0.141</w:t>
-            </w:r>
-          </w:p>
-        </w:tc>
-        <w:tc>
-          <w:tcPr/>
-          <w:p>
-            <w:pPr>
-              <w:pStyle w:val="Compact"/>
-              <w:jc w:val="right"/>
-            </w:pPr>
-            <w:r>
-              <w:t xml:space="preserve">0.175</w:t>
-            </w:r>
-          </w:p>
-        </w:tc>
-      </w:tr>
-      <w:tr>
-        <w:tc>
-          <w:tcPr/>
-          <w:p>
-            <w:pPr>
-              <w:pStyle w:val="Compact"/>
-            </w:pPr>
-          </w:p>
-        </w:tc>
-        <w:tc>
-          <w:tcPr/>
-          <w:p>
-            <w:pPr>
-              <w:pStyle w:val="Compact"/>
-              <w:jc w:val="left"/>
-            </w:pPr>
-            <w:r>
-              <w:t xml:space="preserve">Top-four draft rating x team fit</w:t>
-            </w:r>
-          </w:p>
-        </w:tc>
-        <w:tc>
-          <w:tcPr/>
-          <w:p>
-            <w:pPr>
-              <w:pStyle w:val="Compact"/>
-              <w:jc w:val="right"/>
-            </w:pPr>
-            <w:r>
-              <w:t xml:space="preserve">-0.032</w:t>
-            </w:r>
-          </w:p>
-        </w:tc>
-        <w:tc>
-          <w:tcPr/>
-          <w:p>
-            <w:pPr>
-              <w:pStyle w:val="Compact"/>
-              <w:jc w:val="right"/>
-            </w:pPr>
-            <w:r>
-              <w:t xml:space="preserve">0.757</w:t>
-            </w:r>
-          </w:p>
-        </w:tc>
-      </w:tr>
-    </w:tbl>
-    <w:p>
-      <w:pPr>
-        <w:pStyle w:val="BodyText"/>
-      </w:pPr>
-      <w:r>
-        <w:t xml:space="preserve">The coefficient of interest in Table 5 is the interaction between top-four draft strength and team fit. Because both variables are standardized, the interaction coefficient of -0.032 means that a one-standard-deviation increase in team fit changes the draft-strength slope by -0.032 tanking-index units, holding the controls fixed. The interaction p-value is 0.76, so this is not statistically significant. This does not mean fit is irrelevant; it means our simple fit proxy does not add clear evidence beyond the main draft-strength model. A stronger version of this idea would use team-specific draft boards, roster contract data, or play-type needs instead of broad position groups.</w:t>
-      </w:r>
-    </w:p>
-    <w:bookmarkEnd w:id="51"/>
-    <w:bookmarkStart w:id="55" w:name="analysis-4-core-player-usage-reduction"/>
-    <w:p>
-      <w:pPr>
-        <w:pStyle w:val="Heading3"/>
-      </w:pPr>
-      <w:r>
-        <w:t xml:space="preserve">Analysis 4: Core-Player Usage Reduction</w:t>
-      </w:r>
-    </w:p>
-    <w:p>
-      <w:pPr>
-        <w:pStyle w:val="FirstParagraph"/>
-      </w:pPr>
-      <w:r>
-        <w:t xml:space="preserve">The final exploratory model uses a different kind of tanking signal: whether likely lottery teams reduce the minutes of their main pre-March players late in the season. This is motivated by the idea that tanking may show up not only in losses, but also in roster management. We define each team’s core players as the three players with the most pre-March starts, breaking ties by pre-March minutes. To focus on usage changes rather than trades or complete absences, we keep only core players who appeared for the same team at least once after March 1. We then calculate their combined minutes per team game before March and after March. The outcome,</w:t>
-      </w:r>
-      <w:r>
-        <w:t xml:space="preserve"> </w:t>
-      </w:r>
-      <w:r>
-        <w:rPr>
-          <w:rStyle w:val="VerbatimChar"/>
-        </w:rPr>
-        <w:t xml:space="preserve">core_usage_drop_rate</w:t>
-      </w:r>
-      <w:r>
-        <w:t xml:space="preserve">, is the percentage drop in those core-player minutes after March 1. Positive values mean the team’s main continuing pre-March players were used less late in the season.</w:t>
-      </w:r>
-    </w:p>
-    <w:p>
-      <w:pPr>
-        <w:pStyle w:val="BodyText"/>
-      </w:pPr>
-      <w:r>
-        <w:t xml:space="preserve">This model should be interpreted cautiously. The player logs include</w:t>
-      </w:r>
-      <w:r>
-        <w:t xml:space="preserve"> </w:t>
-      </w:r>
-      <w:r>
-        <w:rPr>
-          <w:rStyle w:val="VerbatimChar"/>
-        </w:rPr>
-        <w:t xml:space="preserve">did_not_play</w:t>
-      </w:r>
-      <w:r>
-        <w:t xml:space="preserve">,</w:t>
-      </w:r>
-      <w:r>
-        <w:t xml:space="preserve"> </w:t>
-      </w:r>
-      <w:r>
-        <w:rPr>
-          <w:rStyle w:val="VerbatimChar"/>
-        </w:rPr>
-        <w:t xml:space="preserve">active</w:t>
-      </w:r>
-      <w:r>
-        <w:t xml:space="preserve">, and</w:t>
-      </w:r>
-      <w:r>
-        <w:t xml:space="preserve"> </w:t>
-      </w:r>
-      <w:r>
-        <w:rPr>
-          <w:rStyle w:val="VerbatimChar"/>
-        </w:rPr>
-        <w:t xml:space="preserve">reason</w:t>
-      </w:r>
-      <w:r>
-        <w:t xml:space="preserve"> </w:t>
-      </w:r>
-      <w:r>
-        <w:t xml:space="preserve">fields, but they do not perfectly tell us whether a player was healthy. Therefore this is a</w:t>
-      </w:r>
-      <w:r>
-        <w:t xml:space="preserve"> </w:t>
-      </w:r>
-      <w:r>
-        <w:rPr>
-          <w:b/>
-          <w:bCs/>
-        </w:rPr>
-        <w:t xml:space="preserve">core-player usage reduction</w:t>
-      </w:r>
-      <w:r>
-        <w:t xml:space="preserve"> </w:t>
-      </w:r>
-      <w:r>
-        <w:t xml:space="preserve">model, not proof that teams intentionally benched healthy starters. We use raw top-four draft rating here, instead of the position-adjusted lottery incentive, because this mechanism asks whether stronger top-end classes are associated with a broader roster-management response among likely lottery teams.</w:t>
-      </w:r>
-    </w:p>
-    <w:p>
-      <w:pPr>
-        <w:pStyle w:val="CaptionedFigure"/>
-      </w:pPr>
-      <w:r>
-        <w:drawing>
-          <wp:inline>
-            <wp:extent cx="5334000" cy="3597671"/>
-            <wp:effectExtent b="0" l="0" r="0" t="0"/>
-            <wp:docPr descr="Figure 7. Top-four draft strength and core-player usage reduction among likely lottery candidates. Each point is one team-season. Core players are the top three pre-March starters, among players who stayed with the same team and appeared after March 1. The y-axis is the percentage drop in their combined minutes per team game after March 1." title="" id="53" name="Picture"/>
-            <a:graphic>
-              <a:graphicData uri="http://schemas.openxmlformats.org/drawingml/2006/picture">
-                <pic:pic>
-                  <pic:nvPicPr>
-                    <pic:cNvPr descr="final-report_files/figure-docx/core-usage-visual-1.png" id="54" name="Picture"/>
+                    <pic:cNvPr descr="final-report_files/figure-docx/team-fit-visual-1.png" id="54" name="Picture"/>
                     <pic:cNvPicPr>
                       <a:picLocks noChangeArrowheads="1" noChangeAspect="1"/>
                     </pic:cNvPicPr>
@@ -4698,7 +4500,380 @@
         <w:pStyle w:val="ImageCaption"/>
       </w:pPr>
       <w:r>
-        <w:t xml:space="preserve">Figure 7. Top-four draft strength and core-player usage reduction among likely lottery candidates. Each point is one team-season. Core players are the top three pre-March starters, among players who stayed with the same team and appeared after March 1. The y-axis is the percentage drop in their combined minutes per team game after March 1.</w:t>
+        <w:t xml:space="preserve">Figure 7. Team fit and tanking index among likely lottery candidates. Each point is one team-season. The x-axis measures whether a team’s pre-March positional weaknesses align with the strongest prospect position groups in that year’s draft, and color shows top-four draft class strength.</w:t>
+      </w:r>
+    </w:p>
+    <w:p>
+      <w:pPr>
+        <w:pStyle w:val="TableCaption"/>
+      </w:pPr>
+      <w:r>
+        <w:t xml:space="preserve">Table 5. Exploratory models adding team fit and a draft-strength-by-fit interaction.</w:t>
+      </w:r>
+    </w:p>
+    <w:tbl>
+      <w:tblPr>
+        <w:tblStyle w:val="Table"/>
+        <w:tblW w:type="auto" w:w="0"/>
+        <w:tblLook w:firstRow="1" w:lastRow="0" w:firstColumn="0" w:lastColumn="0" w:noHBand="0" w:noVBand="0" w:val="0020"/>
+        <w:tblCaption w:val="Table 5. Exploratory models adding team fit and a draft-strength-by-fit interaction."/>
+      </w:tblPr>
+      <w:tblGrid>
+        <w:gridCol w:w="1980"/>
+        <w:gridCol w:w="1980"/>
+        <w:gridCol w:w="1980"/>
+        <w:gridCol w:w="1980"/>
+      </w:tblGrid>
+      <w:tr>
+        <w:trPr>
+          <w:tblHeader w:val="on"/>
+        </w:trPr>
+        <w:tc>
+          <w:tcPr/>
+          <w:p>
+            <w:pPr>
+              <w:pStyle w:val="Compact"/>
+              <w:jc w:val="left"/>
+            </w:pPr>
+            <w:r>
+              <w:t xml:space="preserve">Outcome</w:t>
+            </w:r>
+          </w:p>
+        </w:tc>
+        <w:tc>
+          <w:tcPr/>
+          <w:p>
+            <w:pPr>
+              <w:pStyle w:val="Compact"/>
+              <w:jc w:val="left"/>
+            </w:pPr>
+            <w:r>
+              <w:t xml:space="preserve">Term</w:t>
+            </w:r>
+          </w:p>
+        </w:tc>
+        <w:tc>
+          <w:tcPr/>
+          <w:p>
+            <w:pPr>
+              <w:pStyle w:val="Compact"/>
+              <w:jc w:val="right"/>
+            </w:pPr>
+            <w:r>
+              <w:t xml:space="preserve">Estimate</w:t>
+            </w:r>
+          </w:p>
+        </w:tc>
+        <w:tc>
+          <w:tcPr/>
+          <w:p>
+            <w:pPr>
+              <w:pStyle w:val="Compact"/>
+              <w:jc w:val="right"/>
+            </w:pPr>
+            <w:r>
+              <w:t xml:space="preserve">p-value</w:t>
+            </w:r>
+          </w:p>
+        </w:tc>
+      </w:tr>
+      <w:tr>
+        <w:tc>
+          <w:tcPr/>
+          <w:p>
+            <w:pPr>
+              <w:pStyle w:val="Compact"/>
+              <w:jc w:val="left"/>
+            </w:pPr>
+            <w:r>
+              <w:t xml:space="preserve">Tanking index</w:t>
+            </w:r>
+          </w:p>
+        </w:tc>
+        <w:tc>
+          <w:tcPr/>
+          <w:p>
+            <w:pPr>
+              <w:pStyle w:val="Compact"/>
+              <w:jc w:val="left"/>
+            </w:pPr>
+            <w:r>
+              <w:t xml:space="preserve">Top-four draft rating</w:t>
+            </w:r>
+          </w:p>
+        </w:tc>
+        <w:tc>
+          <w:tcPr/>
+          <w:p>
+            <w:pPr>
+              <w:pStyle w:val="Compact"/>
+              <w:jc w:val="right"/>
+            </w:pPr>
+            <w:r>
+              <w:t xml:space="preserve">0.154</w:t>
+            </w:r>
+          </w:p>
+        </w:tc>
+        <w:tc>
+          <w:tcPr/>
+          <w:p>
+            <w:pPr>
+              <w:pStyle w:val="Compact"/>
+              <w:jc w:val="right"/>
+            </w:pPr>
+            <w:r>
+              <w:t xml:space="preserve">0.121</w:t>
+            </w:r>
+          </w:p>
+        </w:tc>
+      </w:tr>
+      <w:tr>
+        <w:tc>
+          <w:tcPr/>
+          <w:p>
+            <w:pPr>
+              <w:pStyle w:val="Compact"/>
+            </w:pPr>
+          </w:p>
+        </w:tc>
+        <w:tc>
+          <w:tcPr/>
+          <w:p>
+            <w:pPr>
+              <w:pStyle w:val="Compact"/>
+              <w:jc w:val="left"/>
+            </w:pPr>
+            <w:r>
+              <w:t xml:space="preserve">Team fit</w:t>
+            </w:r>
+          </w:p>
+        </w:tc>
+        <w:tc>
+          <w:tcPr/>
+          <w:p>
+            <w:pPr>
+              <w:pStyle w:val="Compact"/>
+              <w:jc w:val="right"/>
+            </w:pPr>
+            <w:r>
+              <w:t xml:space="preserve">0.141</w:t>
+            </w:r>
+          </w:p>
+        </w:tc>
+        <w:tc>
+          <w:tcPr/>
+          <w:p>
+            <w:pPr>
+              <w:pStyle w:val="Compact"/>
+              <w:jc w:val="right"/>
+            </w:pPr>
+            <w:r>
+              <w:t xml:space="preserve">0.175</w:t>
+            </w:r>
+          </w:p>
+        </w:tc>
+      </w:tr>
+      <w:tr>
+        <w:tc>
+          <w:tcPr/>
+          <w:p>
+            <w:pPr>
+              <w:pStyle w:val="Compact"/>
+            </w:pPr>
+          </w:p>
+        </w:tc>
+        <w:tc>
+          <w:tcPr/>
+          <w:p>
+            <w:pPr>
+              <w:pStyle w:val="Compact"/>
+              <w:jc w:val="left"/>
+            </w:pPr>
+            <w:r>
+              <w:t xml:space="preserve">Top-four draft rating x team fit</w:t>
+            </w:r>
+          </w:p>
+        </w:tc>
+        <w:tc>
+          <w:tcPr/>
+          <w:p>
+            <w:pPr>
+              <w:pStyle w:val="Compact"/>
+              <w:jc w:val="right"/>
+            </w:pPr>
+            <w:r>
+              <w:t xml:space="preserve">-0.032</w:t>
+            </w:r>
+          </w:p>
+        </w:tc>
+        <w:tc>
+          <w:tcPr/>
+          <w:p>
+            <w:pPr>
+              <w:pStyle w:val="Compact"/>
+              <w:jc w:val="right"/>
+            </w:pPr>
+            <w:r>
+              <w:t xml:space="preserve">0.757</w:t>
+            </w:r>
+          </w:p>
+        </w:tc>
+      </w:tr>
+    </w:tbl>
+    <w:p>
+      <w:pPr>
+        <w:pStyle w:val="BodyText"/>
+      </w:pPr>
+      <w:r>
+        <w:t xml:space="preserve">The coefficient of interest in Table 5 is the interaction between top-four draft strength and team fit. Because both variables are standardized, the interaction coefficient of -0.032 means that a one-standard-deviation increase in team fit changes the draft-strength slope by -0.032 tanking-index units, holding the controls fixed. The interaction p-value is 0.76, so this is not statistically significant. This does not mean fit is irrelevant; it means our simple fit proxy does not add clear evidence beyond the main draft-strength model. A stronger version of this idea would use team-specific draft boards, roster contract data, or play-type needs instead of broad position groups.</w:t>
+      </w:r>
+    </w:p>
+    <w:bookmarkEnd w:id="55"/>
+    <w:bookmarkStart w:id="59" w:name="analysis-4-core-player-usage-reduction"/>
+    <w:p>
+      <w:pPr>
+        <w:pStyle w:val="Heading3"/>
+      </w:pPr>
+      <w:r>
+        <w:t xml:space="preserve">Analysis 4: Core-Player Usage Reduction</w:t>
+      </w:r>
+    </w:p>
+    <w:p>
+      <w:pPr>
+        <w:pStyle w:val="FirstParagraph"/>
+      </w:pPr>
+      <w:r>
+        <w:t xml:space="preserve">The final exploratory model uses a different kind of tanking signal: whether likely lottery teams reduce the minutes of their main pre-March players late in the season. This is motivated by the idea that tanking may show up not only in losses, but also in roster management. We define each team’s core players as the three players with the most pre-March starts, breaking ties by pre-March minutes. To focus on usage changes rather than trades or complete absences, we keep only core players who appeared for the same team at least once after March 1. We then calculate their combined minutes per team game before March and after March. The outcome,</w:t>
+      </w:r>
+      <w:r>
+        <w:t xml:space="preserve"> </w:t>
+      </w:r>
+      <w:r>
+        <w:rPr>
+          <w:rStyle w:val="VerbatimChar"/>
+        </w:rPr>
+        <w:t xml:space="preserve">core_usage_drop_rate</w:t>
+      </w:r>
+      <w:r>
+        <w:t xml:space="preserve">, is the proportional drop in those core-player minutes after March 1. Positive values mean the team’s main continuing pre-March players were used less late in the season.</w:t>
+      </w:r>
+    </w:p>
+    <w:p>
+      <w:pPr>
+        <w:pStyle w:val="BodyText"/>
+      </w:pPr>
+      <w:r>
+        <w:t xml:space="preserve">This model should be interpreted cautiously. The player logs include</w:t>
+      </w:r>
+      <w:r>
+        <w:t xml:space="preserve"> </w:t>
+      </w:r>
+      <w:r>
+        <w:rPr>
+          <w:rStyle w:val="VerbatimChar"/>
+        </w:rPr>
+        <w:t xml:space="preserve">did_not_play</w:t>
+      </w:r>
+      <w:r>
+        <w:t xml:space="preserve">,</w:t>
+      </w:r>
+      <w:r>
+        <w:t xml:space="preserve"> </w:t>
+      </w:r>
+      <w:r>
+        <w:rPr>
+          <w:rStyle w:val="VerbatimChar"/>
+        </w:rPr>
+        <w:t xml:space="preserve">active</w:t>
+      </w:r>
+      <w:r>
+        <w:t xml:space="preserve">, and</w:t>
+      </w:r>
+      <w:r>
+        <w:t xml:space="preserve"> </w:t>
+      </w:r>
+      <w:r>
+        <w:rPr>
+          <w:rStyle w:val="VerbatimChar"/>
+        </w:rPr>
+        <w:t xml:space="preserve">reason</w:t>
+      </w:r>
+      <w:r>
+        <w:t xml:space="preserve"> </w:t>
+      </w:r>
+      <w:r>
+        <w:t xml:space="preserve">fields, but they do not perfectly tell us whether a player was healthy. Therefore this is a</w:t>
+      </w:r>
+      <w:r>
+        <w:t xml:space="preserve"> </w:t>
+      </w:r>
+      <w:r>
+        <w:rPr>
+          <w:b/>
+          <w:bCs/>
+        </w:rPr>
+        <w:t xml:space="preserve">core-player usage reduction</w:t>
+      </w:r>
+      <w:r>
+        <w:t xml:space="preserve"> </w:t>
+      </w:r>
+      <w:r>
+        <w:t xml:space="preserve">model, not proof that teams intentionally benched healthy starters. We use raw top-four draft rating here, instead of the position-adjusted lottery incentive, because this mechanism asks whether stronger top-end classes are associated with a broader roster-management response among likely lottery teams.</w:t>
+      </w:r>
+    </w:p>
+    <w:p>
+      <w:pPr>
+        <w:pStyle w:val="CaptionedFigure"/>
+      </w:pPr>
+      <w:r>
+        <w:drawing>
+          <wp:inline>
+            <wp:extent cx="5334000" cy="3597671"/>
+            <wp:effectExtent b="0" l="0" r="0" t="0"/>
+            <wp:docPr descr="Figure 8. Top-four draft strength and core-player usage reduction among likely lottery candidates. Each point is one team-season. Core players are the top three pre-March starters, among players who stayed with the same team and appeared after March 1. The y-axis is the proportional drop in their combined minutes per team game after March 1." title="" id="57" name="Picture"/>
+            <a:graphic>
+              <a:graphicData uri="http://schemas.openxmlformats.org/drawingml/2006/picture">
+                <pic:pic>
+                  <pic:nvPicPr>
+                    <pic:cNvPr descr="final-report_files/figure-docx/core-usage-visual-1.png" id="58" name="Picture"/>
+                    <pic:cNvPicPr>
+                      <a:picLocks noChangeArrowheads="1" noChangeAspect="1"/>
+                    </pic:cNvPicPr>
+                  </pic:nvPicPr>
+                  <pic:blipFill>
+                    <a:blip r:embed="rId56"/>
+                    <a:stretch>
+                      <a:fillRect/>
+                    </a:stretch>
+                  </pic:blipFill>
+                  <pic:spPr bwMode="auto">
+                    <a:xfrm>
+                      <a:off x="0" y="0"/>
+                      <a:ext cx="5334000" cy="3597671"/>
+                    </a:xfrm>
+                    <a:prstGeom prst="rect">
+                      <a:avLst/>
+                    </a:prstGeom>
+                    <a:noFill/>
+                    <a:ln w="9525">
+                      <a:noFill/>
+                      <a:headEnd/>
+                      <a:tailEnd/>
+                    </a:ln>
+                  </pic:spPr>
+                </pic:pic>
+              </a:graphicData>
+            </a:graphic>
+          </wp:inline>
+        </w:drawing>
+      </w:r>
+    </w:p>
+    <w:p>
+      <w:pPr>
+        <w:pStyle w:val="ImageCaption"/>
+      </w:pPr>
+      <w:r>
+        <w:t xml:space="preserve">Figure 8. Top-four draft strength and core-player usage reduction among likely lottery candidates. Each point is one team-season. Core players are the top three pre-March starters, among players who stayed with the same team and appeared after March 1. The y-axis is the proportional drop in their combined minutes per team game after March 1.</w:t>
       </w:r>
     </w:p>
     <w:p>
@@ -5089,7 +5264,7 @@
         <w:pStyle w:val="BodyText"/>
       </w:pPr>
       <w:r>
-        <w:t xml:space="preserve">The coefficient of interest in Table 6 is the standardized top-four draft rating. Because the draft rating is standardized and the outcome is a percentage drop in core-player minutes, the coefficient of 0.054 means that a one-standard-deviation stronger top-four draft class is associated with a 5.4 percentage point larger drop in late-season core-player usage, holding pre-March core-player minutes and disrupted-season controls fixed. The usual team-season p-value is 0.00098, and the p-value remains 0.0036 when standard errors are clustered by draft season. This matters because</w:t>
+        <w:t xml:space="preserve">The coefficient of interest in Table 6 is the standardized top-four draft rating. Because the draft rating is standardized and the outcome is a proportional drop in core-player minutes, the coefficient of 0.054 means that a one-standard-deviation stronger top-four draft class is associated with a 5.4 percentage point larger drop in late-season core-player usage, holding pre-March core-player minutes and disrupted-season controls fixed. The usual team-season p-value is 0.00098, and the p-value remains 0.0036 when standard errors are clustered by draft season. This matters because</w:t>
       </w:r>
       <w:r>
         <w:t xml:space="preserve"> </w:t>
@@ -5104,7 +5279,7 @@
         <w:t xml:space="preserve"> </w:t>
       </w:r>
       <w:r>
-        <w:t xml:space="preserve">has only 17 unique season-level values even though the outcome is measured for many team-seasons. The result therefore gives evidence of a roster-management pattern associated with stronger draft classes, but it should not be interpreted as causal proof of tanking because injuries, planned rest, player development, and unobserved availability can also affect late-season minutes.</w:t>
+        <w:t xml:space="preserve">has only 17 unique season-level values even though the outcome is measured for many team-seasons. As with the win-loss model, R-squared is secondary here: the model R-squared is 0.121 and the adjusted R-squared is 0.094, but the main result is the estimated draft-strength effect after accounting for baseline core-player minutes and disrupted seasons. The result gives evidence of a roster-management pattern associated with stronger draft classes, but it should not be interpreted as causal proof of tanking because injuries, planned rest, player development, and unobserved availability can also affect late-season minutes.</w:t>
       </w:r>
     </w:p>
     <w:p>
@@ -5929,8 +6104,8 @@
         </w:tc>
       </w:tr>
     </w:tbl>
-    <w:bookmarkEnd w:id="55"/>
-    <w:bookmarkStart w:id="56" w:name="conclusions-from-the-formal-analysis"/>
+    <w:bookmarkEnd w:id="59"/>
+    <w:bookmarkStart w:id="60" w:name="conclusions-from-the-formal-analysis"/>
     <w:p>
       <w:pPr>
         <w:pStyle w:val="Heading3"/>
@@ -5968,7 +6143,7 @@
         <w:pStyle w:val="BodyText"/>
       </w:pPr>
       <w:r>
-        <w:t xml:space="preserve">The core-player usage model adds a different type of outcome. It asks whether stronger top-four draft classes are associated with using main continuing pre-March players less often late in the season. This is closer to a behavioral tanking mechanism than the win-loss outcome alone, and this version points in the expected direction: stronger top-four classes are associated with larger percentage drops in core-player minutes. However, the raw top-four rating is season-level, so we interpret this as a draft-class-level signal with team-season outcomes rather than as 172 independent draft-strength observations. The sensitivity checks show that this result is stronger for raw draft strength than for the position-adjusted lottery incentive. That makes the result interesting, but still exploratory: injuries, planned rest, player development, and unobserved availability can all reduce minutes for reasons unrelated to intentional tanking.</w:t>
+        <w:t xml:space="preserve">The core-player usage model adds a different type of outcome. It asks whether stronger top-four draft classes are associated with using main continuing pre-March players less often late in the season. This is closer to a behavioral tanking mechanism than the win-loss outcome alone, and this version points in the expected direction: stronger top-four classes are associated with larger proportional drops in core-player minutes. However, the raw top-four rating is season-level, so we interpret this as a draft-class-level signal with team-season outcomes rather than as 172 independent draft-strength observations. The sensitivity checks show that this result is stronger for raw draft strength than for the position-adjusted lottery incentive. That makes the result interesting, but still exploratory: injuries, planned rest, player development, and unobserved availability can all reduce minutes for reasons unrelated to intentional tanking.</w:t>
       </w:r>
     </w:p>
     <w:p>
@@ -5977,123 +6152,123 @@
       </w:pPr>
       <w:r>
         <w:t xml:space="preserve">The 2021 season remains an important case. Several teams underperformed sharply late in the season, but that year was shortened and affected by COVID-era scheduling and player availability. Rather than deleting 2021 from the main model, we include a separate 2021 control. We also include separate controls for 2012 and 2020 because those seasons were disrupted in different ways. This keeps the observations in the main analysis while acknowledging that they may not be comparable to normal 82-game seasons.</w:t>
-      </w:r>
-    </w:p>
-    <w:bookmarkEnd w:id="56"/>
-    <w:bookmarkEnd w:id="57"/>
-    <w:bookmarkStart w:id="61" w:name="vi.-next-steps"/>
-    <w:p>
-      <w:pPr>
-        <w:pStyle w:val="Heading2"/>
-      </w:pPr>
-      <w:r>
-        <w:t xml:space="preserve">VI. Next Steps</w:t>
-      </w:r>
-    </w:p>
-    <w:p>
-      <w:pPr>
-        <w:pStyle w:val="FirstParagraph"/>
-      </w:pPr>
-      <w:r>
-        <w:t xml:space="preserve">The results should be interpreted cautiously. The model finds a positive relationship between position-adjusted top-four draft incentives and late-season underperformance, but it does not prove intent and should not be read as definitive evidence that teams deliberately lost games.</w:t>
-      </w:r>
-    </w:p>
-    <w:bookmarkStart w:id="58" w:name="limitations-and-cautions"/>
-    <w:p>
-      <w:pPr>
-        <w:pStyle w:val="Heading3"/>
-      </w:pPr>
-      <w:r>
-        <w:t xml:space="preserve">Limitations and Cautions</w:t>
-      </w:r>
-    </w:p>
-    <w:p>
-      <w:pPr>
-        <w:pStyle w:val="FirstParagraph"/>
-      </w:pPr>
-      <w:r>
-        <w:t xml:space="preserve">The biggest limitation is that tanking is not directly observable. We can observe losses, late-season underperformance, and playoff context, but we cannot observe whether a front office intended to lose. For that reason, all outcomes in this report should be interpreted as tanking proxies or tanking signals.</w:t>
-      </w:r>
-    </w:p>
-    <w:p>
-      <w:pPr>
-        <w:pStyle w:val="BodyText"/>
-      </w:pPr>
-      <w:r>
-        <w:t xml:space="preserve">A second limitation is that raw draft strength varies by season, not by team. Even after expanding the data to 2010-2026, there are only 17 draft-class observations. The position-adjusted incentive improves this by combining draft strength with each team’s lottery position, but part of the signal still comes from season-level variation in draft quality. The incentive measure is also simplified: it uses the marginal gain in top-four-pick probability from moving one lottery slot worse, so it does not distinguish between the value of the first, second, third, and fourth picks, larger multi-slot changes, player-specific team preferences, or the possibility that teams care about protecting an already-strong lottery position.</w:t>
-      </w:r>
-    </w:p>
-    <w:bookmarkEnd w:id="58"/>
-    <w:bookmarkStart w:id="59" w:name="future-extensions"/>
-    <w:p>
-      <w:pPr>
-        <w:pStyle w:val="Heading3"/>
-      </w:pPr>
-      <w:r>
-        <w:t xml:space="preserve">Future Extensions</w:t>
-      </w:r>
-    </w:p>
-    <w:p>
-      <w:pPr>
-        <w:pStyle w:val="FirstParagraph"/>
-      </w:pPr>
-      <w:r>
-        <w:t xml:space="preserve">A direct next step is to improve the core-player usage model with better availability data. The version in this report uses player game logs to identify each team’s main pre-March players who stayed with the team and appeared after March 1, then measures whether their minutes drop late in the season. This keeps the analysis focused on continuing players, but it still cannot perfectly distinguish injuries, rest, player development, and coach’s decisions. A stronger version would merge injury reports, transaction data, and inactive-list reasons to separate strategic late-season roster management from ordinary player availability.</w:t>
-      </w:r>
-    </w:p>
-    <w:p>
-      <w:pPr>
-        <w:pStyle w:val="BodyText"/>
-      </w:pPr>
-      <w:r>
-        <w:t xml:space="preserve">Another extension would improve the team-fit score. The current version uses broad position groups and pre-March box-score production, not detailed roster needs, contracts, player age, front-office preferences, or team-specific draft evaluations. The fit extension should therefore be interpreted as a first-pass robustness check rather than a final answer about roster construction.</w:t>
-      </w:r>
-    </w:p>
-    <w:p>
-      <w:pPr>
-        <w:pStyle w:val="BodyText"/>
-      </w:pPr>
-      <w:r>
-        <w:t xml:space="preserve">A final extension would compare multiple draft-quality measures. The CraftedNBA rating is useful because it gives one consistent external measure of draft class quality, but it is still one source’s model-based ranking. Future versions should test whether results change when draft strength is measured by top-prospect rating, number of elite prospects, consensus mock draft rankings, or later NBA outcomes such as win shares.</w:t>
-      </w:r>
-    </w:p>
-    <w:bookmarkEnd w:id="59"/>
-    <w:bookmarkStart w:id="60" w:name="final-takeaway"/>
-    <w:p>
-      <w:pPr>
-        <w:pStyle w:val="Heading3"/>
-      </w:pPr>
-      <w:r>
-        <w:t xml:space="preserve">Final Takeaway</w:t>
-      </w:r>
-    </w:p>
-    <w:p>
-      <w:pPr>
-        <w:pStyle w:val="FirstParagraph"/>
-      </w:pPr>
-      <w:r>
-        <w:t xml:space="preserve">This project finds suggestive evidence that draft class strength is related to late-season losing signals among likely lottery candidates. The clearest descriptive patterns come from season-level draft-strength graphs, while the more conservative position-adjusted win-loss model shows positive but noisier estimates. The core-player usage model adds a stronger exploratory signal that teams in better top-four draft classes reduced minutes more for continuing core players. The full tanking index is a better final win-loss outcome because it measures the size and direction of late-season underperformance rather than depending on an arbitrary cutoff.</w:t>
-      </w:r>
-    </w:p>
-    <w:p>
-      <w:pPr>
-        <w:pStyle w:val="BodyText"/>
-      </w:pPr>
-      <w:r>
-        <w:t xml:space="preserve">The most defensible conclusion is therefore cautious: draft class quality appears relevant to tanking incentives, but the evidence is not strong enough to claim that stronger draft classes directly cause tanking. The project improves on simpler tanking analyses by combining playoff context, lottery position, standardized late-season underperformance, and draft class quality into one framework.</w:t>
-      </w:r>
-    </w:p>
-    <w:p>
-      <w:pPr>
-        <w:pStyle w:val="BodyText"/>
-      </w:pPr>
-      <w:r>
-        <w:t xml:space="preserve">The exploratory team-fit extension for the main win-loss outcome is less conclusive. It gives a plausible way to think about team-level heterogeneity, but the broad fit proxy does not add strong statistical evidence beyond overall draft strength in the primary tanking-index model. That leaves team fit as an important direction for future work rather than a core result of this report.</w:t>
       </w:r>
     </w:p>
     <w:bookmarkEnd w:id="60"/>
     <w:bookmarkEnd w:id="61"/>
-    <w:bookmarkStart w:id="64" w:name="references"/>
+    <w:bookmarkStart w:id="65" w:name="vi.-next-steps"/>
+    <w:p>
+      <w:pPr>
+        <w:pStyle w:val="Heading2"/>
+      </w:pPr>
+      <w:r>
+        <w:t xml:space="preserve">VI. Next Steps</w:t>
+      </w:r>
+    </w:p>
+    <w:p>
+      <w:pPr>
+        <w:pStyle w:val="FirstParagraph"/>
+      </w:pPr>
+      <w:r>
+        <w:t xml:space="preserve">The results should be interpreted cautiously. The model finds a positive relationship between position-adjusted top-four draft incentives and late-season underperformance, but it does not prove intent and should not be read as definitive evidence that teams deliberately lost games.</w:t>
+      </w:r>
+    </w:p>
+    <w:bookmarkStart w:id="62" w:name="limitations-and-cautions"/>
+    <w:p>
+      <w:pPr>
+        <w:pStyle w:val="Heading3"/>
+      </w:pPr>
+      <w:r>
+        <w:t xml:space="preserve">Limitations and Cautions</w:t>
+      </w:r>
+    </w:p>
+    <w:p>
+      <w:pPr>
+        <w:pStyle w:val="FirstParagraph"/>
+      </w:pPr>
+      <w:r>
+        <w:t xml:space="preserve">The biggest limitation is that tanking is not directly observable. We can observe losses, late-season underperformance, and playoff context, but we cannot observe whether a front office intended to lose. For that reason, all outcomes in this report should be interpreted as tanking proxies or tanking signals.</w:t>
+      </w:r>
+    </w:p>
+    <w:p>
+      <w:pPr>
+        <w:pStyle w:val="BodyText"/>
+      </w:pPr>
+      <w:r>
+        <w:t xml:space="preserve">A second limitation is that raw draft strength varies by season, not by team. Even after expanding the data to 2010-2026, there are only 17 draft-class observations. The position-adjusted incentive improves this by combining draft strength with each team’s lottery position, but part of the signal still comes from season-level variation in draft quality. The incentive measure is also simplified: it uses the marginal gain in top-four-pick probability from moving one lottery slot worse, so it does not distinguish between the value of the first, second, third, and fourth picks, larger multi-slot changes, player-specific team preferences, or the possibility that teams care about protecting an already-strong lottery position.</w:t>
+      </w:r>
+    </w:p>
+    <w:bookmarkEnd w:id="62"/>
+    <w:bookmarkStart w:id="63" w:name="future-extensions"/>
+    <w:p>
+      <w:pPr>
+        <w:pStyle w:val="Heading3"/>
+      </w:pPr>
+      <w:r>
+        <w:t xml:space="preserve">Future Extensions</w:t>
+      </w:r>
+    </w:p>
+    <w:p>
+      <w:pPr>
+        <w:pStyle w:val="FirstParagraph"/>
+      </w:pPr>
+      <w:r>
+        <w:t xml:space="preserve">A direct next step is to improve the core-player usage model with better availability data. The version in this report uses player game logs to identify each team’s main pre-March players who stayed with the team and appeared after March 1, then measures whether their minutes drop late in the season. This keeps the analysis focused on continuing players, but it still cannot perfectly distinguish injuries, rest, player development, and coach’s decisions. A stronger version would merge injury reports, transaction data, and inactive-list reasons to separate strategic late-season roster management from ordinary player availability.</w:t>
+      </w:r>
+    </w:p>
+    <w:p>
+      <w:pPr>
+        <w:pStyle w:val="BodyText"/>
+      </w:pPr>
+      <w:r>
+        <w:t xml:space="preserve">Another extension would improve the team-fit score. The current version uses broad position groups and pre-March box-score production, not detailed roster needs, contracts, player age, front-office preferences, or team-specific draft evaluations. The fit extension should therefore be interpreted as a first-pass robustness check rather than a final answer about roster construction.</w:t>
+      </w:r>
+    </w:p>
+    <w:p>
+      <w:pPr>
+        <w:pStyle w:val="BodyText"/>
+      </w:pPr>
+      <w:r>
+        <w:t xml:space="preserve">A final extension would compare multiple draft-quality measures. The CraftedNBA rating is useful because it gives one consistent external measure of draft class quality, but it is still one source’s model-based ranking. Future versions should test whether results change when draft strength is measured by top-prospect rating, number of elite prospects, consensus mock draft rankings, or later NBA outcomes such as win shares.</w:t>
+      </w:r>
+    </w:p>
+    <w:bookmarkEnd w:id="63"/>
+    <w:bookmarkStart w:id="64" w:name="final-takeaway"/>
+    <w:p>
+      <w:pPr>
+        <w:pStyle w:val="Heading3"/>
+      </w:pPr>
+      <w:r>
+        <w:t xml:space="preserve">Final Takeaway</w:t>
+      </w:r>
+    </w:p>
+    <w:p>
+      <w:pPr>
+        <w:pStyle w:val="FirstParagraph"/>
+      </w:pPr>
+      <w:r>
+        <w:t xml:space="preserve">This project finds suggestive evidence that draft class strength is related to late-season losing signals among likely lottery candidates. The clearest descriptive patterns come from season-level draft-strength graphs, while the more conservative position-adjusted win-loss model shows positive but noisier estimates. The core-player usage model adds a stronger exploratory signal that teams in better top-four draft classes reduced minutes more for continuing core players. The full tanking index is a better final win-loss outcome because it measures the size and direction of late-season underperformance rather than depending on an arbitrary cutoff.</w:t>
+      </w:r>
+    </w:p>
+    <w:p>
+      <w:pPr>
+        <w:pStyle w:val="BodyText"/>
+      </w:pPr>
+      <w:r>
+        <w:t xml:space="preserve">The most defensible conclusion is therefore cautious: draft class quality appears relevant to tanking incentives, but the evidence is not strong enough to claim that stronger draft classes directly cause tanking. The project improves on simpler tanking analyses by combining playoff context, lottery position, standardized late-season underperformance, and draft class quality into one framework.</w:t>
+      </w:r>
+    </w:p>
+    <w:p>
+      <w:pPr>
+        <w:pStyle w:val="BodyText"/>
+      </w:pPr>
+      <w:r>
+        <w:t xml:space="preserve">The exploratory team-fit extension for the main win-loss outcome is less conclusive. It gives a plausible way to think about team-level heterogeneity, but the broad fit proxy does not add strong statistical evidence beyond overall draft strength in the primary tanking-index model. That leaves team fit as an important direction for future work rather than a core result of this report.</w:t>
+      </w:r>
+    </w:p>
+    <w:bookmarkEnd w:id="64"/>
+    <w:bookmarkEnd w:id="65"/>
+    <w:bookmarkStart w:id="68" w:name="references"/>
     <w:p>
       <w:pPr>
         <w:pStyle w:val="Heading2"/>
@@ -6142,7 +6317,7 @@
       <w:r>
         <w:t xml:space="preserve"> </w:t>
       </w:r>
-      <w:hyperlink r:id="rId62">
+      <w:hyperlink r:id="rId66">
         <w:r>
           <w:rPr>
             <w:rStyle w:val="Hyperlink"/>
@@ -6189,6 +6364,39 @@
         </w:numPr>
       </w:pPr>
       <w:r>
+        <w:rPr>
+          <w:i/>
+          <w:iCs/>
+        </w:rPr>
+        <w:t xml:space="preserve">New York Post</w:t>
+      </w:r>
+      <w:r>
+        <w:t xml:space="preserve">. (2026, February 12).</w:t>
+      </w:r>
+      <w:r>
+        <w:t xml:space="preserve"> </w:t>
+      </w:r>
+      <w:hyperlink r:id="rId33">
+        <w:r>
+          <w:rPr>
+            <w:rStyle w:val="Hyperlink"/>
+          </w:rPr>
+          <w:t xml:space="preserve">Jazz, Pacers slammed with $600K in fines over tanking decisions</w:t>
+        </w:r>
+      </w:hyperlink>
+      <w:r>
+        <w:t xml:space="preserve">.</w:t>
+      </w:r>
+    </w:p>
+    <w:p>
+      <w:pPr>
+        <w:pStyle w:val="Compact"/>
+        <w:numPr>
+          <w:ilvl w:val="0"/>
+          <w:numId w:val="1002"/>
+        </w:numPr>
+      </w:pPr>
+      <w:r>
         <w:t xml:space="preserve">NBA.com.</w:t>
       </w:r>
       <w:r>
@@ -6246,7 +6454,7 @@
       <w:r>
         <w:t xml:space="preserve"> </w:t>
       </w:r>
-      <w:hyperlink r:id="rId63">
+      <w:hyperlink r:id="rId67">
         <w:r>
           <w:rPr>
             <w:rStyle w:val="Hyperlink"/>
@@ -6310,7 +6518,7 @@
         <w:t xml:space="preserve">.</w:t>
       </w:r>
     </w:p>
-    <w:bookmarkEnd w:id="64"/>
+    <w:bookmarkEnd w:id="68"/>
     <w:sectPr>
       <w:footnotePr>
         <w:numRestart w:val="eachSect"/>

</xml_diff>

<commit_message>
Shortening analysis thru next steps
</commit_message>
<xml_diff>
--- a/final-report.docx
+++ b/final-report.docx
@@ -3176,7 +3176,7 @@
       </w:r>
     </w:p>
     <w:bookmarkEnd w:id="49"/>
-    <w:bookmarkStart w:id="61" w:name="v.-formal-analysis"/>
+    <w:bookmarkStart w:id="62" w:name="v.-formal-analysis"/>
     <w:p>
       <w:pPr>
         <w:pStyle w:val="Heading2"/>
@@ -3202,7 +3202,7 @@
         <w:t xml:space="preserve">tanking_index</w:t>
       </w:r>
       <w:r>
-        <w:t xml:space="preserve">. This is a standardized late-season win shortfall: positive values mean a team won fewer March-onward games than expected from its pre-March record, while negative values mean it overperformed late.</w:t>
+        <w:t xml:space="preserve">. This is a standardized late-season win deficit with positive values meaning a team won fewer March-onward games than expected from its pre-March record, while negative values mean it overperformed late.</w:t>
       </w:r>
     </w:p>
     <w:p>
@@ -3276,7 +3276,7 @@
         <w:pStyle w:val="BodyText"/>
       </w:pPr>
       <w:r>
-        <w:t xml:space="preserve">The final model’s key coefficient is the standardized position-adjusted draft incentive. It asks whether teams with larger marginal lottery rewards in stronger top-four draft classes have larger tanking signals after controlling for pre-March team strength and separate indicators for the disrupted 2012, 2020, and 2021 seasons. We also include follow-up checks for whether the relationship changed after the 2019 lottery reform, whether a team’s roster fit with the draft class adds explanatory power, and whether stronger top-four draft classes are associated with late-season reductions in core-player minutes.</w:t>
+        <w:t xml:space="preserve">The main win-loss model’s key coefficient is the standardized position-adjusted draft incentive. It asks whether teams with larger marginal lottery rewards in stronger top-four draft classes have larger tanking signals after controlling for pre-March team strength and separate indicators for the disrupted 2012, 2020, and 2021 seasons. We also include follow-up checks for whether the relationship changed after the 2019 lottery reform, whether a team’s roster fit with the draft class adds explanatory power, and whether stronger top-four draft classes are associated with late-season reductions in core-player minutes.</w:t>
       </w:r>
     </w:p>
     <w:bookmarkStart w:id="50" w:name="analysis-1-prepost-reform-interaction"/>
@@ -3560,7 +3560,25 @@
         <w:pStyle w:val="BodyText"/>
       </w:pPr>
       <w:r>
-        <w:t xml:space="preserve">The interaction models were included because feedback suggested testing whether the relationship between draft strength and tanking signals changed after the 2019 lottery reform. They are useful as an exploratory check, but they are not our preferred final model. With only 17 draft-class seasons, splitting the draft-strength effect into pre- and post-reform components makes the model harder to estimate and easier for individual seasons to influence.</w:t>
+        <w:t xml:space="preserve">Table 2 tests whether the relationship between top-four draft strength and the tanking index changed after the 2019 lottery reform. The main terms to look at are the top-four draft rating coefficient and its interaction with the post-2019 reform indicator. The top-four draft rating coefficient shows the pre-reform relationship between draft strength and late-season underperformance. The interaction term shows whether that relationship became stronger or weaker after the reform. Because the interaction p-value is 0.15, the change is not statistically significant. We therefore treat this as an exploratory check, not evidence that the lottery reform clearly changed the draft-strength/tanking relationship.</w:t>
+      </w:r>
+    </w:p>
+    <w:bookmarkEnd w:id="50"/>
+    <w:bookmarkStart w:id="51" w:name="Xe837124f9f200bd350346b45a493dd227e53ca1"/>
+    <w:p>
+      <w:pPr>
+        <w:pStyle w:val="Heading3"/>
+      </w:pPr>
+      <w:r>
+        <w:t xml:space="preserve">Analysis 2: Position-Adjusted Team-Season Regression</w:t>
+      </w:r>
+    </w:p>
+    <w:p>
+      <w:pPr>
+        <w:pStyle w:val="FirstParagraph"/>
+      </w:pPr>
+      <w:r>
+        <w:t xml:space="preserve">Our next model looks at all seasons together and focuses on the team-specific draft incentive. This variable combines how strong the top of the draft class was with how much a team could improve its top-four pick odds by losing more games. That matters because a strong draft class does not create the same incentive for every lottery team.</w:t>
       </w:r>
     </w:p>
     <w:p>
@@ -3568,7 +3586,7 @@
         <w:pStyle w:val="BodyText"/>
       </w:pPr>
       <w:r>
-        <w:t xml:space="preserve">The coefficient of interest in Table 2 is the draft-strength slope and its interaction with the post-2019 reform indicator. Because</w:t>
+        <w:t xml:space="preserve">We use pre_win_pct to control for how good or bad a team already was before March. We do not include</w:t>
       </w:r>
       <w:r>
         <w:t xml:space="preserve"> </w:t>
@@ -3577,39 +3595,13 @@
         <w:rPr>
           <w:rStyle w:val="VerbatimChar"/>
         </w:rPr>
-        <w:t xml:space="preserve">top4_avg_rating</w:t>
-      </w:r>
-      <w:r>
-        <w:t xml:space="preserve"> </w:t>
-      </w:r>
-      <w:r>
-        <w:t xml:space="preserve">is standardized, the top-four draft rating coefficient means that, before the reform, a one-standard-deviation increase in top-four draft strength is associated with a 0.077 change in the tanking index, holding pre-March strength and disrupted-season controls fixed. The interaction coefficient of 0.207 is the additional post-reform change in that slope, so the implied post-reform slope is 0.284. Since draft strength is shared by teams in the same season, Table 2 reports standard errors clustered by season. The season-clustered interaction p-value is 0.15, so we do not treat this as strong evidence that the relationship changed after the lottery reform.</w:t>
-      </w:r>
-    </w:p>
-    <w:bookmarkEnd w:id="50"/>
-    <w:bookmarkStart w:id="51" w:name="Xe837124f9f200bd350346b45a493dd227e53ca1"/>
-    <w:p>
-      <w:pPr>
-        <w:pStyle w:val="Heading3"/>
-      </w:pPr>
-      <w:r>
-        <w:t xml:space="preserve">Analysis 2: Position-Adjusted Team-Season Regression</w:t>
-      </w:r>
-    </w:p>
-    <w:p>
-      <w:pPr>
-        <w:pStyle w:val="FirstParagraph"/>
-      </w:pPr>
-      <w:r>
-        <w:t xml:space="preserve">For that reason, our final model pools all seasons together and focuses on the team-specific position-adjusted draft incentive. This keeps the model simpler than the pre/post interaction while addressing an important weakness of the raw draft-rating model: not every likely lottery team has the same chance of turning a strong top-four draft class into a top-four pick.</w:t>
-      </w:r>
-    </w:p>
-    <w:p>
-      <w:pPr>
-        <w:pStyle w:val="BodyText"/>
-      </w:pPr>
-      <w:r>
-        <w:t xml:space="preserve">We considered including both</w:t>
+        <w:t xml:space="preserve">games_back_cutline</w:t>
+      </w:r>
+      <w:r>
+        <w:t xml:space="preserve"> </w:t>
+      </w:r>
+      <w:r>
+        <w:t xml:space="preserve">in the regression because it is closely related to</w:t>
       </w:r>
       <w:r>
         <w:t xml:space="preserve"> </w:t>
@@ -3621,70 +3613,7 @@
         <w:t xml:space="preserve">pre_win_pct</w:t>
       </w:r>
       <w:r>
-        <w:t xml:space="preserve"> </w:t>
-      </w:r>
-      <w:r>
-        <w:t xml:space="preserve">and</w:t>
-      </w:r>
-      <w:r>
-        <w:t xml:space="preserve"> </w:t>
-      </w:r>
-      <w:r>
-        <w:rPr>
-          <w:rStyle w:val="VerbatimChar"/>
-        </w:rPr>
-        <w:t xml:space="preserve">games_back_cutline</w:t>
-      </w:r>
-      <w:r>
-        <w:t xml:space="preserve"> </w:t>
-      </w:r>
-      <w:r>
-        <w:t xml:space="preserve">as model controls, but they are highly correlated among likely lottery candidates, with a correlation of -0.827. To avoid unnecessary multicollinearity, the final model keeps</w:t>
-      </w:r>
-      <w:r>
-        <w:t xml:space="preserve"> </w:t>
-      </w:r>
-      <w:r>
-        <w:rPr>
-          <w:rStyle w:val="VerbatimChar"/>
-        </w:rPr>
-        <w:t xml:space="preserve">pre_win_pct</w:t>
-      </w:r>
-      <w:r>
-        <w:t xml:space="preserve"> </w:t>
-      </w:r>
-      <w:r>
-        <w:t xml:space="preserve">as the main baseline team-quality control and removes</w:t>
-      </w:r>
-      <w:r>
-        <w:t xml:space="preserve"> </w:t>
-      </w:r>
-      <w:r>
-        <w:rPr>
-          <w:rStyle w:val="VerbatimChar"/>
-        </w:rPr>
-        <w:t xml:space="preserve">games_back_cutline</w:t>
-      </w:r>
-      <w:r>
-        <w:t xml:space="preserve"> </w:t>
-      </w:r>
-      <w:r>
-        <w:t xml:space="preserve">from the regression.</w:t>
-      </w:r>
-      <w:r>
-        <w:t xml:space="preserve"> </w:t>
-      </w:r>
-      <w:r>
-        <w:rPr>
-          <w:rStyle w:val="VerbatimChar"/>
-        </w:rPr>
-        <w:t xml:space="preserve">games_back_cutline</w:t>
-      </w:r>
-      <w:r>
-        <w:t xml:space="preserve"> </w:t>
-      </w:r>
-      <w:r>
-        <w:t xml:space="preserve">still matters in the analysis because it helps define which teams are likely lottery candidates, but it is not included as an additional predictor in the final model.</w:t>
+        <w:t xml:space="preserve">, but it still helps us decide which teams count as likely lottery candidates. Our preferred draft-strength measure is top4_avg_rating because the lottery is mostly about access to the very top of the draft, not the entire class.</w:t>
       </w:r>
     </w:p>
     <w:p>
@@ -3692,7 +3621,7 @@
         <w:pStyle w:val="BodyText"/>
       </w:pPr>
       <w:r>
-        <w:t xml:space="preserve">We also compared two ways of measuring draft strength: the average rating of the top 35 prospects and the average rating of only the top four prospects. The top-four version is our preferred measure because the lottery is mainly about access to the top of the draft. In both models, the coefficient of interest has the same interpretation: the expected change in</w:t>
+        <w:t xml:space="preserve">The outcome is</w:t>
       </w:r>
       <w:r>
         <w:t xml:space="preserve"> </w:t>
@@ -3704,18 +3633,7 @@
         <w:t xml:space="preserve">tanking_index</w:t>
       </w:r>
       <w:r>
-        <w:t xml:space="preserve"> </w:t>
-      </w:r>
-      <w:r>
-        <w:t xml:space="preserve">for a one-standard-deviation increase in the position-adjusted draft incentive. The top-four version performs slightly better in the final model: the top-35 incentive p-value is 0.13, compared with 0.12 for the top-four incentive.</w:t>
-      </w:r>
-    </w:p>
-    <w:p>
-      <w:pPr>
-        <w:pStyle w:val="BodyText"/>
-      </w:pPr>
-      <w:r>
-        <w:t xml:space="preserve">The final model uses the full</w:t>
+        <w:t xml:space="preserve">, which measures how many fewer games a team won after March 1 than expected based on its earlier record. We use the full index instead of a yes/no tanking label because it captures the size and direction of late-season underperformance. A higher</w:t>
       </w:r>
       <w:r>
         <w:t xml:space="preserve"> </w:t>
@@ -3730,19 +3648,7 @@
         <w:t xml:space="preserve"> </w:t>
       </w:r>
       <w:r>
-        <w:t xml:space="preserve">rather than a binary collapse flag because the index keeps more information. A strict cutoff is useful for labeling the most obvious cases in figures, but it treats a small late-season decline and a strong late-season improvement as equally</w:t>
-      </w:r>
-      <w:r>
-        <w:t xml:space="preserve"> </w:t>
-      </w:r>
-      <w:r>
-        <w:t xml:space="preserve">“not flagged.”</w:t>
-      </w:r>
-      <w:r>
-        <w:t xml:space="preserve"> </w:t>
-      </w:r>
-      <w:r>
-        <w:t xml:space="preserve">The continuous index is better for regression because larger underperformance counts more strongly, while late-season overperformance counts against the tanking-incentive story.</w:t>
+        <w:t xml:space="preserve">means a stronger tanking signal.</w:t>
       </w:r>
     </w:p>
     <w:p>
@@ -3750,7 +3656,7 @@
         <w:pStyle w:val="TableCaption"/>
       </w:pPr>
       <w:r>
-        <w:t xml:space="preserve">Table 3. Final pooled regression models using position-adjusted draft incentives among likely lottery candidates.</w:t>
+        <w:t xml:space="preserve">Table 3. Main pooled regression model using position-adjusted draft incentives among likely lottery candidates.</w:t>
       </w:r>
     </w:p>
     <w:tbl>
@@ -3759,7 +3665,7 @@
         <w:tblW w:type="pct" w:w="5000"/>
         <w:tblLayout w:type="fixed"/>
         <w:tblLook w:firstRow="1" w:lastRow="0" w:firstColumn="0" w:lastColumn="0" w:noHBand="0" w:noVBand="0" w:val="0020"/>
-        <w:tblCaption w:val="Table 3. Final pooled regression models using position-adjusted draft incentives among likely lottery candidates."/>
+        <w:tblCaption w:val="Table 3. Main pooled regression model using position-adjusted draft incentives among likely lottery candidates."/>
       </w:tblPr>
       <w:tblGrid>
         <w:gridCol w:w="1458"/>
@@ -4133,7 +4039,7 @@
         <w:pStyle w:val="BodyText"/>
       </w:pPr>
       <w:r>
-        <w:t xml:space="preserve">The tanking-index model has a positive position-adjusted incentive coefficient of 0.157, with a p-value of 0.12. Because the incentive variable is standardized, this means that a likely lottery team with a one-standard-deviation larger marginal top-four draft incentive is expected to have a tanking index that is 0.157 units higher, holding pre-March win percentage and disrupted-season controls fixed. Positive values of the tanking index mean more late-season wins below expectation, so the positive coefficient points in the direction predicted by the tanking-incentive story.</w:t>
+        <w:t xml:space="preserve">The tanking-index model has a positive position-adjusted incentive coefficient of 0.157, with a p-value of 0.12. Since the incentive variable is standardized, this means that a likely lottery team with a one-standard-deviation larger marginal top-four draft incentive is expected to have a tanking index 0.157 units higher, holding pre-March win percentage and disrupted-season controls fixed. Because positive tanking-index values mean more late-season wins below expectation, the result points in the direction predicted by the tanking-incentive story, though the evidence remains suggestive rather than conclusive.</w:t>
       </w:r>
     </w:p>
     <w:p>
@@ -4141,15 +4047,7 @@
         <w:pStyle w:val="BodyText"/>
       </w:pPr>
       <w:r>
-        <w:t xml:space="preserve">We report R-squared only as descriptive context, not as the main criterion for judging the model. The goal is not to build the best possible prediction model for late-season wins; it is to isolate the direction and uncertainty of the draft-incentive coefficient. With that framing, the model R-squared is 0.14 and the adjusted R-squared is 0.114, which is consistent with the graphs showing that win-loss tanking signals are noisy.</w:t>
-      </w:r>
-    </w:p>
-    <w:p>
-      <w:pPr>
-        <w:pStyle w:val="BodyText"/>
-      </w:pPr>
-      <w:r>
-        <w:t xml:space="preserve">Because 2021 is visibly unusual in the exploratory graphs, we also refit the same all-years models after removing only the 2021 season. This is a sensitivity check, not a replacement for the main model. The main model uses all available years from 2010 through 2026, while the sensitivity model asks whether the conclusion depends heavily on one COVID-affected season.</w:t>
+        <w:t xml:space="preserve">Because 2021 is visibly unusual in the exploratory graphs, we also refit the same all-years models after removing only the 2021 season. This is a sensitivity check, not a replacement for the main model:</w:t>
       </w:r>
     </w:p>
     <w:p>
@@ -4366,7 +4264,7 @@
         <w:pStyle w:val="BodyText"/>
       </w:pPr>
       <w:r>
-        <w:t xml:space="preserve">Excluding 2021 does not reverse the direction of the estimate. The coefficient has the same interpretation as in Table 3, but it is estimated on the sample without the unusual 2021 season: a one-standard-deviation larger position-adjusted draft incentive is associated with a 0.145 higher tanking index, holding the remaining controls fixed. The position-adjusted incentive coefficient changes from 0.157 in the all-years model to 0.145 after excluding 2021, with the p-value changing from 0.12 to 0.14. This suggests that 2021 matters, but the main pattern is not simply a one-season artifact. The separate season controls in the main model let us keep all years in the primary analysis while acknowledging that disrupted seasons are not perfectly comparable to normal 82-game seasons.</w:t>
+        <w:t xml:space="preserve">Excluding 2021 does not change the direction of the result. The position-adjusted incentive coefficient remains positive, changing from 0.157 to 0.145, while the p-value changes from 0.12 to 0.14. This suggests 2021 affects the estimate, but the main pattern is not only driven by that season.</w:t>
       </w:r>
     </w:p>
     <w:bookmarkEnd w:id="51"/>
@@ -4384,15 +4282,7 @@
         <w:pStyle w:val="FirstParagraph"/>
       </w:pPr>
       <w:r>
-        <w:t xml:space="preserve">One peer-review suggestion was to account for whether a draft class fits a particular team’s needs. This is a useful idea because a strong draft class may not create the same incentive for every team. For example, a team that badly needs guard creation may respond differently to a guard-heavy draft than to a draft whose best prospects are mostly bigs.</w:t>
-      </w:r>
-    </w:p>
-    <w:p>
-      <w:pPr>
-        <w:pStyle w:val="BodyText"/>
-      </w:pPr>
-      <w:r>
-        <w:t xml:space="preserve">We build a rough</w:t>
+        <w:t xml:space="preserve">Based on peer review feedback, we add an exploratory</w:t>
       </w:r>
       <w:r>
         <w:t xml:space="preserve"> </w:t>
@@ -4407,30 +4297,7 @@
         <w:t xml:space="preserve"> </w:t>
       </w:r>
       <w:r>
-        <w:t xml:space="preserve">by matching team need to draft supply. Team need comes from pre-March production by position group. For guards, wings, and bigs, we calculate each team’s</w:t>
-      </w:r>
-      <w:r>
-        <w:t xml:space="preserve"> </w:t>
-      </w:r>
-      <w:r>
-        <w:rPr>
-          <w:rStyle w:val="VerbatimChar"/>
-        </w:rPr>
-        <w:t xml:space="preserve">value_per36</w:t>
-      </w:r>
-      <w:r>
-        <w:t xml:space="preserve"> </w:t>
-      </w:r>
-      <w:r>
-        <w:t xml:space="preserve">using points, rebounds, assists, steals, blocks, turnovers, and minutes. We then standardize that rate within each season-position group, so below-average production becomes a positive need score and above-average production becomes 0 need. Draft supply comes from the top 35 CraftedNBA prospects: we calculate each prospect’s positive rating value above 50, sum that value by position group, and convert it to a share of the draft class’s top-35 value. The final score multiplies each position group’s team need by that position group’s draft-value share and sums across guards, wings, and bigs.</w:t>
-      </w:r>
-    </w:p>
-    <w:p>
-      <w:pPr>
-        <w:pStyle w:val="BodyText"/>
-      </w:pPr>
-      <w:r>
-        <w:t xml:space="preserve">This extension is exploratory, so it is not our preferred final model. It is still useful because</w:t>
+        <w:t xml:space="preserve">to account for whether a draft class fit a team’s needs. This variable measures whether a team was weak at the same positions where that draft class had the most value. We group both NBA players and draft prospects into guards, wings, and bigs, then compare each team’s pre-March production at those positions with the position mix of the top 35 prospects. Higher</w:t>
       </w:r>
       <w:r>
         <w:t xml:space="preserve"> </w:t>
@@ -4445,7 +4312,7 @@
         <w:t xml:space="preserve"> </w:t>
       </w:r>
       <w:r>
-        <w:t xml:space="preserve">is team-specific and is only weakly correlated with top-four draft rating among likely lottery candidates (0.009). In other words, it is not just another version of draft strength.</w:t>
+        <w:t xml:space="preserve">values mean the draft class fit that team’s roster needs more closely. This measure is only weakly correlated with top-four draft rating among likely lottery candidates (0.009), so it captures something different from overall draft strength.</w:t>
       </w:r>
     </w:p>
     <w:p>
@@ -4725,7 +4592,34 @@
         <w:pStyle w:val="BodyText"/>
       </w:pPr>
       <w:r>
-        <w:t xml:space="preserve">The coefficient of interest in Table 5 is the interaction between top-four draft strength and team fit. Because both variables are standardized, the interaction coefficient of -0.032 means that a one-standard-deviation increase in team fit changes the draft-strength slope by -0.032 tanking-index units, holding the controls fixed. The interaction p-value is 0.76, so this is not statistically significant. This does not mean fit is irrelevant; it means our simple fit proxy does not add clear evidence beyond the main draft-strength model. A stronger version of this idea would use team-specific draft boards, roster contract data, or play-type needs instead of broad position groups.</w:t>
+        <w:t xml:space="preserve">In Table 5, the key term is the interaction between</w:t>
+      </w:r>
+      <w:r>
+        <w:t xml:space="preserve"> </w:t>
+      </w:r>
+      <w:r>
+        <w:rPr>
+          <w:rStyle w:val="VerbatimChar"/>
+        </w:rPr>
+        <w:t xml:space="preserve">top4_avg_rating</w:t>
+      </w:r>
+      <w:r>
+        <w:t xml:space="preserve"> </w:t>
+      </w:r>
+      <w:r>
+        <w:t xml:space="preserve">and</w:t>
+      </w:r>
+      <w:r>
+        <w:t xml:space="preserve"> </w:t>
+      </w:r>
+      <w:r>
+        <w:rPr>
+          <w:rStyle w:val="VerbatimChar"/>
+        </w:rPr>
+        <w:t xml:space="preserve">team_fit_score</w:t>
+      </w:r>
+      <w:r>
+        <w:t xml:space="preserve">. This tests whether stronger draft classes are linked to more late-season underperformance specifically when they fit a team’s roster needs. The interaction coefficient is -0.032, with a p-value of 0.76, so the result is not statistically significant. Our simple team-fit measure does not add clear evidence beyond overall draft strength.</w:t>
       </w:r>
     </w:p>
     <w:bookmarkEnd w:id="55"/>
@@ -4743,7 +4637,7 @@
         <w:pStyle w:val="FirstParagraph"/>
       </w:pPr>
       <w:r>
-        <w:t xml:space="preserve">The final exploratory model uses a different kind of tanking signal: whether likely lottery teams reduce the minutes of their main pre-March players late in the season. This is motivated by the idea that tanking may show up not only in losses, but also in roster management. We define each team’s core players as the three players with the most pre-March starts, breaking ties by pre-March minutes. To focus on usage changes rather than trades or complete absences, we keep only core players who appeared for the same team at least once after March 1. We then calculate their combined minutes per team game before March and after March. The outcome,</w:t>
+        <w:t xml:space="preserve">The final exploratory model uses a different kind of tanking signal: whether likely lottery teams reduce the minutes of their main pre-March players late in the season. This is motivated by the idea that tanking may show up not only in losses, but also in roster management. We define each team’s core players as the three players with the most pre-March starts, breaking ties by most pre-March minutes. To focus on usage changes rather than trades or complete absences, we keep only core players who appeared for the same team at least once after March 1. We then calculate their combined minutes per team game before March and after March. The outcome,</w:t>
       </w:r>
       <w:r>
         <w:t xml:space="preserve"> </w:t>
@@ -5264,7 +5158,7 @@
         <w:pStyle w:val="BodyText"/>
       </w:pPr>
       <w:r>
-        <w:t xml:space="preserve">The coefficient of interest in Table 6 is the standardized top-four draft rating. Because the draft rating is standardized and the outcome is a proportional drop in core-player minutes, the coefficient of 0.054 means that a one-standard-deviation stronger top-four draft class is associated with a 5.4 percentage point larger drop in late-season core-player usage, holding pre-March core-player minutes and disrupted-season controls fixed. The usual team-season p-value is 0.00098, and the p-value remains 0.0036 when standard errors are clustered by draft season. This matters because</w:t>
+        <w:t xml:space="preserve">In Table 6, the key predictor is the standardized</w:t>
       </w:r>
       <w:r>
         <w:t xml:space="preserve"> </w:t>
@@ -5276,18 +5170,22 @@
         <w:t xml:space="preserve">top4_avg_rating</w:t>
       </w:r>
       <w:r>
-        <w:t xml:space="preserve"> </w:t>
-      </w:r>
-      <w:r>
-        <w:t xml:space="preserve">has only 17 unique season-level values even though the outcome is measured for many team-seasons. As with the win-loss model, R-squared is secondary here: the model R-squared is 0.121 and the adjusted R-squared is 0.094, but the main result is the estimated draft-strength effect after accounting for baseline core-player minutes and disrupted seasons. The result gives evidence of a roster-management pattern associated with stronger draft classes, but it should not be interpreted as causal proof of tanking because injuries, planned rest, player development, and unobserved availability can also affect late-season minutes.</w:t>
-      </w:r>
-    </w:p>
-    <w:p>
-      <w:pPr>
-        <w:pStyle w:val="BodyText"/>
-      </w:pPr>
-      <w:r>
-        <w:t xml:space="preserve">Because this result is stronger than the main win-loss models, we also re-used the earlier model structures with</w:t>
+        <w:t xml:space="preserve">. The coefficient of 0.054 means that a one-standard-deviation stronger top-four draft class is associated with a 5.4 percentage point larger drop in late-season core-player usage, holding pre-March core-player minutes and disrupted-season controls fixed. The usual team-season p-value is 0.00098, and the season-clustered p-value is 0.0036. The clustered version is important because</w:t>
+      </w:r>
+      <w:r>
+        <w:t xml:space="preserve"> </w:t>
+      </w:r>
+      <w:r>
+        <w:rPr>
+          <w:rStyle w:val="VerbatimChar"/>
+        </w:rPr>
+        <w:t xml:space="preserve">top4_avg_rating</w:t>
+      </w:r>
+      <w:r>
+        <w:t xml:space="preserve"> </w:t>
+      </w:r>
+      <w:r>
+        <w:t xml:space="preserve">only changes by draft year, even though</w:t>
       </w:r>
       <w:r>
         <w:t xml:space="preserve"> </w:t>
@@ -5302,7 +5200,27 @@
         <w:t xml:space="preserve"> </w:t>
       </w:r>
       <w:r>
-        <w:t xml:space="preserve">as the outcome. Table 7 reports both the usual team-season p-value and a season-clustered p-value. The raw top-four draft rating remains positive when 2021 is excluded, but the position-adjusted lottery incentive does not explain the core-usage outcome. This suggests that core-player minutes respond more to the overall strength of the top of the draft than to the exact marginal lottery-odds gain from one March lottery position. The pre/post interaction is also not strong, so we do not treat the 2019 lottery reform as clearly changing the core-usage relationship. The core-usage team-fit interaction is interesting under clustered inference, but because it is a secondary interaction built from a rough fit proxy, we treat it as hypothesis-generating rather than as a main result.</w:t>
+        <w:t xml:space="preserve">is measured for individual team-seasons. Overall, this suggests that stronger top-four draft classes are associated with larger late-season reductions in minutes for continuing core players, but the result should not be read as causal proof of tanking because injuries, rest, player development, and other availability issues can also affect minutes.</w:t>
+      </w:r>
+    </w:p>
+    <w:p>
+      <w:pPr>
+        <w:pStyle w:val="BodyText"/>
+      </w:pPr>
+      <w:r>
+        <w:t xml:space="preserve">Because this core-usage result is stronger than the win-loss results, Table 7 checks whether it holds under related model specifications. The top-four draft rating remains positive when 2021 is excluded, while the position-adjusted lottery incentive is not a strong predictor of</w:t>
+      </w:r>
+      <w:r>
+        <w:t xml:space="preserve"> </w:t>
+      </w:r>
+      <w:r>
+        <w:rPr>
+          <w:rStyle w:val="VerbatimChar"/>
+        </w:rPr>
+        <w:t xml:space="preserve">core_usage_drop_rate</w:t>
+      </w:r>
+      <w:r>
+        <w:t xml:space="preserve">. This suggests that core-player minutes may respond more to the overall strength of the top of the draft than to the exact marginal lottery-odds gain from one March lottery position. The pre/post reform interaction is also not strong, so we do not find clear evidence that the 2019 lottery reform changed the core-usage relationship. The team-fit interaction is interesting but secondary, so we treat it as hypothesis-generating rather than as a main result.</w:t>
       </w:r>
     </w:p>
     <w:p>
@@ -5322,13 +5240,12 @@
         <w:tblCaption w:val="Table 7. Sensitivity checks using core-player usage reduction as the outcome."/>
       </w:tblPr>
       <w:tblGrid>
-        <w:gridCol w:w="2225"/>
-        <w:gridCol w:w="1832"/>
-        <w:gridCol w:w="916"/>
-        <w:gridCol w:w="523"/>
-        <w:gridCol w:w="1636"/>
-        <w:gridCol w:w="261"/>
-        <w:gridCol w:w="523"/>
+        <w:gridCol w:w="2383"/>
+        <w:gridCol w:w="1962"/>
+        <w:gridCol w:w="981"/>
+        <w:gridCol w:w="560"/>
+        <w:gridCol w:w="1752"/>
+        <w:gridCol w:w="280"/>
       </w:tblGrid>
       <w:tr>
         <w:trPr>
@@ -5406,18 +5323,6 @@
             </w:r>
           </w:p>
         </w:tc>
-        <w:tc>
-          <w:tcPr/>
-          <w:p>
-            <w:pPr>
-              <w:pStyle w:val="Compact"/>
-              <w:jc w:val="right"/>
-            </w:pPr>
-            <w:r>
-              <w:t xml:space="preserve">Adj. R2</w:t>
-            </w:r>
-          </w:p>
-        </w:tc>
       </w:tr>
       <w:tr>
         <w:tc>
@@ -5492,18 +5397,6 @@
             </w:r>
           </w:p>
         </w:tc>
-        <w:tc>
-          <w:tcPr/>
-          <w:p>
-            <w:pPr>
-              <w:pStyle w:val="Compact"/>
-              <w:jc w:val="right"/>
-            </w:pPr>
-            <w:r>
-              <w:t xml:space="preserve">0.094</w:t>
-            </w:r>
-          </w:p>
-        </w:tc>
       </w:tr>
       <w:tr>
         <w:tc>
@@ -5578,18 +5471,6 @@
             </w:r>
           </w:p>
         </w:tc>
-        <w:tc>
-          <w:tcPr/>
-          <w:p>
-            <w:pPr>
-              <w:pStyle w:val="Compact"/>
-              <w:jc w:val="right"/>
-            </w:pPr>
-            <w:r>
-              <w:t xml:space="preserve">0.130</w:t>
-            </w:r>
-          </w:p>
-        </w:tc>
       </w:tr>
       <w:tr>
         <w:tc>
@@ -5660,18 +5541,6 @@
             </w:r>
           </w:p>
         </w:tc>
-        <w:tc>
-          <w:tcPr/>
-          <w:p>
-            <w:pPr>
-              <w:pStyle w:val="Compact"/>
-              <w:jc w:val="right"/>
-            </w:pPr>
-            <w:r>
-              <w:t xml:space="preserve">0.130</w:t>
-            </w:r>
-          </w:p>
-        </w:tc>
       </w:tr>
       <w:tr>
         <w:tc>
@@ -5746,18 +5615,6 @@
             </w:r>
           </w:p>
         </w:tc>
-        <w:tc>
-          <w:tcPr/>
-          <w:p>
-            <w:pPr>
-              <w:pStyle w:val="Compact"/>
-              <w:jc w:val="right"/>
-            </w:pPr>
-            <w:r>
-              <w:t xml:space="preserve">0.033</w:t>
-            </w:r>
-          </w:p>
-        </w:tc>
       </w:tr>
       <w:tr>
         <w:tc>
@@ -5832,18 +5689,6 @@
             </w:r>
           </w:p>
         </w:tc>
-        <w:tc>
-          <w:tcPr/>
-          <w:p>
-            <w:pPr>
-              <w:pStyle w:val="Compact"/>
-              <w:jc w:val="right"/>
-            </w:pPr>
-            <w:r>
-              <w:t xml:space="preserve">0.015</w:t>
-            </w:r>
-          </w:p>
-        </w:tc>
       </w:tr>
       <w:tr>
         <w:tc>
@@ -5918,18 +5763,6 @@
             </w:r>
           </w:p>
         </w:tc>
-        <w:tc>
-          <w:tcPr/>
-          <w:p>
-            <w:pPr>
-              <w:pStyle w:val="Compact"/>
-              <w:jc w:val="right"/>
-            </w:pPr>
-            <w:r>
-              <w:t xml:space="preserve">0.079</w:t>
-            </w:r>
-          </w:p>
-        </w:tc>
       </w:tr>
       <w:tr>
         <w:tc>
@@ -6004,18 +5837,6 @@
             </w:r>
           </w:p>
         </w:tc>
-        <w:tc>
-          <w:tcPr/>
-          <w:p>
-            <w:pPr>
-              <w:pStyle w:val="Compact"/>
-              <w:jc w:val="right"/>
-            </w:pPr>
-            <w:r>
-              <w:t xml:space="preserve">0.100</w:t>
-            </w:r>
-          </w:p>
-        </w:tc>
       </w:tr>
       <w:tr>
         <w:tc>
@@ -6087,30 +5908,423 @@
             </w:pPr>
             <w:r>
               <w:t xml:space="preserve">172</w:t>
-            </w:r>
-          </w:p>
-        </w:tc>
-        <w:tc>
-          <w:tcPr/>
-          <w:p>
-            <w:pPr>
-              <w:pStyle w:val="Compact"/>
-              <w:jc w:val="right"/>
-            </w:pPr>
-            <w:r>
-              <w:t xml:space="preserve">0.051</w:t>
             </w:r>
           </w:p>
         </w:tc>
       </w:tr>
     </w:tbl>
     <w:bookmarkEnd w:id="59"/>
-    <w:bookmarkStart w:id="60" w:name="conclusions-from-the-formal-analysis"/>
+    <w:bookmarkStart w:id="60" w:name="model-fit-and-quality-checks"/>
     <w:p>
       <w:pPr>
         <w:pStyle w:val="Heading3"/>
       </w:pPr>
       <w:r>
+        <w:t xml:space="preserve">Model Fit and Quality Checks</w:t>
+      </w:r>
+    </w:p>
+    <w:p>
+      <w:pPr>
+        <w:pStyle w:val="TableCaption"/>
+      </w:pPr>
+      <w:r>
+        <w:t xml:space="preserve">Table 8. Model fit statistics for the main formal models.</w:t>
+      </w:r>
+    </w:p>
+    <w:tbl>
+      <w:tblPr>
+        <w:tblStyle w:val="Table"/>
+        <w:tblW w:type="pct" w:w="5000"/>
+        <w:tblLayout w:type="fixed"/>
+        <w:tblLook w:firstRow="1" w:lastRow="0" w:firstColumn="0" w:lastColumn="0" w:noHBand="0" w:noVBand="0" w:val="0020"/>
+        <w:tblCaption w:val="Table 8. Model fit statistics for the main formal models."/>
+      </w:tblPr>
+      <w:tblGrid>
+        <w:gridCol w:w="2834"/>
+        <w:gridCol w:w="2334"/>
+        <w:gridCol w:w="333"/>
+        <w:gridCol w:w="833"/>
+        <w:gridCol w:w="1584"/>
+      </w:tblGrid>
+      <w:tr>
+        <w:trPr>
+          <w:tblHeader w:val="on"/>
+        </w:trPr>
+        <w:tc>
+          <w:tcPr/>
+          <w:p>
+            <w:pPr>
+              <w:pStyle w:val="Compact"/>
+              <w:jc w:val="left"/>
+            </w:pPr>
+            <w:r>
+              <w:t xml:space="preserve">Model</w:t>
+            </w:r>
+          </w:p>
+        </w:tc>
+        <w:tc>
+          <w:tcPr/>
+          <w:p>
+            <w:pPr>
+              <w:pStyle w:val="Compact"/>
+              <w:jc w:val="left"/>
+            </w:pPr>
+            <w:r>
+              <w:t xml:space="preserve">Outcome</w:t>
+            </w:r>
+          </w:p>
+        </w:tc>
+        <w:tc>
+          <w:tcPr/>
+          <w:p>
+            <w:pPr>
+              <w:pStyle w:val="Compact"/>
+              <w:jc w:val="right"/>
+            </w:pPr>
+            <w:r>
+              <w:t xml:space="preserve">N</w:t>
+            </w:r>
+          </w:p>
+        </w:tc>
+        <w:tc>
+          <w:tcPr/>
+          <w:p>
+            <w:pPr>
+              <w:pStyle w:val="Compact"/>
+              <w:jc w:val="right"/>
+            </w:pPr>
+            <w:r>
+              <w:t xml:space="preserve">R-squared</w:t>
+            </w:r>
+          </w:p>
+        </w:tc>
+        <w:tc>
+          <w:tcPr/>
+          <w:p>
+            <w:pPr>
+              <w:pStyle w:val="Compact"/>
+              <w:jc w:val="right"/>
+            </w:pPr>
+            <w:r>
+              <w:t xml:space="preserve">Adjusted R-squared</w:t>
+            </w:r>
+          </w:p>
+        </w:tc>
+      </w:tr>
+      <w:tr>
+        <w:tc>
+          <w:tcPr/>
+          <w:p>
+            <w:pPr>
+              <w:pStyle w:val="Compact"/>
+              <w:jc w:val="left"/>
+            </w:pPr>
+            <w:r>
+              <w:t xml:space="preserve">Pre/post reform interaction</w:t>
+            </w:r>
+          </w:p>
+        </w:tc>
+        <w:tc>
+          <w:tcPr/>
+          <w:p>
+            <w:pPr>
+              <w:pStyle w:val="Compact"/>
+              <w:jc w:val="left"/>
+            </w:pPr>
+            <w:r>
+              <w:t xml:space="preserve">Tanking index</w:t>
+            </w:r>
+          </w:p>
+        </w:tc>
+        <w:tc>
+          <w:tcPr/>
+          <w:p>
+            <w:pPr>
+              <w:pStyle w:val="Compact"/>
+              <w:jc w:val="right"/>
+            </w:pPr>
+            <w:r>
+              <w:t xml:space="preserve">175</w:t>
+            </w:r>
+          </w:p>
+        </w:tc>
+        <w:tc>
+          <w:tcPr/>
+          <w:p>
+            <w:pPr>
+              <w:pStyle w:val="Compact"/>
+              <w:jc w:val="right"/>
+            </w:pPr>
+            <w:r>
+              <w:t xml:space="preserve">0.146</w:t>
+            </w:r>
+          </w:p>
+        </w:tc>
+        <w:tc>
+          <w:tcPr/>
+          <w:p>
+            <w:pPr>
+              <w:pStyle w:val="Compact"/>
+              <w:jc w:val="right"/>
+            </w:pPr>
+            <w:r>
+              <w:t xml:space="preserve">0.110</w:t>
+            </w:r>
+          </w:p>
+        </w:tc>
+      </w:tr>
+      <w:tr>
+        <w:tc>
+          <w:tcPr/>
+          <w:p>
+            <w:pPr>
+              <w:pStyle w:val="Compact"/>
+              <w:jc w:val="left"/>
+            </w:pPr>
+            <w:r>
+              <w:t xml:space="preserve">Position-adjusted incentive</w:t>
+            </w:r>
+          </w:p>
+        </w:tc>
+        <w:tc>
+          <w:tcPr/>
+          <w:p>
+            <w:pPr>
+              <w:pStyle w:val="Compact"/>
+            </w:pPr>
+          </w:p>
+        </w:tc>
+        <w:tc>
+          <w:tcPr/>
+          <w:p>
+            <w:pPr>
+              <w:pStyle w:val="Compact"/>
+              <w:jc w:val="right"/>
+            </w:pPr>
+            <w:r>
+              <w:t xml:space="preserve">175</w:t>
+            </w:r>
+          </w:p>
+        </w:tc>
+        <w:tc>
+          <w:tcPr/>
+          <w:p>
+            <w:pPr>
+              <w:pStyle w:val="Compact"/>
+              <w:jc w:val="right"/>
+            </w:pPr>
+            <w:r>
+              <w:t xml:space="preserve">0.140</w:t>
+            </w:r>
+          </w:p>
+        </w:tc>
+        <w:tc>
+          <w:tcPr/>
+          <w:p>
+            <w:pPr>
+              <w:pStyle w:val="Compact"/>
+              <w:jc w:val="right"/>
+            </w:pPr>
+            <w:r>
+              <w:t xml:space="preserve">0.114</w:t>
+            </w:r>
+          </w:p>
+        </w:tc>
+      </w:tr>
+      <w:tr>
+        <w:tc>
+          <w:tcPr/>
+          <w:p>
+            <w:pPr>
+              <w:pStyle w:val="Compact"/>
+              <w:jc w:val="left"/>
+            </w:pPr>
+            <w:r>
+              <w:t xml:space="preserve">Position-adjusted, excluding 2021</w:t>
+            </w:r>
+          </w:p>
+        </w:tc>
+        <w:tc>
+          <w:tcPr/>
+          <w:p>
+            <w:pPr>
+              <w:pStyle w:val="Compact"/>
+            </w:pPr>
+          </w:p>
+        </w:tc>
+        <w:tc>
+          <w:tcPr/>
+          <w:p>
+            <w:pPr>
+              <w:pStyle w:val="Compact"/>
+              <w:jc w:val="right"/>
+            </w:pPr>
+            <w:r>
+              <w:t xml:space="preserve">168</w:t>
+            </w:r>
+          </w:p>
+        </w:tc>
+        <w:tc>
+          <w:tcPr/>
+          <w:p>
+            <w:pPr>
+              <w:pStyle w:val="Compact"/>
+              <w:jc w:val="right"/>
+            </w:pPr>
+            <w:r>
+              <w:t xml:space="preserve">0.123</w:t>
+            </w:r>
+          </w:p>
+        </w:tc>
+        <w:tc>
+          <w:tcPr/>
+          <w:p>
+            <w:pPr>
+              <w:pStyle w:val="Compact"/>
+              <w:jc w:val="right"/>
+            </w:pPr>
+            <w:r>
+              <w:t xml:space="preserve">0.101</w:t>
+            </w:r>
+          </w:p>
+        </w:tc>
+      </w:tr>
+      <w:tr>
+        <w:tc>
+          <w:tcPr/>
+          <w:p>
+            <w:pPr>
+              <w:pStyle w:val="Compact"/>
+              <w:jc w:val="left"/>
+            </w:pPr>
+            <w:r>
+              <w:t xml:space="preserve">Team-fit interaction</w:t>
+            </w:r>
+          </w:p>
+        </w:tc>
+        <w:tc>
+          <w:tcPr/>
+          <w:p>
+            <w:pPr>
+              <w:pStyle w:val="Compact"/>
+            </w:pPr>
+          </w:p>
+        </w:tc>
+        <w:tc>
+          <w:tcPr/>
+          <w:p>
+            <w:pPr>
+              <w:pStyle w:val="Compact"/>
+              <w:jc w:val="right"/>
+            </w:pPr>
+            <w:r>
+              <w:t xml:space="preserve">175</w:t>
+            </w:r>
+          </w:p>
+        </w:tc>
+        <w:tc>
+          <w:tcPr/>
+          <w:p>
+            <w:pPr>
+              <w:pStyle w:val="Compact"/>
+              <w:jc w:val="right"/>
+            </w:pPr>
+            <w:r>
+              <w:t xml:space="preserve">0.150</w:t>
+            </w:r>
+          </w:p>
+        </w:tc>
+        <w:tc>
+          <w:tcPr/>
+          <w:p>
+            <w:pPr>
+              <w:pStyle w:val="Compact"/>
+              <w:jc w:val="right"/>
+            </w:pPr>
+            <w:r>
+              <w:t xml:space="preserve">0.114</w:t>
+            </w:r>
+          </w:p>
+        </w:tc>
+      </w:tr>
+      <w:tr>
+        <w:tc>
+          <w:tcPr/>
+          <w:p>
+            <w:pPr>
+              <w:pStyle w:val="Compact"/>
+              <w:jc w:val="left"/>
+            </w:pPr>
+            <w:r>
+              <w:t xml:space="preserve">Raw top-four rating</w:t>
+            </w:r>
+          </w:p>
+        </w:tc>
+        <w:tc>
+          <w:tcPr/>
+          <w:p>
+            <w:pPr>
+              <w:pStyle w:val="Compact"/>
+              <w:jc w:val="left"/>
+            </w:pPr>
+            <w:r>
+              <w:t xml:space="preserve">Core-player usage drop rate</w:t>
+            </w:r>
+          </w:p>
+        </w:tc>
+        <w:tc>
+          <w:tcPr/>
+          <w:p>
+            <w:pPr>
+              <w:pStyle w:val="Compact"/>
+              <w:jc w:val="right"/>
+            </w:pPr>
+            <w:r>
+              <w:t xml:space="preserve">172</w:t>
+            </w:r>
+          </w:p>
+        </w:tc>
+        <w:tc>
+          <w:tcPr/>
+          <w:p>
+            <w:pPr>
+              <w:pStyle w:val="Compact"/>
+              <w:jc w:val="right"/>
+            </w:pPr>
+            <w:r>
+              <w:t xml:space="preserve">0.121</w:t>
+            </w:r>
+          </w:p>
+        </w:tc>
+        <w:tc>
+          <w:tcPr/>
+          <w:p>
+            <w:pPr>
+              <w:pStyle w:val="Compact"/>
+              <w:jc w:val="right"/>
+            </w:pPr>
+            <w:r>
+              <w:t xml:space="preserve">0.094</w:t>
+            </w:r>
+          </w:p>
+        </w:tc>
+      </w:tr>
+    </w:tbl>
+    <w:p>
+      <w:pPr>
+        <w:pStyle w:val="BodyText"/>
+      </w:pPr>
+      <w:r>
+        <w:t xml:space="preserve">Table 8 shows that all of the formal models explain a modest share of the variation in the outcomes. The tanking-index models have R-squared values between 0.123 and 0.15, with adjusted R-squared values near 0.11. The pre/post reform and team-fit versions do not improve fit much over the main position-adjusted model, so their value is mainly as robustness and heterogeneity checks. Excluding 2021 lowers the fit slightly, which supports treating that season as unusual but not as the only source of the pattern. The core-player usage model has a similar fit level, with an R-squared of 0.121 and an adjusted R-squared of 0.094, so its stronger interpretation comes more from the coefficient size and clustered p-value than from dramatically better overall fit.</w:t>
+      </w:r>
+    </w:p>
+    <w:bookmarkEnd w:id="60"/>
+    <w:bookmarkStart w:id="61" w:name="conclusions-from-the-formal-analysis"/>
+    <w:p>
+      <w:pPr>
+        <w:pStyle w:val="Heading3"/>
+      </w:pPr>
+      <w:r>
         <w:t xml:space="preserve">Conclusions From the Formal Analysis</w:t>
       </w:r>
     </w:p>
@@ -6119,7 +6333,19 @@
         <w:pStyle w:val="FirstParagraph"/>
       </w:pPr>
       <w:r>
-        <w:t xml:space="preserve">The main finding is that draft strength appears related to late-season losing signals, but the strength of the evidence depends on how directly we model incentives. The raw draft-strength figures show a clearer positive relationship, but they are partly season-level summaries. The position-adjusted model is more conservative because it asks whether a team’s own lottery position gives it more to gain from a strong class. In that model, the estimate remains positive for the tanking index, but it is not strong enough to support a causal claim.</w:t>
+        <w:t xml:space="preserve">The formal analysis points in the expected direction, but the strength of the evidence depends on the outcome. In the main win-loss model, the position-adjusted draft incentive has a positive relationship with</w:t>
+      </w:r>
+      <w:r>
+        <w:t xml:space="preserve"> </w:t>
+      </w:r>
+      <w:r>
+        <w:rPr>
+          <w:rStyle w:val="VerbatimChar"/>
+        </w:rPr>
+        <w:t xml:space="preserve">tanking_index</w:t>
+      </w:r>
+      <w:r>
+        <w:t xml:space="preserve">, meaning teams with stronger lottery incentives tended to win fewer late-season games than expected. However, the estimate is noisy, so this supports a suggestive rather than causal conclusion.</w:t>
       </w:r>
     </w:p>
     <w:p>
@@ -6127,7 +6353,52 @@
         <w:pStyle w:val="BodyText"/>
       </w:pPr>
       <w:r>
-        <w:t xml:space="preserve">The analysis also shows why the definition of tanking matters. Instead of forcing teams into a yes/no tanking category, the full tanking index measures degree of underperformance. That is better suited for regression because a small late-season decline, a major collapse, and a late-season improvement should not all be treated the same.</w:t>
+        <w:t xml:space="preserve">The full</w:t>
+      </w:r>
+      <w:r>
+        <w:t xml:space="preserve"> </w:t>
+      </w:r>
+      <w:r>
+        <w:rPr>
+          <w:rStyle w:val="VerbatimChar"/>
+        </w:rPr>
+        <w:t xml:space="preserve">tanking_index</w:t>
+      </w:r>
+      <w:r>
+        <w:t xml:space="preserve"> </w:t>
+      </w:r>
+      <w:r>
+        <w:t xml:space="preserve">remains useful because it measures the size and direction of late-season underperformance instead of forcing teams into a yes/no tanking category. The team-fit extension is less conclusive: the interaction between</w:t>
+      </w:r>
+      <w:r>
+        <w:t xml:space="preserve"> </w:t>
+      </w:r>
+      <w:r>
+        <w:rPr>
+          <w:rStyle w:val="VerbatimChar"/>
+        </w:rPr>
+        <w:t xml:space="preserve">top4_avg_rating</w:t>
+      </w:r>
+      <w:r>
+        <w:t xml:space="preserve"> </w:t>
+      </w:r>
+      <w:r>
+        <w:t xml:space="preserve">and</w:t>
+      </w:r>
+      <w:r>
+        <w:t xml:space="preserve"> </w:t>
+      </w:r>
+      <w:r>
+        <w:rPr>
+          <w:rStyle w:val="VerbatimChar"/>
+        </w:rPr>
+        <w:t xml:space="preserve">team_fit_score</w:t>
+      </w:r>
+      <w:r>
+        <w:t xml:space="preserve"> </w:t>
+      </w:r>
+      <w:r>
+        <w:t xml:space="preserve">is not statistically significant, so our simple fit measure does not add clear evidence beyond overall draft strength.</w:t>
       </w:r>
     </w:p>
     <w:p>
@@ -6135,7 +6406,43 @@
         <w:pStyle w:val="BodyText"/>
       </w:pPr>
       <w:r>
-        <w:t xml:space="preserve">The team-fit extension adds a second check on heterogeneity. It asks whether a strong class matters more when its strongest prospect positions line up with a team’s roster weaknesses. In our version, the answer is not clear. The fit interaction is not statistically significant, so we do not make it part of the main conclusion. Still, including the extension makes the model more responsive to the basketball mechanism: teams are not only responding to abstract draft strength, but to the players they could realistically hope to add.</w:t>
+        <w:t xml:space="preserve">The core-player usage model gives the clearest exploratory signal. Stronger top-four draft classes are associated with larger reductions in late-season minutes for continuing core players, and this pattern is stronger when using raw top-four draft strength than the position-adjusted lottery incentive. The 2021 season remains unusual, but excluding it does not reverse the main direction of the win-loss result.</w:t>
+      </w:r>
+    </w:p>
+    <w:bookmarkEnd w:id="61"/>
+    <w:bookmarkEnd w:id="62"/>
+    <w:bookmarkStart w:id="66" w:name="vi.-next-steps"/>
+    <w:p>
+      <w:pPr>
+        <w:pStyle w:val="Heading2"/>
+      </w:pPr>
+      <w:r>
+        <w:t xml:space="preserve">VI. Next Steps</w:t>
+      </w:r>
+    </w:p>
+    <w:p>
+      <w:pPr>
+        <w:pStyle w:val="FirstParagraph"/>
+      </w:pPr>
+      <w:r>
+        <w:t xml:space="preserve">The results should be interpreted as evidence about tanking signals, not confirmed tanking. The project finds a positive relationship between top-four draft incentives and late-season underperformance, along with a stronger exploratory relationship between top-four draft strength and reduced core-player usage. Neither result proves that teams deliberately lost games, but both suggest that draft class quality belongs in discussions of tanking incentives.</w:t>
+      </w:r>
+    </w:p>
+    <w:bookmarkStart w:id="63" w:name="limitations-and-cautions"/>
+    <w:p>
+      <w:pPr>
+        <w:pStyle w:val="Heading3"/>
+      </w:pPr>
+      <w:r>
+        <w:t xml:space="preserve">Limitations and Cautions</w:t>
+      </w:r>
+    </w:p>
+    <w:p>
+      <w:pPr>
+        <w:pStyle w:val="FirstParagraph"/>
+      </w:pPr>
+      <w:r>
+        <w:t xml:space="preserve">The biggest limitation is that intent is not directly observable. Teams can lose late-season games or reduce core-player minutes for many reasons, including injuries, trades, rest, player development, and random performance. For that reason, the outcome variables in this report should be treated as proxies for tanking behavior rather than direct proof.</w:t>
       </w:r>
     </w:p>
     <w:p>
@@ -6143,7 +6450,25 @@
         <w:pStyle w:val="BodyText"/>
       </w:pPr>
       <w:r>
-        <w:t xml:space="preserve">The core-player usage model adds a different type of outcome. It asks whether stronger top-four draft classes are associated with using main continuing pre-March players less often late in the season. This is closer to a behavioral tanking mechanism than the win-loss outcome alone, and this version points in the expected direction: stronger top-four classes are associated with larger proportional drops in core-player minutes. However, the raw top-four rating is season-level, so we interpret this as a draft-class-level signal with team-season outcomes rather than as 172 independent draft-strength observations. The sensitivity checks show that this result is stronger for raw draft strength than for the position-adjusted lottery incentive. That makes the result interesting, but still exploratory: injuries, planned rest, player development, and unobserved availability can all reduce minutes for reasons unrelated to intentional tanking.</w:t>
+        <w:t xml:space="preserve">A second limitation is that draft strength mostly varies by season. The position-adjusted incentive adds team-level variation by combining draft quality with March lottery position, but the underlying draft-quality signal still comes from only 17 draft classes. The incentive measure is also simplified because it focuses on the marginal gain in top-four-pick probability from moving one lottery slot worse, rather than the exact value of each pick or team-specific player preferences.</w:t>
+      </w:r>
+    </w:p>
+    <w:bookmarkEnd w:id="63"/>
+    <w:bookmarkStart w:id="64" w:name="future-extensions"/>
+    <w:p>
+      <w:pPr>
+        <w:pStyle w:val="Heading3"/>
+      </w:pPr>
+      <w:r>
+        <w:t xml:space="preserve">Future Extensions</w:t>
+      </w:r>
+    </w:p>
+    <w:p>
+      <w:pPr>
+        <w:pStyle w:val="FirstParagraph"/>
+      </w:pPr>
+      <w:r>
+        <w:t xml:space="preserve">The most useful next step would be improving the core-player usage model with injury reports, transaction data, and inactive-list reasons. That would help separate strategic late-season roster management from ordinary player availability.</w:t>
       </w:r>
     </w:p>
     <w:p>
@@ -6151,18 +6476,37 @@
         <w:pStyle w:val="BodyText"/>
       </w:pPr>
       <w:r>
-        <w:t xml:space="preserve">The 2021 season remains an important case. Several teams underperformed sharply late in the season, but that year was shortened and affected by COVID-era scheduling and player availability. Rather than deleting 2021 from the main model, we include a separate 2021 control. We also include separate controls for 2012 and 2020 because those seasons were disrupted in different ways. This keeps the observations in the main analysis while acknowledging that they may not be comparable to normal 82-game seasons.</w:t>
-      </w:r>
-    </w:p>
-    <w:bookmarkEnd w:id="60"/>
-    <w:bookmarkEnd w:id="61"/>
-    <w:bookmarkStart w:id="65" w:name="vi.-next-steps"/>
-    <w:p>
-      <w:pPr>
-        <w:pStyle w:val="Heading2"/>
-      </w:pPr>
-      <w:r>
-        <w:t xml:space="preserve">VI. Next Steps</w:t>
+        <w:t xml:space="preserve">Another extension would improve</w:t>
+      </w:r>
+      <w:r>
+        <w:t xml:space="preserve"> </w:t>
+      </w:r>
+      <w:r>
+        <w:rPr>
+          <w:rStyle w:val="VerbatimChar"/>
+        </w:rPr>
+        <w:t xml:space="preserve">team_fit_score</w:t>
+      </w:r>
+      <w:r>
+        <w:t xml:space="preserve">. The current version uses broad position groups and pre-March box-score production, so a stronger version would include contract status, age, detailed roster needs, and team-specific draft evaluations.</w:t>
+      </w:r>
+    </w:p>
+    <w:p>
+      <w:pPr>
+        <w:pStyle w:val="BodyText"/>
+      </w:pPr>
+      <w:r>
+        <w:t xml:space="preserve">A final extension would compare multiple draft-quality measures. CraftedNBA provides a consistent external rating, but future versions could test whether the results change using consensus mock drafts, top-prospect ratings, number of elite prospects, or later NBA outcomes such as win shares.</w:t>
+      </w:r>
+    </w:p>
+    <w:bookmarkEnd w:id="64"/>
+    <w:bookmarkStart w:id="65" w:name="final-takeaway"/>
+    <w:p>
+      <w:pPr>
+        <w:pStyle w:val="Heading3"/>
+      </w:pPr>
+      <w:r>
+        <w:t xml:space="preserve">Final Takeaway</w:t>
       </w:r>
     </w:p>
     <w:p>
@@ -6170,105 +6514,12 @@
         <w:pStyle w:val="FirstParagraph"/>
       </w:pPr>
       <w:r>
-        <w:t xml:space="preserve">The results should be interpreted cautiously. The model finds a positive relationship between position-adjusted top-four draft incentives and late-season underperformance, but it does not prove intent and should not be read as definitive evidence that teams deliberately lost games.</w:t>
-      </w:r>
-    </w:p>
-    <w:bookmarkStart w:id="62" w:name="limitations-and-cautions"/>
-    <w:p>
-      <w:pPr>
-        <w:pStyle w:val="Heading3"/>
-      </w:pPr>
-      <w:r>
-        <w:t xml:space="preserve">Limitations and Cautions</w:t>
-      </w:r>
-    </w:p>
-    <w:p>
-      <w:pPr>
-        <w:pStyle w:val="FirstParagraph"/>
-      </w:pPr>
-      <w:r>
-        <w:t xml:space="preserve">The biggest limitation is that tanking is not directly observable. We can observe losses, late-season underperformance, and playoff context, but we cannot observe whether a front office intended to lose. For that reason, all outcomes in this report should be interpreted as tanking proxies or tanking signals.</w:t>
-      </w:r>
-    </w:p>
-    <w:p>
-      <w:pPr>
-        <w:pStyle w:val="BodyText"/>
-      </w:pPr>
-      <w:r>
-        <w:t xml:space="preserve">A second limitation is that raw draft strength varies by season, not by team. Even after expanding the data to 2010-2026, there are only 17 draft-class observations. The position-adjusted incentive improves this by combining draft strength with each team’s lottery position, but part of the signal still comes from season-level variation in draft quality. The incentive measure is also simplified: it uses the marginal gain in top-four-pick probability from moving one lottery slot worse, so it does not distinguish between the value of the first, second, third, and fourth picks, larger multi-slot changes, player-specific team preferences, or the possibility that teams care about protecting an already-strong lottery position.</w:t>
-      </w:r>
-    </w:p>
-    <w:bookmarkEnd w:id="62"/>
-    <w:bookmarkStart w:id="63" w:name="future-extensions"/>
-    <w:p>
-      <w:pPr>
-        <w:pStyle w:val="Heading3"/>
-      </w:pPr>
-      <w:r>
-        <w:t xml:space="preserve">Future Extensions</w:t>
-      </w:r>
-    </w:p>
-    <w:p>
-      <w:pPr>
-        <w:pStyle w:val="FirstParagraph"/>
-      </w:pPr>
-      <w:r>
-        <w:t xml:space="preserve">A direct next step is to improve the core-player usage model with better availability data. The version in this report uses player game logs to identify each team’s main pre-March players who stayed with the team and appeared after March 1, then measures whether their minutes drop late in the season. This keeps the analysis focused on continuing players, but it still cannot perfectly distinguish injuries, rest, player development, and coach’s decisions. A stronger version would merge injury reports, transaction data, and inactive-list reasons to separate strategic late-season roster management from ordinary player availability.</w:t>
-      </w:r>
-    </w:p>
-    <w:p>
-      <w:pPr>
-        <w:pStyle w:val="BodyText"/>
-      </w:pPr>
-      <w:r>
-        <w:t xml:space="preserve">Another extension would improve the team-fit score. The current version uses broad position groups and pre-March box-score production, not detailed roster needs, contracts, player age, front-office preferences, or team-specific draft evaluations. The fit extension should therefore be interpreted as a first-pass robustness check rather than a final answer about roster construction.</w:t>
-      </w:r>
-    </w:p>
-    <w:p>
-      <w:pPr>
-        <w:pStyle w:val="BodyText"/>
-      </w:pPr>
-      <w:r>
-        <w:t xml:space="preserve">A final extension would compare multiple draft-quality measures. The CraftedNBA rating is useful because it gives one consistent external measure of draft class quality, but it is still one source’s model-based ranking. Future versions should test whether results change when draft strength is measured by top-prospect rating, number of elite prospects, consensus mock draft rankings, or later NBA outcomes such as win shares.</w:t>
-      </w:r>
-    </w:p>
-    <w:bookmarkEnd w:id="63"/>
-    <w:bookmarkStart w:id="64" w:name="final-takeaway"/>
-    <w:p>
-      <w:pPr>
-        <w:pStyle w:val="Heading3"/>
-      </w:pPr>
-      <w:r>
-        <w:t xml:space="preserve">Final Takeaway</w:t>
-      </w:r>
-    </w:p>
-    <w:p>
-      <w:pPr>
-        <w:pStyle w:val="FirstParagraph"/>
-      </w:pPr>
-      <w:r>
-        <w:t xml:space="preserve">This project finds suggestive evidence that draft class strength is related to late-season losing signals among likely lottery candidates. The clearest descriptive patterns come from season-level draft-strength graphs, while the more conservative position-adjusted win-loss model shows positive but noisier estimates. The core-player usage model adds a stronger exploratory signal that teams in better top-four draft classes reduced minutes more for continuing core players. The full tanking index is a better final win-loss outcome because it measures the size and direction of late-season underperformance rather than depending on an arbitrary cutoff.</w:t>
-      </w:r>
-    </w:p>
-    <w:p>
-      <w:pPr>
-        <w:pStyle w:val="BodyText"/>
-      </w:pPr>
-      <w:r>
-        <w:t xml:space="preserve">The most defensible conclusion is therefore cautious: draft class quality appears relevant to tanking incentives, but the evidence is not strong enough to claim that stronger draft classes directly cause tanking. The project improves on simpler tanking analyses by combining playoff context, lottery position, standardized late-season underperformance, and draft class quality into one framework.</w:t>
-      </w:r>
-    </w:p>
-    <w:p>
-      <w:pPr>
-        <w:pStyle w:val="BodyText"/>
-      </w:pPr>
-      <w:r>
-        <w:t xml:space="preserve">The exploratory team-fit extension for the main win-loss outcome is less conclusive. It gives a plausible way to think about team-level heterogeneity, but the broad fit proxy does not add strong statistical evidence beyond overall draft strength in the primary tanking-index model. That leaves team fit as an important direction for future work rather than a core result of this report.</w:t>
-      </w:r>
-    </w:p>
-    <w:bookmarkEnd w:id="64"/>
+        <w:t xml:space="preserve">The most defensible conclusion is cautious: draft class quality appears relevant to tanking incentives, but the evidence is not strong enough to claim that stronger draft classes directly cause tanking. The project improves on simpler tanking analyses by combining playoff context, lottery position, standardized late-season underperformance, draft quality, and core-player usage into one framework.</w:t>
+      </w:r>
+    </w:p>
     <w:bookmarkEnd w:id="65"/>
-    <w:bookmarkStart w:id="68" w:name="references"/>
+    <w:bookmarkEnd w:id="66"/>
+    <w:bookmarkStart w:id="69" w:name="references"/>
     <w:p>
       <w:pPr>
         <w:pStyle w:val="Heading2"/>
@@ -6317,7 +6568,7 @@
       <w:r>
         <w:t xml:space="preserve"> </w:t>
       </w:r>
-      <w:hyperlink r:id="rId66">
+      <w:hyperlink r:id="rId67">
         <w:r>
           <w:rPr>
             <w:rStyle w:val="Hyperlink"/>
@@ -6454,7 +6705,7 @@
       <w:r>
         <w:t xml:space="preserve"> </w:t>
       </w:r>
-      <w:hyperlink r:id="rId67">
+      <w:hyperlink r:id="rId68">
         <w:r>
           <w:rPr>
             <w:rStyle w:val="Hyperlink"/>
@@ -6518,7 +6769,7 @@
         <w:t xml:space="preserve">.</w:t>
       </w:r>
     </w:p>
-    <w:bookmarkEnd w:id="68"/>
+    <w:bookmarkEnd w:id="69"/>
     <w:sectPr>
       <w:footnotePr>
         <w:numRestart w:val="eachSect"/>

</xml_diff>